<commit_message>
fix: comprehensive BAP template XML fixes and route improvements
- Fix split tags across XML runs in all 5 templates
- Fix broken tags: ket_lb3_jenis (missing brace), ket_udara_pantau (double brace), saksi {n: (non-breaking space typo)
- Convert footer image tags to text tags (VML textbox incompatibility with docxtemplater-image-module)
- Add tim_penilai_lengkap data for perumahan template
- Add SPPG category to template selection
- Add placeholder.png for fallback images
</commit_message>
<xml_diff>
--- a/public/templates-bap/bap-fasyankes.docx
+++ b/public/templates-bap/bap-fasyankes.docx
@@ -5884,7 +5884,7 @@
                 <w:sz w:val="24"/>
                 <w:szCs w:val="24"/>
               </w:rPr>
-              <w:t>ket_lb3_jenis}</w:t>
+              <w:t>{ket_lb3_jenis}</w:t>
             </w:r>
           </w:p>
         </w:tc>
@@ -8887,63 +8887,7 @@
                 <w:szCs w:val="24"/>
                 <w:lang w:eastAsia="en-ID"/>
               </w:rPr>
-              <w:t>{#saksi} {no}.</w:t>
-            </w:r>
-          </w:p>
-        </w:tc>
-        <w:tc>
-          <w:tcPr>
-            <w:tcW w:w="1808" w:type="dxa"/>
-            <w:vAlign w:val="center"/>
-          </w:tcPr>
-          <w:p>
-            <w:pPr>
-              <w:spacing w:after="0" w:line="240" w:lineRule="auto"/>
-              <w:rPr>
-                <w:rFonts w:ascii="Arial Nova Cond" w:eastAsia="Times New Roman" w:hAnsi="Arial Nova Cond" w:cs="Times New Roman"/>
-                <w:color w:val="0D0D0D"/>
-                <w:sz w:val="24"/>
-                <w:szCs w:val="24"/>
-                <w:lang w:eastAsia="en-ID"/>
-              </w:rPr>
-            </w:pPr>
-            <w:r>
-              <w:rPr>
-                <w:rFonts w:ascii="Arial Nova Cond" w:eastAsia="Times New Roman" w:hAnsi="Arial Nova Cond" w:cs="Times New Roman"/>
-                <w:color w:val="0D0D0D"/>
-                <w:sz w:val="24"/>
-                <w:szCs w:val="24"/>
-                <w:lang w:eastAsia="en-ID"/>
-              </w:rPr>
-              <w:lastRenderedPageBreak/>
-              <w:t xml:space="preserve">Nama </w:t>
-            </w:r>
-          </w:p>
-        </w:tc>
-        <w:tc>
-          <w:tcPr>
-            <w:tcW w:w="283" w:type="dxa"/>
-          </w:tcPr>
-          <w:p>
-            <w:pPr>
-              <w:spacing w:after="0" w:line="240" w:lineRule="auto"/>
-              <w:rPr>
-                <w:rFonts w:ascii="Arial Nova Cond" w:eastAsia="Times New Roman" w:hAnsi="Arial Nova Cond" w:cs="Times New Roman"/>
-                <w:color w:val="0D0D0D"/>
-                <w:sz w:val="24"/>
-                <w:szCs w:val="24"/>
-                <w:lang w:eastAsia="en-ID"/>
-              </w:rPr>
-            </w:pPr>
-            <w:r>
-              <w:rPr>
-                <w:rFonts w:ascii="Arial Nova Cond" w:eastAsia="Times New Roman" w:hAnsi="Arial Nova Cond" w:cs="Times New Roman"/>
-                <w:color w:val="0D0D0D"/>
-                <w:sz w:val="24"/>
-                <w:szCs w:val="24"/>
-                <w:lang w:eastAsia="en-ID"/>
-              </w:rPr>
-              <w:t>:</w:t>
+              <w:t>{#saksi} {no}.</w:t>
             </w:r>
           </w:p>
         </w:tc>
@@ -9370,7 +9314,7 @@
                               <w:sz w:val="20"/>
                               <w:szCs w:val="20"/>
                             </w:rPr>
-                            <w:t>{#tim_pengawas} {%paraf_pengawas} {/tim_pengawas}</w:t>
+                            <w:t>{#tim_pengawas} {paraf_pengawas_text} {/tim_pengawas}</w:t>
                           </w:r>
                         </w:p>
                         <w:p>
@@ -9442,7 +9386,7 @@
                         <w:sz w:val="20"/>
                         <w:szCs w:val="20"/>
                       </w:rPr>
-                      <w:t>{#tim_pengawas} {%paraf_pengawas} {/tim_pengawas}</w:t>
+                      <w:t>{#tim_pengawas} {paraf_pengawas_text} {/tim_pengawas}</w:t>
                     </w:r>
                   </w:p>
                   <w:p>
@@ -9576,7 +9520,7 @@
                               <w:sz w:val="20"/>
                               <w:szCs w:val="20"/>
                             </w:rPr>
-                            <w:t>{%paraf_pemrakarsa}</w:t>
+                            <w:t>{paraf_pemrakarsa_text}</w:t>
                           </w:r>
                           <w:r>
                             <w:rPr>
@@ -9661,7 +9605,7 @@
                         <w:sz w:val="20"/>
                         <w:szCs w:val="20"/>
                       </w:rPr>
-                      <w:t>{%paraf_pemrakarsa}</w:t>
+                      <w:t>{paraf_pemrakarsa_text}</w:t>
                     </w:r>
                     <w:r>
                       <w:rPr>

</xml_diff>

<commit_message>
fix: dokumen_izin format, signature sizes, time format, and footer image tags
</commit_message>
<xml_diff>
--- a/public/templates-bap/bap-fasyankes.docx
+++ b/public/templates-bap/bap-fasyankes.docx
@@ -9314,7 +9314,7 @@
                               <w:sz w:val="20"/>
                               <w:szCs w:val="20"/>
                             </w:rPr>
-                            <w:t>{#tim_pengawas} {paraf_pengawas_text} {/tim_pengawas}</w:t>
+                            <w:t>{#tim_pengawas} {%paraf_pengawas} {/tim_pengawas}</w:t>
                           </w:r>
                         </w:p>
                         <w:p>
@@ -9386,7 +9386,7 @@
                         <w:sz w:val="20"/>
                         <w:szCs w:val="20"/>
                       </w:rPr>
-                      <w:t>{#tim_pengawas} {paraf_pengawas_text} {/tim_pengawas}</w:t>
+                      <w:t>{#tim_pengawas} {%paraf_pengawas} {/tim_pengawas}</w:t>
                     </w:r>
                   </w:p>
                   <w:p>
@@ -9520,7 +9520,7 @@
                               <w:sz w:val="20"/>
                               <w:szCs w:val="20"/>
                             </w:rPr>
-                            <w:t>{paraf_pemrakarsa_text}</w:t>
+                            <w:t>{%paraf_pemrakarsa}</w:t>
                           </w:r>
                           <w:r>
                             <w:rPr>
@@ -9605,7 +9605,7 @@
                         <w:sz w:val="20"/>
                         <w:szCs w:val="20"/>
                       </w:rPr>
-                      <w:t>{paraf_pemrakarsa_text}</w:t>
+                      <w:t>{%paraf_pemrakarsa}</w:t>
                     </w:r>
                     <w:r>
                       <w:rPr>

</xml_diff>

<commit_message>
fix: template paraf tag xml structure for docxtemplater-image-module
</commit_message>
<xml_diff>
--- a/public/templates-bap/bap-fasyankes.docx
+++ b/public/templates-bap/bap-fasyankes.docx
@@ -9314,7 +9314,7 @@
                               <w:sz w:val="20"/>
                               <w:szCs w:val="20"/>
                             </w:rPr>
-                            <w:t>{#tim_pengawas} {%paraf_pengawas} {/tim_pengawas}</w:t>
+                            <w:t>{%paraf_pengawas}</w:t>
                           </w:r>
                         </w:p>
                         <w:p>
@@ -9386,7 +9386,7 @@
                         <w:sz w:val="20"/>
                         <w:szCs w:val="20"/>
                       </w:rPr>
-                      <w:t>{#tim_pengawas} {%paraf_pengawas} {/tim_pengawas}</w:t>
+                      <w:t>{%paraf_pengawas}</w:t>
                     </w:r>
                   </w:p>
                   <w:p>

</xml_diff>

<commit_message>
fix: docx template variables mapping and inline saran formatting
</commit_message>
<xml_diff>
--- a/public/templates-bap/bap-fasyankes.docx
+++ b/public/templates-bap/bap-fasyankes.docx
@@ -43,7 +43,7 @@
                 <w:lang w:val="en-US"/>
               </w:rPr>
               <w:drawing>
-                <wp:anchor distT="0" distB="0" distL="114300" distR="114300" simplePos="0" relativeHeight="251658752" behindDoc="0" locked="0" layoutInCell="1" allowOverlap="1" wp14:anchorId="069080DA" wp14:editId="3A31AD63">
+                <wp:anchor distT="0" distB="0" distL="114300" distR="114300" simplePos="0" relativeHeight="251658752" behindDoc="0" locked="0" layoutInCell="1" allowOverlap="1" wp14:anchorId="069080DA" wp14:editId="1B71E19E">
                   <wp:simplePos x="0" y="0"/>
                   <wp:positionH relativeFrom="column">
                     <wp:posOffset>68580</wp:posOffset>
@@ -164,107 +164,23 @@
                 <w:rFonts w:ascii="Arial" w:hAnsi="Arial" w:cs="Arial"/>
                 <w:lang w:val="en-US"/>
               </w:rPr>
-              <w:t xml:space="preserve">Jl. </w:t>
-            </w:r>
-            <w:r>
+              <w:t>Jl. Ronggowarsito No.18b, Sragen Wetan, Sragen, Jawa Tengah</w:t>
+            </w:r>
+          </w:p>
+          <w:p>
+            <w:pPr>
+              <w:jc w:val="center"/>
               <w:rPr>
                 <w:rFonts w:ascii="Arial" w:hAnsi="Arial" w:cs="Arial"/>
                 <w:lang w:val="en-US"/>
               </w:rPr>
-              <w:t>Ronggowarsito</w:t>
-            </w:r>
+            </w:pPr>
             <w:r>
               <w:rPr>
                 <w:rFonts w:ascii="Arial" w:hAnsi="Arial" w:cs="Arial"/>
                 <w:lang w:val="en-US"/>
               </w:rPr>
-              <w:t xml:space="preserve"> No.18b, </w:t>
-            </w:r>
-            <w:r>
-              <w:rPr>
-                <w:rFonts w:ascii="Arial" w:hAnsi="Arial" w:cs="Arial"/>
-                <w:lang w:val="en-US"/>
-              </w:rPr>
-              <w:t>Sragen</w:t>
-            </w:r>
-            <w:r>
-              <w:rPr>
-                <w:rFonts w:ascii="Arial" w:hAnsi="Arial" w:cs="Arial"/>
-                <w:lang w:val="en-US"/>
-              </w:rPr>
-              <w:t xml:space="preserve"> </w:t>
-            </w:r>
-            <w:r>
-              <w:rPr>
-                <w:rFonts w:ascii="Arial" w:hAnsi="Arial" w:cs="Arial"/>
-                <w:lang w:val="en-US"/>
-              </w:rPr>
-              <w:t>Wetan</w:t>
-            </w:r>
-            <w:r>
-              <w:rPr>
-                <w:rFonts w:ascii="Arial" w:hAnsi="Arial" w:cs="Arial"/>
-                <w:lang w:val="en-US"/>
-              </w:rPr>
-              <w:t xml:space="preserve">, </w:t>
-            </w:r>
-            <w:r>
-              <w:rPr>
-                <w:rFonts w:ascii="Arial" w:hAnsi="Arial" w:cs="Arial"/>
-                <w:lang w:val="en-US"/>
-              </w:rPr>
-              <w:t>Sragen</w:t>
-            </w:r>
-            <w:r>
-              <w:rPr>
-                <w:rFonts w:ascii="Arial" w:hAnsi="Arial" w:cs="Arial"/>
-                <w:lang w:val="en-US"/>
-              </w:rPr>
-              <w:t xml:space="preserve">, </w:t>
-            </w:r>
-            <w:r>
-              <w:rPr>
-                <w:rFonts w:ascii="Arial" w:hAnsi="Arial" w:cs="Arial"/>
-                <w:lang w:val="en-US"/>
-              </w:rPr>
-              <w:t>Jawa</w:t>
-            </w:r>
-            <w:r>
-              <w:rPr>
-                <w:rFonts w:ascii="Arial" w:hAnsi="Arial" w:cs="Arial"/>
-                <w:lang w:val="en-US"/>
-              </w:rPr>
-              <w:t xml:space="preserve"> Tengah</w:t>
-            </w:r>
-          </w:p>
-          <w:p>
-            <w:pPr>
-              <w:jc w:val="center"/>
-              <w:rPr>
-                <w:rFonts w:ascii="Arial" w:hAnsi="Arial" w:cs="Arial"/>
-                <w:lang w:val="en-US"/>
-              </w:rPr>
-            </w:pPr>
-            <w:r>
-              <w:rPr>
-                <w:rFonts w:ascii="Arial" w:hAnsi="Arial" w:cs="Arial"/>
-                <w:lang w:val="en-US"/>
-              </w:rPr>
-              <w:t xml:space="preserve">Telp. (0271) </w:t>
-            </w:r>
-            <w:r>
-              <w:rPr>
-                <w:rFonts w:ascii="Arial" w:hAnsi="Arial" w:cs="Arial"/>
-                <w:lang w:val="en-US"/>
-              </w:rPr>
-              <w:t>891136  Email</w:t>
-            </w:r>
-            <w:r>
-              <w:rPr>
-                <w:rFonts w:ascii="Arial" w:hAnsi="Arial" w:cs="Arial"/>
-                <w:lang w:val="en-US"/>
-              </w:rPr>
-              <w:t xml:space="preserve"> : dlhsragenkab@gmail.com</w:t>
+              <w:t>Telp. (0271) 891136  Email : dlhsragenkab@gmail.com</w:t>
             </w:r>
           </w:p>
           <w:p>
@@ -356,15 +272,7 @@
           <w:sz w:val="24"/>
           <w:szCs w:val="24"/>
         </w:rPr>
-        <w:t>Nomor</w:t>
-      </w:r>
-      <w:r>
-        <w:rPr>
-          <w:rFonts w:ascii="Arial Nova Cond" w:hAnsi="Arial Nova Cond"/>
-          <w:sz w:val="24"/>
-          <w:szCs w:val="24"/>
-        </w:rPr>
-        <w:t>: 600.4/         /BAP/17/</w:t>
+        <w:t>Nomor: 600.4/         /BAP/17/</w:t>
       </w:r>
       <w:r>
         <w:rPr>
@@ -401,71 +309,7 @@
           <w:sz w:val="24"/>
           <w:szCs w:val="24"/>
         </w:rPr>
-        <w:t xml:space="preserve">Pada </w:t>
-      </w:r>
-      <w:r>
-        <w:rPr>
-          <w:rFonts w:ascii="Arial Nova Cond" w:hAnsi="Arial Nova Cond"/>
-          <w:sz w:val="24"/>
-          <w:szCs w:val="24"/>
-        </w:rPr>
-        <w:t>hari</w:t>
-      </w:r>
-      <w:r>
-        <w:rPr>
-          <w:rFonts w:ascii="Arial Nova Cond" w:hAnsi="Arial Nova Cond"/>
-          <w:sz w:val="24"/>
-          <w:szCs w:val="24"/>
-        </w:rPr>
-        <w:t xml:space="preserve"> </w:t>
-      </w:r>
-      <w:r>
-        <w:rPr>
-          <w:rFonts w:ascii="Arial Nova Cond" w:hAnsi="Arial Nova Cond"/>
-          <w:sz w:val="24"/>
-          <w:szCs w:val="24"/>
-        </w:rPr>
-        <w:t>ini</w:t>
-      </w:r>
-      <w:r>
-        <w:rPr>
-          <w:rFonts w:ascii="Arial Nova Cond" w:hAnsi="Arial Nova Cond"/>
-          <w:sz w:val="24"/>
-          <w:szCs w:val="24"/>
-        </w:rPr>
-        <w:t xml:space="preserve"> {hari_ini_nama}, </w:t>
-      </w:r>
-      <w:r>
-        <w:rPr>
-          <w:rFonts w:ascii="Arial Nova Cond" w:hAnsi="Arial Nova Cond"/>
-          <w:sz w:val="24"/>
-          <w:szCs w:val="24"/>
-        </w:rPr>
-        <w:t>tanggal</w:t>
-      </w:r>
-      <w:r>
-        <w:rPr>
-          <w:rFonts w:ascii="Arial Nova Cond" w:hAnsi="Arial Nova Cond"/>
-          <w:sz w:val="24"/>
-          <w:szCs w:val="24"/>
-        </w:rPr>
-        <w:t xml:space="preserve"> {hari_ini_tanggal_terbilang} </w:t>
-      </w:r>
-      <w:r>
-        <w:rPr>
-          <w:rFonts w:ascii="Arial Nova Cond" w:hAnsi="Arial Nova Cond"/>
-          <w:sz w:val="24"/>
-          <w:szCs w:val="24"/>
-        </w:rPr>
-        <w:t>bulan</w:t>
-      </w:r>
-      <w:r>
-        <w:rPr>
-          <w:rFonts w:ascii="Arial Nova Cond" w:hAnsi="Arial Nova Cond"/>
-          <w:sz w:val="24"/>
-          <w:szCs w:val="24"/>
-        </w:rPr>
-        <w:t xml:space="preserve"> {hari_ini_bulan}</w:t>
+        <w:t>Pada hari ini {hari_ini_nama}, tanggal {hari_ini_tanggal_terbilang} bulan {hari_ini_bulan}</w:t>
       </w:r>
       <w:r>
         <w:rPr>
@@ -483,15 +327,7 @@
           <w:sz w:val="24"/>
           <w:szCs w:val="24"/>
         </w:rPr>
-        <w:t>tahun</w:t>
-      </w:r>
-      <w:r>
-        <w:rPr>
-          <w:rFonts w:ascii="Arial Nova Cond" w:hAnsi="Arial Nova Cond"/>
-          <w:sz w:val="24"/>
-          <w:szCs w:val="24"/>
-        </w:rPr>
-        <w:t xml:space="preserve"> {hari_ini_tahun_terbilang}</w:t>
+        <w:t>tahun {hari_ini_tahun_terbilang}</w:t>
       </w:r>
       <w:r>
         <w:rPr>
@@ -509,223 +345,7 @@
           <w:sz w:val="24"/>
           <w:szCs w:val="24"/>
         </w:rPr>
-        <w:t>pukul</w:t>
-      </w:r>
-      <w:r>
-        <w:rPr>
-          <w:rFonts w:ascii="Arial Nova Cond" w:hAnsi="Arial Nova Cond"/>
-          <w:sz w:val="24"/>
-          <w:szCs w:val="24"/>
-        </w:rPr>
-        <w:t xml:space="preserve"> {waktu_pengawasan} WIB, di </w:t>
-      </w:r>
-      <w:r>
-        <w:rPr>
-          <w:rFonts w:ascii="Arial Nova Cond" w:hAnsi="Arial Nova Cond"/>
-          <w:sz w:val="24"/>
-          <w:szCs w:val="24"/>
-        </w:rPr>
-        <w:t>lokasi</w:t>
-      </w:r>
-      <w:r>
-        <w:rPr>
-          <w:rFonts w:ascii="Arial Nova Cond" w:hAnsi="Arial Nova Cond"/>
-          <w:sz w:val="24"/>
-          <w:szCs w:val="24"/>
-        </w:rPr>
-        <w:t xml:space="preserve"> {nama_badan_usaha_kegiatan}, {alamat_lokasi}, </w:t>
-      </w:r>
-      <w:r>
-        <w:rPr>
-          <w:rFonts w:ascii="Arial Nova Cond" w:hAnsi="Arial Nova Cond"/>
-          <w:sz w:val="24"/>
-          <w:szCs w:val="24"/>
-        </w:rPr>
-        <w:t>telah</w:t>
-      </w:r>
-      <w:r>
-        <w:rPr>
-          <w:rFonts w:ascii="Arial Nova Cond" w:hAnsi="Arial Nova Cond"/>
-          <w:sz w:val="24"/>
-          <w:szCs w:val="24"/>
-        </w:rPr>
-        <w:t xml:space="preserve"> </w:t>
-      </w:r>
-      <w:r>
-        <w:rPr>
-          <w:rFonts w:ascii="Arial Nova Cond" w:hAnsi="Arial Nova Cond"/>
-          <w:sz w:val="24"/>
-          <w:szCs w:val="24"/>
-        </w:rPr>
-        <w:t>dilakukan</w:t>
-      </w:r>
-      <w:r>
-        <w:rPr>
-          <w:rFonts w:ascii="Arial Nova Cond" w:hAnsi="Arial Nova Cond"/>
-          <w:sz w:val="24"/>
-          <w:szCs w:val="24"/>
-        </w:rPr>
-        <w:t xml:space="preserve"> </w:t>
-      </w:r>
-      <w:r>
-        <w:rPr>
-          <w:rFonts w:ascii="Arial Nova Cond" w:hAnsi="Arial Nova Cond"/>
-          <w:sz w:val="24"/>
-          <w:szCs w:val="24"/>
-        </w:rPr>
-        <w:t>penandatanganan</w:t>
-      </w:r>
-      <w:r>
-        <w:rPr>
-          <w:rFonts w:ascii="Arial Nova Cond" w:hAnsi="Arial Nova Cond"/>
-          <w:sz w:val="24"/>
-          <w:szCs w:val="24"/>
-        </w:rPr>
-        <w:t xml:space="preserve"> </w:t>
-      </w:r>
-      <w:r>
-        <w:rPr>
-          <w:rFonts w:ascii="Arial Nova Cond" w:hAnsi="Arial Nova Cond"/>
-          <w:sz w:val="24"/>
-          <w:szCs w:val="24"/>
-        </w:rPr>
-        <w:t>berita</w:t>
-      </w:r>
-      <w:r>
-        <w:rPr>
-          <w:rFonts w:ascii="Arial Nova Cond" w:hAnsi="Arial Nova Cond"/>
-          <w:sz w:val="24"/>
-          <w:szCs w:val="24"/>
-        </w:rPr>
-        <w:t xml:space="preserve"> acara </w:t>
-      </w:r>
-      <w:r>
-        <w:rPr>
-          <w:rFonts w:ascii="Arial Nova Cond" w:hAnsi="Arial Nova Cond"/>
-          <w:sz w:val="24"/>
-          <w:szCs w:val="24"/>
-        </w:rPr>
-        <w:t>pengawasan</w:t>
-      </w:r>
-      <w:r>
-        <w:rPr>
-          <w:rFonts w:ascii="Arial Nova Cond" w:hAnsi="Arial Nova Cond"/>
-          <w:sz w:val="24"/>
-          <w:szCs w:val="24"/>
-        </w:rPr>
-        <w:t xml:space="preserve"> </w:t>
-      </w:r>
-      <w:r>
-        <w:rPr>
-          <w:rFonts w:ascii="Arial Nova Cond" w:hAnsi="Arial Nova Cond"/>
-          <w:sz w:val="24"/>
-          <w:szCs w:val="24"/>
-        </w:rPr>
-        <w:t>lingkungan</w:t>
-      </w:r>
-      <w:r>
-        <w:rPr>
-          <w:rFonts w:ascii="Arial Nova Cond" w:hAnsi="Arial Nova Cond"/>
-          <w:sz w:val="24"/>
-          <w:szCs w:val="24"/>
-        </w:rPr>
-        <w:t xml:space="preserve"> </w:t>
-      </w:r>
-      <w:r>
-        <w:rPr>
-          <w:rFonts w:ascii="Arial Nova Cond" w:hAnsi="Arial Nova Cond"/>
-          <w:sz w:val="24"/>
-          <w:szCs w:val="24"/>
-        </w:rPr>
-        <w:t>hidup</w:t>
-      </w:r>
-      <w:r>
-        <w:rPr>
-          <w:rFonts w:ascii="Arial Nova Cond" w:hAnsi="Arial Nova Cond"/>
-          <w:sz w:val="24"/>
-          <w:szCs w:val="24"/>
-        </w:rPr>
-        <w:t xml:space="preserve"> </w:t>
-      </w:r>
-      <w:r>
-        <w:rPr>
-          <w:rFonts w:ascii="Arial Nova Cond" w:hAnsi="Arial Nova Cond"/>
-          <w:sz w:val="24"/>
-          <w:szCs w:val="24"/>
-        </w:rPr>
-        <w:t>terhadap</w:t>
-      </w:r>
-      <w:r>
-        <w:rPr>
-          <w:rFonts w:ascii="Arial Nova Cond" w:hAnsi="Arial Nova Cond"/>
-          <w:sz w:val="24"/>
-          <w:szCs w:val="24"/>
-        </w:rPr>
-        <w:t xml:space="preserve"> {nama_badan_usaha_kegiatan} </w:t>
-      </w:r>
-      <w:r>
-        <w:rPr>
-          <w:rFonts w:ascii="Arial Nova Cond" w:hAnsi="Arial Nova Cond"/>
-          <w:sz w:val="24"/>
-          <w:szCs w:val="24"/>
-        </w:rPr>
-        <w:t>dengan</w:t>
-      </w:r>
-      <w:r>
-        <w:rPr>
-          <w:rFonts w:ascii="Arial Nova Cond" w:hAnsi="Arial Nova Cond"/>
-          <w:sz w:val="24"/>
-          <w:szCs w:val="24"/>
-        </w:rPr>
-        <w:t xml:space="preserve"> </w:t>
-      </w:r>
-      <w:r>
-        <w:rPr>
-          <w:rFonts w:ascii="Arial Nova Cond" w:hAnsi="Arial Nova Cond"/>
-          <w:sz w:val="24"/>
-          <w:szCs w:val="24"/>
-        </w:rPr>
-        <w:t>hasil</w:t>
-      </w:r>
-      <w:r>
-        <w:rPr>
-          <w:rFonts w:ascii="Arial Nova Cond" w:hAnsi="Arial Nova Cond"/>
-          <w:sz w:val="24"/>
-          <w:szCs w:val="24"/>
-        </w:rPr>
-        <w:t xml:space="preserve"> </w:t>
-      </w:r>
-      <w:r>
-        <w:rPr>
-          <w:rFonts w:ascii="Arial Nova Cond" w:hAnsi="Arial Nova Cond"/>
-          <w:sz w:val="24"/>
-          <w:szCs w:val="24"/>
-        </w:rPr>
-        <w:t>sebagai</w:t>
-      </w:r>
-      <w:r>
-        <w:rPr>
-          <w:rFonts w:ascii="Arial Nova Cond" w:hAnsi="Arial Nova Cond"/>
-          <w:sz w:val="24"/>
-          <w:szCs w:val="24"/>
-        </w:rPr>
-        <w:t xml:space="preserve"> </w:t>
-      </w:r>
-      <w:r>
-        <w:rPr>
-          <w:rFonts w:ascii="Arial Nova Cond" w:hAnsi="Arial Nova Cond"/>
-          <w:sz w:val="24"/>
-          <w:szCs w:val="24"/>
-        </w:rPr>
-        <w:t>berikut</w:t>
-      </w:r>
-      <w:r>
-        <w:rPr>
-          <w:rFonts w:ascii="Arial Nova Cond" w:hAnsi="Arial Nova Cond"/>
-          <w:sz w:val="24"/>
-          <w:szCs w:val="24"/>
-        </w:rPr>
-        <w:t>:</w:t>
+        <w:t>pukul {waktu_pengawasan} WIB, di lokasi {nama_badan_usaha_kegiatan}, {alamat_lokasi}, telah dilakukan penandatanganan berita acara pengawasan lingkungan hidup terhadap {nama_badan_usaha_kegiatan} dengan hasil sebagai berikut:</w:t>
       </w:r>
     </w:p>
     <w:p>
@@ -755,23 +375,7 @@
           <w:sz w:val="24"/>
           <w:szCs w:val="24"/>
         </w:rPr>
-        <w:t xml:space="preserve">A. </w:t>
-      </w:r>
-      <w:r>
-        <w:rPr>
-          <w:rFonts w:ascii="Arial Nova Cond" w:hAnsi="Arial Nova Cond"/>
-          <w:sz w:val="24"/>
-          <w:szCs w:val="24"/>
-        </w:rPr>
-        <w:t>Identitas</w:t>
-      </w:r>
-      <w:r>
-        <w:rPr>
-          <w:rFonts w:ascii="Arial Nova Cond" w:hAnsi="Arial Nova Cond"/>
-          <w:sz w:val="24"/>
-          <w:szCs w:val="24"/>
-        </w:rPr>
-        <w:t xml:space="preserve"> </w:t>
+        <w:t xml:space="preserve">A. Identitas </w:t>
       </w:r>
       <w:r>
         <w:rPr>
@@ -787,47 +391,7 @@
           <w:sz w:val="24"/>
           <w:szCs w:val="24"/>
         </w:rPr>
-        <w:t xml:space="preserve"> </w:t>
-      </w:r>
-      <w:r>
-        <w:rPr>
-          <w:rFonts w:ascii="Arial Nova Cond" w:hAnsi="Arial Nova Cond"/>
-          <w:sz w:val="24"/>
-          <w:szCs w:val="24"/>
-        </w:rPr>
-        <w:t>Pengawas</w:t>
-      </w:r>
-      <w:r>
-        <w:rPr>
-          <w:rFonts w:ascii="Arial Nova Cond" w:hAnsi="Arial Nova Cond"/>
-          <w:sz w:val="24"/>
-          <w:szCs w:val="24"/>
-        </w:rPr>
-        <w:t xml:space="preserve"> </w:t>
-      </w:r>
-      <w:r>
-        <w:rPr>
-          <w:rFonts w:ascii="Arial Nova Cond" w:hAnsi="Arial Nova Cond"/>
-          <w:sz w:val="24"/>
-          <w:szCs w:val="24"/>
-        </w:rPr>
-        <w:t>Lingkungan</w:t>
-      </w:r>
-      <w:r>
-        <w:rPr>
-          <w:rFonts w:ascii="Arial Nova Cond" w:hAnsi="Arial Nova Cond"/>
-          <w:sz w:val="24"/>
-          <w:szCs w:val="24"/>
-        </w:rPr>
-        <w:t xml:space="preserve"> </w:t>
-      </w:r>
-      <w:r>
-        <w:rPr>
-          <w:rFonts w:ascii="Arial Nova Cond" w:hAnsi="Arial Nova Cond"/>
-          <w:sz w:val="24"/>
-          <w:szCs w:val="24"/>
-        </w:rPr>
-        <w:t>Hidup</w:t>
+        <w:t xml:space="preserve"> Pengawas Lingkungan Hidup</w:t>
       </w:r>
       <w:r>
         <w:rPr>
@@ -951,15 +515,7 @@
                 <w:sz w:val="24"/>
                 <w:szCs w:val="24"/>
               </w:rPr>
-              <w:t>Instansi</w:t>
-            </w:r>
-            <w:r>
-              <w:rPr>
-                <w:rFonts w:ascii="Arial Nova Cond" w:hAnsi="Arial Nova Cond"/>
-                <w:sz w:val="24"/>
-                <w:szCs w:val="24"/>
-              </w:rPr>
-              <w:t xml:space="preserve"> </w:t>
+              <w:t xml:space="preserve">Instansi </w:t>
             </w:r>
           </w:p>
         </w:tc>
@@ -1149,63 +705,7 @@
                 <w:sz w:val="24"/>
                 <w:szCs w:val="24"/>
               </w:rPr>
-              <w:t xml:space="preserve">Dinas </w:t>
-            </w:r>
-            <w:r>
-              <w:rPr>
-                <w:rFonts w:ascii="Arial Nova Cond" w:hAnsi="Arial Nova Cond"/>
-                <w:sz w:val="24"/>
-                <w:szCs w:val="24"/>
-              </w:rPr>
-              <w:t>Lingkungan</w:t>
-            </w:r>
-            <w:r>
-              <w:rPr>
-                <w:rFonts w:ascii="Arial Nova Cond" w:hAnsi="Arial Nova Cond"/>
-                <w:sz w:val="24"/>
-                <w:szCs w:val="24"/>
-              </w:rPr>
-              <w:t xml:space="preserve"> </w:t>
-            </w:r>
-            <w:r>
-              <w:rPr>
-                <w:rFonts w:ascii="Arial Nova Cond" w:hAnsi="Arial Nova Cond"/>
-                <w:sz w:val="24"/>
-                <w:szCs w:val="24"/>
-              </w:rPr>
-              <w:t>Hidup</w:t>
-            </w:r>
-            <w:r>
-              <w:rPr>
-                <w:rFonts w:ascii="Arial Nova Cond" w:hAnsi="Arial Nova Cond"/>
-                <w:sz w:val="24"/>
-                <w:szCs w:val="24"/>
-              </w:rPr>
-              <w:t xml:space="preserve"> </w:t>
-            </w:r>
-            <w:r>
-              <w:rPr>
-                <w:rFonts w:ascii="Arial Nova Cond" w:hAnsi="Arial Nova Cond"/>
-                <w:sz w:val="24"/>
-                <w:szCs w:val="24"/>
-              </w:rPr>
-              <w:t>Kabupaten</w:t>
-            </w:r>
-            <w:r>
-              <w:rPr>
-                <w:rFonts w:ascii="Arial Nova Cond" w:hAnsi="Arial Nova Cond"/>
-                <w:sz w:val="24"/>
-                <w:szCs w:val="24"/>
-              </w:rPr>
-              <w:t xml:space="preserve"> </w:t>
-            </w:r>
-            <w:r>
-              <w:rPr>
-                <w:rFonts w:ascii="Arial Nova Cond" w:hAnsi="Arial Nova Cond"/>
-                <w:sz w:val="24"/>
-                <w:szCs w:val="24"/>
-              </w:rPr>
-              <w:t>Sragen</w:t>
+              <w:t>Dinas Lingkungan Hidup Kabupaten Sragen</w:t>
             </w:r>
           </w:p>
           <w:p>
@@ -1549,23 +1049,7 @@
                 <w:sz w:val="24"/>
                 <w:szCs w:val="24"/>
               </w:rPr>
-              <w:t>Tahun</w:t>
-            </w:r>
-            <w:r>
-              <w:rPr>
-                <w:rFonts w:ascii="Arial Nova Cond" w:hAnsi="Arial Nova Cond"/>
-                <w:sz w:val="24"/>
-                <w:szCs w:val="24"/>
-              </w:rPr>
-              <w:t xml:space="preserve"> </w:t>
-            </w:r>
-            <w:r>
-              <w:rPr>
-                <w:rFonts w:ascii="Arial Nova Cond" w:hAnsi="Arial Nova Cond"/>
-                <w:sz w:val="24"/>
-                <w:szCs w:val="24"/>
-              </w:rPr>
-              <w:t>beroperasi</w:t>
+              <w:t>Tahun beroperasi</w:t>
             </w:r>
           </w:p>
         </w:tc>
@@ -1659,15 +1143,7 @@
                 <w:sz w:val="24"/>
                 <w:szCs w:val="24"/>
               </w:rPr>
-              <w:t xml:space="preserve">Status </w:t>
-            </w:r>
-            <w:r>
-              <w:rPr>
-                <w:rFonts w:ascii="Arial Nova Cond" w:hAnsi="Arial Nova Cond"/>
-                <w:sz w:val="24"/>
-                <w:szCs w:val="24"/>
-              </w:rPr>
-              <w:t>permodalan</w:t>
+              <w:t>Status permodalan</w:t>
             </w:r>
           </w:p>
         </w:tc>
@@ -1761,63 +1237,7 @@
                 <w:sz w:val="24"/>
                 <w:szCs w:val="24"/>
               </w:rPr>
-              <w:t xml:space="preserve">Nama </w:t>
-            </w:r>
-            <w:r>
-              <w:rPr>
-                <w:rFonts w:ascii="Arial Nova Cond" w:hAnsi="Arial Nova Cond"/>
-                <w:sz w:val="24"/>
-                <w:szCs w:val="24"/>
-              </w:rPr>
-              <w:t>penanggung</w:t>
-            </w:r>
-            <w:r>
-              <w:rPr>
-                <w:rFonts w:ascii="Arial Nova Cond" w:hAnsi="Arial Nova Cond"/>
-                <w:sz w:val="24"/>
-                <w:szCs w:val="24"/>
-              </w:rPr>
-              <w:t xml:space="preserve"> </w:t>
-            </w:r>
-            <w:r>
-              <w:rPr>
-                <w:rFonts w:ascii="Arial Nova Cond" w:hAnsi="Arial Nova Cond"/>
-                <w:sz w:val="24"/>
-                <w:szCs w:val="24"/>
-              </w:rPr>
-              <w:t>jawab</w:t>
-            </w:r>
-            <w:r>
-              <w:rPr>
-                <w:rFonts w:ascii="Arial Nova Cond" w:hAnsi="Arial Nova Cond"/>
-                <w:sz w:val="24"/>
-                <w:szCs w:val="24"/>
-              </w:rPr>
-              <w:t xml:space="preserve"> Usaha dan/</w:t>
-            </w:r>
-            <w:r>
-              <w:rPr>
-                <w:rFonts w:ascii="Arial Nova Cond" w:hAnsi="Arial Nova Cond"/>
-                <w:sz w:val="24"/>
-                <w:szCs w:val="24"/>
-              </w:rPr>
-              <w:t>atau</w:t>
-            </w:r>
-            <w:r>
-              <w:rPr>
-                <w:rFonts w:ascii="Arial Nova Cond" w:hAnsi="Arial Nova Cond"/>
-                <w:sz w:val="24"/>
-                <w:szCs w:val="24"/>
-              </w:rPr>
-              <w:t xml:space="preserve"> </w:t>
-            </w:r>
-            <w:r>
-              <w:rPr>
-                <w:rFonts w:ascii="Arial Nova Cond" w:hAnsi="Arial Nova Cond"/>
-                <w:sz w:val="24"/>
-                <w:szCs w:val="24"/>
-              </w:rPr>
-              <w:t>Kegiatan</w:t>
+              <w:t>Nama penanggung jawab Usaha dan/atau Kegiatan</w:t>
             </w:r>
           </w:p>
         </w:tc>
@@ -1911,71 +1331,7 @@
                 <w:sz w:val="24"/>
                 <w:szCs w:val="24"/>
               </w:rPr>
-              <w:t>Jabatan</w:t>
-            </w:r>
-            <w:r>
-              <w:rPr>
-                <w:rFonts w:ascii="Arial Nova Cond" w:hAnsi="Arial Nova Cond"/>
-                <w:sz w:val="24"/>
-                <w:szCs w:val="24"/>
-              </w:rPr>
-              <w:t xml:space="preserve"> </w:t>
-            </w:r>
-            <w:r>
-              <w:rPr>
-                <w:rFonts w:ascii="Arial Nova Cond" w:hAnsi="Arial Nova Cond"/>
-                <w:sz w:val="24"/>
-                <w:szCs w:val="24"/>
-              </w:rPr>
-              <w:t>penanggung</w:t>
-            </w:r>
-            <w:r>
-              <w:rPr>
-                <w:rFonts w:ascii="Arial Nova Cond" w:hAnsi="Arial Nova Cond"/>
-                <w:sz w:val="24"/>
-                <w:szCs w:val="24"/>
-              </w:rPr>
-              <w:t xml:space="preserve"> </w:t>
-            </w:r>
-            <w:r>
-              <w:rPr>
-                <w:rFonts w:ascii="Arial Nova Cond" w:hAnsi="Arial Nova Cond"/>
-                <w:sz w:val="24"/>
-                <w:szCs w:val="24"/>
-              </w:rPr>
-              <w:t>jawab</w:t>
-            </w:r>
-            <w:r>
-              <w:rPr>
-                <w:rFonts w:ascii="Arial Nova Cond" w:hAnsi="Arial Nova Cond"/>
-                <w:sz w:val="24"/>
-                <w:szCs w:val="24"/>
-              </w:rPr>
-              <w:t xml:space="preserve"> Usaha dan/</w:t>
-            </w:r>
-            <w:r>
-              <w:rPr>
-                <w:rFonts w:ascii="Arial Nova Cond" w:hAnsi="Arial Nova Cond"/>
-                <w:sz w:val="24"/>
-                <w:szCs w:val="24"/>
-              </w:rPr>
-              <w:t>atau</w:t>
-            </w:r>
-            <w:r>
-              <w:rPr>
-                <w:rFonts w:ascii="Arial Nova Cond" w:hAnsi="Arial Nova Cond"/>
-                <w:sz w:val="24"/>
-                <w:szCs w:val="24"/>
-              </w:rPr>
-              <w:t xml:space="preserve"> </w:t>
-            </w:r>
-            <w:r>
-              <w:rPr>
-                <w:rFonts w:ascii="Arial Nova Cond" w:hAnsi="Arial Nova Cond"/>
-                <w:sz w:val="24"/>
-                <w:szCs w:val="24"/>
-              </w:rPr>
-              <w:t>Kegiatan</w:t>
+              <w:t>Jabatan penanggung jawab Usaha dan/atau Kegiatan</w:t>
             </w:r>
           </w:p>
         </w:tc>
@@ -2165,23 +1521,7 @@
                 <w:sz w:val="24"/>
                 <w:szCs w:val="24"/>
               </w:rPr>
-              <w:t>Nomor</w:t>
-            </w:r>
-            <w:r>
-              <w:rPr>
-                <w:rFonts w:ascii="Arial Nova Cond" w:hAnsi="Arial Nova Cond"/>
-                <w:sz w:val="24"/>
-                <w:szCs w:val="24"/>
-              </w:rPr>
-              <w:t xml:space="preserve"> </w:t>
-            </w:r>
-            <w:r>
-              <w:rPr>
-                <w:rFonts w:ascii="Arial Nova Cond" w:hAnsi="Arial Nova Cond"/>
-                <w:sz w:val="24"/>
-                <w:szCs w:val="24"/>
-              </w:rPr>
-              <w:t>telepon</w:t>
+              <w:t>Nomor telepon</w:t>
             </w:r>
           </w:p>
         </w:tc>
@@ -2279,55 +1619,7 @@
                 <w:sz w:val="24"/>
                 <w:szCs w:val="24"/>
               </w:rPr>
-              <w:t>Koordinat</w:t>
-            </w:r>
-            <w:r>
-              <w:rPr>
-                <w:rFonts w:ascii="Arial Nova Cond" w:hAnsi="Arial Nova Cond"/>
-                <w:sz w:val="24"/>
-                <w:szCs w:val="24"/>
-              </w:rPr>
-              <w:t xml:space="preserve"> </w:t>
-            </w:r>
-            <w:r>
-              <w:rPr>
-                <w:rFonts w:ascii="Arial Nova Cond" w:hAnsi="Arial Nova Cond"/>
-                <w:sz w:val="24"/>
-                <w:szCs w:val="24"/>
-              </w:rPr>
-              <w:t>lokasi</w:t>
-            </w:r>
-            <w:r>
-              <w:rPr>
-                <w:rFonts w:ascii="Arial Nova Cond" w:hAnsi="Arial Nova Cond"/>
-                <w:sz w:val="24"/>
-                <w:szCs w:val="24"/>
-              </w:rPr>
-              <w:t xml:space="preserve"> Usaha dan/</w:t>
-            </w:r>
-            <w:r>
-              <w:rPr>
-                <w:rFonts w:ascii="Arial Nova Cond" w:hAnsi="Arial Nova Cond"/>
-                <w:sz w:val="24"/>
-                <w:szCs w:val="24"/>
-              </w:rPr>
-              <w:t>atau</w:t>
-            </w:r>
-            <w:r>
-              <w:rPr>
-                <w:rFonts w:ascii="Arial Nova Cond" w:hAnsi="Arial Nova Cond"/>
-                <w:sz w:val="24"/>
-                <w:szCs w:val="24"/>
-              </w:rPr>
-              <w:t xml:space="preserve"> </w:t>
-            </w:r>
-            <w:r>
-              <w:rPr>
-                <w:rFonts w:ascii="Arial Nova Cond" w:hAnsi="Arial Nova Cond"/>
-                <w:sz w:val="24"/>
-                <w:szCs w:val="24"/>
-              </w:rPr>
-              <w:t>Kegiatan</w:t>
+              <w:t>Koordinat lokasi Usaha dan/atau Kegiatan</w:t>
             </w:r>
           </w:p>
           <w:p>
@@ -2484,45 +1776,55 @@
                 <w:szCs w:val="24"/>
                 <w:lang w:val="en-US"/>
               </w:rPr>
-              <w:t>Utara :</w:t>
-            </w:r>
-            <w:r>
+              <w:t xml:space="preserve">Utara : </w:t>
+            </w:r>
+            <w:r>
+              <w:rPr>
+                <w:rFonts w:ascii="Arial Nova Cond" w:hAnsi="Arial Nova Cond"/>
+                <w:sz w:val="24"/>
+                <w:szCs w:val="24"/>
+              </w:rPr>
+              <w:t>{batas_utara}</w:t>
+            </w:r>
+          </w:p>
+          <w:p>
+            <w:pPr>
+              <w:jc w:val="both"/>
               <w:rPr>
                 <w:rFonts w:ascii="Arial Nova Cond" w:hAnsi="Arial Nova Cond"/>
                 <w:sz w:val="24"/>
                 <w:szCs w:val="24"/>
                 <w:lang w:val="en-US"/>
               </w:rPr>
-              <w:t xml:space="preserve"> </w:t>
-            </w:r>
-            <w:r>
-              <w:rPr>
-                <w:rFonts w:ascii="Arial Nova Cond" w:hAnsi="Arial Nova Cond"/>
-                <w:sz w:val="24"/>
-                <w:szCs w:val="24"/>
-              </w:rPr>
-              <w:t>{batas_utara}</w:t>
-            </w:r>
-          </w:p>
-          <w:p>
-            <w:pPr>
-              <w:jc w:val="both"/>
+            </w:pPr>
+            <w:r>
               <w:rPr>
                 <w:rFonts w:ascii="Arial Nova Cond" w:hAnsi="Arial Nova Cond"/>
                 <w:sz w:val="24"/>
                 <w:szCs w:val="24"/>
                 <w:lang w:val="en-US"/>
               </w:rPr>
-            </w:pPr>
-            <w:r>
+              <w:t xml:space="preserve">Timur : </w:t>
+            </w:r>
+            <w:r>
+              <w:rPr>
+                <w:rFonts w:ascii="Arial Nova Cond" w:hAnsi="Arial Nova Cond"/>
+                <w:sz w:val="24"/>
+                <w:szCs w:val="24"/>
+              </w:rPr>
+              <w:t>{batas_timur}</w:t>
+            </w:r>
+          </w:p>
+          <w:p>
+            <w:pPr>
+              <w:jc w:val="both"/>
               <w:rPr>
                 <w:rFonts w:ascii="Arial Nova Cond" w:hAnsi="Arial Nova Cond"/>
                 <w:sz w:val="24"/>
                 <w:szCs w:val="24"/>
                 <w:lang w:val="en-US"/>
               </w:rPr>
-              <w:t>Timur :</w:t>
-            </w:r>
+            </w:pPr>
             <w:r>
               <w:rPr>
                 <w:rFonts w:ascii="Arial Nova Cond" w:hAnsi="Arial Nova Cond"/>
@@ -2530,15 +1832,15 @@
                 <w:szCs w:val="24"/>
                 <w:lang w:val="en-US"/>
               </w:rPr>
-              <w:t xml:space="preserve"> </w:t>
-            </w:r>
-            <w:r>
-              <w:rPr>
-                <w:rFonts w:ascii="Arial Nova Cond" w:hAnsi="Arial Nova Cond"/>
-                <w:sz w:val="24"/>
-                <w:szCs w:val="24"/>
-              </w:rPr>
-              <w:t>{batas_timur}</w:t>
+              <w:t xml:space="preserve">Selatan : </w:t>
+            </w:r>
+            <w:r>
+              <w:rPr>
+                <w:rFonts w:ascii="Arial Nova Cond" w:hAnsi="Arial Nova Cond"/>
+                <w:sz w:val="24"/>
+                <w:szCs w:val="24"/>
+              </w:rPr>
+              <w:t>{batas_selatan}</w:t>
             </w:r>
           </w:p>
           <w:p>
@@ -2558,53 +1860,7 @@
                 <w:szCs w:val="24"/>
                 <w:lang w:val="en-US"/>
               </w:rPr>
-              <w:t>Selatan :</w:t>
-            </w:r>
-            <w:r>
-              <w:rPr>
-                <w:rFonts w:ascii="Arial Nova Cond" w:hAnsi="Arial Nova Cond"/>
-                <w:sz w:val="24"/>
-                <w:szCs w:val="24"/>
-                <w:lang w:val="en-US"/>
-              </w:rPr>
-              <w:t xml:space="preserve"> </w:t>
-            </w:r>
-            <w:r>
-              <w:rPr>
-                <w:rFonts w:ascii="Arial Nova Cond" w:hAnsi="Arial Nova Cond"/>
-                <w:sz w:val="24"/>
-                <w:szCs w:val="24"/>
-              </w:rPr>
-              <w:t>{batas_selatan}</w:t>
-            </w:r>
-          </w:p>
-          <w:p>
-            <w:pPr>
-              <w:jc w:val="both"/>
-              <w:rPr>
-                <w:rFonts w:ascii="Arial Nova Cond" w:hAnsi="Arial Nova Cond"/>
-                <w:sz w:val="24"/>
-                <w:szCs w:val="24"/>
-                <w:lang w:val="en-US"/>
-              </w:rPr>
-            </w:pPr>
-            <w:r>
-              <w:rPr>
-                <w:rFonts w:ascii="Arial Nova Cond" w:hAnsi="Arial Nova Cond"/>
-                <w:sz w:val="24"/>
-                <w:szCs w:val="24"/>
-                <w:lang w:val="en-US"/>
-              </w:rPr>
-              <w:t>Barat :</w:t>
-            </w:r>
-            <w:r>
-              <w:rPr>
-                <w:rFonts w:ascii="Arial Nova Cond" w:hAnsi="Arial Nova Cond"/>
-                <w:sz w:val="24"/>
-                <w:szCs w:val="24"/>
-                <w:lang w:val="en-US"/>
-              </w:rPr>
-              <w:t xml:space="preserve"> </w:t>
+              <w:t xml:space="preserve">Barat : </w:t>
             </w:r>
             <w:r>
               <w:rPr>
@@ -2748,7 +2004,7 @@
                 <w:sz w:val="24"/>
                 <w:szCs w:val="24"/>
               </w:rPr>
-              <w:t>{luas_lahan} </w:t>
+              <w:t>{luas_lahan}</w:t>
             </w:r>
             <w:r>
               <w:rPr>
@@ -2977,23 +2233,7 @@
                 <w:sz w:val="24"/>
                 <w:szCs w:val="24"/>
               </w:rPr>
-              <w:t>Dokumen</w:t>
-            </w:r>
-            <w:r>
-              <w:rPr>
-                <w:rFonts w:ascii="Arial Nova Cond" w:hAnsi="Arial Nova Cond"/>
-                <w:sz w:val="24"/>
-                <w:szCs w:val="24"/>
-              </w:rPr>
-              <w:t xml:space="preserve"> yang </w:t>
-            </w:r>
-            <w:r>
-              <w:rPr>
-                <w:rFonts w:ascii="Arial Nova Cond" w:hAnsi="Arial Nova Cond"/>
-                <w:sz w:val="24"/>
-                <w:szCs w:val="24"/>
-              </w:rPr>
-              <w:t>dimiliki</w:t>
+              <w:t>Dokumen yang dimiliki</w:t>
             </w:r>
           </w:p>
         </w:tc>
@@ -3087,23 +2327,7 @@
                 <w:sz w:val="24"/>
                 <w:szCs w:val="24"/>
               </w:rPr>
-              <w:t>Persetujuan</w:t>
-            </w:r>
-            <w:r>
-              <w:rPr>
-                <w:rFonts w:ascii="Arial Nova Cond" w:hAnsi="Arial Nova Cond"/>
-                <w:sz w:val="24"/>
-                <w:szCs w:val="24"/>
-              </w:rPr>
-              <w:t xml:space="preserve"> </w:t>
-            </w:r>
-            <w:r>
-              <w:rPr>
-                <w:rFonts w:ascii="Arial Nova Cond" w:hAnsi="Arial Nova Cond"/>
-                <w:sz w:val="24"/>
-                <w:szCs w:val="24"/>
-              </w:rPr>
-              <w:t>Lingkungan</w:t>
+              <w:t>Persetujuan Lingkungan</w:t>
             </w:r>
           </w:p>
         </w:tc>
@@ -3198,55 +2422,7 @@
                 <w:sz w:val="24"/>
                 <w:szCs w:val="24"/>
               </w:rPr>
-              <w:t>Teknologi</w:t>
-            </w:r>
-            <w:r>
-              <w:rPr>
-                <w:rFonts w:ascii="Arial Nova Cond" w:hAnsi="Arial Nova Cond"/>
-                <w:sz w:val="24"/>
-                <w:szCs w:val="24"/>
-              </w:rPr>
-              <w:t xml:space="preserve"> </w:t>
-            </w:r>
-            <w:r>
-              <w:rPr>
-                <w:rFonts w:ascii="Arial Nova Cond" w:hAnsi="Arial Nova Cond"/>
-                <w:sz w:val="24"/>
-                <w:szCs w:val="24"/>
-              </w:rPr>
-              <w:t>pengelolaan</w:t>
-            </w:r>
-            <w:r>
-              <w:rPr>
-                <w:rFonts w:ascii="Arial Nova Cond" w:hAnsi="Arial Nova Cond"/>
-                <w:sz w:val="24"/>
-                <w:szCs w:val="24"/>
-              </w:rPr>
-              <w:t xml:space="preserve"> </w:t>
-            </w:r>
-            <w:r>
-              <w:rPr>
-                <w:rFonts w:ascii="Arial Nova Cond" w:hAnsi="Arial Nova Cond"/>
-                <w:sz w:val="24"/>
-                <w:szCs w:val="24"/>
-              </w:rPr>
-              <w:t>Pembuangan</w:t>
-            </w:r>
-            <w:r>
-              <w:rPr>
-                <w:rFonts w:ascii="Arial Nova Cond" w:hAnsi="Arial Nova Cond"/>
-                <w:sz w:val="24"/>
-                <w:szCs w:val="24"/>
-              </w:rPr>
-              <w:t xml:space="preserve"> Air </w:t>
-            </w:r>
-            <w:r>
-              <w:rPr>
-                <w:rFonts w:ascii="Arial Nova Cond" w:hAnsi="Arial Nova Cond"/>
-                <w:sz w:val="24"/>
-                <w:szCs w:val="24"/>
-              </w:rPr>
-              <w:t>Limbah</w:t>
+              <w:t>Teknologi pengelolaan Pembuangan Air Limbah</w:t>
             </w:r>
           </w:p>
         </w:tc>
@@ -3341,15 +2517,7 @@
                 <w:sz w:val="24"/>
                 <w:szCs w:val="24"/>
               </w:rPr>
-              <w:t xml:space="preserve">Volume air </w:t>
-            </w:r>
-            <w:r>
-              <w:rPr>
-                <w:rFonts w:ascii="Arial Nova Cond" w:hAnsi="Arial Nova Cond"/>
-                <w:sz w:val="24"/>
-                <w:szCs w:val="24"/>
-              </w:rPr>
-              <w:t>limbah</w:t>
+              <w:t>Volume air limbah</w:t>
             </w:r>
           </w:p>
         </w:tc>
@@ -3443,15 +2611,7 @@
                 <w:sz w:val="24"/>
                 <w:szCs w:val="24"/>
               </w:rPr>
-              <w:t>Pemanfaatan</w:t>
-            </w:r>
-            <w:r>
-              <w:rPr>
-                <w:rFonts w:ascii="Arial Nova Cond" w:hAnsi="Arial Nova Cond"/>
-                <w:sz w:val="24"/>
-                <w:szCs w:val="24"/>
-              </w:rPr>
-              <w:t xml:space="preserve"> Air Tanah</w:t>
+              <w:t>Pemanfaatan Air Tanah</w:t>
             </w:r>
           </w:p>
         </w:tc>
@@ -3545,63 +2705,7 @@
                 <w:sz w:val="24"/>
                 <w:szCs w:val="24"/>
               </w:rPr>
-              <w:t>Jumlah</w:t>
-            </w:r>
-            <w:r>
-              <w:rPr>
-                <w:rFonts w:ascii="Arial Nova Cond" w:hAnsi="Arial Nova Cond"/>
-                <w:sz w:val="24"/>
-                <w:szCs w:val="24"/>
-              </w:rPr>
-              <w:t xml:space="preserve"> </w:t>
-            </w:r>
-            <w:r>
-              <w:rPr>
-                <w:rFonts w:ascii="Arial Nova Cond" w:hAnsi="Arial Nova Cond"/>
-                <w:sz w:val="24"/>
-                <w:szCs w:val="24"/>
-              </w:rPr>
-              <w:t>Penggunaan</w:t>
-            </w:r>
-            <w:r>
-              <w:rPr>
-                <w:rFonts w:ascii="Arial Nova Cond" w:hAnsi="Arial Nova Cond"/>
-                <w:sz w:val="24"/>
-                <w:szCs w:val="24"/>
-              </w:rPr>
-              <w:t xml:space="preserve"> Air </w:t>
-            </w:r>
-            <w:r>
-              <w:rPr>
-                <w:rFonts w:ascii="Arial Nova Cond" w:hAnsi="Arial Nova Cond"/>
-                <w:sz w:val="24"/>
-                <w:szCs w:val="24"/>
-              </w:rPr>
-              <w:t>Dalam</w:t>
-            </w:r>
-            <w:r>
-              <w:rPr>
-                <w:rFonts w:ascii="Arial Nova Cond" w:hAnsi="Arial Nova Cond"/>
-                <w:sz w:val="24"/>
-                <w:szCs w:val="24"/>
-              </w:rPr>
-              <w:t xml:space="preserve"> Satu Hari (m3/</w:t>
-            </w:r>
-            <w:r>
-              <w:rPr>
-                <w:rFonts w:ascii="Arial Nova Cond" w:hAnsi="Arial Nova Cond"/>
-                <w:sz w:val="24"/>
-                <w:szCs w:val="24"/>
-              </w:rPr>
-              <w:t>hari</w:t>
-            </w:r>
-            <w:r>
-              <w:rPr>
-                <w:rFonts w:ascii="Arial Nova Cond" w:hAnsi="Arial Nova Cond"/>
-                <w:sz w:val="24"/>
-                <w:szCs w:val="24"/>
-              </w:rPr>
-              <w:t>)</w:t>
+              <w:t>Jumlah Penggunaan Air Dalam Satu Hari (m3/hari)</w:t>
             </w:r>
           </w:p>
         </w:tc>
@@ -3696,23 +2800,7 @@
                 <w:sz w:val="24"/>
                 <w:szCs w:val="24"/>
               </w:rPr>
-              <w:t>Penggunaan</w:t>
-            </w:r>
-            <w:r>
-              <w:rPr>
-                <w:rFonts w:ascii="Arial Nova Cond" w:hAnsi="Arial Nova Cond"/>
-                <w:sz w:val="24"/>
-                <w:szCs w:val="24"/>
-              </w:rPr>
-              <w:t xml:space="preserve"> </w:t>
-            </w:r>
-            <w:r>
-              <w:rPr>
-                <w:rFonts w:ascii="Arial Nova Cond" w:hAnsi="Arial Nova Cond"/>
-                <w:sz w:val="24"/>
-                <w:szCs w:val="24"/>
-              </w:rPr>
-              <w:t>Energi</w:t>
+              <w:t>Penggunaan Energi</w:t>
             </w:r>
           </w:p>
         </w:tc>
@@ -3729,6 +2817,14 @@
                 <w:szCs w:val="24"/>
               </w:rPr>
             </w:pPr>
+            <w:r>
+              <w:rPr>
+                <w:rFonts w:ascii="Arial Nova Cond" w:hAnsi="Arial Nova Cond"/>
+                <w:sz w:val="24"/>
+                <w:szCs w:val="24"/>
+              </w:rPr>
+              <w:t>:</w:t>
+            </w:r>
           </w:p>
         </w:tc>
         <w:tc>
@@ -3751,7 +2847,7 @@
                 <w:sz w:val="24"/>
                 <w:szCs w:val="24"/>
               </w:rPr>
-              <w:t>{jumlah_karyawan_pengunjung}</w:t>
+              <w:t>{penggunaan_energi}</w:t>
             </w:r>
           </w:p>
         </w:tc>
@@ -3799,71 +2895,7 @@
                 <w:sz w:val="24"/>
                 <w:szCs w:val="24"/>
               </w:rPr>
-              <w:t>Jumlah</w:t>
-            </w:r>
-            <w:r>
-              <w:rPr>
-                <w:rFonts w:ascii="Arial Nova Cond" w:hAnsi="Arial Nova Cond"/>
-                <w:sz w:val="24"/>
-                <w:szCs w:val="24"/>
-              </w:rPr>
-              <w:t xml:space="preserve"> </w:t>
-            </w:r>
-            <w:r>
-              <w:rPr>
-                <w:rFonts w:ascii="Arial Nova Cond" w:hAnsi="Arial Nova Cond"/>
-                <w:sz w:val="24"/>
-                <w:szCs w:val="24"/>
-              </w:rPr>
-              <w:t>Pekerja</w:t>
-            </w:r>
-            <w:r>
-              <w:rPr>
-                <w:rFonts w:ascii="Arial Nova Cond" w:hAnsi="Arial Nova Cond"/>
-                <w:sz w:val="24"/>
-                <w:szCs w:val="24"/>
-              </w:rPr>
-              <w:t xml:space="preserve"> </w:t>
-            </w:r>
-            <w:r>
-              <w:rPr>
-                <w:rFonts w:ascii="Arial Nova Cond" w:hAnsi="Arial Nova Cond"/>
-                <w:sz w:val="24"/>
-                <w:szCs w:val="24"/>
-              </w:rPr>
-              <w:t>karyawan</w:t>
-            </w:r>
-            <w:r>
-              <w:rPr>
-                <w:rFonts w:ascii="Arial Nova Cond" w:hAnsi="Arial Nova Cond"/>
-                <w:sz w:val="24"/>
-                <w:szCs w:val="24"/>
-              </w:rPr>
-              <w:t xml:space="preserve"> dan </w:t>
-            </w:r>
-            <w:r>
-              <w:rPr>
-                <w:rFonts w:ascii="Arial Nova Cond" w:hAnsi="Arial Nova Cond"/>
-                <w:sz w:val="24"/>
-                <w:szCs w:val="24"/>
-              </w:rPr>
-              <w:t>pengunjung</w:t>
-            </w:r>
-            <w:r>
-              <w:rPr>
-                <w:rFonts w:ascii="Arial Nova Cond" w:hAnsi="Arial Nova Cond"/>
-                <w:sz w:val="24"/>
-                <w:szCs w:val="24"/>
-              </w:rPr>
-              <w:t xml:space="preserve">/ </w:t>
-            </w:r>
-            <w:r>
-              <w:rPr>
-                <w:rFonts w:ascii="Arial Nova Cond" w:hAnsi="Arial Nova Cond"/>
-                <w:sz w:val="24"/>
-                <w:szCs w:val="24"/>
-              </w:rPr>
-              <w:t>hari</w:t>
+              <w:t>Jumlah Pekerja karyawan dan pengunjung/ hari</w:t>
             </w:r>
           </w:p>
         </w:tc>
@@ -3909,7 +2941,7 @@
                 <w:sz w:val="24"/>
                 <w:szCs w:val="24"/>
               </w:rPr>
-              <w:t>{shift_kerja}</w:t>
+              <w:t>{jumlah_karyawan_pengunjung}</w:t>
             </w:r>
           </w:p>
         </w:tc>
@@ -3957,23 +2989,7 @@
                 <w:sz w:val="24"/>
                 <w:szCs w:val="24"/>
               </w:rPr>
-              <w:t xml:space="preserve">Jam Shift </w:t>
-            </w:r>
-            <w:r>
-              <w:rPr>
-                <w:rFonts w:ascii="Arial Nova Cond" w:hAnsi="Arial Nova Cond"/>
-                <w:sz w:val="24"/>
-                <w:szCs w:val="24"/>
-              </w:rPr>
-              <w:t>Kerja</w:t>
-            </w:r>
-            <w:r>
-              <w:rPr>
-                <w:rFonts w:ascii="Arial Nova Cond" w:hAnsi="Arial Nova Cond"/>
-                <w:sz w:val="24"/>
-                <w:szCs w:val="24"/>
-              </w:rPr>
-              <w:t xml:space="preserve">/Hari </w:t>
+              <w:t xml:space="preserve">Jam Shift Kerja/Hari </w:t>
             </w:r>
           </w:p>
         </w:tc>
@@ -4019,7 +3035,7 @@
                 <w:sz w:val="24"/>
                 <w:szCs w:val="24"/>
               </w:rPr>
-              <w:t>{jam_operasional}</w:t>
+              <w:t>{shift_kerja}</w:t>
             </w:r>
           </w:p>
         </w:tc>
@@ -4067,71 +3083,7 @@
                 <w:sz w:val="24"/>
                 <w:szCs w:val="24"/>
               </w:rPr>
-              <w:t>Jumlah</w:t>
-            </w:r>
-            <w:r>
-              <w:rPr>
-                <w:rFonts w:ascii="Arial Nova Cond" w:hAnsi="Arial Nova Cond"/>
-                <w:sz w:val="24"/>
-                <w:szCs w:val="24"/>
-              </w:rPr>
-              <w:t xml:space="preserve"> </w:t>
-            </w:r>
-            <w:r>
-              <w:rPr>
-                <w:rFonts w:ascii="Arial Nova Cond" w:hAnsi="Arial Nova Cond"/>
-                <w:sz w:val="24"/>
-                <w:szCs w:val="24"/>
-              </w:rPr>
-              <w:t>hari</w:t>
-            </w:r>
-            <w:r>
-              <w:rPr>
-                <w:rFonts w:ascii="Arial Nova Cond" w:hAnsi="Arial Nova Cond"/>
-                <w:sz w:val="24"/>
-                <w:szCs w:val="24"/>
-              </w:rPr>
-              <w:t xml:space="preserve"> </w:t>
-            </w:r>
-            <w:r>
-              <w:rPr>
-                <w:rFonts w:ascii="Arial Nova Cond" w:hAnsi="Arial Nova Cond"/>
-                <w:sz w:val="24"/>
-                <w:szCs w:val="24"/>
-              </w:rPr>
-              <w:t>kerja</w:t>
-            </w:r>
-            <w:r>
-              <w:rPr>
-                <w:rFonts w:ascii="Arial Nova Cond" w:hAnsi="Arial Nova Cond"/>
-                <w:sz w:val="24"/>
-                <w:szCs w:val="24"/>
-              </w:rPr>
-              <w:t xml:space="preserve"> </w:t>
-            </w:r>
-            <w:r>
-              <w:rPr>
-                <w:rFonts w:ascii="Arial Nova Cond" w:hAnsi="Arial Nova Cond"/>
-                <w:sz w:val="24"/>
-                <w:szCs w:val="24"/>
-              </w:rPr>
-              <w:t>dalam</w:t>
-            </w:r>
-            <w:r>
-              <w:rPr>
-                <w:rFonts w:ascii="Arial Nova Cond" w:hAnsi="Arial Nova Cond"/>
-                <w:sz w:val="24"/>
-                <w:szCs w:val="24"/>
-              </w:rPr>
-              <w:t xml:space="preserve"> 1 </w:t>
-            </w:r>
-            <w:r>
-              <w:rPr>
-                <w:rFonts w:ascii="Arial Nova Cond" w:hAnsi="Arial Nova Cond"/>
-                <w:sz w:val="24"/>
-                <w:szCs w:val="24"/>
-              </w:rPr>
-              <w:t>minggu</w:t>
+              <w:t>Jumlah hari kerja dalam 1 minggu</w:t>
             </w:r>
           </w:p>
         </w:tc>
@@ -4225,15 +3177,7 @@
                 <w:sz w:val="24"/>
                 <w:szCs w:val="24"/>
               </w:rPr>
-              <w:t xml:space="preserve">Riwayat </w:t>
-            </w:r>
-            <w:r>
-              <w:rPr>
-                <w:rFonts w:ascii="Arial Nova Cond" w:hAnsi="Arial Nova Cond"/>
-                <w:sz w:val="24"/>
-                <w:szCs w:val="24"/>
-              </w:rPr>
-              <w:t>ketaatan</w:t>
+              <w:t>Riwayat ketaatan</w:t>
             </w:r>
           </w:p>
         </w:tc>
@@ -4327,23 +3271,7 @@
                 <w:sz w:val="24"/>
                 <w:szCs w:val="24"/>
               </w:rPr>
-              <w:t>Inspeksi</w:t>
-            </w:r>
-            <w:r>
-              <w:rPr>
-                <w:rFonts w:ascii="Arial Nova Cond" w:hAnsi="Arial Nova Cond"/>
-                <w:sz w:val="24"/>
-                <w:szCs w:val="24"/>
-              </w:rPr>
-              <w:t xml:space="preserve"> </w:t>
-            </w:r>
-            <w:r>
-              <w:rPr>
-                <w:rFonts w:ascii="Arial Nova Cond" w:hAnsi="Arial Nova Cond"/>
-                <w:sz w:val="24"/>
-                <w:szCs w:val="24"/>
-              </w:rPr>
-              <w:t>Terakhir</w:t>
+              <w:t>Inspeksi Terakhir</w:t>
             </w:r>
           </w:p>
         </w:tc>
@@ -4421,15 +3349,7 @@
           <w:sz w:val="24"/>
           <w:szCs w:val="24"/>
         </w:rPr>
-        <w:t xml:space="preserve">C. Hasil </w:t>
-      </w:r>
-      <w:r>
-        <w:rPr>
-          <w:rFonts w:ascii="Arial Nova Cond" w:hAnsi="Arial Nova Cond"/>
-          <w:sz w:val="24"/>
-          <w:szCs w:val="24"/>
-        </w:rPr>
-        <w:t>Pengawasan</w:t>
+        <w:t>C. Hasil Pengawasan</w:t>
       </w:r>
     </w:p>
     <w:p>
@@ -4448,31 +3368,7 @@
           <w:sz w:val="24"/>
           <w:szCs w:val="24"/>
         </w:rPr>
-        <w:t xml:space="preserve">1.  </w:t>
-      </w:r>
-      <w:r>
-        <w:rPr>
-          <w:rFonts w:ascii="Arial Nova Cond" w:hAnsi="Arial Nova Cond"/>
-          <w:sz w:val="24"/>
-          <w:szCs w:val="24"/>
-        </w:rPr>
-        <w:t>Persetujuan</w:t>
-      </w:r>
-      <w:r>
-        <w:rPr>
-          <w:rFonts w:ascii="Arial Nova Cond" w:hAnsi="Arial Nova Cond"/>
-          <w:sz w:val="24"/>
-          <w:szCs w:val="24"/>
-        </w:rPr>
-        <w:t xml:space="preserve"> </w:t>
-      </w:r>
-      <w:r>
-        <w:rPr>
-          <w:rFonts w:ascii="Arial Nova Cond" w:hAnsi="Arial Nova Cond"/>
-          <w:sz w:val="24"/>
-          <w:szCs w:val="24"/>
-        </w:rPr>
-        <w:t>Lingkungan</w:t>
+        <w:t>1.  Persetujuan Lingkungan</w:t>
       </w:r>
     </w:p>
     <w:p>
@@ -4561,7 +3457,7 @@
           <w:sz w:val="24"/>
           <w:szCs w:val="24"/>
         </w:rPr>
-        <w:t>Pemeriksaan</w:t>
+        <w:t xml:space="preserve">Pemeriksaan </w:t>
       </w:r>
       <w:r>
         <w:rPr>
@@ -4569,7 +3465,7 @@
           <w:sz w:val="24"/>
           <w:szCs w:val="24"/>
         </w:rPr>
-        <w:t xml:space="preserve"> </w:t>
+        <w:t xml:space="preserve">Pengelolaan </w:t>
       </w:r>
       <w:r>
         <w:rPr>
@@ -4577,7 +3473,7 @@
           <w:sz w:val="24"/>
           <w:szCs w:val="24"/>
         </w:rPr>
-        <w:t>Pengelolaan</w:t>
+        <w:t>Air Limbah</w:t>
       </w:r>
       <w:r>
         <w:rPr>
@@ -4585,39 +3481,7 @@
           <w:sz w:val="24"/>
           <w:szCs w:val="24"/>
         </w:rPr>
-        <w:t xml:space="preserve"> </w:t>
-      </w:r>
-      <w:r>
-        <w:rPr>
-          <w:rFonts w:ascii="Arial Nova Cond" w:hAnsi="Arial Nova Cond"/>
-          <w:sz w:val="24"/>
-          <w:szCs w:val="24"/>
-        </w:rPr>
-        <w:t xml:space="preserve">Air </w:t>
-      </w:r>
-      <w:r>
-        <w:rPr>
-          <w:rFonts w:ascii="Arial Nova Cond" w:hAnsi="Arial Nova Cond"/>
-          <w:sz w:val="24"/>
-          <w:szCs w:val="24"/>
-        </w:rPr>
-        <w:t>Limbah</w:t>
-      </w:r>
-      <w:r>
-        <w:rPr>
-          <w:rFonts w:ascii="Arial Nova Cond" w:hAnsi="Arial Nova Cond"/>
-          <w:sz w:val="24"/>
-          <w:szCs w:val="24"/>
-        </w:rPr>
-        <w:t xml:space="preserve"> </w:t>
-      </w:r>
-      <w:r>
-        <w:rPr>
-          <w:rFonts w:ascii="Arial Nova Cond" w:hAnsi="Arial Nova Cond"/>
-          <w:sz w:val="24"/>
-          <w:szCs w:val="24"/>
-        </w:rPr>
-        <w:t>domestik</w:t>
+        <w:t xml:space="preserve"> domestik</w:t>
       </w:r>
     </w:p>
     <w:tbl>
@@ -4684,9 +3548,17 @@
                 <w:sz w:val="24"/>
                 <w:szCs w:val="24"/>
               </w:rPr>
-              <w:t xml:space="preserve">Point </w:t>
-            </w:r>
-            <w:r>
+              <w:t>Point Pemeriksaan</w:t>
+            </w:r>
+          </w:p>
+        </w:tc>
+        <w:tc>
+          <w:tcPr>
+            <w:tcW w:w="4002" w:type="dxa"/>
+          </w:tcPr>
+          <w:p>
+            <w:pPr>
+              <w:jc w:val="center"/>
               <w:rPr>
                 <w:rFonts w:ascii="Arial Nova Cond" w:hAnsi="Arial Nova Cond"/>
                 <w:b/>
@@ -4694,17 +3566,8 @@
                 <w:sz w:val="24"/>
                 <w:szCs w:val="24"/>
               </w:rPr>
-              <w:t>Pemeriksaan</w:t>
-            </w:r>
-          </w:p>
-        </w:tc>
-        <w:tc>
-          <w:tcPr>
-            <w:tcW w:w="4002" w:type="dxa"/>
-          </w:tcPr>
-          <w:p>
-            <w:pPr>
-              <w:jc w:val="center"/>
+            </w:pPr>
+            <w:r>
               <w:rPr>
                 <w:rFonts w:ascii="Arial Nova Cond" w:hAnsi="Arial Nova Cond"/>
                 <w:b/>
@@ -4712,8 +3575,17 @@
                 <w:sz w:val="24"/>
                 <w:szCs w:val="24"/>
               </w:rPr>
-            </w:pPr>
-            <w:r>
+              <w:t>Kondisi Eksisting</w:t>
+            </w:r>
+          </w:p>
+        </w:tc>
+        <w:tc>
+          <w:tcPr>
+            <w:tcW w:w="3154" w:type="dxa"/>
+          </w:tcPr>
+          <w:p>
+            <w:pPr>
+              <w:jc w:val="center"/>
               <w:rPr>
                 <w:rFonts w:ascii="Arial Nova Cond" w:hAnsi="Arial Nova Cond"/>
                 <w:b/>
@@ -4721,8 +3593,7 @@
                 <w:sz w:val="24"/>
                 <w:szCs w:val="24"/>
               </w:rPr>
-              <w:t>Kondisi</w:t>
-            </w:r>
+            </w:pPr>
             <w:r>
               <w:rPr>
                 <w:rFonts w:ascii="Arial Nova Cond" w:hAnsi="Arial Nova Cond"/>
@@ -4731,43 +3602,6 @@
                 <w:sz w:val="24"/>
                 <w:szCs w:val="24"/>
               </w:rPr>
-              <w:t xml:space="preserve"> </w:t>
-            </w:r>
-            <w:r>
-              <w:rPr>
-                <w:rFonts w:ascii="Arial Nova Cond" w:hAnsi="Arial Nova Cond"/>
-                <w:b/>
-                <w:bCs/>
-                <w:sz w:val="24"/>
-                <w:szCs w:val="24"/>
-              </w:rPr>
-              <w:t>Eksisting</w:t>
-            </w:r>
-          </w:p>
-        </w:tc>
-        <w:tc>
-          <w:tcPr>
-            <w:tcW w:w="3154" w:type="dxa"/>
-          </w:tcPr>
-          <w:p>
-            <w:pPr>
-              <w:jc w:val="center"/>
-              <w:rPr>
-                <w:rFonts w:ascii="Arial Nova Cond" w:hAnsi="Arial Nova Cond"/>
-                <w:b/>
-                <w:bCs/>
-                <w:sz w:val="24"/>
-                <w:szCs w:val="24"/>
-              </w:rPr>
-            </w:pPr>
-            <w:r>
-              <w:rPr>
-                <w:rFonts w:ascii="Arial Nova Cond" w:hAnsi="Arial Nova Cond"/>
-                <w:b/>
-                <w:bCs/>
-                <w:sz w:val="24"/>
-                <w:szCs w:val="24"/>
-              </w:rPr>
               <w:t>Keterangan</w:t>
             </w:r>
           </w:p>
@@ -4815,23 +3649,7 @@
                 <w:sz w:val="24"/>
                 <w:szCs w:val="24"/>
               </w:rPr>
-              <w:t>Sumber</w:t>
-            </w:r>
-            <w:r>
-              <w:rPr>
-                <w:rFonts w:ascii="Arial Nova Cond" w:hAnsi="Arial Nova Cond"/>
-                <w:sz w:val="24"/>
-                <w:szCs w:val="24"/>
-              </w:rPr>
-              <w:t xml:space="preserve"> </w:t>
-            </w:r>
-            <w:r>
-              <w:rPr>
-                <w:rFonts w:ascii="Arial Nova Cond" w:hAnsi="Arial Nova Cond"/>
-                <w:sz w:val="24"/>
-                <w:szCs w:val="24"/>
-              </w:rPr>
-              <w:t>limbah</w:t>
+              <w:t>Sumber limbah</w:t>
             </w:r>
           </w:p>
         </w:tc>
@@ -4923,63 +3741,7 @@
                 <w:sz w:val="24"/>
                 <w:szCs w:val="24"/>
               </w:rPr>
-              <w:t>Kondisi</w:t>
-            </w:r>
-            <w:r>
-              <w:rPr>
-                <w:rFonts w:ascii="Arial Nova Cond" w:hAnsi="Arial Nova Cond"/>
-                <w:sz w:val="24"/>
-                <w:szCs w:val="24"/>
-              </w:rPr>
-              <w:t xml:space="preserve"> </w:t>
-            </w:r>
-            <w:r>
-              <w:rPr>
-                <w:rFonts w:ascii="Arial Nova Cond" w:hAnsi="Arial Nova Cond"/>
-                <w:sz w:val="24"/>
-                <w:szCs w:val="24"/>
-              </w:rPr>
-              <w:t>fisik</w:t>
-            </w:r>
-            <w:r>
-              <w:rPr>
-                <w:rFonts w:ascii="Arial Nova Cond" w:hAnsi="Arial Nova Cond"/>
-                <w:sz w:val="24"/>
-                <w:szCs w:val="24"/>
-              </w:rPr>
-              <w:t xml:space="preserve"> </w:t>
-            </w:r>
-            <w:r>
-              <w:rPr>
-                <w:rFonts w:ascii="Arial Nova Cond" w:hAnsi="Arial Nova Cond"/>
-                <w:sz w:val="24"/>
-                <w:szCs w:val="24"/>
-              </w:rPr>
-              <w:t>septictank</w:t>
-            </w:r>
-            <w:r>
-              <w:rPr>
-                <w:rFonts w:ascii="Arial Nova Cond" w:hAnsi="Arial Nova Cond"/>
-                <w:sz w:val="24"/>
-                <w:szCs w:val="24"/>
-              </w:rPr>
-              <w:t xml:space="preserve"> dan </w:t>
-            </w:r>
-            <w:r>
-              <w:rPr>
-                <w:rFonts w:ascii="Arial Nova Cond" w:hAnsi="Arial Nova Cond"/>
-                <w:sz w:val="24"/>
-                <w:szCs w:val="24"/>
-              </w:rPr>
-              <w:t>resapan</w:t>
-            </w:r>
-            <w:r>
-              <w:rPr>
-                <w:rFonts w:ascii="Arial Nova Cond" w:hAnsi="Arial Nova Cond"/>
-                <w:sz w:val="24"/>
-                <w:szCs w:val="24"/>
-              </w:rPr>
-              <w:t xml:space="preserve"> </w:t>
+              <w:t xml:space="preserve">Kondisi fisik septictank dan resapan </w:t>
             </w:r>
           </w:p>
         </w:tc>
@@ -5071,55 +3833,7 @@
                 <w:sz w:val="24"/>
                 <w:szCs w:val="24"/>
               </w:rPr>
-              <w:t xml:space="preserve">Data </w:t>
-            </w:r>
-            <w:r>
-              <w:rPr>
-                <w:rFonts w:ascii="Arial Nova Cond" w:hAnsi="Arial Nova Cond"/>
-                <w:sz w:val="24"/>
-                <w:szCs w:val="24"/>
-              </w:rPr>
-              <w:t>pantau</w:t>
-            </w:r>
-            <w:r>
-              <w:rPr>
-                <w:rFonts w:ascii="Arial Nova Cond" w:hAnsi="Arial Nova Cond"/>
-                <w:sz w:val="24"/>
-                <w:szCs w:val="24"/>
-              </w:rPr>
-              <w:t xml:space="preserve"> </w:t>
-            </w:r>
-            <w:r>
-              <w:rPr>
-                <w:rFonts w:ascii="Arial Nova Cond" w:hAnsi="Arial Nova Cond"/>
-                <w:sz w:val="24"/>
-                <w:szCs w:val="24"/>
-              </w:rPr>
-              <w:t>analisa</w:t>
-            </w:r>
-            <w:r>
-              <w:rPr>
-                <w:rFonts w:ascii="Arial Nova Cond" w:hAnsi="Arial Nova Cond"/>
-                <w:sz w:val="24"/>
-                <w:szCs w:val="24"/>
-              </w:rPr>
-              <w:t xml:space="preserve"> air </w:t>
-            </w:r>
-            <w:r>
-              <w:rPr>
-                <w:rFonts w:ascii="Arial Nova Cond" w:hAnsi="Arial Nova Cond"/>
-                <w:sz w:val="24"/>
-                <w:szCs w:val="24"/>
-              </w:rPr>
-              <w:t>limbah</w:t>
-            </w:r>
-            <w:r>
-              <w:rPr>
-                <w:rFonts w:ascii="Arial Nova Cond" w:hAnsi="Arial Nova Cond"/>
-                <w:sz w:val="24"/>
-                <w:szCs w:val="24"/>
-              </w:rPr>
-              <w:t xml:space="preserve"> domestic</w:t>
+              <w:t>Data pantau analisa air limbah domestic</w:t>
             </w:r>
           </w:p>
         </w:tc>
@@ -5228,23 +3942,7 @@
                 <w:sz w:val="24"/>
                 <w:szCs w:val="24"/>
               </w:rPr>
-              <w:t>Pengelolaan</w:t>
-            </w:r>
-            <w:r>
-              <w:rPr>
-                <w:rFonts w:ascii="Arial Nova Cond" w:hAnsi="Arial Nova Cond"/>
-                <w:sz w:val="24"/>
-                <w:szCs w:val="24"/>
-              </w:rPr>
-              <w:t xml:space="preserve"> sludge </w:t>
-            </w:r>
-            <w:r>
-              <w:rPr>
-                <w:rFonts w:ascii="Arial Nova Cond" w:hAnsi="Arial Nova Cond"/>
-                <w:sz w:val="24"/>
-                <w:szCs w:val="24"/>
-              </w:rPr>
-              <w:t>septictank</w:t>
+              <w:t>Pengelolaan sludge septictank</w:t>
             </w:r>
           </w:p>
         </w:tc>
@@ -5335,15 +4033,7 @@
                 <w:sz w:val="24"/>
                 <w:szCs w:val="24"/>
               </w:rPr>
-              <w:t>Pengelolaan</w:t>
-            </w:r>
-            <w:r>
-              <w:rPr>
-                <w:rFonts w:ascii="Arial Nova Cond" w:hAnsi="Arial Nova Cond"/>
-                <w:sz w:val="24"/>
-                <w:szCs w:val="24"/>
-              </w:rPr>
-              <w:t xml:space="preserve"> IPAL</w:t>
+              <w:t>Pengelolaan IPAL</w:t>
             </w:r>
           </w:p>
         </w:tc>
@@ -5428,103 +4118,7 @@
           <w:sz w:val="24"/>
           <w:szCs w:val="24"/>
         </w:rPr>
-        <w:t xml:space="preserve">.  </w:t>
-      </w:r>
-      <w:r>
-        <w:rPr>
-          <w:rFonts w:ascii="Arial Nova Cond" w:hAnsi="Arial Nova Cond"/>
-          <w:sz w:val="24"/>
-          <w:szCs w:val="24"/>
-        </w:rPr>
-        <w:t>Pemeriksaan</w:t>
-      </w:r>
-      <w:r>
-        <w:rPr>
-          <w:rFonts w:ascii="Arial Nova Cond" w:hAnsi="Arial Nova Cond"/>
-          <w:sz w:val="24"/>
-          <w:szCs w:val="24"/>
-        </w:rPr>
-        <w:t xml:space="preserve"> </w:t>
-      </w:r>
-      <w:r>
-        <w:rPr>
-          <w:rFonts w:ascii="Arial Nova Cond" w:hAnsi="Arial Nova Cond"/>
-          <w:sz w:val="24"/>
-          <w:szCs w:val="24"/>
-        </w:rPr>
-        <w:t>Pengelolaan</w:t>
-      </w:r>
-      <w:r>
-        <w:rPr>
-          <w:rFonts w:ascii="Arial Nova Cond" w:hAnsi="Arial Nova Cond"/>
-          <w:sz w:val="24"/>
-          <w:szCs w:val="24"/>
-        </w:rPr>
-        <w:t xml:space="preserve"> </w:t>
-      </w:r>
-      <w:r>
-        <w:rPr>
-          <w:rFonts w:ascii="Arial Nova Cond" w:hAnsi="Arial Nova Cond"/>
-          <w:sz w:val="24"/>
-          <w:szCs w:val="24"/>
-        </w:rPr>
-        <w:t>Limbah</w:t>
-      </w:r>
-      <w:r>
-        <w:rPr>
-          <w:rFonts w:ascii="Arial Nova Cond" w:hAnsi="Arial Nova Cond"/>
-          <w:sz w:val="24"/>
-          <w:szCs w:val="24"/>
-        </w:rPr>
-        <w:t xml:space="preserve"> </w:t>
-      </w:r>
-      <w:r>
-        <w:rPr>
-          <w:rFonts w:ascii="Arial Nova Cond" w:hAnsi="Arial Nova Cond"/>
-          <w:sz w:val="24"/>
-          <w:szCs w:val="24"/>
-        </w:rPr>
-        <w:t>Bahan</w:t>
-      </w:r>
-      <w:r>
-        <w:rPr>
-          <w:rFonts w:ascii="Arial Nova Cond" w:hAnsi="Arial Nova Cond"/>
-          <w:sz w:val="24"/>
-          <w:szCs w:val="24"/>
-        </w:rPr>
-        <w:t xml:space="preserve"> </w:t>
-      </w:r>
-      <w:r>
-        <w:rPr>
-          <w:rFonts w:ascii="Arial Nova Cond" w:hAnsi="Arial Nova Cond"/>
-          <w:sz w:val="24"/>
-          <w:szCs w:val="24"/>
-        </w:rPr>
-        <w:t>Berbahaya</w:t>
-      </w:r>
-      <w:r>
-        <w:rPr>
-          <w:rFonts w:ascii="Arial Nova Cond" w:hAnsi="Arial Nova Cond"/>
-          <w:sz w:val="24"/>
-          <w:szCs w:val="24"/>
-        </w:rPr>
-        <w:t xml:space="preserve"> dan </w:t>
-      </w:r>
-      <w:r>
-        <w:rPr>
-          <w:rFonts w:ascii="Arial Nova Cond" w:hAnsi="Arial Nova Cond"/>
-          <w:sz w:val="24"/>
-          <w:szCs w:val="24"/>
-        </w:rPr>
-        <w:t>Beracun</w:t>
-      </w:r>
-      <w:r>
-        <w:rPr>
-          <w:rFonts w:ascii="Arial Nova Cond" w:hAnsi="Arial Nova Cond"/>
-          <w:sz w:val="24"/>
-          <w:szCs w:val="24"/>
-        </w:rPr>
-        <w:t xml:space="preserve"> </w:t>
+        <w:t xml:space="preserve">.  Pemeriksaan Pengelolaan Limbah Bahan Berbahaya dan Beracun </w:t>
       </w:r>
       <w:r>
         <w:rPr>
@@ -5599,9 +4193,17 @@
                 <w:sz w:val="24"/>
                 <w:szCs w:val="24"/>
               </w:rPr>
-              <w:t xml:space="preserve">Point </w:t>
-            </w:r>
-            <w:r>
+              <w:t>Point Pemeriksaan</w:t>
+            </w:r>
+          </w:p>
+        </w:tc>
+        <w:tc>
+          <w:tcPr>
+            <w:tcW w:w="3460" w:type="dxa"/>
+          </w:tcPr>
+          <w:p>
+            <w:pPr>
+              <w:jc w:val="center"/>
               <w:rPr>
                 <w:rFonts w:ascii="Arial Nova Cond" w:hAnsi="Arial Nova Cond"/>
                 <w:b/>
@@ -5609,17 +4211,8 @@
                 <w:sz w:val="24"/>
                 <w:szCs w:val="24"/>
               </w:rPr>
-              <w:t>Pemeriksaan</w:t>
-            </w:r>
-          </w:p>
-        </w:tc>
-        <w:tc>
-          <w:tcPr>
-            <w:tcW w:w="3460" w:type="dxa"/>
-          </w:tcPr>
-          <w:p>
-            <w:pPr>
-              <w:jc w:val="center"/>
+            </w:pPr>
+            <w:r>
               <w:rPr>
                 <w:rFonts w:ascii="Arial Nova Cond" w:hAnsi="Arial Nova Cond"/>
                 <w:b/>
@@ -5627,8 +4220,17 @@
                 <w:sz w:val="24"/>
                 <w:szCs w:val="24"/>
               </w:rPr>
-            </w:pPr>
-            <w:r>
+              <w:t>Kondisi Eksisting</w:t>
+            </w:r>
+          </w:p>
+        </w:tc>
+        <w:tc>
+          <w:tcPr>
+            <w:tcW w:w="3694" w:type="dxa"/>
+          </w:tcPr>
+          <w:p>
+            <w:pPr>
+              <w:jc w:val="center"/>
               <w:rPr>
                 <w:rFonts w:ascii="Arial Nova Cond" w:hAnsi="Arial Nova Cond"/>
                 <w:b/>
@@ -5636,8 +4238,7 @@
                 <w:sz w:val="24"/>
                 <w:szCs w:val="24"/>
               </w:rPr>
-              <w:t>Kondisi</w:t>
-            </w:r>
+            </w:pPr>
             <w:r>
               <w:rPr>
                 <w:rFonts w:ascii="Arial Nova Cond" w:hAnsi="Arial Nova Cond"/>
@@ -5646,43 +4247,6 @@
                 <w:sz w:val="24"/>
                 <w:szCs w:val="24"/>
               </w:rPr>
-              <w:t xml:space="preserve"> </w:t>
-            </w:r>
-            <w:r>
-              <w:rPr>
-                <w:rFonts w:ascii="Arial Nova Cond" w:hAnsi="Arial Nova Cond"/>
-                <w:b/>
-                <w:bCs/>
-                <w:sz w:val="24"/>
-                <w:szCs w:val="24"/>
-              </w:rPr>
-              <w:t>Eksisting</w:t>
-            </w:r>
-          </w:p>
-        </w:tc>
-        <w:tc>
-          <w:tcPr>
-            <w:tcW w:w="3694" w:type="dxa"/>
-          </w:tcPr>
-          <w:p>
-            <w:pPr>
-              <w:jc w:val="center"/>
-              <w:rPr>
-                <w:rFonts w:ascii="Arial Nova Cond" w:hAnsi="Arial Nova Cond"/>
-                <w:b/>
-                <w:bCs/>
-                <w:sz w:val="24"/>
-                <w:szCs w:val="24"/>
-              </w:rPr>
-            </w:pPr>
-            <w:r>
-              <w:rPr>
-                <w:rFonts w:ascii="Arial Nova Cond" w:hAnsi="Arial Nova Cond"/>
-                <w:b/>
-                <w:bCs/>
-                <w:sz w:val="24"/>
-                <w:szCs w:val="24"/>
-              </w:rPr>
               <w:t>Keterangan</w:t>
             </w:r>
           </w:p>
@@ -5730,15 +4294,7 @@
                 <w:sz w:val="24"/>
                 <w:szCs w:val="24"/>
               </w:rPr>
-              <w:t>Sumber</w:t>
-            </w:r>
-            <w:r>
-              <w:rPr>
-                <w:rFonts w:ascii="Arial Nova Cond" w:hAnsi="Arial Nova Cond"/>
-                <w:sz w:val="24"/>
-                <w:szCs w:val="24"/>
-              </w:rPr>
-              <w:t xml:space="preserve"> LB3</w:t>
+              <w:t>Sumber LB3</w:t>
             </w:r>
           </w:p>
         </w:tc>
@@ -5830,15 +4386,7 @@
                 <w:sz w:val="24"/>
                 <w:szCs w:val="24"/>
               </w:rPr>
-              <w:t>Jenis</w:t>
-            </w:r>
-            <w:r>
-              <w:rPr>
-                <w:rFonts w:ascii="Arial Nova Cond" w:hAnsi="Arial Nova Cond"/>
-                <w:sz w:val="24"/>
-                <w:szCs w:val="24"/>
-              </w:rPr>
-              <w:t xml:space="preserve"> LB3</w:t>
+              <w:t>Jenis LB3</w:t>
             </w:r>
           </w:p>
         </w:tc>
@@ -5931,15 +4479,7 @@
                 <w:sz w:val="24"/>
                 <w:szCs w:val="24"/>
               </w:rPr>
-              <w:t>Kondisi</w:t>
-            </w:r>
-            <w:r>
-              <w:rPr>
-                <w:rFonts w:ascii="Arial Nova Cond" w:hAnsi="Arial Nova Cond"/>
-                <w:sz w:val="24"/>
-                <w:szCs w:val="24"/>
-              </w:rPr>
-              <w:t xml:space="preserve"> TPS LB3</w:t>
+              <w:t>Kondisi TPS LB3</w:t>
             </w:r>
           </w:p>
         </w:tc>
@@ -6034,15 +4574,7 @@
                 <w:sz w:val="24"/>
                 <w:szCs w:val="24"/>
               </w:rPr>
-              <w:t>Pengelolaan</w:t>
-            </w:r>
-            <w:r>
-              <w:rPr>
-                <w:rFonts w:ascii="Arial Nova Cond" w:hAnsi="Arial Nova Cond"/>
-                <w:sz w:val="24"/>
-                <w:szCs w:val="24"/>
-              </w:rPr>
-              <w:t xml:space="preserve"> LB3 </w:t>
+              <w:t xml:space="preserve">Pengelolaan LB3 </w:t>
             </w:r>
           </w:p>
         </w:tc>
@@ -6127,63 +4659,7 @@
           <w:sz w:val="24"/>
           <w:szCs w:val="24"/>
         </w:rPr>
-        <w:t xml:space="preserve">.  </w:t>
-      </w:r>
-      <w:r>
-        <w:rPr>
-          <w:rFonts w:ascii="Arial Nova Cond" w:hAnsi="Arial Nova Cond"/>
-          <w:sz w:val="24"/>
-          <w:szCs w:val="24"/>
-        </w:rPr>
-        <w:t>Pemeriksaan</w:t>
-      </w:r>
-      <w:r>
-        <w:rPr>
-          <w:rFonts w:ascii="Arial Nova Cond" w:hAnsi="Arial Nova Cond"/>
-          <w:sz w:val="24"/>
-          <w:szCs w:val="24"/>
-        </w:rPr>
-        <w:t xml:space="preserve"> </w:t>
-      </w:r>
-      <w:r>
-        <w:rPr>
-          <w:rFonts w:ascii="Arial Nova Cond" w:hAnsi="Arial Nova Cond"/>
-          <w:sz w:val="24"/>
-          <w:szCs w:val="24"/>
-        </w:rPr>
-        <w:t>Pengelolaan</w:t>
-      </w:r>
-      <w:r>
-        <w:rPr>
-          <w:rFonts w:ascii="Arial Nova Cond" w:hAnsi="Arial Nova Cond"/>
-          <w:sz w:val="24"/>
-          <w:szCs w:val="24"/>
-        </w:rPr>
-        <w:t xml:space="preserve"> </w:t>
-      </w:r>
-      <w:r>
-        <w:rPr>
-          <w:rFonts w:ascii="Arial Nova Cond" w:hAnsi="Arial Nova Cond"/>
-          <w:sz w:val="24"/>
-          <w:szCs w:val="24"/>
-        </w:rPr>
-        <w:t>Sampah</w:t>
-      </w:r>
-      <w:r>
-        <w:rPr>
-          <w:rFonts w:ascii="Arial Nova Cond" w:hAnsi="Arial Nova Cond"/>
-          <w:sz w:val="24"/>
-          <w:szCs w:val="24"/>
-        </w:rPr>
-        <w:t xml:space="preserve"> </w:t>
-      </w:r>
-      <w:r>
-        <w:rPr>
-          <w:rFonts w:ascii="Arial Nova Cond" w:hAnsi="Arial Nova Cond"/>
-          <w:sz w:val="24"/>
-          <w:szCs w:val="24"/>
-        </w:rPr>
-        <w:t>Domestik</w:t>
+        <w:t>.  Pemeriksaan Pengelolaan Sampah Domestik</w:t>
       </w:r>
     </w:p>
     <w:tbl>
@@ -6250,9 +4726,17 @@
                 <w:sz w:val="24"/>
                 <w:szCs w:val="24"/>
               </w:rPr>
-              <w:t xml:space="preserve">Point </w:t>
-            </w:r>
-            <w:r>
+              <w:t>Point Pemeriksaan</w:t>
+            </w:r>
+          </w:p>
+        </w:tc>
+        <w:tc>
+          <w:tcPr>
+            <w:tcW w:w="3757" w:type="dxa"/>
+          </w:tcPr>
+          <w:p>
+            <w:pPr>
+              <w:jc w:val="center"/>
               <w:rPr>
                 <w:rFonts w:ascii="Arial Nova Cond" w:hAnsi="Arial Nova Cond"/>
                 <w:b/>
@@ -6260,17 +4744,8 @@
                 <w:sz w:val="24"/>
                 <w:szCs w:val="24"/>
               </w:rPr>
-              <w:t>Pemeriksaan</w:t>
-            </w:r>
-          </w:p>
-        </w:tc>
-        <w:tc>
-          <w:tcPr>
-            <w:tcW w:w="3757" w:type="dxa"/>
-          </w:tcPr>
-          <w:p>
-            <w:pPr>
-              <w:jc w:val="center"/>
+            </w:pPr>
+            <w:r>
               <w:rPr>
                 <w:rFonts w:ascii="Arial Nova Cond" w:hAnsi="Arial Nova Cond"/>
                 <w:b/>
@@ -6278,8 +4753,17 @@
                 <w:sz w:val="24"/>
                 <w:szCs w:val="24"/>
               </w:rPr>
-            </w:pPr>
-            <w:r>
+              <w:t>Kondisi Eksisting</w:t>
+            </w:r>
+          </w:p>
+        </w:tc>
+        <w:tc>
+          <w:tcPr>
+            <w:tcW w:w="3331" w:type="dxa"/>
+          </w:tcPr>
+          <w:p>
+            <w:pPr>
+              <w:jc w:val="center"/>
               <w:rPr>
                 <w:rFonts w:ascii="Arial Nova Cond" w:hAnsi="Arial Nova Cond"/>
                 <w:b/>
@@ -6287,8 +4771,7 @@
                 <w:sz w:val="24"/>
                 <w:szCs w:val="24"/>
               </w:rPr>
-              <w:t>Kondisi</w:t>
-            </w:r>
+            </w:pPr>
             <w:r>
               <w:rPr>
                 <w:rFonts w:ascii="Arial Nova Cond" w:hAnsi="Arial Nova Cond"/>
@@ -6297,43 +4780,6 @@
                 <w:sz w:val="24"/>
                 <w:szCs w:val="24"/>
               </w:rPr>
-              <w:t xml:space="preserve"> </w:t>
-            </w:r>
-            <w:r>
-              <w:rPr>
-                <w:rFonts w:ascii="Arial Nova Cond" w:hAnsi="Arial Nova Cond"/>
-                <w:b/>
-                <w:bCs/>
-                <w:sz w:val="24"/>
-                <w:szCs w:val="24"/>
-              </w:rPr>
-              <w:t>Eksisting</w:t>
-            </w:r>
-          </w:p>
-        </w:tc>
-        <w:tc>
-          <w:tcPr>
-            <w:tcW w:w="3331" w:type="dxa"/>
-          </w:tcPr>
-          <w:p>
-            <w:pPr>
-              <w:jc w:val="center"/>
-              <w:rPr>
-                <w:rFonts w:ascii="Arial Nova Cond" w:hAnsi="Arial Nova Cond"/>
-                <w:b/>
-                <w:bCs/>
-                <w:sz w:val="24"/>
-                <w:szCs w:val="24"/>
-              </w:rPr>
-            </w:pPr>
-            <w:r>
-              <w:rPr>
-                <w:rFonts w:ascii="Arial Nova Cond" w:hAnsi="Arial Nova Cond"/>
-                <w:b/>
-                <w:bCs/>
-                <w:sz w:val="24"/>
-                <w:szCs w:val="24"/>
-              </w:rPr>
               <w:t>Keterangan</w:t>
             </w:r>
           </w:p>
@@ -6382,39 +4828,7 @@
                 <w:sz w:val="24"/>
                 <w:szCs w:val="24"/>
               </w:rPr>
-              <w:t>Sumber</w:t>
-            </w:r>
-            <w:r>
-              <w:rPr>
-                <w:rFonts w:ascii="Arial Nova Cond" w:hAnsi="Arial Nova Cond"/>
-                <w:sz w:val="24"/>
-                <w:szCs w:val="24"/>
-              </w:rPr>
-              <w:t xml:space="preserve"> </w:t>
-            </w:r>
-            <w:r>
-              <w:rPr>
-                <w:rFonts w:ascii="Arial Nova Cond" w:hAnsi="Arial Nova Cond"/>
-                <w:sz w:val="24"/>
-                <w:szCs w:val="24"/>
-              </w:rPr>
-              <w:t>Sampah</w:t>
-            </w:r>
-            <w:r>
-              <w:rPr>
-                <w:rFonts w:ascii="Arial Nova Cond" w:hAnsi="Arial Nova Cond"/>
-                <w:sz w:val="24"/>
-                <w:szCs w:val="24"/>
-              </w:rPr>
-              <w:t xml:space="preserve"> </w:t>
-            </w:r>
-            <w:r>
-              <w:rPr>
-                <w:rFonts w:ascii="Arial Nova Cond" w:hAnsi="Arial Nova Cond"/>
-                <w:sz w:val="24"/>
-                <w:szCs w:val="24"/>
-              </w:rPr>
-              <w:t>Domestik</w:t>
+              <w:t>Sumber Sampah Domestik</w:t>
             </w:r>
           </w:p>
         </w:tc>
@@ -6506,39 +4920,7 @@
                 <w:sz w:val="24"/>
                 <w:szCs w:val="24"/>
               </w:rPr>
-              <w:t>Jenis</w:t>
-            </w:r>
-            <w:r>
-              <w:rPr>
-                <w:rFonts w:ascii="Arial Nova Cond" w:hAnsi="Arial Nova Cond"/>
-                <w:sz w:val="24"/>
-                <w:szCs w:val="24"/>
-              </w:rPr>
-              <w:t xml:space="preserve"> </w:t>
-            </w:r>
-            <w:r>
-              <w:rPr>
-                <w:rFonts w:ascii="Arial Nova Cond" w:hAnsi="Arial Nova Cond"/>
-                <w:sz w:val="24"/>
-                <w:szCs w:val="24"/>
-              </w:rPr>
-              <w:t>Sampah</w:t>
-            </w:r>
-            <w:r>
-              <w:rPr>
-                <w:rFonts w:ascii="Arial Nova Cond" w:hAnsi="Arial Nova Cond"/>
-                <w:sz w:val="24"/>
-                <w:szCs w:val="24"/>
-              </w:rPr>
-              <w:t xml:space="preserve"> </w:t>
-            </w:r>
-            <w:r>
-              <w:rPr>
-                <w:rFonts w:ascii="Arial Nova Cond" w:hAnsi="Arial Nova Cond"/>
-                <w:sz w:val="24"/>
-                <w:szCs w:val="24"/>
-              </w:rPr>
-              <w:t>Domestik</w:t>
+              <w:t>Jenis Sampah Domestik</w:t>
             </w:r>
           </w:p>
         </w:tc>
@@ -6630,39 +5012,7 @@
                 <w:sz w:val="24"/>
                 <w:szCs w:val="24"/>
               </w:rPr>
-              <w:t>Kondisi</w:t>
-            </w:r>
-            <w:r>
-              <w:rPr>
-                <w:rFonts w:ascii="Arial Nova Cond" w:hAnsi="Arial Nova Cond"/>
-                <w:sz w:val="24"/>
-                <w:szCs w:val="24"/>
-              </w:rPr>
-              <w:t xml:space="preserve"> TPS </w:t>
-            </w:r>
-            <w:r>
-              <w:rPr>
-                <w:rFonts w:ascii="Arial Nova Cond" w:hAnsi="Arial Nova Cond"/>
-                <w:sz w:val="24"/>
-                <w:szCs w:val="24"/>
-              </w:rPr>
-              <w:t>Sampah</w:t>
-            </w:r>
-            <w:r>
-              <w:rPr>
-                <w:rFonts w:ascii="Arial Nova Cond" w:hAnsi="Arial Nova Cond"/>
-                <w:sz w:val="24"/>
-                <w:szCs w:val="24"/>
-              </w:rPr>
-              <w:t xml:space="preserve"> </w:t>
-            </w:r>
-            <w:r>
-              <w:rPr>
-                <w:rFonts w:ascii="Arial Nova Cond" w:hAnsi="Arial Nova Cond"/>
-                <w:sz w:val="24"/>
-                <w:szCs w:val="24"/>
-              </w:rPr>
-              <w:t>Domestik</w:t>
+              <w:t>Kondisi TPS Sampah Domestik</w:t>
             </w:r>
           </w:p>
         </w:tc>
@@ -6754,39 +5104,7 @@
                 <w:sz w:val="24"/>
                 <w:szCs w:val="24"/>
               </w:rPr>
-              <w:t>Pengelolaan</w:t>
-            </w:r>
-            <w:r>
-              <w:rPr>
-                <w:rFonts w:ascii="Arial Nova Cond" w:hAnsi="Arial Nova Cond"/>
-                <w:sz w:val="24"/>
-                <w:szCs w:val="24"/>
-              </w:rPr>
-              <w:t xml:space="preserve"> </w:t>
-            </w:r>
-            <w:r>
-              <w:rPr>
-                <w:rFonts w:ascii="Arial Nova Cond" w:hAnsi="Arial Nova Cond"/>
-                <w:sz w:val="24"/>
-                <w:szCs w:val="24"/>
-              </w:rPr>
-              <w:t>sampah</w:t>
-            </w:r>
-            <w:r>
-              <w:rPr>
-                <w:rFonts w:ascii="Arial Nova Cond" w:hAnsi="Arial Nova Cond"/>
-                <w:sz w:val="24"/>
-                <w:szCs w:val="24"/>
-              </w:rPr>
-              <w:t xml:space="preserve"> </w:t>
-            </w:r>
-            <w:r>
-              <w:rPr>
-                <w:rFonts w:ascii="Arial Nova Cond" w:hAnsi="Arial Nova Cond"/>
-                <w:sz w:val="24"/>
-                <w:szCs w:val="24"/>
-              </w:rPr>
-              <w:t>domestik</w:t>
+              <w:t>Pengelolaan sampah domestik</w:t>
             </w:r>
           </w:p>
         </w:tc>
@@ -7073,15 +5391,7 @@
           <w:sz w:val="24"/>
           <w:szCs w:val="24"/>
         </w:rPr>
-        <w:t xml:space="preserve">6. Saran dan </w:t>
-      </w:r>
-      <w:r>
-        <w:rPr>
-          <w:rFonts w:ascii="Arial Nova Cond" w:hAnsi="Arial Nova Cond"/>
-          <w:sz w:val="24"/>
-          <w:szCs w:val="24"/>
-        </w:rPr>
-        <w:t>Masukan</w:t>
+        <w:t>6. Saran dan Masukan</w:t>
       </w:r>
       <w:r>
         <w:rPr>
@@ -7097,7 +5407,7 @@
           <w:sz w:val="24"/>
           <w:szCs w:val="24"/>
         </w:rPr>
-        <w:t>{#saran} {abjad}. {saran_text} {/saran}</w:t>
+        <w:t>{saran_list_text}</w:t>
       </w:r>
     </w:p>
     <w:p>
@@ -7133,151 +5443,7 @@
           <w:szCs w:val="24"/>
         </w:rPr>
         <w:lastRenderedPageBreak/>
-        <w:t>Pelaksanaan</w:t>
-      </w:r>
-      <w:r>
-        <w:rPr>
-          <w:rFonts w:ascii="Arial Nova Cond" w:hAnsi="Arial Nova Cond"/>
-          <w:sz w:val="24"/>
-          <w:szCs w:val="24"/>
-        </w:rPr>
-        <w:t xml:space="preserve"> dan </w:t>
-      </w:r>
-      <w:r>
-        <w:rPr>
-          <w:rFonts w:ascii="Arial Nova Cond" w:hAnsi="Arial Nova Cond"/>
-          <w:sz w:val="24"/>
-          <w:szCs w:val="24"/>
-        </w:rPr>
-        <w:t>temuan</w:t>
-      </w:r>
-      <w:r>
-        <w:rPr>
-          <w:rFonts w:ascii="Arial Nova Cond" w:hAnsi="Arial Nova Cond"/>
-          <w:sz w:val="24"/>
-          <w:szCs w:val="24"/>
-        </w:rPr>
-        <w:t xml:space="preserve"> </w:t>
-      </w:r>
-      <w:r>
-        <w:rPr>
-          <w:rFonts w:ascii="Arial Nova Cond" w:hAnsi="Arial Nova Cond"/>
-          <w:sz w:val="24"/>
-          <w:szCs w:val="24"/>
-        </w:rPr>
-        <w:t>fakta-fakta</w:t>
-      </w:r>
-      <w:r>
-        <w:rPr>
-          <w:rFonts w:ascii="Arial Nova Cond" w:hAnsi="Arial Nova Cond"/>
-          <w:sz w:val="24"/>
-          <w:szCs w:val="24"/>
-        </w:rPr>
-        <w:t xml:space="preserve"> </w:t>
-      </w:r>
-      <w:r>
-        <w:rPr>
-          <w:rFonts w:ascii="Arial Nova Cond" w:hAnsi="Arial Nova Cond"/>
-          <w:sz w:val="24"/>
-          <w:szCs w:val="24"/>
-        </w:rPr>
-        <w:t>pengawasan</w:t>
-      </w:r>
-      <w:r>
-        <w:rPr>
-          <w:rFonts w:ascii="Arial Nova Cond" w:hAnsi="Arial Nova Cond"/>
-          <w:sz w:val="24"/>
-          <w:szCs w:val="24"/>
-        </w:rPr>
-        <w:t xml:space="preserve"> </w:t>
-      </w:r>
-      <w:r>
-        <w:rPr>
-          <w:rFonts w:ascii="Arial Nova Cond" w:hAnsi="Arial Nova Cond"/>
-          <w:sz w:val="24"/>
-          <w:szCs w:val="24"/>
-        </w:rPr>
-        <w:t>lingkungan</w:t>
-      </w:r>
-      <w:r>
-        <w:rPr>
-          <w:rFonts w:ascii="Arial Nova Cond" w:hAnsi="Arial Nova Cond"/>
-          <w:sz w:val="24"/>
-          <w:szCs w:val="24"/>
-        </w:rPr>
-        <w:t xml:space="preserve"> </w:t>
-      </w:r>
-      <w:r>
-        <w:rPr>
-          <w:rFonts w:ascii="Arial Nova Cond" w:hAnsi="Arial Nova Cond"/>
-          <w:sz w:val="24"/>
-          <w:szCs w:val="24"/>
-        </w:rPr>
-        <w:t>hidup</w:t>
-      </w:r>
-      <w:r>
-        <w:rPr>
-          <w:rFonts w:ascii="Arial Nova Cond" w:hAnsi="Arial Nova Cond"/>
-          <w:sz w:val="24"/>
-          <w:szCs w:val="24"/>
-        </w:rPr>
-        <w:t xml:space="preserve"> </w:t>
-      </w:r>
-      <w:r>
-        <w:rPr>
-          <w:rFonts w:ascii="Arial Nova Cond" w:hAnsi="Arial Nova Cond"/>
-          <w:sz w:val="24"/>
-          <w:szCs w:val="24"/>
-        </w:rPr>
-        <w:t>ini</w:t>
-      </w:r>
-      <w:r>
-        <w:rPr>
-          <w:rFonts w:ascii="Arial Nova Cond" w:hAnsi="Arial Nova Cond"/>
-          <w:sz w:val="24"/>
-          <w:szCs w:val="24"/>
-        </w:rPr>
-        <w:t xml:space="preserve"> </w:t>
-      </w:r>
-      <w:r>
-        <w:rPr>
-          <w:rFonts w:ascii="Arial Nova Cond" w:hAnsi="Arial Nova Cond"/>
-          <w:sz w:val="24"/>
-          <w:szCs w:val="24"/>
-        </w:rPr>
-        <w:t>diketahui</w:t>
-      </w:r>
-      <w:r>
-        <w:rPr>
-          <w:rFonts w:ascii="Arial Nova Cond" w:hAnsi="Arial Nova Cond"/>
-          <w:sz w:val="24"/>
-          <w:szCs w:val="24"/>
-        </w:rPr>
-        <w:t xml:space="preserve"> dan </w:t>
-      </w:r>
-      <w:r>
-        <w:rPr>
-          <w:rFonts w:ascii="Arial Nova Cond" w:hAnsi="Arial Nova Cond"/>
-          <w:sz w:val="24"/>
-          <w:szCs w:val="24"/>
-        </w:rPr>
-        <w:t>dibenarkan</w:t>
-      </w:r>
-      <w:r>
-        <w:rPr>
-          <w:rFonts w:ascii="Arial Nova Cond" w:hAnsi="Arial Nova Cond"/>
-          <w:sz w:val="24"/>
-          <w:szCs w:val="24"/>
-        </w:rPr>
-        <w:t xml:space="preserve"> oleh </w:t>
-      </w:r>
-      <w:r>
-        <w:rPr>
-          <w:rFonts w:ascii="Arial Nova Cond" w:hAnsi="Arial Nova Cond"/>
-          <w:sz w:val="24"/>
-          <w:szCs w:val="24"/>
-        </w:rPr>
-        <w:t>pihak</w:t>
+        <w:t>Pelaksanaan dan temuan fakta-fakta pengawasan lingkungan hidup ini diketahui dan dibenarkan oleh pihak</w:t>
       </w:r>
       <w:r>
         <w:rPr>
@@ -7309,31 +5475,7 @@
           <w:sz w:val="24"/>
           <w:szCs w:val="24"/>
         </w:rPr>
-        <w:t>sebagai</w:t>
-      </w:r>
-      <w:r>
-        <w:rPr>
-          <w:rFonts w:ascii="Arial Nova Cond" w:hAnsi="Arial Nova Cond"/>
-          <w:sz w:val="24"/>
-          <w:szCs w:val="24"/>
-        </w:rPr>
-        <w:t xml:space="preserve"> </w:t>
-      </w:r>
-      <w:r>
-        <w:rPr>
-          <w:rFonts w:ascii="Arial Nova Cond" w:hAnsi="Arial Nova Cond"/>
-          <w:sz w:val="24"/>
-          <w:szCs w:val="24"/>
-        </w:rPr>
-        <w:t>berikut</w:t>
-      </w:r>
-      <w:r>
-        <w:rPr>
-          <w:rFonts w:ascii="Arial Nova Cond" w:hAnsi="Arial Nova Cond"/>
-          <w:sz w:val="24"/>
-          <w:szCs w:val="24"/>
-        </w:rPr>
-        <w:t xml:space="preserve"> :</w:t>
+        <w:t>sebagai berikut :</w:t>
       </w:r>
     </w:p>
     <w:p>
@@ -7574,15 +5716,7 @@
                 <w:sz w:val="24"/>
                 <w:szCs w:val="24"/>
               </w:rPr>
-              <w:t>Nomor</w:t>
-            </w:r>
-            <w:r>
-              <w:rPr>
-                <w:rFonts w:ascii="Arial Nova Cond" w:hAnsi="Arial Nova Cond"/>
-                <w:sz w:val="24"/>
-                <w:szCs w:val="24"/>
-              </w:rPr>
-              <w:t xml:space="preserve"> HP</w:t>
+              <w:t>Nomor HP</w:t>
             </w:r>
           </w:p>
         </w:tc>
@@ -7667,15 +5801,7 @@
                 <w:sz w:val="24"/>
                 <w:szCs w:val="24"/>
               </w:rPr>
-              <w:t xml:space="preserve">Tanda </w:t>
-            </w:r>
-            <w:r>
-              <w:rPr>
-                <w:rFonts w:ascii="Arial Nova Cond" w:hAnsi="Arial Nova Cond"/>
-                <w:sz w:val="24"/>
-                <w:szCs w:val="24"/>
-              </w:rPr>
-              <w:t>tangan</w:t>
+              <w:t>Tanda tangan</w:t>
             </w:r>
           </w:p>
         </w:tc>
@@ -7956,15 +6082,7 @@
                 <w:sz w:val="24"/>
                 <w:szCs w:val="24"/>
               </w:rPr>
-              <w:t>Nomor</w:t>
-            </w:r>
-            <w:r>
-              <w:rPr>
-                <w:rFonts w:ascii="Arial Nova Cond" w:hAnsi="Arial Nova Cond"/>
-                <w:sz w:val="24"/>
-                <w:szCs w:val="24"/>
-              </w:rPr>
-              <w:t xml:space="preserve"> HP</w:t>
+              <w:t>Nomor HP</w:t>
             </w:r>
           </w:p>
         </w:tc>
@@ -8049,15 +6167,7 @@
                 <w:sz w:val="24"/>
                 <w:szCs w:val="24"/>
               </w:rPr>
-              <w:t xml:space="preserve">Tanda </w:t>
-            </w:r>
-            <w:r>
-              <w:rPr>
-                <w:rFonts w:ascii="Arial Nova Cond" w:hAnsi="Arial Nova Cond"/>
-                <w:sz w:val="24"/>
-                <w:szCs w:val="24"/>
-              </w:rPr>
-              <w:t>tangan</w:t>
+              <w:t>Tanda tangan</w:t>
             </w:r>
           </w:p>
         </w:tc>
@@ -8156,124 +6266,7 @@
           <w:sz w:val="24"/>
           <w:szCs w:val="24"/>
         </w:rPr>
-        <w:t>Demikian</w:t>
-      </w:r>
-      <w:r>
-        <w:rPr>
-          <w:rFonts w:ascii="Arial Nova Cond" w:hAnsi="Arial Nova Cond"/>
-          <w:color w:val="0D0D0D"/>
-          <w:sz w:val="24"/>
-          <w:szCs w:val="24"/>
-        </w:rPr>
-        <w:t xml:space="preserve"> </w:t>
-      </w:r>
-      <w:r>
-        <w:rPr>
-          <w:rFonts w:ascii="Arial Nova Cond" w:hAnsi="Arial Nova Cond"/>
-          <w:color w:val="0D0D0D"/>
-          <w:sz w:val="24"/>
-          <w:szCs w:val="24"/>
-        </w:rPr>
-        <w:t>Berita</w:t>
-      </w:r>
-      <w:r>
-        <w:rPr>
-          <w:rFonts w:ascii="Arial Nova Cond" w:hAnsi="Arial Nova Cond"/>
-          <w:color w:val="0D0D0D"/>
-          <w:sz w:val="24"/>
-          <w:szCs w:val="24"/>
-        </w:rPr>
-        <w:t xml:space="preserve"> Acara </w:t>
-      </w:r>
-      <w:r>
-        <w:rPr>
-          <w:rFonts w:ascii="Arial Nova Cond" w:hAnsi="Arial Nova Cond"/>
-          <w:color w:val="0D0D0D"/>
-          <w:sz w:val="24"/>
-          <w:szCs w:val="24"/>
-        </w:rPr>
-        <w:t>Pengawasan</w:t>
-      </w:r>
-      <w:r>
-        <w:rPr>
-          <w:rFonts w:ascii="Arial Nova Cond" w:hAnsi="Arial Nova Cond"/>
-          <w:color w:val="0D0D0D"/>
-          <w:sz w:val="24"/>
-          <w:szCs w:val="24"/>
-        </w:rPr>
-        <w:t xml:space="preserve"> </w:t>
-      </w:r>
-      <w:r>
-        <w:rPr>
-          <w:rFonts w:ascii="Arial Nova Cond" w:hAnsi="Arial Nova Cond"/>
-          <w:color w:val="0D0D0D"/>
-          <w:sz w:val="24"/>
-          <w:szCs w:val="24"/>
-        </w:rPr>
-        <w:t>Lingkungan</w:t>
-      </w:r>
-      <w:r>
-        <w:rPr>
-          <w:rFonts w:ascii="Arial Nova Cond" w:hAnsi="Arial Nova Cond"/>
-          <w:color w:val="0D0D0D"/>
-          <w:sz w:val="24"/>
-          <w:szCs w:val="24"/>
-        </w:rPr>
-        <w:t xml:space="preserve"> </w:t>
-      </w:r>
-      <w:r>
-        <w:rPr>
-          <w:rFonts w:ascii="Arial Nova Cond" w:hAnsi="Arial Nova Cond"/>
-          <w:color w:val="0D0D0D"/>
-          <w:sz w:val="24"/>
-          <w:szCs w:val="24"/>
-        </w:rPr>
-        <w:t>Hidup</w:t>
-      </w:r>
-      <w:r>
-        <w:rPr>
-          <w:rFonts w:ascii="Arial Nova Cond" w:hAnsi="Arial Nova Cond"/>
-          <w:color w:val="0D0D0D"/>
-          <w:sz w:val="24"/>
-          <w:szCs w:val="24"/>
-        </w:rPr>
-        <w:t xml:space="preserve"> pada </w:t>
-      </w:r>
-      <w:r>
-        <w:rPr>
-          <w:rFonts w:ascii="Arial Nova Cond" w:hAnsi="Arial Nova Cond"/>
-          <w:color w:val="0D0D0D"/>
-          <w:sz w:val="24"/>
-          <w:szCs w:val="24"/>
-        </w:rPr>
-        <w:t>lokasi</w:t>
-      </w:r>
-      <w:r>
-        <w:rPr>
-          <w:rFonts w:ascii="Arial Nova Cond" w:hAnsi="Arial Nova Cond"/>
-          <w:color w:val="0D0D0D"/>
-          <w:sz w:val="24"/>
-          <w:szCs w:val="24"/>
-        </w:rPr>
-        <w:t xml:space="preserve"> </w:t>
-      </w:r>
-      <w:r>
-        <w:rPr>
-          <w:rFonts w:ascii="Arial Nova Cond" w:hAnsi="Arial Nova Cond"/>
-          <w:color w:val="0D0D0D"/>
-          <w:sz w:val="24"/>
-          <w:szCs w:val="24"/>
-        </w:rPr>
-        <w:t>kegiatan</w:t>
-      </w:r>
-      <w:r>
-        <w:rPr>
-          <w:rFonts w:ascii="Arial Nova Cond" w:hAnsi="Arial Nova Cond"/>
-          <w:color w:val="0D0D0D"/>
-          <w:sz w:val="24"/>
-          <w:szCs w:val="24"/>
-        </w:rPr>
-        <w:t xml:space="preserve"> </w:t>
+        <w:t xml:space="preserve">Demikian Berita Acara Pengawasan Lingkungan Hidup pada lokasi kegiatan </w:t>
       </w:r>
       <w:r>
         <w:rPr>
@@ -8299,106 +6292,7 @@
           <w:sz w:val="24"/>
           <w:szCs w:val="24"/>
         </w:rPr>
-        <w:t>dibuat</w:t>
-      </w:r>
-      <w:r>
-        <w:rPr>
-          <w:rFonts w:ascii="Arial Nova Cond" w:hAnsi="Arial Nova Cond"/>
-          <w:color w:val="0D0D0D"/>
-          <w:sz w:val="24"/>
-          <w:szCs w:val="24"/>
-        </w:rPr>
-        <w:t xml:space="preserve"> </w:t>
-      </w:r>
-      <w:r>
-        <w:rPr>
-          <w:rFonts w:ascii="Arial Nova Cond" w:hAnsi="Arial Nova Cond"/>
-          <w:color w:val="0D0D0D"/>
-          <w:sz w:val="24"/>
-          <w:szCs w:val="24"/>
-        </w:rPr>
-        <w:t>dengan</w:t>
-      </w:r>
-      <w:r>
-        <w:rPr>
-          <w:rFonts w:ascii="Arial Nova Cond" w:hAnsi="Arial Nova Cond"/>
-          <w:color w:val="0D0D0D"/>
-          <w:sz w:val="24"/>
-          <w:szCs w:val="24"/>
-        </w:rPr>
-        <w:t xml:space="preserve"> </w:t>
-      </w:r>
-      <w:r>
-        <w:rPr>
-          <w:rFonts w:ascii="Arial Nova Cond" w:hAnsi="Arial Nova Cond"/>
-          <w:color w:val="0D0D0D"/>
-          <w:sz w:val="24"/>
-          <w:szCs w:val="24"/>
-        </w:rPr>
-        <w:t>sebenar-benarnya</w:t>
-      </w:r>
-      <w:r>
-        <w:rPr>
-          <w:rFonts w:ascii="Arial Nova Cond" w:hAnsi="Arial Nova Cond"/>
-          <w:color w:val="0D0D0D"/>
-          <w:sz w:val="24"/>
-          <w:szCs w:val="24"/>
-        </w:rPr>
-        <w:t xml:space="preserve"> dan </w:t>
-      </w:r>
-      <w:r>
-        <w:rPr>
-          <w:rFonts w:ascii="Arial Nova Cond" w:hAnsi="Arial Nova Cond"/>
-          <w:color w:val="0D0D0D"/>
-          <w:sz w:val="24"/>
-          <w:szCs w:val="24"/>
-        </w:rPr>
-        <w:t>mengingat</w:t>
-      </w:r>
-      <w:r>
-        <w:rPr>
-          <w:rFonts w:ascii="Arial Nova Cond" w:hAnsi="Arial Nova Cond"/>
-          <w:color w:val="0D0D0D"/>
-          <w:sz w:val="24"/>
-          <w:szCs w:val="24"/>
-        </w:rPr>
-        <w:t xml:space="preserve"> </w:t>
-      </w:r>
-      <w:r>
-        <w:rPr>
-          <w:rFonts w:ascii="Arial Nova Cond" w:hAnsi="Arial Nova Cond"/>
-          <w:color w:val="0D0D0D"/>
-          <w:sz w:val="24"/>
-          <w:szCs w:val="24"/>
-        </w:rPr>
-        <w:t>sumpah</w:t>
-      </w:r>
-      <w:r>
-        <w:rPr>
-          <w:rFonts w:ascii="Arial Nova Cond" w:hAnsi="Arial Nova Cond"/>
-          <w:color w:val="0D0D0D"/>
-          <w:sz w:val="24"/>
-          <w:szCs w:val="24"/>
-        </w:rPr>
-        <w:t xml:space="preserve"> </w:t>
-      </w:r>
-      <w:r>
-        <w:rPr>
-          <w:rFonts w:ascii="Arial Nova Cond" w:hAnsi="Arial Nova Cond"/>
-          <w:color w:val="0D0D0D"/>
-          <w:sz w:val="24"/>
-          <w:szCs w:val="24"/>
-        </w:rPr>
-        <w:t>jabatan</w:t>
-      </w:r>
-      <w:r>
-        <w:rPr>
-          <w:rFonts w:ascii="Arial Nova Cond" w:hAnsi="Arial Nova Cond"/>
-          <w:color w:val="0D0D0D"/>
-          <w:sz w:val="24"/>
-          <w:szCs w:val="24"/>
-        </w:rPr>
-        <w:t>.</w:t>
+        <w:t>dibuat dengan sebenar-benarnya dan mengingat sumpah jabatan.</w:t>
       </w:r>
     </w:p>
     <w:p>
@@ -8435,77 +6329,7 @@
           <w:szCs w:val="24"/>
           <w:lang w:eastAsia="en-ID"/>
         </w:rPr>
-        <w:t xml:space="preserve">Tim </w:t>
-      </w:r>
-      <w:r>
-        <w:rPr>
-          <w:rFonts w:ascii="Arial Nova Cond" w:eastAsia="Times New Roman" w:hAnsi="Arial Nova Cond" w:cs="Times New Roman"/>
-          <w:color w:val="0D0D0D"/>
-          <w:sz w:val="24"/>
-          <w:szCs w:val="24"/>
-          <w:lang w:eastAsia="en-ID"/>
-        </w:rPr>
-        <w:t>Pejabat</w:t>
-      </w:r>
-      <w:r>
-        <w:rPr>
-          <w:rFonts w:ascii="Arial Nova Cond" w:eastAsia="Times New Roman" w:hAnsi="Arial Nova Cond" w:cs="Times New Roman"/>
-          <w:color w:val="0D0D0D"/>
-          <w:sz w:val="24"/>
-          <w:szCs w:val="24"/>
-          <w:lang w:eastAsia="en-ID"/>
-        </w:rPr>
-        <w:t xml:space="preserve"> </w:t>
-      </w:r>
-      <w:r>
-        <w:rPr>
-          <w:rFonts w:ascii="Arial Nova Cond" w:eastAsia="Times New Roman" w:hAnsi="Arial Nova Cond" w:cs="Times New Roman"/>
-          <w:color w:val="0D0D0D"/>
-          <w:sz w:val="24"/>
-          <w:szCs w:val="24"/>
-          <w:lang w:eastAsia="en-ID"/>
-        </w:rPr>
-        <w:t>Pengawas</w:t>
-      </w:r>
-      <w:r>
-        <w:rPr>
-          <w:rFonts w:ascii="Arial Nova Cond" w:eastAsia="Times New Roman" w:hAnsi="Arial Nova Cond" w:cs="Times New Roman"/>
-          <w:color w:val="0D0D0D"/>
-          <w:sz w:val="24"/>
-          <w:szCs w:val="24"/>
-          <w:lang w:eastAsia="en-ID"/>
-        </w:rPr>
-        <w:t xml:space="preserve"> </w:t>
-      </w:r>
-      <w:r>
-        <w:rPr>
-          <w:rFonts w:ascii="Arial Nova Cond" w:eastAsia="Times New Roman" w:hAnsi="Arial Nova Cond" w:cs="Times New Roman"/>
-          <w:color w:val="0D0D0D"/>
-          <w:sz w:val="24"/>
-          <w:szCs w:val="24"/>
-          <w:lang w:eastAsia="en-ID"/>
-        </w:rPr>
-        <w:t>Lingkungan</w:t>
-      </w:r>
-      <w:r>
-        <w:rPr>
-          <w:rFonts w:ascii="Arial Nova Cond" w:eastAsia="Times New Roman" w:hAnsi="Arial Nova Cond" w:cs="Times New Roman"/>
-          <w:color w:val="0D0D0D"/>
-          <w:sz w:val="24"/>
-          <w:szCs w:val="24"/>
-          <w:lang w:eastAsia="en-ID"/>
-        </w:rPr>
-        <w:t xml:space="preserve"> </w:t>
-      </w:r>
-      <w:r>
-        <w:rPr>
-          <w:rFonts w:ascii="Arial Nova Cond" w:eastAsia="Times New Roman" w:hAnsi="Arial Nova Cond" w:cs="Times New Roman"/>
-          <w:color w:val="0D0D0D"/>
-          <w:sz w:val="24"/>
-          <w:szCs w:val="24"/>
-          <w:lang w:eastAsia="en-ID"/>
-        </w:rPr>
-        <w:t>Hidup</w:t>
+        <w:t>Tim Pejabat Pengawas Lingkungan Hidup</w:t>
       </w:r>
     </w:p>
     <w:p>
@@ -8697,27 +6521,7 @@
                 <w:szCs w:val="24"/>
                 <w:lang w:eastAsia="en-ID"/>
               </w:rPr>
-              <w:t xml:space="preserve">Tanda </w:t>
-            </w:r>
-            <w:r>
-              <w:rPr>
-                <w:rFonts w:ascii="Arial Nova Cond" w:eastAsia="Times New Roman" w:hAnsi="Arial Nova Cond" w:cs="Times New Roman"/>
-                <w:color w:val="0D0D0D"/>
-                <w:sz w:val="24"/>
-                <w:szCs w:val="24"/>
-                <w:lang w:eastAsia="en-ID"/>
-              </w:rPr>
-              <w:t>tangan</w:t>
-            </w:r>
-            <w:r>
-              <w:rPr>
-                <w:rFonts w:ascii="Arial Nova Cond" w:eastAsia="Times New Roman" w:hAnsi="Arial Nova Cond" w:cs="Times New Roman"/>
-                <w:color w:val="0D0D0D"/>
-                <w:sz w:val="24"/>
-                <w:szCs w:val="24"/>
-                <w:lang w:eastAsia="en-ID"/>
-              </w:rPr>
-              <w:t xml:space="preserve"> </w:t>
+              <w:t xml:space="preserve">Tanda tangan </w:t>
             </w:r>
           </w:p>
         </w:tc>
@@ -8830,16 +6634,7 @@
           <w:sz w:val="24"/>
           <w:szCs w:val="24"/>
         </w:rPr>
-        <w:t>Saksi</w:t>
-      </w:r>
-      <w:r>
-        <w:rPr>
-          <w:rFonts w:ascii="Arial Nova Cond" w:hAnsi="Arial Nova Cond"/>
-          <w:color w:val="0D0D0D"/>
-          <w:sz w:val="24"/>
-          <w:szCs w:val="24"/>
-        </w:rPr>
-        <w:t xml:space="preserve"> </w:t>
+        <w:t xml:space="preserve">Saksi </w:t>
       </w:r>
     </w:p>
     <w:tbl>
@@ -8857,12 +6652,16 @@
         <w:tblLook w:val="04A0" w:firstRow="1" w:lastRow="0" w:firstColumn="1" w:lastColumn="0" w:noHBand="0" w:noVBand="1"/>
       </w:tblPr>
       <w:tblGrid>
-        <w:gridCol w:w="421"/>
-        <w:gridCol w:w="1808"/>
-        <w:gridCol w:w="283"/>
-        <w:gridCol w:w="7122"/>
+        <w:gridCol w:w="351"/>
+        <w:gridCol w:w="4509"/>
+        <w:gridCol w:w="265"/>
+        <w:gridCol w:w="4509"/>
       </w:tblGrid>
       <w:tr>
+        <w:trPr>
+          <w:gridAfter w:val="2"/>
+          <w:wAfter w:w="7405" w:type="dxa"/>
+        </w:trPr>
         <w:tc>
           <w:tcPr>
             <w:tcW w:w="421" w:type="dxa"/>
@@ -8887,7 +6686,18 @@
                 <w:szCs w:val="24"/>
                 <w:lang w:eastAsia="en-ID"/>
               </w:rPr>
-              <w:t>{#saksi} {no}.</w:t>
+              <w:t xml:space="preserve">{#saksi} </w:t>
+            </w:r>
+            <w:r>
+              <w:rPr>
+                <w:rFonts w:ascii="Arial Nova Cond" w:eastAsia="Times New Roman" w:hAnsi="Arial Nova Cond" w:cs="Times New Roman"/>
+                <w:color w:val="0D0D0D"/>
+                <w:sz w:val="24"/>
+                <w:szCs w:val="24"/>
+                <w:lang w:eastAsia="en-ID"/>
+              </w:rPr>
+              <w:lastRenderedPageBreak/>
+              <w:t>{no}.</w:t>
             </w:r>
           </w:p>
         </w:tc>
@@ -8915,6 +6725,7 @@
                 <w:szCs w:val="24"/>
                 <w:lang w:eastAsia="en-ID"/>
               </w:rPr>
+              <w:lastRenderedPageBreak/>
               <w:t>{nama_saksi}</w:t>
             </w:r>
           </w:p>
@@ -9066,27 +6877,7 @@
                 <w:szCs w:val="24"/>
                 <w:lang w:eastAsia="en-ID"/>
               </w:rPr>
-              <w:t xml:space="preserve">Tanda </w:t>
-            </w:r>
-            <w:r>
-              <w:rPr>
-                <w:rFonts w:ascii="Arial Nova Cond" w:eastAsia="Times New Roman" w:hAnsi="Arial Nova Cond" w:cs="Times New Roman"/>
-                <w:color w:val="0D0D0D"/>
-                <w:sz w:val="24"/>
-                <w:szCs w:val="24"/>
-                <w:lang w:eastAsia="en-ID"/>
-              </w:rPr>
-              <w:t>tangan</w:t>
-            </w:r>
-            <w:r>
-              <w:rPr>
-                <w:rFonts w:ascii="Arial Nova Cond" w:eastAsia="Times New Roman" w:hAnsi="Arial Nova Cond" w:cs="Times New Roman"/>
-                <w:color w:val="0D0D0D"/>
-                <w:sz w:val="24"/>
-                <w:szCs w:val="24"/>
-                <w:lang w:eastAsia="en-ID"/>
-              </w:rPr>
-              <w:t xml:space="preserve"> </w:t>
+              <w:t xml:space="preserve">Tanda tangan </w:t>
             </w:r>
           </w:p>
         </w:tc>
@@ -9282,31 +7073,7 @@
                               <w:sz w:val="20"/>
                               <w:szCs w:val="20"/>
                             </w:rPr>
-                            <w:t>Paraf</w:t>
-                          </w:r>
-                          <w:r>
-                            <w:rPr>
-                              <w:rFonts w:ascii="Arial Nova Cond" w:hAnsi="Arial Nova Cond"/>
-                              <w:sz w:val="20"/>
-                              <w:szCs w:val="20"/>
-                            </w:rPr>
-                            <w:t xml:space="preserve"> Tim </w:t>
-                          </w:r>
-                          <w:r>
-                            <w:rPr>
-                              <w:rFonts w:ascii="Arial Nova Cond" w:hAnsi="Arial Nova Cond"/>
-                              <w:sz w:val="20"/>
-                              <w:szCs w:val="20"/>
-                            </w:rPr>
-                            <w:t>Pengawas</w:t>
-                          </w:r>
-                          <w:r>
-                            <w:rPr>
-                              <w:rFonts w:ascii="Arial Nova Cond" w:hAnsi="Arial Nova Cond"/>
-                              <w:sz w:val="20"/>
-                              <w:szCs w:val="20"/>
-                            </w:rPr>
-                            <w:t xml:space="preserve"> </w:t>
+                            <w:t xml:space="preserve">Paraf Tim Pengawas </w:t>
                           </w:r>
                           <w:r>
                             <w:rPr>
@@ -9472,47 +7239,7 @@
                               <w:sz w:val="20"/>
                               <w:szCs w:val="20"/>
                             </w:rPr>
-                            <w:t>Paraf</w:t>
-                          </w:r>
-                          <w:r>
-                            <w:rPr>
-                              <w:rFonts w:ascii="Arial Nova Cond" w:hAnsi="Arial Nova Cond" w:cs="Arial"/>
-                              <w:sz w:val="20"/>
-                              <w:szCs w:val="20"/>
-                            </w:rPr>
-                            <w:t xml:space="preserve"> </w:t>
-                          </w:r>
-                          <w:r>
-                            <w:rPr>
-                              <w:rFonts w:ascii="Arial Nova Cond" w:hAnsi="Arial Nova Cond" w:cs="Arial"/>
-                              <w:sz w:val="20"/>
-                              <w:szCs w:val="20"/>
-                            </w:rPr>
-                            <w:t>Pihak</w:t>
-                          </w:r>
-                          <w:r>
-                            <w:rPr>
-                              <w:rFonts w:ascii="Arial Nova Cond" w:hAnsi="Arial Nova Cond" w:cs="Arial"/>
-                              <w:sz w:val="20"/>
-                              <w:szCs w:val="20"/>
-                            </w:rPr>
-                            <w:t xml:space="preserve"> Usaha/ </w:t>
-                          </w:r>
-                          <w:r>
-                            <w:rPr>
-                              <w:rFonts w:ascii="Arial Nova Cond" w:hAnsi="Arial Nova Cond" w:cs="Arial"/>
-                              <w:sz w:val="20"/>
-                              <w:szCs w:val="20"/>
-                            </w:rPr>
-                            <w:t>Kegiatan</w:t>
-                          </w:r>
-                          <w:r>
-                            <w:rPr>
-                              <w:rFonts w:ascii="Arial Nova Cond" w:hAnsi="Arial Nova Cond" w:cs="Arial"/>
-                              <w:sz w:val="20"/>
-                              <w:szCs w:val="20"/>
-                            </w:rPr>
-                            <w:t xml:space="preserve"> </w:t>
+                            <w:t xml:space="preserve">Paraf Pihak Usaha/ Kegiatan </w:t>
                           </w:r>
                           <w:r>
                             <w:rPr>

</xml_diff>

<commit_message>
chore: revert docx templates to allow manual editing
</commit_message>
<xml_diff>
--- a/public/templates-bap/bap-fasyankes.docx
+++ b/public/templates-bap/bap-fasyankes.docx
@@ -43,7 +43,7 @@
                 <w:lang w:val="en-US"/>
               </w:rPr>
               <w:drawing>
-                <wp:anchor distT="0" distB="0" distL="114300" distR="114300" simplePos="0" relativeHeight="251658752" behindDoc="0" locked="0" layoutInCell="1" allowOverlap="1" wp14:anchorId="069080DA" wp14:editId="1B71E19E">
+                <wp:anchor distT="0" distB="0" distL="114300" distR="114300" simplePos="0" relativeHeight="251658752" behindDoc="0" locked="0" layoutInCell="1" allowOverlap="1" wp14:anchorId="069080DA" wp14:editId="3A31AD63">
                   <wp:simplePos x="0" y="0"/>
                   <wp:positionH relativeFrom="column">
                     <wp:posOffset>68580</wp:posOffset>
@@ -164,23 +164,107 @@
                 <w:rFonts w:ascii="Arial" w:hAnsi="Arial" w:cs="Arial"/>
                 <w:lang w:val="en-US"/>
               </w:rPr>
-              <w:t>Jl. Ronggowarsito No.18b, Sragen Wetan, Sragen, Jawa Tengah</w:t>
-            </w:r>
-          </w:p>
-          <w:p>
-            <w:pPr>
-              <w:jc w:val="center"/>
+              <w:t xml:space="preserve">Jl. </w:t>
+            </w:r>
+            <w:r>
               <w:rPr>
                 <w:rFonts w:ascii="Arial" w:hAnsi="Arial" w:cs="Arial"/>
                 <w:lang w:val="en-US"/>
               </w:rPr>
-            </w:pPr>
+              <w:t>Ronggowarsito</w:t>
+            </w:r>
             <w:r>
               <w:rPr>
                 <w:rFonts w:ascii="Arial" w:hAnsi="Arial" w:cs="Arial"/>
                 <w:lang w:val="en-US"/>
               </w:rPr>
-              <w:t>Telp. (0271) 891136  Email : dlhsragenkab@gmail.com</w:t>
+              <w:t xml:space="preserve"> No.18b, </w:t>
+            </w:r>
+            <w:r>
+              <w:rPr>
+                <w:rFonts w:ascii="Arial" w:hAnsi="Arial" w:cs="Arial"/>
+                <w:lang w:val="en-US"/>
+              </w:rPr>
+              <w:t>Sragen</w:t>
+            </w:r>
+            <w:r>
+              <w:rPr>
+                <w:rFonts w:ascii="Arial" w:hAnsi="Arial" w:cs="Arial"/>
+                <w:lang w:val="en-US"/>
+              </w:rPr>
+              <w:t xml:space="preserve"> </w:t>
+            </w:r>
+            <w:r>
+              <w:rPr>
+                <w:rFonts w:ascii="Arial" w:hAnsi="Arial" w:cs="Arial"/>
+                <w:lang w:val="en-US"/>
+              </w:rPr>
+              <w:t>Wetan</w:t>
+            </w:r>
+            <w:r>
+              <w:rPr>
+                <w:rFonts w:ascii="Arial" w:hAnsi="Arial" w:cs="Arial"/>
+                <w:lang w:val="en-US"/>
+              </w:rPr>
+              <w:t xml:space="preserve">, </w:t>
+            </w:r>
+            <w:r>
+              <w:rPr>
+                <w:rFonts w:ascii="Arial" w:hAnsi="Arial" w:cs="Arial"/>
+                <w:lang w:val="en-US"/>
+              </w:rPr>
+              <w:t>Sragen</w:t>
+            </w:r>
+            <w:r>
+              <w:rPr>
+                <w:rFonts w:ascii="Arial" w:hAnsi="Arial" w:cs="Arial"/>
+                <w:lang w:val="en-US"/>
+              </w:rPr>
+              <w:t xml:space="preserve">, </w:t>
+            </w:r>
+            <w:r>
+              <w:rPr>
+                <w:rFonts w:ascii="Arial" w:hAnsi="Arial" w:cs="Arial"/>
+                <w:lang w:val="en-US"/>
+              </w:rPr>
+              <w:t>Jawa</w:t>
+            </w:r>
+            <w:r>
+              <w:rPr>
+                <w:rFonts w:ascii="Arial" w:hAnsi="Arial" w:cs="Arial"/>
+                <w:lang w:val="en-US"/>
+              </w:rPr>
+              <w:t xml:space="preserve"> Tengah</w:t>
+            </w:r>
+          </w:p>
+          <w:p>
+            <w:pPr>
+              <w:jc w:val="center"/>
+              <w:rPr>
+                <w:rFonts w:ascii="Arial" w:hAnsi="Arial" w:cs="Arial"/>
+                <w:lang w:val="en-US"/>
+              </w:rPr>
+            </w:pPr>
+            <w:r>
+              <w:rPr>
+                <w:rFonts w:ascii="Arial" w:hAnsi="Arial" w:cs="Arial"/>
+                <w:lang w:val="en-US"/>
+              </w:rPr>
+              <w:t xml:space="preserve">Telp. (0271) </w:t>
+            </w:r>
+            <w:r>
+              <w:rPr>
+                <w:rFonts w:ascii="Arial" w:hAnsi="Arial" w:cs="Arial"/>
+                <w:lang w:val="en-US"/>
+              </w:rPr>
+              <w:t>891136  Email</w:t>
+            </w:r>
+            <w:r>
+              <w:rPr>
+                <w:rFonts w:ascii="Arial" w:hAnsi="Arial" w:cs="Arial"/>
+                <w:lang w:val="en-US"/>
+              </w:rPr>
+              <w:t xml:space="preserve"> : dlhsragenkab@gmail.com</w:t>
             </w:r>
           </w:p>
           <w:p>
@@ -272,7 +356,15 @@
           <w:sz w:val="24"/>
           <w:szCs w:val="24"/>
         </w:rPr>
-        <w:t>Nomor: 600.4/         /BAP/17/</w:t>
+        <w:t>Nomor</w:t>
+      </w:r>
+      <w:r>
+        <w:rPr>
+          <w:rFonts w:ascii="Arial Nova Cond" w:hAnsi="Arial Nova Cond"/>
+          <w:sz w:val="24"/>
+          <w:szCs w:val="24"/>
+        </w:rPr>
+        <w:t>: 600.4/         /BAP/17/</w:t>
       </w:r>
       <w:r>
         <w:rPr>
@@ -309,7 +401,71 @@
           <w:sz w:val="24"/>
           <w:szCs w:val="24"/>
         </w:rPr>
-        <w:t>Pada hari ini {hari_ini_nama}, tanggal {hari_ini_tanggal_terbilang} bulan {hari_ini_bulan}</w:t>
+        <w:t xml:space="preserve">Pada </w:t>
+      </w:r>
+      <w:r>
+        <w:rPr>
+          <w:rFonts w:ascii="Arial Nova Cond" w:hAnsi="Arial Nova Cond"/>
+          <w:sz w:val="24"/>
+          <w:szCs w:val="24"/>
+        </w:rPr>
+        <w:t>hari</w:t>
+      </w:r>
+      <w:r>
+        <w:rPr>
+          <w:rFonts w:ascii="Arial Nova Cond" w:hAnsi="Arial Nova Cond"/>
+          <w:sz w:val="24"/>
+          <w:szCs w:val="24"/>
+        </w:rPr>
+        <w:t xml:space="preserve"> </w:t>
+      </w:r>
+      <w:r>
+        <w:rPr>
+          <w:rFonts w:ascii="Arial Nova Cond" w:hAnsi="Arial Nova Cond"/>
+          <w:sz w:val="24"/>
+          <w:szCs w:val="24"/>
+        </w:rPr>
+        <w:t>ini</w:t>
+      </w:r>
+      <w:r>
+        <w:rPr>
+          <w:rFonts w:ascii="Arial Nova Cond" w:hAnsi="Arial Nova Cond"/>
+          <w:sz w:val="24"/>
+          <w:szCs w:val="24"/>
+        </w:rPr>
+        <w:t xml:space="preserve"> {hari_ini_nama}, </w:t>
+      </w:r>
+      <w:r>
+        <w:rPr>
+          <w:rFonts w:ascii="Arial Nova Cond" w:hAnsi="Arial Nova Cond"/>
+          <w:sz w:val="24"/>
+          <w:szCs w:val="24"/>
+        </w:rPr>
+        <w:t>tanggal</w:t>
+      </w:r>
+      <w:r>
+        <w:rPr>
+          <w:rFonts w:ascii="Arial Nova Cond" w:hAnsi="Arial Nova Cond"/>
+          <w:sz w:val="24"/>
+          <w:szCs w:val="24"/>
+        </w:rPr>
+        <w:t xml:space="preserve"> {hari_ini_tanggal_terbilang} </w:t>
+      </w:r>
+      <w:r>
+        <w:rPr>
+          <w:rFonts w:ascii="Arial Nova Cond" w:hAnsi="Arial Nova Cond"/>
+          <w:sz w:val="24"/>
+          <w:szCs w:val="24"/>
+        </w:rPr>
+        <w:t>bulan</w:t>
+      </w:r>
+      <w:r>
+        <w:rPr>
+          <w:rFonts w:ascii="Arial Nova Cond" w:hAnsi="Arial Nova Cond"/>
+          <w:sz w:val="24"/>
+          <w:szCs w:val="24"/>
+        </w:rPr>
+        <w:t xml:space="preserve"> {hari_ini_bulan}</w:t>
       </w:r>
       <w:r>
         <w:rPr>
@@ -327,7 +483,15 @@
           <w:sz w:val="24"/>
           <w:szCs w:val="24"/>
         </w:rPr>
-        <w:t>tahun {hari_ini_tahun_terbilang}</w:t>
+        <w:t>tahun</w:t>
+      </w:r>
+      <w:r>
+        <w:rPr>
+          <w:rFonts w:ascii="Arial Nova Cond" w:hAnsi="Arial Nova Cond"/>
+          <w:sz w:val="24"/>
+          <w:szCs w:val="24"/>
+        </w:rPr>
+        <w:t xml:space="preserve"> {hari_ini_tahun_terbilang}</w:t>
       </w:r>
       <w:r>
         <w:rPr>
@@ -345,7 +509,223 @@
           <w:sz w:val="24"/>
           <w:szCs w:val="24"/>
         </w:rPr>
-        <w:t>pukul {waktu_pengawasan} WIB, di lokasi {nama_badan_usaha_kegiatan}, {alamat_lokasi}, telah dilakukan penandatanganan berita acara pengawasan lingkungan hidup terhadap {nama_badan_usaha_kegiatan} dengan hasil sebagai berikut:</w:t>
+        <w:t>pukul</w:t>
+      </w:r>
+      <w:r>
+        <w:rPr>
+          <w:rFonts w:ascii="Arial Nova Cond" w:hAnsi="Arial Nova Cond"/>
+          <w:sz w:val="24"/>
+          <w:szCs w:val="24"/>
+        </w:rPr>
+        <w:t xml:space="preserve"> {waktu_pengawasan} WIB, di </w:t>
+      </w:r>
+      <w:r>
+        <w:rPr>
+          <w:rFonts w:ascii="Arial Nova Cond" w:hAnsi="Arial Nova Cond"/>
+          <w:sz w:val="24"/>
+          <w:szCs w:val="24"/>
+        </w:rPr>
+        <w:t>lokasi</w:t>
+      </w:r>
+      <w:r>
+        <w:rPr>
+          <w:rFonts w:ascii="Arial Nova Cond" w:hAnsi="Arial Nova Cond"/>
+          <w:sz w:val="24"/>
+          <w:szCs w:val="24"/>
+        </w:rPr>
+        <w:t xml:space="preserve"> {nama_badan_usaha_kegiatan}, {alamat_lokasi}, </w:t>
+      </w:r>
+      <w:r>
+        <w:rPr>
+          <w:rFonts w:ascii="Arial Nova Cond" w:hAnsi="Arial Nova Cond"/>
+          <w:sz w:val="24"/>
+          <w:szCs w:val="24"/>
+        </w:rPr>
+        <w:t>telah</w:t>
+      </w:r>
+      <w:r>
+        <w:rPr>
+          <w:rFonts w:ascii="Arial Nova Cond" w:hAnsi="Arial Nova Cond"/>
+          <w:sz w:val="24"/>
+          <w:szCs w:val="24"/>
+        </w:rPr>
+        <w:t xml:space="preserve"> </w:t>
+      </w:r>
+      <w:r>
+        <w:rPr>
+          <w:rFonts w:ascii="Arial Nova Cond" w:hAnsi="Arial Nova Cond"/>
+          <w:sz w:val="24"/>
+          <w:szCs w:val="24"/>
+        </w:rPr>
+        <w:t>dilakukan</w:t>
+      </w:r>
+      <w:r>
+        <w:rPr>
+          <w:rFonts w:ascii="Arial Nova Cond" w:hAnsi="Arial Nova Cond"/>
+          <w:sz w:val="24"/>
+          <w:szCs w:val="24"/>
+        </w:rPr>
+        <w:t xml:space="preserve"> </w:t>
+      </w:r>
+      <w:r>
+        <w:rPr>
+          <w:rFonts w:ascii="Arial Nova Cond" w:hAnsi="Arial Nova Cond"/>
+          <w:sz w:val="24"/>
+          <w:szCs w:val="24"/>
+        </w:rPr>
+        <w:t>penandatanganan</w:t>
+      </w:r>
+      <w:r>
+        <w:rPr>
+          <w:rFonts w:ascii="Arial Nova Cond" w:hAnsi="Arial Nova Cond"/>
+          <w:sz w:val="24"/>
+          <w:szCs w:val="24"/>
+        </w:rPr>
+        <w:t xml:space="preserve"> </w:t>
+      </w:r>
+      <w:r>
+        <w:rPr>
+          <w:rFonts w:ascii="Arial Nova Cond" w:hAnsi="Arial Nova Cond"/>
+          <w:sz w:val="24"/>
+          <w:szCs w:val="24"/>
+        </w:rPr>
+        <w:t>berita</w:t>
+      </w:r>
+      <w:r>
+        <w:rPr>
+          <w:rFonts w:ascii="Arial Nova Cond" w:hAnsi="Arial Nova Cond"/>
+          <w:sz w:val="24"/>
+          <w:szCs w:val="24"/>
+        </w:rPr>
+        <w:t xml:space="preserve"> acara </w:t>
+      </w:r>
+      <w:r>
+        <w:rPr>
+          <w:rFonts w:ascii="Arial Nova Cond" w:hAnsi="Arial Nova Cond"/>
+          <w:sz w:val="24"/>
+          <w:szCs w:val="24"/>
+        </w:rPr>
+        <w:t>pengawasan</w:t>
+      </w:r>
+      <w:r>
+        <w:rPr>
+          <w:rFonts w:ascii="Arial Nova Cond" w:hAnsi="Arial Nova Cond"/>
+          <w:sz w:val="24"/>
+          <w:szCs w:val="24"/>
+        </w:rPr>
+        <w:t xml:space="preserve"> </w:t>
+      </w:r>
+      <w:r>
+        <w:rPr>
+          <w:rFonts w:ascii="Arial Nova Cond" w:hAnsi="Arial Nova Cond"/>
+          <w:sz w:val="24"/>
+          <w:szCs w:val="24"/>
+        </w:rPr>
+        <w:t>lingkungan</w:t>
+      </w:r>
+      <w:r>
+        <w:rPr>
+          <w:rFonts w:ascii="Arial Nova Cond" w:hAnsi="Arial Nova Cond"/>
+          <w:sz w:val="24"/>
+          <w:szCs w:val="24"/>
+        </w:rPr>
+        <w:t xml:space="preserve"> </w:t>
+      </w:r>
+      <w:r>
+        <w:rPr>
+          <w:rFonts w:ascii="Arial Nova Cond" w:hAnsi="Arial Nova Cond"/>
+          <w:sz w:val="24"/>
+          <w:szCs w:val="24"/>
+        </w:rPr>
+        <w:t>hidup</w:t>
+      </w:r>
+      <w:r>
+        <w:rPr>
+          <w:rFonts w:ascii="Arial Nova Cond" w:hAnsi="Arial Nova Cond"/>
+          <w:sz w:val="24"/>
+          <w:szCs w:val="24"/>
+        </w:rPr>
+        <w:t xml:space="preserve"> </w:t>
+      </w:r>
+      <w:r>
+        <w:rPr>
+          <w:rFonts w:ascii="Arial Nova Cond" w:hAnsi="Arial Nova Cond"/>
+          <w:sz w:val="24"/>
+          <w:szCs w:val="24"/>
+        </w:rPr>
+        <w:t>terhadap</w:t>
+      </w:r>
+      <w:r>
+        <w:rPr>
+          <w:rFonts w:ascii="Arial Nova Cond" w:hAnsi="Arial Nova Cond"/>
+          <w:sz w:val="24"/>
+          <w:szCs w:val="24"/>
+        </w:rPr>
+        <w:t xml:space="preserve"> {nama_badan_usaha_kegiatan} </w:t>
+      </w:r>
+      <w:r>
+        <w:rPr>
+          <w:rFonts w:ascii="Arial Nova Cond" w:hAnsi="Arial Nova Cond"/>
+          <w:sz w:val="24"/>
+          <w:szCs w:val="24"/>
+        </w:rPr>
+        <w:t>dengan</w:t>
+      </w:r>
+      <w:r>
+        <w:rPr>
+          <w:rFonts w:ascii="Arial Nova Cond" w:hAnsi="Arial Nova Cond"/>
+          <w:sz w:val="24"/>
+          <w:szCs w:val="24"/>
+        </w:rPr>
+        <w:t xml:space="preserve"> </w:t>
+      </w:r>
+      <w:r>
+        <w:rPr>
+          <w:rFonts w:ascii="Arial Nova Cond" w:hAnsi="Arial Nova Cond"/>
+          <w:sz w:val="24"/>
+          <w:szCs w:val="24"/>
+        </w:rPr>
+        <w:t>hasil</w:t>
+      </w:r>
+      <w:r>
+        <w:rPr>
+          <w:rFonts w:ascii="Arial Nova Cond" w:hAnsi="Arial Nova Cond"/>
+          <w:sz w:val="24"/>
+          <w:szCs w:val="24"/>
+        </w:rPr>
+        <w:t xml:space="preserve"> </w:t>
+      </w:r>
+      <w:r>
+        <w:rPr>
+          <w:rFonts w:ascii="Arial Nova Cond" w:hAnsi="Arial Nova Cond"/>
+          <w:sz w:val="24"/>
+          <w:szCs w:val="24"/>
+        </w:rPr>
+        <w:t>sebagai</w:t>
+      </w:r>
+      <w:r>
+        <w:rPr>
+          <w:rFonts w:ascii="Arial Nova Cond" w:hAnsi="Arial Nova Cond"/>
+          <w:sz w:val="24"/>
+          <w:szCs w:val="24"/>
+        </w:rPr>
+        <w:t xml:space="preserve"> </w:t>
+      </w:r>
+      <w:r>
+        <w:rPr>
+          <w:rFonts w:ascii="Arial Nova Cond" w:hAnsi="Arial Nova Cond"/>
+          <w:sz w:val="24"/>
+          <w:szCs w:val="24"/>
+        </w:rPr>
+        <w:t>berikut</w:t>
+      </w:r>
+      <w:r>
+        <w:rPr>
+          <w:rFonts w:ascii="Arial Nova Cond" w:hAnsi="Arial Nova Cond"/>
+          <w:sz w:val="24"/>
+          <w:szCs w:val="24"/>
+        </w:rPr>
+        <w:t>:</w:t>
       </w:r>
     </w:p>
     <w:p>
@@ -375,7 +755,23 @@
           <w:sz w:val="24"/>
           <w:szCs w:val="24"/>
         </w:rPr>
-        <w:t xml:space="preserve">A. Identitas </w:t>
+        <w:t xml:space="preserve">A. </w:t>
+      </w:r>
+      <w:r>
+        <w:rPr>
+          <w:rFonts w:ascii="Arial Nova Cond" w:hAnsi="Arial Nova Cond"/>
+          <w:sz w:val="24"/>
+          <w:szCs w:val="24"/>
+        </w:rPr>
+        <w:t>Identitas</w:t>
+      </w:r>
+      <w:r>
+        <w:rPr>
+          <w:rFonts w:ascii="Arial Nova Cond" w:hAnsi="Arial Nova Cond"/>
+          <w:sz w:val="24"/>
+          <w:szCs w:val="24"/>
+        </w:rPr>
+        <w:t xml:space="preserve"> </w:t>
       </w:r>
       <w:r>
         <w:rPr>
@@ -391,7 +787,47 @@
           <w:sz w:val="24"/>
           <w:szCs w:val="24"/>
         </w:rPr>
-        <w:t xml:space="preserve"> Pengawas Lingkungan Hidup</w:t>
+        <w:t xml:space="preserve"> </w:t>
+      </w:r>
+      <w:r>
+        <w:rPr>
+          <w:rFonts w:ascii="Arial Nova Cond" w:hAnsi="Arial Nova Cond"/>
+          <w:sz w:val="24"/>
+          <w:szCs w:val="24"/>
+        </w:rPr>
+        <w:t>Pengawas</w:t>
+      </w:r>
+      <w:r>
+        <w:rPr>
+          <w:rFonts w:ascii="Arial Nova Cond" w:hAnsi="Arial Nova Cond"/>
+          <w:sz w:val="24"/>
+          <w:szCs w:val="24"/>
+        </w:rPr>
+        <w:t xml:space="preserve"> </w:t>
+      </w:r>
+      <w:r>
+        <w:rPr>
+          <w:rFonts w:ascii="Arial Nova Cond" w:hAnsi="Arial Nova Cond"/>
+          <w:sz w:val="24"/>
+          <w:szCs w:val="24"/>
+        </w:rPr>
+        <w:t>Lingkungan</w:t>
+      </w:r>
+      <w:r>
+        <w:rPr>
+          <w:rFonts w:ascii="Arial Nova Cond" w:hAnsi="Arial Nova Cond"/>
+          <w:sz w:val="24"/>
+          <w:szCs w:val="24"/>
+        </w:rPr>
+        <w:t xml:space="preserve"> </w:t>
+      </w:r>
+      <w:r>
+        <w:rPr>
+          <w:rFonts w:ascii="Arial Nova Cond" w:hAnsi="Arial Nova Cond"/>
+          <w:sz w:val="24"/>
+          <w:szCs w:val="24"/>
+        </w:rPr>
+        <w:t>Hidup</w:t>
       </w:r>
       <w:r>
         <w:rPr>
@@ -515,7 +951,15 @@
                 <w:sz w:val="24"/>
                 <w:szCs w:val="24"/>
               </w:rPr>
-              <w:t xml:space="preserve">Instansi </w:t>
+              <w:t>Instansi</w:t>
+            </w:r>
+            <w:r>
+              <w:rPr>
+                <w:rFonts w:ascii="Arial Nova Cond" w:hAnsi="Arial Nova Cond"/>
+                <w:sz w:val="24"/>
+                <w:szCs w:val="24"/>
+              </w:rPr>
+              <w:t xml:space="preserve"> </w:t>
             </w:r>
           </w:p>
         </w:tc>
@@ -705,7 +1149,63 @@
                 <w:sz w:val="24"/>
                 <w:szCs w:val="24"/>
               </w:rPr>
-              <w:t>Dinas Lingkungan Hidup Kabupaten Sragen</w:t>
+              <w:t xml:space="preserve">Dinas </w:t>
+            </w:r>
+            <w:r>
+              <w:rPr>
+                <w:rFonts w:ascii="Arial Nova Cond" w:hAnsi="Arial Nova Cond"/>
+                <w:sz w:val="24"/>
+                <w:szCs w:val="24"/>
+              </w:rPr>
+              <w:t>Lingkungan</w:t>
+            </w:r>
+            <w:r>
+              <w:rPr>
+                <w:rFonts w:ascii="Arial Nova Cond" w:hAnsi="Arial Nova Cond"/>
+                <w:sz w:val="24"/>
+                <w:szCs w:val="24"/>
+              </w:rPr>
+              <w:t xml:space="preserve"> </w:t>
+            </w:r>
+            <w:r>
+              <w:rPr>
+                <w:rFonts w:ascii="Arial Nova Cond" w:hAnsi="Arial Nova Cond"/>
+                <w:sz w:val="24"/>
+                <w:szCs w:val="24"/>
+              </w:rPr>
+              <w:t>Hidup</w:t>
+            </w:r>
+            <w:r>
+              <w:rPr>
+                <w:rFonts w:ascii="Arial Nova Cond" w:hAnsi="Arial Nova Cond"/>
+                <w:sz w:val="24"/>
+                <w:szCs w:val="24"/>
+              </w:rPr>
+              <w:t xml:space="preserve"> </w:t>
+            </w:r>
+            <w:r>
+              <w:rPr>
+                <w:rFonts w:ascii="Arial Nova Cond" w:hAnsi="Arial Nova Cond"/>
+                <w:sz w:val="24"/>
+                <w:szCs w:val="24"/>
+              </w:rPr>
+              <w:t>Kabupaten</w:t>
+            </w:r>
+            <w:r>
+              <w:rPr>
+                <w:rFonts w:ascii="Arial Nova Cond" w:hAnsi="Arial Nova Cond"/>
+                <w:sz w:val="24"/>
+                <w:szCs w:val="24"/>
+              </w:rPr>
+              <w:t xml:space="preserve"> </w:t>
+            </w:r>
+            <w:r>
+              <w:rPr>
+                <w:rFonts w:ascii="Arial Nova Cond" w:hAnsi="Arial Nova Cond"/>
+                <w:sz w:val="24"/>
+                <w:szCs w:val="24"/>
+              </w:rPr>
+              <w:t>Sragen</w:t>
             </w:r>
           </w:p>
           <w:p>
@@ -1049,7 +1549,23 @@
                 <w:sz w:val="24"/>
                 <w:szCs w:val="24"/>
               </w:rPr>
-              <w:t>Tahun beroperasi</w:t>
+              <w:t>Tahun</w:t>
+            </w:r>
+            <w:r>
+              <w:rPr>
+                <w:rFonts w:ascii="Arial Nova Cond" w:hAnsi="Arial Nova Cond"/>
+                <w:sz w:val="24"/>
+                <w:szCs w:val="24"/>
+              </w:rPr>
+              <w:t xml:space="preserve"> </w:t>
+            </w:r>
+            <w:r>
+              <w:rPr>
+                <w:rFonts w:ascii="Arial Nova Cond" w:hAnsi="Arial Nova Cond"/>
+                <w:sz w:val="24"/>
+                <w:szCs w:val="24"/>
+              </w:rPr>
+              <w:t>beroperasi</w:t>
             </w:r>
           </w:p>
         </w:tc>
@@ -1143,7 +1659,15 @@
                 <w:sz w:val="24"/>
                 <w:szCs w:val="24"/>
               </w:rPr>
-              <w:t>Status permodalan</w:t>
+              <w:t xml:space="preserve">Status </w:t>
+            </w:r>
+            <w:r>
+              <w:rPr>
+                <w:rFonts w:ascii="Arial Nova Cond" w:hAnsi="Arial Nova Cond"/>
+                <w:sz w:val="24"/>
+                <w:szCs w:val="24"/>
+              </w:rPr>
+              <w:t>permodalan</w:t>
             </w:r>
           </w:p>
         </w:tc>
@@ -1237,7 +1761,63 @@
                 <w:sz w:val="24"/>
                 <w:szCs w:val="24"/>
               </w:rPr>
-              <w:t>Nama penanggung jawab Usaha dan/atau Kegiatan</w:t>
+              <w:t xml:space="preserve">Nama </w:t>
+            </w:r>
+            <w:r>
+              <w:rPr>
+                <w:rFonts w:ascii="Arial Nova Cond" w:hAnsi="Arial Nova Cond"/>
+                <w:sz w:val="24"/>
+                <w:szCs w:val="24"/>
+              </w:rPr>
+              <w:t>penanggung</w:t>
+            </w:r>
+            <w:r>
+              <w:rPr>
+                <w:rFonts w:ascii="Arial Nova Cond" w:hAnsi="Arial Nova Cond"/>
+                <w:sz w:val="24"/>
+                <w:szCs w:val="24"/>
+              </w:rPr>
+              <w:t xml:space="preserve"> </w:t>
+            </w:r>
+            <w:r>
+              <w:rPr>
+                <w:rFonts w:ascii="Arial Nova Cond" w:hAnsi="Arial Nova Cond"/>
+                <w:sz w:val="24"/>
+                <w:szCs w:val="24"/>
+              </w:rPr>
+              <w:t>jawab</w:t>
+            </w:r>
+            <w:r>
+              <w:rPr>
+                <w:rFonts w:ascii="Arial Nova Cond" w:hAnsi="Arial Nova Cond"/>
+                <w:sz w:val="24"/>
+                <w:szCs w:val="24"/>
+              </w:rPr>
+              <w:t xml:space="preserve"> Usaha dan/</w:t>
+            </w:r>
+            <w:r>
+              <w:rPr>
+                <w:rFonts w:ascii="Arial Nova Cond" w:hAnsi="Arial Nova Cond"/>
+                <w:sz w:val="24"/>
+                <w:szCs w:val="24"/>
+              </w:rPr>
+              <w:t>atau</w:t>
+            </w:r>
+            <w:r>
+              <w:rPr>
+                <w:rFonts w:ascii="Arial Nova Cond" w:hAnsi="Arial Nova Cond"/>
+                <w:sz w:val="24"/>
+                <w:szCs w:val="24"/>
+              </w:rPr>
+              <w:t xml:space="preserve"> </w:t>
+            </w:r>
+            <w:r>
+              <w:rPr>
+                <w:rFonts w:ascii="Arial Nova Cond" w:hAnsi="Arial Nova Cond"/>
+                <w:sz w:val="24"/>
+                <w:szCs w:val="24"/>
+              </w:rPr>
+              <w:t>Kegiatan</w:t>
             </w:r>
           </w:p>
         </w:tc>
@@ -1331,7 +1911,71 @@
                 <w:sz w:val="24"/>
                 <w:szCs w:val="24"/>
               </w:rPr>
-              <w:t>Jabatan penanggung jawab Usaha dan/atau Kegiatan</w:t>
+              <w:t>Jabatan</w:t>
+            </w:r>
+            <w:r>
+              <w:rPr>
+                <w:rFonts w:ascii="Arial Nova Cond" w:hAnsi="Arial Nova Cond"/>
+                <w:sz w:val="24"/>
+                <w:szCs w:val="24"/>
+              </w:rPr>
+              <w:t xml:space="preserve"> </w:t>
+            </w:r>
+            <w:r>
+              <w:rPr>
+                <w:rFonts w:ascii="Arial Nova Cond" w:hAnsi="Arial Nova Cond"/>
+                <w:sz w:val="24"/>
+                <w:szCs w:val="24"/>
+              </w:rPr>
+              <w:t>penanggung</w:t>
+            </w:r>
+            <w:r>
+              <w:rPr>
+                <w:rFonts w:ascii="Arial Nova Cond" w:hAnsi="Arial Nova Cond"/>
+                <w:sz w:val="24"/>
+                <w:szCs w:val="24"/>
+              </w:rPr>
+              <w:t xml:space="preserve"> </w:t>
+            </w:r>
+            <w:r>
+              <w:rPr>
+                <w:rFonts w:ascii="Arial Nova Cond" w:hAnsi="Arial Nova Cond"/>
+                <w:sz w:val="24"/>
+                <w:szCs w:val="24"/>
+              </w:rPr>
+              <w:t>jawab</w:t>
+            </w:r>
+            <w:r>
+              <w:rPr>
+                <w:rFonts w:ascii="Arial Nova Cond" w:hAnsi="Arial Nova Cond"/>
+                <w:sz w:val="24"/>
+                <w:szCs w:val="24"/>
+              </w:rPr>
+              <w:t xml:space="preserve"> Usaha dan/</w:t>
+            </w:r>
+            <w:r>
+              <w:rPr>
+                <w:rFonts w:ascii="Arial Nova Cond" w:hAnsi="Arial Nova Cond"/>
+                <w:sz w:val="24"/>
+                <w:szCs w:val="24"/>
+              </w:rPr>
+              <w:t>atau</w:t>
+            </w:r>
+            <w:r>
+              <w:rPr>
+                <w:rFonts w:ascii="Arial Nova Cond" w:hAnsi="Arial Nova Cond"/>
+                <w:sz w:val="24"/>
+                <w:szCs w:val="24"/>
+              </w:rPr>
+              <w:t xml:space="preserve"> </w:t>
+            </w:r>
+            <w:r>
+              <w:rPr>
+                <w:rFonts w:ascii="Arial Nova Cond" w:hAnsi="Arial Nova Cond"/>
+                <w:sz w:val="24"/>
+                <w:szCs w:val="24"/>
+              </w:rPr>
+              <w:t>Kegiatan</w:t>
             </w:r>
           </w:p>
         </w:tc>
@@ -1521,7 +2165,23 @@
                 <w:sz w:val="24"/>
                 <w:szCs w:val="24"/>
               </w:rPr>
-              <w:t>Nomor telepon</w:t>
+              <w:t>Nomor</w:t>
+            </w:r>
+            <w:r>
+              <w:rPr>
+                <w:rFonts w:ascii="Arial Nova Cond" w:hAnsi="Arial Nova Cond"/>
+                <w:sz w:val="24"/>
+                <w:szCs w:val="24"/>
+              </w:rPr>
+              <w:t xml:space="preserve"> </w:t>
+            </w:r>
+            <w:r>
+              <w:rPr>
+                <w:rFonts w:ascii="Arial Nova Cond" w:hAnsi="Arial Nova Cond"/>
+                <w:sz w:val="24"/>
+                <w:szCs w:val="24"/>
+              </w:rPr>
+              <w:t>telepon</w:t>
             </w:r>
           </w:p>
         </w:tc>
@@ -1619,7 +2279,55 @@
                 <w:sz w:val="24"/>
                 <w:szCs w:val="24"/>
               </w:rPr>
-              <w:t>Koordinat lokasi Usaha dan/atau Kegiatan</w:t>
+              <w:t>Koordinat</w:t>
+            </w:r>
+            <w:r>
+              <w:rPr>
+                <w:rFonts w:ascii="Arial Nova Cond" w:hAnsi="Arial Nova Cond"/>
+                <w:sz w:val="24"/>
+                <w:szCs w:val="24"/>
+              </w:rPr>
+              <w:t xml:space="preserve"> </w:t>
+            </w:r>
+            <w:r>
+              <w:rPr>
+                <w:rFonts w:ascii="Arial Nova Cond" w:hAnsi="Arial Nova Cond"/>
+                <w:sz w:val="24"/>
+                <w:szCs w:val="24"/>
+              </w:rPr>
+              <w:t>lokasi</w:t>
+            </w:r>
+            <w:r>
+              <w:rPr>
+                <w:rFonts w:ascii="Arial Nova Cond" w:hAnsi="Arial Nova Cond"/>
+                <w:sz w:val="24"/>
+                <w:szCs w:val="24"/>
+              </w:rPr>
+              <w:t xml:space="preserve"> Usaha dan/</w:t>
+            </w:r>
+            <w:r>
+              <w:rPr>
+                <w:rFonts w:ascii="Arial Nova Cond" w:hAnsi="Arial Nova Cond"/>
+                <w:sz w:val="24"/>
+                <w:szCs w:val="24"/>
+              </w:rPr>
+              <w:t>atau</w:t>
+            </w:r>
+            <w:r>
+              <w:rPr>
+                <w:rFonts w:ascii="Arial Nova Cond" w:hAnsi="Arial Nova Cond"/>
+                <w:sz w:val="24"/>
+                <w:szCs w:val="24"/>
+              </w:rPr>
+              <w:t xml:space="preserve"> </w:t>
+            </w:r>
+            <w:r>
+              <w:rPr>
+                <w:rFonts w:ascii="Arial Nova Cond" w:hAnsi="Arial Nova Cond"/>
+                <w:sz w:val="24"/>
+                <w:szCs w:val="24"/>
+              </w:rPr>
+              <w:t>Kegiatan</w:t>
             </w:r>
           </w:p>
           <w:p>
@@ -1776,7 +2484,16 @@
                 <w:szCs w:val="24"/>
                 <w:lang w:val="en-US"/>
               </w:rPr>
-              <w:t xml:space="preserve">Utara : </w:t>
+              <w:t>Utara :</w:t>
+            </w:r>
+            <w:r>
+              <w:rPr>
+                <w:rFonts w:ascii="Arial Nova Cond" w:hAnsi="Arial Nova Cond"/>
+                <w:sz w:val="24"/>
+                <w:szCs w:val="24"/>
+                <w:lang w:val="en-US"/>
+              </w:rPr>
+              <w:t xml:space="preserve"> </w:t>
             </w:r>
             <w:r>
               <w:rPr>
@@ -1804,7 +2521,16 @@
                 <w:szCs w:val="24"/>
                 <w:lang w:val="en-US"/>
               </w:rPr>
-              <w:t xml:space="preserve">Timur : </w:t>
+              <w:t>Timur :</w:t>
+            </w:r>
+            <w:r>
+              <w:rPr>
+                <w:rFonts w:ascii="Arial Nova Cond" w:hAnsi="Arial Nova Cond"/>
+                <w:sz w:val="24"/>
+                <w:szCs w:val="24"/>
+                <w:lang w:val="en-US"/>
+              </w:rPr>
+              <w:t xml:space="preserve"> </w:t>
             </w:r>
             <w:r>
               <w:rPr>
@@ -1832,7 +2558,16 @@
                 <w:szCs w:val="24"/>
                 <w:lang w:val="en-US"/>
               </w:rPr>
-              <w:t xml:space="preserve">Selatan : </w:t>
+              <w:t>Selatan :</w:t>
+            </w:r>
+            <w:r>
+              <w:rPr>
+                <w:rFonts w:ascii="Arial Nova Cond" w:hAnsi="Arial Nova Cond"/>
+                <w:sz w:val="24"/>
+                <w:szCs w:val="24"/>
+                <w:lang w:val="en-US"/>
+              </w:rPr>
+              <w:t xml:space="preserve"> </w:t>
             </w:r>
             <w:r>
               <w:rPr>
@@ -1860,7 +2595,16 @@
                 <w:szCs w:val="24"/>
                 <w:lang w:val="en-US"/>
               </w:rPr>
-              <w:t xml:space="preserve">Barat : </w:t>
+              <w:t>Barat :</w:t>
+            </w:r>
+            <w:r>
+              <w:rPr>
+                <w:rFonts w:ascii="Arial Nova Cond" w:hAnsi="Arial Nova Cond"/>
+                <w:sz w:val="24"/>
+                <w:szCs w:val="24"/>
+                <w:lang w:val="en-US"/>
+              </w:rPr>
+              <w:t xml:space="preserve"> </w:t>
             </w:r>
             <w:r>
               <w:rPr>
@@ -2004,7 +2748,7 @@
                 <w:sz w:val="24"/>
                 <w:szCs w:val="24"/>
               </w:rPr>
-              <w:t>{luas_lahan}</w:t>
+              <w:t>{luas_lahan} </w:t>
             </w:r>
             <w:r>
               <w:rPr>
@@ -2233,7 +2977,23 @@
                 <w:sz w:val="24"/>
                 <w:szCs w:val="24"/>
               </w:rPr>
-              <w:t>Dokumen yang dimiliki</w:t>
+              <w:t>Dokumen</w:t>
+            </w:r>
+            <w:r>
+              <w:rPr>
+                <w:rFonts w:ascii="Arial Nova Cond" w:hAnsi="Arial Nova Cond"/>
+                <w:sz w:val="24"/>
+                <w:szCs w:val="24"/>
+              </w:rPr>
+              <w:t xml:space="preserve"> yang </w:t>
+            </w:r>
+            <w:r>
+              <w:rPr>
+                <w:rFonts w:ascii="Arial Nova Cond" w:hAnsi="Arial Nova Cond"/>
+                <w:sz w:val="24"/>
+                <w:szCs w:val="24"/>
+              </w:rPr>
+              <w:t>dimiliki</w:t>
             </w:r>
           </w:p>
         </w:tc>
@@ -2327,7 +3087,23 @@
                 <w:sz w:val="24"/>
                 <w:szCs w:val="24"/>
               </w:rPr>
-              <w:t>Persetujuan Lingkungan</w:t>
+              <w:t>Persetujuan</w:t>
+            </w:r>
+            <w:r>
+              <w:rPr>
+                <w:rFonts w:ascii="Arial Nova Cond" w:hAnsi="Arial Nova Cond"/>
+                <w:sz w:val="24"/>
+                <w:szCs w:val="24"/>
+              </w:rPr>
+              <w:t xml:space="preserve"> </w:t>
+            </w:r>
+            <w:r>
+              <w:rPr>
+                <w:rFonts w:ascii="Arial Nova Cond" w:hAnsi="Arial Nova Cond"/>
+                <w:sz w:val="24"/>
+                <w:szCs w:val="24"/>
+              </w:rPr>
+              <w:t>Lingkungan</w:t>
             </w:r>
           </w:p>
         </w:tc>
@@ -2422,7 +3198,55 @@
                 <w:sz w:val="24"/>
                 <w:szCs w:val="24"/>
               </w:rPr>
-              <w:t>Teknologi pengelolaan Pembuangan Air Limbah</w:t>
+              <w:t>Teknologi</w:t>
+            </w:r>
+            <w:r>
+              <w:rPr>
+                <w:rFonts w:ascii="Arial Nova Cond" w:hAnsi="Arial Nova Cond"/>
+                <w:sz w:val="24"/>
+                <w:szCs w:val="24"/>
+              </w:rPr>
+              <w:t xml:space="preserve"> </w:t>
+            </w:r>
+            <w:r>
+              <w:rPr>
+                <w:rFonts w:ascii="Arial Nova Cond" w:hAnsi="Arial Nova Cond"/>
+                <w:sz w:val="24"/>
+                <w:szCs w:val="24"/>
+              </w:rPr>
+              <w:t>pengelolaan</w:t>
+            </w:r>
+            <w:r>
+              <w:rPr>
+                <w:rFonts w:ascii="Arial Nova Cond" w:hAnsi="Arial Nova Cond"/>
+                <w:sz w:val="24"/>
+                <w:szCs w:val="24"/>
+              </w:rPr>
+              <w:t xml:space="preserve"> </w:t>
+            </w:r>
+            <w:r>
+              <w:rPr>
+                <w:rFonts w:ascii="Arial Nova Cond" w:hAnsi="Arial Nova Cond"/>
+                <w:sz w:val="24"/>
+                <w:szCs w:val="24"/>
+              </w:rPr>
+              <w:t>Pembuangan</w:t>
+            </w:r>
+            <w:r>
+              <w:rPr>
+                <w:rFonts w:ascii="Arial Nova Cond" w:hAnsi="Arial Nova Cond"/>
+                <w:sz w:val="24"/>
+                <w:szCs w:val="24"/>
+              </w:rPr>
+              <w:t xml:space="preserve"> Air </w:t>
+            </w:r>
+            <w:r>
+              <w:rPr>
+                <w:rFonts w:ascii="Arial Nova Cond" w:hAnsi="Arial Nova Cond"/>
+                <w:sz w:val="24"/>
+                <w:szCs w:val="24"/>
+              </w:rPr>
+              <w:t>Limbah</w:t>
             </w:r>
           </w:p>
         </w:tc>
@@ -2517,7 +3341,15 @@
                 <w:sz w:val="24"/>
                 <w:szCs w:val="24"/>
               </w:rPr>
-              <w:t>Volume air limbah</w:t>
+              <w:t xml:space="preserve">Volume air </w:t>
+            </w:r>
+            <w:r>
+              <w:rPr>
+                <w:rFonts w:ascii="Arial Nova Cond" w:hAnsi="Arial Nova Cond"/>
+                <w:sz w:val="24"/>
+                <w:szCs w:val="24"/>
+              </w:rPr>
+              <w:t>limbah</w:t>
             </w:r>
           </w:p>
         </w:tc>
@@ -2611,7 +3443,15 @@
                 <w:sz w:val="24"/>
                 <w:szCs w:val="24"/>
               </w:rPr>
-              <w:t>Pemanfaatan Air Tanah</w:t>
+              <w:t>Pemanfaatan</w:t>
+            </w:r>
+            <w:r>
+              <w:rPr>
+                <w:rFonts w:ascii="Arial Nova Cond" w:hAnsi="Arial Nova Cond"/>
+                <w:sz w:val="24"/>
+                <w:szCs w:val="24"/>
+              </w:rPr>
+              <w:t xml:space="preserve"> Air Tanah</w:t>
             </w:r>
           </w:p>
         </w:tc>
@@ -2705,7 +3545,63 @@
                 <w:sz w:val="24"/>
                 <w:szCs w:val="24"/>
               </w:rPr>
-              <w:t>Jumlah Penggunaan Air Dalam Satu Hari (m3/hari)</w:t>
+              <w:t>Jumlah</w:t>
+            </w:r>
+            <w:r>
+              <w:rPr>
+                <w:rFonts w:ascii="Arial Nova Cond" w:hAnsi="Arial Nova Cond"/>
+                <w:sz w:val="24"/>
+                <w:szCs w:val="24"/>
+              </w:rPr>
+              <w:t xml:space="preserve"> </w:t>
+            </w:r>
+            <w:r>
+              <w:rPr>
+                <w:rFonts w:ascii="Arial Nova Cond" w:hAnsi="Arial Nova Cond"/>
+                <w:sz w:val="24"/>
+                <w:szCs w:val="24"/>
+              </w:rPr>
+              <w:t>Penggunaan</w:t>
+            </w:r>
+            <w:r>
+              <w:rPr>
+                <w:rFonts w:ascii="Arial Nova Cond" w:hAnsi="Arial Nova Cond"/>
+                <w:sz w:val="24"/>
+                <w:szCs w:val="24"/>
+              </w:rPr>
+              <w:t xml:space="preserve"> Air </w:t>
+            </w:r>
+            <w:r>
+              <w:rPr>
+                <w:rFonts w:ascii="Arial Nova Cond" w:hAnsi="Arial Nova Cond"/>
+                <w:sz w:val="24"/>
+                <w:szCs w:val="24"/>
+              </w:rPr>
+              <w:t>Dalam</w:t>
+            </w:r>
+            <w:r>
+              <w:rPr>
+                <w:rFonts w:ascii="Arial Nova Cond" w:hAnsi="Arial Nova Cond"/>
+                <w:sz w:val="24"/>
+                <w:szCs w:val="24"/>
+              </w:rPr>
+              <w:t xml:space="preserve"> Satu Hari (m3/</w:t>
+            </w:r>
+            <w:r>
+              <w:rPr>
+                <w:rFonts w:ascii="Arial Nova Cond" w:hAnsi="Arial Nova Cond"/>
+                <w:sz w:val="24"/>
+                <w:szCs w:val="24"/>
+              </w:rPr>
+              <w:t>hari</w:t>
+            </w:r>
+            <w:r>
+              <w:rPr>
+                <w:rFonts w:ascii="Arial Nova Cond" w:hAnsi="Arial Nova Cond"/>
+                <w:sz w:val="24"/>
+                <w:szCs w:val="24"/>
+              </w:rPr>
+              <w:t>)</w:t>
             </w:r>
           </w:p>
         </w:tc>
@@ -2800,7 +3696,23 @@
                 <w:sz w:val="24"/>
                 <w:szCs w:val="24"/>
               </w:rPr>
-              <w:t>Penggunaan Energi</w:t>
+              <w:t>Penggunaan</w:t>
+            </w:r>
+            <w:r>
+              <w:rPr>
+                <w:rFonts w:ascii="Arial Nova Cond" w:hAnsi="Arial Nova Cond"/>
+                <w:sz w:val="24"/>
+                <w:szCs w:val="24"/>
+              </w:rPr>
+              <w:t xml:space="preserve"> </w:t>
+            </w:r>
+            <w:r>
+              <w:rPr>
+                <w:rFonts w:ascii="Arial Nova Cond" w:hAnsi="Arial Nova Cond"/>
+                <w:sz w:val="24"/>
+                <w:szCs w:val="24"/>
+              </w:rPr>
+              <w:t>Energi</w:t>
             </w:r>
           </w:p>
         </w:tc>
@@ -2817,14 +3729,6 @@
                 <w:szCs w:val="24"/>
               </w:rPr>
             </w:pPr>
-            <w:r>
-              <w:rPr>
-                <w:rFonts w:ascii="Arial Nova Cond" w:hAnsi="Arial Nova Cond"/>
-                <w:sz w:val="24"/>
-                <w:szCs w:val="24"/>
-              </w:rPr>
-              <w:t>:</w:t>
-            </w:r>
           </w:p>
         </w:tc>
         <w:tc>
@@ -2847,7 +3751,7 @@
                 <w:sz w:val="24"/>
                 <w:szCs w:val="24"/>
               </w:rPr>
-              <w:t>{penggunaan_energi}</w:t>
+              <w:t>{jumlah_karyawan_pengunjung}</w:t>
             </w:r>
           </w:p>
         </w:tc>
@@ -2895,7 +3799,71 @@
                 <w:sz w:val="24"/>
                 <w:szCs w:val="24"/>
               </w:rPr>
-              <w:t>Jumlah Pekerja karyawan dan pengunjung/ hari</w:t>
+              <w:t>Jumlah</w:t>
+            </w:r>
+            <w:r>
+              <w:rPr>
+                <w:rFonts w:ascii="Arial Nova Cond" w:hAnsi="Arial Nova Cond"/>
+                <w:sz w:val="24"/>
+                <w:szCs w:val="24"/>
+              </w:rPr>
+              <w:t xml:space="preserve"> </w:t>
+            </w:r>
+            <w:r>
+              <w:rPr>
+                <w:rFonts w:ascii="Arial Nova Cond" w:hAnsi="Arial Nova Cond"/>
+                <w:sz w:val="24"/>
+                <w:szCs w:val="24"/>
+              </w:rPr>
+              <w:t>Pekerja</w:t>
+            </w:r>
+            <w:r>
+              <w:rPr>
+                <w:rFonts w:ascii="Arial Nova Cond" w:hAnsi="Arial Nova Cond"/>
+                <w:sz w:val="24"/>
+                <w:szCs w:val="24"/>
+              </w:rPr>
+              <w:t xml:space="preserve"> </w:t>
+            </w:r>
+            <w:r>
+              <w:rPr>
+                <w:rFonts w:ascii="Arial Nova Cond" w:hAnsi="Arial Nova Cond"/>
+                <w:sz w:val="24"/>
+                <w:szCs w:val="24"/>
+              </w:rPr>
+              <w:t>karyawan</w:t>
+            </w:r>
+            <w:r>
+              <w:rPr>
+                <w:rFonts w:ascii="Arial Nova Cond" w:hAnsi="Arial Nova Cond"/>
+                <w:sz w:val="24"/>
+                <w:szCs w:val="24"/>
+              </w:rPr>
+              <w:t xml:space="preserve"> dan </w:t>
+            </w:r>
+            <w:r>
+              <w:rPr>
+                <w:rFonts w:ascii="Arial Nova Cond" w:hAnsi="Arial Nova Cond"/>
+                <w:sz w:val="24"/>
+                <w:szCs w:val="24"/>
+              </w:rPr>
+              <w:t>pengunjung</w:t>
+            </w:r>
+            <w:r>
+              <w:rPr>
+                <w:rFonts w:ascii="Arial Nova Cond" w:hAnsi="Arial Nova Cond"/>
+                <w:sz w:val="24"/>
+                <w:szCs w:val="24"/>
+              </w:rPr>
+              <w:t xml:space="preserve">/ </w:t>
+            </w:r>
+            <w:r>
+              <w:rPr>
+                <w:rFonts w:ascii="Arial Nova Cond" w:hAnsi="Arial Nova Cond"/>
+                <w:sz w:val="24"/>
+                <w:szCs w:val="24"/>
+              </w:rPr>
+              <w:t>hari</w:t>
             </w:r>
           </w:p>
         </w:tc>
@@ -2941,7 +3909,7 @@
                 <w:sz w:val="24"/>
                 <w:szCs w:val="24"/>
               </w:rPr>
-              <w:t>{jumlah_karyawan_pengunjung}</w:t>
+              <w:t>{shift_kerja}</w:t>
             </w:r>
           </w:p>
         </w:tc>
@@ -2989,7 +3957,23 @@
                 <w:sz w:val="24"/>
                 <w:szCs w:val="24"/>
               </w:rPr>
-              <w:t xml:space="preserve">Jam Shift Kerja/Hari </w:t>
+              <w:t xml:space="preserve">Jam Shift </w:t>
+            </w:r>
+            <w:r>
+              <w:rPr>
+                <w:rFonts w:ascii="Arial Nova Cond" w:hAnsi="Arial Nova Cond"/>
+                <w:sz w:val="24"/>
+                <w:szCs w:val="24"/>
+              </w:rPr>
+              <w:t>Kerja</w:t>
+            </w:r>
+            <w:r>
+              <w:rPr>
+                <w:rFonts w:ascii="Arial Nova Cond" w:hAnsi="Arial Nova Cond"/>
+                <w:sz w:val="24"/>
+                <w:szCs w:val="24"/>
+              </w:rPr>
+              <w:t xml:space="preserve">/Hari </w:t>
             </w:r>
           </w:p>
         </w:tc>
@@ -3035,7 +4019,7 @@
                 <w:sz w:val="24"/>
                 <w:szCs w:val="24"/>
               </w:rPr>
-              <w:t>{shift_kerja}</w:t>
+              <w:t>{jam_operasional}</w:t>
             </w:r>
           </w:p>
         </w:tc>
@@ -3083,7 +4067,71 @@
                 <w:sz w:val="24"/>
                 <w:szCs w:val="24"/>
               </w:rPr>
-              <w:t>Jumlah hari kerja dalam 1 minggu</w:t>
+              <w:t>Jumlah</w:t>
+            </w:r>
+            <w:r>
+              <w:rPr>
+                <w:rFonts w:ascii="Arial Nova Cond" w:hAnsi="Arial Nova Cond"/>
+                <w:sz w:val="24"/>
+                <w:szCs w:val="24"/>
+              </w:rPr>
+              <w:t xml:space="preserve"> </w:t>
+            </w:r>
+            <w:r>
+              <w:rPr>
+                <w:rFonts w:ascii="Arial Nova Cond" w:hAnsi="Arial Nova Cond"/>
+                <w:sz w:val="24"/>
+                <w:szCs w:val="24"/>
+              </w:rPr>
+              <w:t>hari</w:t>
+            </w:r>
+            <w:r>
+              <w:rPr>
+                <w:rFonts w:ascii="Arial Nova Cond" w:hAnsi="Arial Nova Cond"/>
+                <w:sz w:val="24"/>
+                <w:szCs w:val="24"/>
+              </w:rPr>
+              <w:t xml:space="preserve"> </w:t>
+            </w:r>
+            <w:r>
+              <w:rPr>
+                <w:rFonts w:ascii="Arial Nova Cond" w:hAnsi="Arial Nova Cond"/>
+                <w:sz w:val="24"/>
+                <w:szCs w:val="24"/>
+              </w:rPr>
+              <w:t>kerja</w:t>
+            </w:r>
+            <w:r>
+              <w:rPr>
+                <w:rFonts w:ascii="Arial Nova Cond" w:hAnsi="Arial Nova Cond"/>
+                <w:sz w:val="24"/>
+                <w:szCs w:val="24"/>
+              </w:rPr>
+              <w:t xml:space="preserve"> </w:t>
+            </w:r>
+            <w:r>
+              <w:rPr>
+                <w:rFonts w:ascii="Arial Nova Cond" w:hAnsi="Arial Nova Cond"/>
+                <w:sz w:val="24"/>
+                <w:szCs w:val="24"/>
+              </w:rPr>
+              <w:t>dalam</w:t>
+            </w:r>
+            <w:r>
+              <w:rPr>
+                <w:rFonts w:ascii="Arial Nova Cond" w:hAnsi="Arial Nova Cond"/>
+                <w:sz w:val="24"/>
+                <w:szCs w:val="24"/>
+              </w:rPr>
+              <w:t xml:space="preserve"> 1 </w:t>
+            </w:r>
+            <w:r>
+              <w:rPr>
+                <w:rFonts w:ascii="Arial Nova Cond" w:hAnsi="Arial Nova Cond"/>
+                <w:sz w:val="24"/>
+                <w:szCs w:val="24"/>
+              </w:rPr>
+              <w:t>minggu</w:t>
             </w:r>
           </w:p>
         </w:tc>
@@ -3177,7 +4225,15 @@
                 <w:sz w:val="24"/>
                 <w:szCs w:val="24"/>
               </w:rPr>
-              <w:t>Riwayat ketaatan</w:t>
+              <w:t xml:space="preserve">Riwayat </w:t>
+            </w:r>
+            <w:r>
+              <w:rPr>
+                <w:rFonts w:ascii="Arial Nova Cond" w:hAnsi="Arial Nova Cond"/>
+                <w:sz w:val="24"/>
+                <w:szCs w:val="24"/>
+              </w:rPr>
+              <w:t>ketaatan</w:t>
             </w:r>
           </w:p>
         </w:tc>
@@ -3271,7 +4327,23 @@
                 <w:sz w:val="24"/>
                 <w:szCs w:val="24"/>
               </w:rPr>
-              <w:t>Inspeksi Terakhir</w:t>
+              <w:t>Inspeksi</w:t>
+            </w:r>
+            <w:r>
+              <w:rPr>
+                <w:rFonts w:ascii="Arial Nova Cond" w:hAnsi="Arial Nova Cond"/>
+                <w:sz w:val="24"/>
+                <w:szCs w:val="24"/>
+              </w:rPr>
+              <w:t xml:space="preserve"> </w:t>
+            </w:r>
+            <w:r>
+              <w:rPr>
+                <w:rFonts w:ascii="Arial Nova Cond" w:hAnsi="Arial Nova Cond"/>
+                <w:sz w:val="24"/>
+                <w:szCs w:val="24"/>
+              </w:rPr>
+              <w:t>Terakhir</w:t>
             </w:r>
           </w:p>
         </w:tc>
@@ -3349,7 +4421,15 @@
           <w:sz w:val="24"/>
           <w:szCs w:val="24"/>
         </w:rPr>
-        <w:t>C. Hasil Pengawasan</w:t>
+        <w:t xml:space="preserve">C. Hasil </w:t>
+      </w:r>
+      <w:r>
+        <w:rPr>
+          <w:rFonts w:ascii="Arial Nova Cond" w:hAnsi="Arial Nova Cond"/>
+          <w:sz w:val="24"/>
+          <w:szCs w:val="24"/>
+        </w:rPr>
+        <w:t>Pengawasan</w:t>
       </w:r>
     </w:p>
     <w:p>
@@ -3368,7 +4448,31 @@
           <w:sz w:val="24"/>
           <w:szCs w:val="24"/>
         </w:rPr>
-        <w:t>1.  Persetujuan Lingkungan</w:t>
+        <w:t xml:space="preserve">1.  </w:t>
+      </w:r>
+      <w:r>
+        <w:rPr>
+          <w:rFonts w:ascii="Arial Nova Cond" w:hAnsi="Arial Nova Cond"/>
+          <w:sz w:val="24"/>
+          <w:szCs w:val="24"/>
+        </w:rPr>
+        <w:t>Persetujuan</w:t>
+      </w:r>
+      <w:r>
+        <w:rPr>
+          <w:rFonts w:ascii="Arial Nova Cond" w:hAnsi="Arial Nova Cond"/>
+          <w:sz w:val="24"/>
+          <w:szCs w:val="24"/>
+        </w:rPr>
+        <w:t xml:space="preserve"> </w:t>
+      </w:r>
+      <w:r>
+        <w:rPr>
+          <w:rFonts w:ascii="Arial Nova Cond" w:hAnsi="Arial Nova Cond"/>
+          <w:sz w:val="24"/>
+          <w:szCs w:val="24"/>
+        </w:rPr>
+        <w:t>Lingkungan</w:t>
       </w:r>
     </w:p>
     <w:p>
@@ -3457,31 +4561,63 @@
           <w:sz w:val="24"/>
           <w:szCs w:val="24"/>
         </w:rPr>
-        <w:t xml:space="preserve">Pemeriksaan </w:t>
-      </w:r>
-      <w:r>
-        <w:rPr>
-          <w:rFonts w:ascii="Arial Nova Cond" w:hAnsi="Arial Nova Cond"/>
-          <w:sz w:val="24"/>
-          <w:szCs w:val="24"/>
-        </w:rPr>
-        <w:t xml:space="preserve">Pengelolaan </w:t>
-      </w:r>
-      <w:r>
-        <w:rPr>
-          <w:rFonts w:ascii="Arial Nova Cond" w:hAnsi="Arial Nova Cond"/>
-          <w:sz w:val="24"/>
-          <w:szCs w:val="24"/>
-        </w:rPr>
-        <w:t>Air Limbah</w:t>
-      </w:r>
-      <w:r>
-        <w:rPr>
-          <w:rFonts w:ascii="Arial Nova Cond" w:hAnsi="Arial Nova Cond"/>
-          <w:sz w:val="24"/>
-          <w:szCs w:val="24"/>
-        </w:rPr>
-        <w:t xml:space="preserve"> domestik</w:t>
+        <w:t>Pemeriksaan</w:t>
+      </w:r>
+      <w:r>
+        <w:rPr>
+          <w:rFonts w:ascii="Arial Nova Cond" w:hAnsi="Arial Nova Cond"/>
+          <w:sz w:val="24"/>
+          <w:szCs w:val="24"/>
+        </w:rPr>
+        <w:t xml:space="preserve"> </w:t>
+      </w:r>
+      <w:r>
+        <w:rPr>
+          <w:rFonts w:ascii="Arial Nova Cond" w:hAnsi="Arial Nova Cond"/>
+          <w:sz w:val="24"/>
+          <w:szCs w:val="24"/>
+        </w:rPr>
+        <w:t>Pengelolaan</w:t>
+      </w:r>
+      <w:r>
+        <w:rPr>
+          <w:rFonts w:ascii="Arial Nova Cond" w:hAnsi="Arial Nova Cond"/>
+          <w:sz w:val="24"/>
+          <w:szCs w:val="24"/>
+        </w:rPr>
+        <w:t xml:space="preserve"> </w:t>
+      </w:r>
+      <w:r>
+        <w:rPr>
+          <w:rFonts w:ascii="Arial Nova Cond" w:hAnsi="Arial Nova Cond"/>
+          <w:sz w:val="24"/>
+          <w:szCs w:val="24"/>
+        </w:rPr>
+        <w:t xml:space="preserve">Air </w:t>
+      </w:r>
+      <w:r>
+        <w:rPr>
+          <w:rFonts w:ascii="Arial Nova Cond" w:hAnsi="Arial Nova Cond"/>
+          <w:sz w:val="24"/>
+          <w:szCs w:val="24"/>
+        </w:rPr>
+        <w:t>Limbah</w:t>
+      </w:r>
+      <w:r>
+        <w:rPr>
+          <w:rFonts w:ascii="Arial Nova Cond" w:hAnsi="Arial Nova Cond"/>
+          <w:sz w:val="24"/>
+          <w:szCs w:val="24"/>
+        </w:rPr>
+        <w:t xml:space="preserve"> </w:t>
+      </w:r>
+      <w:r>
+        <w:rPr>
+          <w:rFonts w:ascii="Arial Nova Cond" w:hAnsi="Arial Nova Cond"/>
+          <w:sz w:val="24"/>
+          <w:szCs w:val="24"/>
+        </w:rPr>
+        <w:t>domestik</w:t>
       </w:r>
     </w:p>
     <w:tbl>
@@ -3548,17 +4684,9 @@
                 <w:sz w:val="24"/>
                 <w:szCs w:val="24"/>
               </w:rPr>
-              <w:t>Point Pemeriksaan</w:t>
-            </w:r>
-          </w:p>
-        </w:tc>
-        <w:tc>
-          <w:tcPr>
-            <w:tcW w:w="4002" w:type="dxa"/>
-          </w:tcPr>
-          <w:p>
-            <w:pPr>
-              <w:jc w:val="center"/>
+              <w:t xml:space="preserve">Point </w:t>
+            </w:r>
+            <w:r>
               <w:rPr>
                 <w:rFonts w:ascii="Arial Nova Cond" w:hAnsi="Arial Nova Cond"/>
                 <w:b/>
@@ -3566,8 +4694,17 @@
                 <w:sz w:val="24"/>
                 <w:szCs w:val="24"/>
               </w:rPr>
-            </w:pPr>
-            <w:r>
+              <w:t>Pemeriksaan</w:t>
+            </w:r>
+          </w:p>
+        </w:tc>
+        <w:tc>
+          <w:tcPr>
+            <w:tcW w:w="4002" w:type="dxa"/>
+          </w:tcPr>
+          <w:p>
+            <w:pPr>
+              <w:jc w:val="center"/>
               <w:rPr>
                 <w:rFonts w:ascii="Arial Nova Cond" w:hAnsi="Arial Nova Cond"/>
                 <w:b/>
@@ -3575,17 +4712,8 @@
                 <w:sz w:val="24"/>
                 <w:szCs w:val="24"/>
               </w:rPr>
-              <w:t>Kondisi Eksisting</w:t>
-            </w:r>
-          </w:p>
-        </w:tc>
-        <w:tc>
-          <w:tcPr>
-            <w:tcW w:w="3154" w:type="dxa"/>
-          </w:tcPr>
-          <w:p>
-            <w:pPr>
-              <w:jc w:val="center"/>
+            </w:pPr>
+            <w:r>
               <w:rPr>
                 <w:rFonts w:ascii="Arial Nova Cond" w:hAnsi="Arial Nova Cond"/>
                 <w:b/>
@@ -3593,7 +4721,8 @@
                 <w:sz w:val="24"/>
                 <w:szCs w:val="24"/>
               </w:rPr>
-            </w:pPr>
+              <w:t>Kondisi</w:t>
+            </w:r>
             <w:r>
               <w:rPr>
                 <w:rFonts w:ascii="Arial Nova Cond" w:hAnsi="Arial Nova Cond"/>
@@ -3602,6 +4731,43 @@
                 <w:sz w:val="24"/>
                 <w:szCs w:val="24"/>
               </w:rPr>
+              <w:t xml:space="preserve"> </w:t>
+            </w:r>
+            <w:r>
+              <w:rPr>
+                <w:rFonts w:ascii="Arial Nova Cond" w:hAnsi="Arial Nova Cond"/>
+                <w:b/>
+                <w:bCs/>
+                <w:sz w:val="24"/>
+                <w:szCs w:val="24"/>
+              </w:rPr>
+              <w:t>Eksisting</w:t>
+            </w:r>
+          </w:p>
+        </w:tc>
+        <w:tc>
+          <w:tcPr>
+            <w:tcW w:w="3154" w:type="dxa"/>
+          </w:tcPr>
+          <w:p>
+            <w:pPr>
+              <w:jc w:val="center"/>
+              <w:rPr>
+                <w:rFonts w:ascii="Arial Nova Cond" w:hAnsi="Arial Nova Cond"/>
+                <w:b/>
+                <w:bCs/>
+                <w:sz w:val="24"/>
+                <w:szCs w:val="24"/>
+              </w:rPr>
+            </w:pPr>
+            <w:r>
+              <w:rPr>
+                <w:rFonts w:ascii="Arial Nova Cond" w:hAnsi="Arial Nova Cond"/>
+                <w:b/>
+                <w:bCs/>
+                <w:sz w:val="24"/>
+                <w:szCs w:val="24"/>
+              </w:rPr>
               <w:t>Keterangan</w:t>
             </w:r>
           </w:p>
@@ -3649,7 +4815,23 @@
                 <w:sz w:val="24"/>
                 <w:szCs w:val="24"/>
               </w:rPr>
-              <w:t>Sumber limbah</w:t>
+              <w:t>Sumber</w:t>
+            </w:r>
+            <w:r>
+              <w:rPr>
+                <w:rFonts w:ascii="Arial Nova Cond" w:hAnsi="Arial Nova Cond"/>
+                <w:sz w:val="24"/>
+                <w:szCs w:val="24"/>
+              </w:rPr>
+              <w:t xml:space="preserve"> </w:t>
+            </w:r>
+            <w:r>
+              <w:rPr>
+                <w:rFonts w:ascii="Arial Nova Cond" w:hAnsi="Arial Nova Cond"/>
+                <w:sz w:val="24"/>
+                <w:szCs w:val="24"/>
+              </w:rPr>
+              <w:t>limbah</w:t>
             </w:r>
           </w:p>
         </w:tc>
@@ -3741,7 +4923,63 @@
                 <w:sz w:val="24"/>
                 <w:szCs w:val="24"/>
               </w:rPr>
-              <w:t xml:space="preserve">Kondisi fisik septictank dan resapan </w:t>
+              <w:t>Kondisi</w:t>
+            </w:r>
+            <w:r>
+              <w:rPr>
+                <w:rFonts w:ascii="Arial Nova Cond" w:hAnsi="Arial Nova Cond"/>
+                <w:sz w:val="24"/>
+                <w:szCs w:val="24"/>
+              </w:rPr>
+              <w:t xml:space="preserve"> </w:t>
+            </w:r>
+            <w:r>
+              <w:rPr>
+                <w:rFonts w:ascii="Arial Nova Cond" w:hAnsi="Arial Nova Cond"/>
+                <w:sz w:val="24"/>
+                <w:szCs w:val="24"/>
+              </w:rPr>
+              <w:t>fisik</w:t>
+            </w:r>
+            <w:r>
+              <w:rPr>
+                <w:rFonts w:ascii="Arial Nova Cond" w:hAnsi="Arial Nova Cond"/>
+                <w:sz w:val="24"/>
+                <w:szCs w:val="24"/>
+              </w:rPr>
+              <w:t xml:space="preserve"> </w:t>
+            </w:r>
+            <w:r>
+              <w:rPr>
+                <w:rFonts w:ascii="Arial Nova Cond" w:hAnsi="Arial Nova Cond"/>
+                <w:sz w:val="24"/>
+                <w:szCs w:val="24"/>
+              </w:rPr>
+              <w:t>septictank</w:t>
+            </w:r>
+            <w:r>
+              <w:rPr>
+                <w:rFonts w:ascii="Arial Nova Cond" w:hAnsi="Arial Nova Cond"/>
+                <w:sz w:val="24"/>
+                <w:szCs w:val="24"/>
+              </w:rPr>
+              <w:t xml:space="preserve"> dan </w:t>
+            </w:r>
+            <w:r>
+              <w:rPr>
+                <w:rFonts w:ascii="Arial Nova Cond" w:hAnsi="Arial Nova Cond"/>
+                <w:sz w:val="24"/>
+                <w:szCs w:val="24"/>
+              </w:rPr>
+              <w:t>resapan</w:t>
+            </w:r>
+            <w:r>
+              <w:rPr>
+                <w:rFonts w:ascii="Arial Nova Cond" w:hAnsi="Arial Nova Cond"/>
+                <w:sz w:val="24"/>
+                <w:szCs w:val="24"/>
+              </w:rPr>
+              <w:t xml:space="preserve"> </w:t>
             </w:r>
           </w:p>
         </w:tc>
@@ -3833,7 +5071,55 @@
                 <w:sz w:val="24"/>
                 <w:szCs w:val="24"/>
               </w:rPr>
-              <w:t>Data pantau analisa air limbah domestic</w:t>
+              <w:t xml:space="preserve">Data </w:t>
+            </w:r>
+            <w:r>
+              <w:rPr>
+                <w:rFonts w:ascii="Arial Nova Cond" w:hAnsi="Arial Nova Cond"/>
+                <w:sz w:val="24"/>
+                <w:szCs w:val="24"/>
+              </w:rPr>
+              <w:t>pantau</w:t>
+            </w:r>
+            <w:r>
+              <w:rPr>
+                <w:rFonts w:ascii="Arial Nova Cond" w:hAnsi="Arial Nova Cond"/>
+                <w:sz w:val="24"/>
+                <w:szCs w:val="24"/>
+              </w:rPr>
+              <w:t xml:space="preserve"> </w:t>
+            </w:r>
+            <w:r>
+              <w:rPr>
+                <w:rFonts w:ascii="Arial Nova Cond" w:hAnsi="Arial Nova Cond"/>
+                <w:sz w:val="24"/>
+                <w:szCs w:val="24"/>
+              </w:rPr>
+              <w:t>analisa</w:t>
+            </w:r>
+            <w:r>
+              <w:rPr>
+                <w:rFonts w:ascii="Arial Nova Cond" w:hAnsi="Arial Nova Cond"/>
+                <w:sz w:val="24"/>
+                <w:szCs w:val="24"/>
+              </w:rPr>
+              <w:t xml:space="preserve"> air </w:t>
+            </w:r>
+            <w:r>
+              <w:rPr>
+                <w:rFonts w:ascii="Arial Nova Cond" w:hAnsi="Arial Nova Cond"/>
+                <w:sz w:val="24"/>
+                <w:szCs w:val="24"/>
+              </w:rPr>
+              <w:t>limbah</w:t>
+            </w:r>
+            <w:r>
+              <w:rPr>
+                <w:rFonts w:ascii="Arial Nova Cond" w:hAnsi="Arial Nova Cond"/>
+                <w:sz w:val="24"/>
+                <w:szCs w:val="24"/>
+              </w:rPr>
+              <w:t xml:space="preserve"> domestic</w:t>
             </w:r>
           </w:p>
         </w:tc>
@@ -3942,7 +5228,23 @@
                 <w:sz w:val="24"/>
                 <w:szCs w:val="24"/>
               </w:rPr>
-              <w:t>Pengelolaan sludge septictank</w:t>
+              <w:t>Pengelolaan</w:t>
+            </w:r>
+            <w:r>
+              <w:rPr>
+                <w:rFonts w:ascii="Arial Nova Cond" w:hAnsi="Arial Nova Cond"/>
+                <w:sz w:val="24"/>
+                <w:szCs w:val="24"/>
+              </w:rPr>
+              <w:t xml:space="preserve"> sludge </w:t>
+            </w:r>
+            <w:r>
+              <w:rPr>
+                <w:rFonts w:ascii="Arial Nova Cond" w:hAnsi="Arial Nova Cond"/>
+                <w:sz w:val="24"/>
+                <w:szCs w:val="24"/>
+              </w:rPr>
+              <w:t>septictank</w:t>
             </w:r>
           </w:p>
         </w:tc>
@@ -4033,7 +5335,15 @@
                 <w:sz w:val="24"/>
                 <w:szCs w:val="24"/>
               </w:rPr>
-              <w:t>Pengelolaan IPAL</w:t>
+              <w:t>Pengelolaan</w:t>
+            </w:r>
+            <w:r>
+              <w:rPr>
+                <w:rFonts w:ascii="Arial Nova Cond" w:hAnsi="Arial Nova Cond"/>
+                <w:sz w:val="24"/>
+                <w:szCs w:val="24"/>
+              </w:rPr>
+              <w:t xml:space="preserve"> IPAL</w:t>
             </w:r>
           </w:p>
         </w:tc>
@@ -4118,7 +5428,103 @@
           <w:sz w:val="24"/>
           <w:szCs w:val="24"/>
         </w:rPr>
-        <w:t xml:space="preserve">.  Pemeriksaan Pengelolaan Limbah Bahan Berbahaya dan Beracun </w:t>
+        <w:t xml:space="preserve">.  </w:t>
+      </w:r>
+      <w:r>
+        <w:rPr>
+          <w:rFonts w:ascii="Arial Nova Cond" w:hAnsi="Arial Nova Cond"/>
+          <w:sz w:val="24"/>
+          <w:szCs w:val="24"/>
+        </w:rPr>
+        <w:t>Pemeriksaan</w:t>
+      </w:r>
+      <w:r>
+        <w:rPr>
+          <w:rFonts w:ascii="Arial Nova Cond" w:hAnsi="Arial Nova Cond"/>
+          <w:sz w:val="24"/>
+          <w:szCs w:val="24"/>
+        </w:rPr>
+        <w:t xml:space="preserve"> </w:t>
+      </w:r>
+      <w:r>
+        <w:rPr>
+          <w:rFonts w:ascii="Arial Nova Cond" w:hAnsi="Arial Nova Cond"/>
+          <w:sz w:val="24"/>
+          <w:szCs w:val="24"/>
+        </w:rPr>
+        <w:t>Pengelolaan</w:t>
+      </w:r>
+      <w:r>
+        <w:rPr>
+          <w:rFonts w:ascii="Arial Nova Cond" w:hAnsi="Arial Nova Cond"/>
+          <w:sz w:val="24"/>
+          <w:szCs w:val="24"/>
+        </w:rPr>
+        <w:t xml:space="preserve"> </w:t>
+      </w:r>
+      <w:r>
+        <w:rPr>
+          <w:rFonts w:ascii="Arial Nova Cond" w:hAnsi="Arial Nova Cond"/>
+          <w:sz w:val="24"/>
+          <w:szCs w:val="24"/>
+        </w:rPr>
+        <w:t>Limbah</w:t>
+      </w:r>
+      <w:r>
+        <w:rPr>
+          <w:rFonts w:ascii="Arial Nova Cond" w:hAnsi="Arial Nova Cond"/>
+          <w:sz w:val="24"/>
+          <w:szCs w:val="24"/>
+        </w:rPr>
+        <w:t xml:space="preserve"> </w:t>
+      </w:r>
+      <w:r>
+        <w:rPr>
+          <w:rFonts w:ascii="Arial Nova Cond" w:hAnsi="Arial Nova Cond"/>
+          <w:sz w:val="24"/>
+          <w:szCs w:val="24"/>
+        </w:rPr>
+        <w:t>Bahan</w:t>
+      </w:r>
+      <w:r>
+        <w:rPr>
+          <w:rFonts w:ascii="Arial Nova Cond" w:hAnsi="Arial Nova Cond"/>
+          <w:sz w:val="24"/>
+          <w:szCs w:val="24"/>
+        </w:rPr>
+        <w:t xml:space="preserve"> </w:t>
+      </w:r>
+      <w:r>
+        <w:rPr>
+          <w:rFonts w:ascii="Arial Nova Cond" w:hAnsi="Arial Nova Cond"/>
+          <w:sz w:val="24"/>
+          <w:szCs w:val="24"/>
+        </w:rPr>
+        <w:t>Berbahaya</w:t>
+      </w:r>
+      <w:r>
+        <w:rPr>
+          <w:rFonts w:ascii="Arial Nova Cond" w:hAnsi="Arial Nova Cond"/>
+          <w:sz w:val="24"/>
+          <w:szCs w:val="24"/>
+        </w:rPr>
+        <w:t xml:space="preserve"> dan </w:t>
+      </w:r>
+      <w:r>
+        <w:rPr>
+          <w:rFonts w:ascii="Arial Nova Cond" w:hAnsi="Arial Nova Cond"/>
+          <w:sz w:val="24"/>
+          <w:szCs w:val="24"/>
+        </w:rPr>
+        <w:t>Beracun</w:t>
+      </w:r>
+      <w:r>
+        <w:rPr>
+          <w:rFonts w:ascii="Arial Nova Cond" w:hAnsi="Arial Nova Cond"/>
+          <w:sz w:val="24"/>
+          <w:szCs w:val="24"/>
+        </w:rPr>
+        <w:t xml:space="preserve"> </w:t>
       </w:r>
       <w:r>
         <w:rPr>
@@ -4193,17 +5599,9 @@
                 <w:sz w:val="24"/>
                 <w:szCs w:val="24"/>
               </w:rPr>
-              <w:t>Point Pemeriksaan</w:t>
-            </w:r>
-          </w:p>
-        </w:tc>
-        <w:tc>
-          <w:tcPr>
-            <w:tcW w:w="3460" w:type="dxa"/>
-          </w:tcPr>
-          <w:p>
-            <w:pPr>
-              <w:jc w:val="center"/>
+              <w:t xml:space="preserve">Point </w:t>
+            </w:r>
+            <w:r>
               <w:rPr>
                 <w:rFonts w:ascii="Arial Nova Cond" w:hAnsi="Arial Nova Cond"/>
                 <w:b/>
@@ -4211,8 +5609,17 @@
                 <w:sz w:val="24"/>
                 <w:szCs w:val="24"/>
               </w:rPr>
-            </w:pPr>
-            <w:r>
+              <w:t>Pemeriksaan</w:t>
+            </w:r>
+          </w:p>
+        </w:tc>
+        <w:tc>
+          <w:tcPr>
+            <w:tcW w:w="3460" w:type="dxa"/>
+          </w:tcPr>
+          <w:p>
+            <w:pPr>
+              <w:jc w:val="center"/>
               <w:rPr>
                 <w:rFonts w:ascii="Arial Nova Cond" w:hAnsi="Arial Nova Cond"/>
                 <w:b/>
@@ -4220,17 +5627,8 @@
                 <w:sz w:val="24"/>
                 <w:szCs w:val="24"/>
               </w:rPr>
-              <w:t>Kondisi Eksisting</w:t>
-            </w:r>
-          </w:p>
-        </w:tc>
-        <w:tc>
-          <w:tcPr>
-            <w:tcW w:w="3694" w:type="dxa"/>
-          </w:tcPr>
-          <w:p>
-            <w:pPr>
-              <w:jc w:val="center"/>
+            </w:pPr>
+            <w:r>
               <w:rPr>
                 <w:rFonts w:ascii="Arial Nova Cond" w:hAnsi="Arial Nova Cond"/>
                 <w:b/>
@@ -4238,7 +5636,8 @@
                 <w:sz w:val="24"/>
                 <w:szCs w:val="24"/>
               </w:rPr>
-            </w:pPr>
+              <w:t>Kondisi</w:t>
+            </w:r>
             <w:r>
               <w:rPr>
                 <w:rFonts w:ascii="Arial Nova Cond" w:hAnsi="Arial Nova Cond"/>
@@ -4247,6 +5646,43 @@
                 <w:sz w:val="24"/>
                 <w:szCs w:val="24"/>
               </w:rPr>
+              <w:t xml:space="preserve"> </w:t>
+            </w:r>
+            <w:r>
+              <w:rPr>
+                <w:rFonts w:ascii="Arial Nova Cond" w:hAnsi="Arial Nova Cond"/>
+                <w:b/>
+                <w:bCs/>
+                <w:sz w:val="24"/>
+                <w:szCs w:val="24"/>
+              </w:rPr>
+              <w:t>Eksisting</w:t>
+            </w:r>
+          </w:p>
+        </w:tc>
+        <w:tc>
+          <w:tcPr>
+            <w:tcW w:w="3694" w:type="dxa"/>
+          </w:tcPr>
+          <w:p>
+            <w:pPr>
+              <w:jc w:val="center"/>
+              <w:rPr>
+                <w:rFonts w:ascii="Arial Nova Cond" w:hAnsi="Arial Nova Cond"/>
+                <w:b/>
+                <w:bCs/>
+                <w:sz w:val="24"/>
+                <w:szCs w:val="24"/>
+              </w:rPr>
+            </w:pPr>
+            <w:r>
+              <w:rPr>
+                <w:rFonts w:ascii="Arial Nova Cond" w:hAnsi="Arial Nova Cond"/>
+                <w:b/>
+                <w:bCs/>
+                <w:sz w:val="24"/>
+                <w:szCs w:val="24"/>
+              </w:rPr>
               <w:t>Keterangan</w:t>
             </w:r>
           </w:p>
@@ -4294,7 +5730,15 @@
                 <w:sz w:val="24"/>
                 <w:szCs w:val="24"/>
               </w:rPr>
-              <w:t>Sumber LB3</w:t>
+              <w:t>Sumber</w:t>
+            </w:r>
+            <w:r>
+              <w:rPr>
+                <w:rFonts w:ascii="Arial Nova Cond" w:hAnsi="Arial Nova Cond"/>
+                <w:sz w:val="24"/>
+                <w:szCs w:val="24"/>
+              </w:rPr>
+              <w:t xml:space="preserve"> LB3</w:t>
             </w:r>
           </w:p>
         </w:tc>
@@ -4386,7 +5830,15 @@
                 <w:sz w:val="24"/>
                 <w:szCs w:val="24"/>
               </w:rPr>
-              <w:t>Jenis LB3</w:t>
+              <w:t>Jenis</w:t>
+            </w:r>
+            <w:r>
+              <w:rPr>
+                <w:rFonts w:ascii="Arial Nova Cond" w:hAnsi="Arial Nova Cond"/>
+                <w:sz w:val="24"/>
+                <w:szCs w:val="24"/>
+              </w:rPr>
+              <w:t xml:space="preserve"> LB3</w:t>
             </w:r>
           </w:p>
         </w:tc>
@@ -4479,7 +5931,15 @@
                 <w:sz w:val="24"/>
                 <w:szCs w:val="24"/>
               </w:rPr>
-              <w:t>Kondisi TPS LB3</w:t>
+              <w:t>Kondisi</w:t>
+            </w:r>
+            <w:r>
+              <w:rPr>
+                <w:rFonts w:ascii="Arial Nova Cond" w:hAnsi="Arial Nova Cond"/>
+                <w:sz w:val="24"/>
+                <w:szCs w:val="24"/>
+              </w:rPr>
+              <w:t xml:space="preserve"> TPS LB3</w:t>
             </w:r>
           </w:p>
         </w:tc>
@@ -4574,7 +6034,15 @@
                 <w:sz w:val="24"/>
                 <w:szCs w:val="24"/>
               </w:rPr>
-              <w:t xml:space="preserve">Pengelolaan LB3 </w:t>
+              <w:t>Pengelolaan</w:t>
+            </w:r>
+            <w:r>
+              <w:rPr>
+                <w:rFonts w:ascii="Arial Nova Cond" w:hAnsi="Arial Nova Cond"/>
+                <w:sz w:val="24"/>
+                <w:szCs w:val="24"/>
+              </w:rPr>
+              <w:t xml:space="preserve"> LB3 </w:t>
             </w:r>
           </w:p>
         </w:tc>
@@ -4659,7 +6127,63 @@
           <w:sz w:val="24"/>
           <w:szCs w:val="24"/>
         </w:rPr>
-        <w:t>.  Pemeriksaan Pengelolaan Sampah Domestik</w:t>
+        <w:t xml:space="preserve">.  </w:t>
+      </w:r>
+      <w:r>
+        <w:rPr>
+          <w:rFonts w:ascii="Arial Nova Cond" w:hAnsi="Arial Nova Cond"/>
+          <w:sz w:val="24"/>
+          <w:szCs w:val="24"/>
+        </w:rPr>
+        <w:t>Pemeriksaan</w:t>
+      </w:r>
+      <w:r>
+        <w:rPr>
+          <w:rFonts w:ascii="Arial Nova Cond" w:hAnsi="Arial Nova Cond"/>
+          <w:sz w:val="24"/>
+          <w:szCs w:val="24"/>
+        </w:rPr>
+        <w:t xml:space="preserve"> </w:t>
+      </w:r>
+      <w:r>
+        <w:rPr>
+          <w:rFonts w:ascii="Arial Nova Cond" w:hAnsi="Arial Nova Cond"/>
+          <w:sz w:val="24"/>
+          <w:szCs w:val="24"/>
+        </w:rPr>
+        <w:t>Pengelolaan</w:t>
+      </w:r>
+      <w:r>
+        <w:rPr>
+          <w:rFonts w:ascii="Arial Nova Cond" w:hAnsi="Arial Nova Cond"/>
+          <w:sz w:val="24"/>
+          <w:szCs w:val="24"/>
+        </w:rPr>
+        <w:t xml:space="preserve"> </w:t>
+      </w:r>
+      <w:r>
+        <w:rPr>
+          <w:rFonts w:ascii="Arial Nova Cond" w:hAnsi="Arial Nova Cond"/>
+          <w:sz w:val="24"/>
+          <w:szCs w:val="24"/>
+        </w:rPr>
+        <w:t>Sampah</w:t>
+      </w:r>
+      <w:r>
+        <w:rPr>
+          <w:rFonts w:ascii="Arial Nova Cond" w:hAnsi="Arial Nova Cond"/>
+          <w:sz w:val="24"/>
+          <w:szCs w:val="24"/>
+        </w:rPr>
+        <w:t xml:space="preserve"> </w:t>
+      </w:r>
+      <w:r>
+        <w:rPr>
+          <w:rFonts w:ascii="Arial Nova Cond" w:hAnsi="Arial Nova Cond"/>
+          <w:sz w:val="24"/>
+          <w:szCs w:val="24"/>
+        </w:rPr>
+        <w:t>Domestik</w:t>
       </w:r>
     </w:p>
     <w:tbl>
@@ -4726,17 +6250,9 @@
                 <w:sz w:val="24"/>
                 <w:szCs w:val="24"/>
               </w:rPr>
-              <w:t>Point Pemeriksaan</w:t>
-            </w:r>
-          </w:p>
-        </w:tc>
-        <w:tc>
-          <w:tcPr>
-            <w:tcW w:w="3757" w:type="dxa"/>
-          </w:tcPr>
-          <w:p>
-            <w:pPr>
-              <w:jc w:val="center"/>
+              <w:t xml:space="preserve">Point </w:t>
+            </w:r>
+            <w:r>
               <w:rPr>
                 <w:rFonts w:ascii="Arial Nova Cond" w:hAnsi="Arial Nova Cond"/>
                 <w:b/>
@@ -4744,8 +6260,17 @@
                 <w:sz w:val="24"/>
                 <w:szCs w:val="24"/>
               </w:rPr>
-            </w:pPr>
-            <w:r>
+              <w:t>Pemeriksaan</w:t>
+            </w:r>
+          </w:p>
+        </w:tc>
+        <w:tc>
+          <w:tcPr>
+            <w:tcW w:w="3757" w:type="dxa"/>
+          </w:tcPr>
+          <w:p>
+            <w:pPr>
+              <w:jc w:val="center"/>
               <w:rPr>
                 <w:rFonts w:ascii="Arial Nova Cond" w:hAnsi="Arial Nova Cond"/>
                 <w:b/>
@@ -4753,17 +6278,8 @@
                 <w:sz w:val="24"/>
                 <w:szCs w:val="24"/>
               </w:rPr>
-              <w:t>Kondisi Eksisting</w:t>
-            </w:r>
-          </w:p>
-        </w:tc>
-        <w:tc>
-          <w:tcPr>
-            <w:tcW w:w="3331" w:type="dxa"/>
-          </w:tcPr>
-          <w:p>
-            <w:pPr>
-              <w:jc w:val="center"/>
+            </w:pPr>
+            <w:r>
               <w:rPr>
                 <w:rFonts w:ascii="Arial Nova Cond" w:hAnsi="Arial Nova Cond"/>
                 <w:b/>
@@ -4771,7 +6287,8 @@
                 <w:sz w:val="24"/>
                 <w:szCs w:val="24"/>
               </w:rPr>
-            </w:pPr>
+              <w:t>Kondisi</w:t>
+            </w:r>
             <w:r>
               <w:rPr>
                 <w:rFonts w:ascii="Arial Nova Cond" w:hAnsi="Arial Nova Cond"/>
@@ -4780,6 +6297,43 @@
                 <w:sz w:val="24"/>
                 <w:szCs w:val="24"/>
               </w:rPr>
+              <w:t xml:space="preserve"> </w:t>
+            </w:r>
+            <w:r>
+              <w:rPr>
+                <w:rFonts w:ascii="Arial Nova Cond" w:hAnsi="Arial Nova Cond"/>
+                <w:b/>
+                <w:bCs/>
+                <w:sz w:val="24"/>
+                <w:szCs w:val="24"/>
+              </w:rPr>
+              <w:t>Eksisting</w:t>
+            </w:r>
+          </w:p>
+        </w:tc>
+        <w:tc>
+          <w:tcPr>
+            <w:tcW w:w="3331" w:type="dxa"/>
+          </w:tcPr>
+          <w:p>
+            <w:pPr>
+              <w:jc w:val="center"/>
+              <w:rPr>
+                <w:rFonts w:ascii="Arial Nova Cond" w:hAnsi="Arial Nova Cond"/>
+                <w:b/>
+                <w:bCs/>
+                <w:sz w:val="24"/>
+                <w:szCs w:val="24"/>
+              </w:rPr>
+            </w:pPr>
+            <w:r>
+              <w:rPr>
+                <w:rFonts w:ascii="Arial Nova Cond" w:hAnsi="Arial Nova Cond"/>
+                <w:b/>
+                <w:bCs/>
+                <w:sz w:val="24"/>
+                <w:szCs w:val="24"/>
+              </w:rPr>
               <w:t>Keterangan</w:t>
             </w:r>
           </w:p>
@@ -4828,7 +6382,39 @@
                 <w:sz w:val="24"/>
                 <w:szCs w:val="24"/>
               </w:rPr>
-              <w:t>Sumber Sampah Domestik</w:t>
+              <w:t>Sumber</w:t>
+            </w:r>
+            <w:r>
+              <w:rPr>
+                <w:rFonts w:ascii="Arial Nova Cond" w:hAnsi="Arial Nova Cond"/>
+                <w:sz w:val="24"/>
+                <w:szCs w:val="24"/>
+              </w:rPr>
+              <w:t xml:space="preserve"> </w:t>
+            </w:r>
+            <w:r>
+              <w:rPr>
+                <w:rFonts w:ascii="Arial Nova Cond" w:hAnsi="Arial Nova Cond"/>
+                <w:sz w:val="24"/>
+                <w:szCs w:val="24"/>
+              </w:rPr>
+              <w:t>Sampah</w:t>
+            </w:r>
+            <w:r>
+              <w:rPr>
+                <w:rFonts w:ascii="Arial Nova Cond" w:hAnsi="Arial Nova Cond"/>
+                <w:sz w:val="24"/>
+                <w:szCs w:val="24"/>
+              </w:rPr>
+              <w:t xml:space="preserve"> </w:t>
+            </w:r>
+            <w:r>
+              <w:rPr>
+                <w:rFonts w:ascii="Arial Nova Cond" w:hAnsi="Arial Nova Cond"/>
+                <w:sz w:val="24"/>
+                <w:szCs w:val="24"/>
+              </w:rPr>
+              <w:t>Domestik</w:t>
             </w:r>
           </w:p>
         </w:tc>
@@ -4920,7 +6506,39 @@
                 <w:sz w:val="24"/>
                 <w:szCs w:val="24"/>
               </w:rPr>
-              <w:t>Jenis Sampah Domestik</w:t>
+              <w:t>Jenis</w:t>
+            </w:r>
+            <w:r>
+              <w:rPr>
+                <w:rFonts w:ascii="Arial Nova Cond" w:hAnsi="Arial Nova Cond"/>
+                <w:sz w:val="24"/>
+                <w:szCs w:val="24"/>
+              </w:rPr>
+              <w:t xml:space="preserve"> </w:t>
+            </w:r>
+            <w:r>
+              <w:rPr>
+                <w:rFonts w:ascii="Arial Nova Cond" w:hAnsi="Arial Nova Cond"/>
+                <w:sz w:val="24"/>
+                <w:szCs w:val="24"/>
+              </w:rPr>
+              <w:t>Sampah</w:t>
+            </w:r>
+            <w:r>
+              <w:rPr>
+                <w:rFonts w:ascii="Arial Nova Cond" w:hAnsi="Arial Nova Cond"/>
+                <w:sz w:val="24"/>
+                <w:szCs w:val="24"/>
+              </w:rPr>
+              <w:t xml:space="preserve"> </w:t>
+            </w:r>
+            <w:r>
+              <w:rPr>
+                <w:rFonts w:ascii="Arial Nova Cond" w:hAnsi="Arial Nova Cond"/>
+                <w:sz w:val="24"/>
+                <w:szCs w:val="24"/>
+              </w:rPr>
+              <w:t>Domestik</w:t>
             </w:r>
           </w:p>
         </w:tc>
@@ -5012,7 +6630,39 @@
                 <w:sz w:val="24"/>
                 <w:szCs w:val="24"/>
               </w:rPr>
-              <w:t>Kondisi TPS Sampah Domestik</w:t>
+              <w:t>Kondisi</w:t>
+            </w:r>
+            <w:r>
+              <w:rPr>
+                <w:rFonts w:ascii="Arial Nova Cond" w:hAnsi="Arial Nova Cond"/>
+                <w:sz w:val="24"/>
+                <w:szCs w:val="24"/>
+              </w:rPr>
+              <w:t xml:space="preserve"> TPS </w:t>
+            </w:r>
+            <w:r>
+              <w:rPr>
+                <w:rFonts w:ascii="Arial Nova Cond" w:hAnsi="Arial Nova Cond"/>
+                <w:sz w:val="24"/>
+                <w:szCs w:val="24"/>
+              </w:rPr>
+              <w:t>Sampah</w:t>
+            </w:r>
+            <w:r>
+              <w:rPr>
+                <w:rFonts w:ascii="Arial Nova Cond" w:hAnsi="Arial Nova Cond"/>
+                <w:sz w:val="24"/>
+                <w:szCs w:val="24"/>
+              </w:rPr>
+              <w:t xml:space="preserve"> </w:t>
+            </w:r>
+            <w:r>
+              <w:rPr>
+                <w:rFonts w:ascii="Arial Nova Cond" w:hAnsi="Arial Nova Cond"/>
+                <w:sz w:val="24"/>
+                <w:szCs w:val="24"/>
+              </w:rPr>
+              <w:t>Domestik</w:t>
             </w:r>
           </w:p>
         </w:tc>
@@ -5104,7 +6754,39 @@
                 <w:sz w:val="24"/>
                 <w:szCs w:val="24"/>
               </w:rPr>
-              <w:t>Pengelolaan sampah domestik</w:t>
+              <w:t>Pengelolaan</w:t>
+            </w:r>
+            <w:r>
+              <w:rPr>
+                <w:rFonts w:ascii="Arial Nova Cond" w:hAnsi="Arial Nova Cond"/>
+                <w:sz w:val="24"/>
+                <w:szCs w:val="24"/>
+              </w:rPr>
+              <w:t xml:space="preserve"> </w:t>
+            </w:r>
+            <w:r>
+              <w:rPr>
+                <w:rFonts w:ascii="Arial Nova Cond" w:hAnsi="Arial Nova Cond"/>
+                <w:sz w:val="24"/>
+                <w:szCs w:val="24"/>
+              </w:rPr>
+              <w:t>sampah</w:t>
+            </w:r>
+            <w:r>
+              <w:rPr>
+                <w:rFonts w:ascii="Arial Nova Cond" w:hAnsi="Arial Nova Cond"/>
+                <w:sz w:val="24"/>
+                <w:szCs w:val="24"/>
+              </w:rPr>
+              <w:t xml:space="preserve"> </w:t>
+            </w:r>
+            <w:r>
+              <w:rPr>
+                <w:rFonts w:ascii="Arial Nova Cond" w:hAnsi="Arial Nova Cond"/>
+                <w:sz w:val="24"/>
+                <w:szCs w:val="24"/>
+              </w:rPr>
+              <w:t>domestik</w:t>
             </w:r>
           </w:p>
         </w:tc>
@@ -5391,7 +7073,15 @@
           <w:sz w:val="24"/>
           <w:szCs w:val="24"/>
         </w:rPr>
-        <w:t>6. Saran dan Masukan</w:t>
+        <w:t xml:space="preserve">6. Saran dan </w:t>
+      </w:r>
+      <w:r>
+        <w:rPr>
+          <w:rFonts w:ascii="Arial Nova Cond" w:hAnsi="Arial Nova Cond"/>
+          <w:sz w:val="24"/>
+          <w:szCs w:val="24"/>
+        </w:rPr>
+        <w:t>Masukan</w:t>
       </w:r>
       <w:r>
         <w:rPr>
@@ -5407,7 +7097,7 @@
           <w:sz w:val="24"/>
           <w:szCs w:val="24"/>
         </w:rPr>
-        <w:t>{saran_list_text}</w:t>
+        <w:t>{#saran} {abjad}. {saran_text} {/saran}</w:t>
       </w:r>
     </w:p>
     <w:p>
@@ -5443,7 +7133,23 @@
           <w:szCs w:val="24"/>
         </w:rPr>
         <w:lastRenderedPageBreak/>
-        <w:t>Pelaksanaan dan temuan fakta-fakta pengawasan lingkungan hidup ini diketahui dan dibenarkan oleh pihak</w:t>
+        <w:t>Pelaksanaan</w:t>
+      </w:r>
+      <w:r>
+        <w:rPr>
+          <w:rFonts w:ascii="Arial Nova Cond" w:hAnsi="Arial Nova Cond"/>
+          <w:sz w:val="24"/>
+          <w:szCs w:val="24"/>
+        </w:rPr>
+        <w:t xml:space="preserve"> dan </w:t>
+      </w:r>
+      <w:r>
+        <w:rPr>
+          <w:rFonts w:ascii="Arial Nova Cond" w:hAnsi="Arial Nova Cond"/>
+          <w:sz w:val="24"/>
+          <w:szCs w:val="24"/>
+        </w:rPr>
+        <w:t>temuan</w:t>
       </w:r>
       <w:r>
         <w:rPr>
@@ -5459,6 +7165,134 @@
           <w:sz w:val="24"/>
           <w:szCs w:val="24"/>
         </w:rPr>
+        <w:t>fakta-fakta</w:t>
+      </w:r>
+      <w:r>
+        <w:rPr>
+          <w:rFonts w:ascii="Arial Nova Cond" w:hAnsi="Arial Nova Cond"/>
+          <w:sz w:val="24"/>
+          <w:szCs w:val="24"/>
+        </w:rPr>
+        <w:t xml:space="preserve"> </w:t>
+      </w:r>
+      <w:r>
+        <w:rPr>
+          <w:rFonts w:ascii="Arial Nova Cond" w:hAnsi="Arial Nova Cond"/>
+          <w:sz w:val="24"/>
+          <w:szCs w:val="24"/>
+        </w:rPr>
+        <w:t>pengawasan</w:t>
+      </w:r>
+      <w:r>
+        <w:rPr>
+          <w:rFonts w:ascii="Arial Nova Cond" w:hAnsi="Arial Nova Cond"/>
+          <w:sz w:val="24"/>
+          <w:szCs w:val="24"/>
+        </w:rPr>
+        <w:t xml:space="preserve"> </w:t>
+      </w:r>
+      <w:r>
+        <w:rPr>
+          <w:rFonts w:ascii="Arial Nova Cond" w:hAnsi="Arial Nova Cond"/>
+          <w:sz w:val="24"/>
+          <w:szCs w:val="24"/>
+        </w:rPr>
+        <w:t>lingkungan</w:t>
+      </w:r>
+      <w:r>
+        <w:rPr>
+          <w:rFonts w:ascii="Arial Nova Cond" w:hAnsi="Arial Nova Cond"/>
+          <w:sz w:val="24"/>
+          <w:szCs w:val="24"/>
+        </w:rPr>
+        <w:t xml:space="preserve"> </w:t>
+      </w:r>
+      <w:r>
+        <w:rPr>
+          <w:rFonts w:ascii="Arial Nova Cond" w:hAnsi="Arial Nova Cond"/>
+          <w:sz w:val="24"/>
+          <w:szCs w:val="24"/>
+        </w:rPr>
+        <w:t>hidup</w:t>
+      </w:r>
+      <w:r>
+        <w:rPr>
+          <w:rFonts w:ascii="Arial Nova Cond" w:hAnsi="Arial Nova Cond"/>
+          <w:sz w:val="24"/>
+          <w:szCs w:val="24"/>
+        </w:rPr>
+        <w:t xml:space="preserve"> </w:t>
+      </w:r>
+      <w:r>
+        <w:rPr>
+          <w:rFonts w:ascii="Arial Nova Cond" w:hAnsi="Arial Nova Cond"/>
+          <w:sz w:val="24"/>
+          <w:szCs w:val="24"/>
+        </w:rPr>
+        <w:t>ini</w:t>
+      </w:r>
+      <w:r>
+        <w:rPr>
+          <w:rFonts w:ascii="Arial Nova Cond" w:hAnsi="Arial Nova Cond"/>
+          <w:sz w:val="24"/>
+          <w:szCs w:val="24"/>
+        </w:rPr>
+        <w:t xml:space="preserve"> </w:t>
+      </w:r>
+      <w:r>
+        <w:rPr>
+          <w:rFonts w:ascii="Arial Nova Cond" w:hAnsi="Arial Nova Cond"/>
+          <w:sz w:val="24"/>
+          <w:szCs w:val="24"/>
+        </w:rPr>
+        <w:t>diketahui</w:t>
+      </w:r>
+      <w:r>
+        <w:rPr>
+          <w:rFonts w:ascii="Arial Nova Cond" w:hAnsi="Arial Nova Cond"/>
+          <w:sz w:val="24"/>
+          <w:szCs w:val="24"/>
+        </w:rPr>
+        <w:t xml:space="preserve"> dan </w:t>
+      </w:r>
+      <w:r>
+        <w:rPr>
+          <w:rFonts w:ascii="Arial Nova Cond" w:hAnsi="Arial Nova Cond"/>
+          <w:sz w:val="24"/>
+          <w:szCs w:val="24"/>
+        </w:rPr>
+        <w:t>dibenarkan</w:t>
+      </w:r>
+      <w:r>
+        <w:rPr>
+          <w:rFonts w:ascii="Arial Nova Cond" w:hAnsi="Arial Nova Cond"/>
+          <w:sz w:val="24"/>
+          <w:szCs w:val="24"/>
+        </w:rPr>
+        <w:t xml:space="preserve"> oleh </w:t>
+      </w:r>
+      <w:r>
+        <w:rPr>
+          <w:rFonts w:ascii="Arial Nova Cond" w:hAnsi="Arial Nova Cond"/>
+          <w:sz w:val="24"/>
+          <w:szCs w:val="24"/>
+        </w:rPr>
+        <w:t>pihak</w:t>
+      </w:r>
+      <w:r>
+        <w:rPr>
+          <w:rFonts w:ascii="Arial Nova Cond" w:hAnsi="Arial Nova Cond"/>
+          <w:sz w:val="24"/>
+          <w:szCs w:val="24"/>
+        </w:rPr>
+        <w:t xml:space="preserve"> </w:t>
+      </w:r>
+      <w:r>
+        <w:rPr>
+          <w:rFonts w:ascii="Arial Nova Cond" w:hAnsi="Arial Nova Cond"/>
+          <w:sz w:val="24"/>
+          <w:szCs w:val="24"/>
+        </w:rPr>
         <w:t>{nama_badan_usaha_kegiatan}</w:t>
       </w:r>
       <w:r>
@@ -5475,7 +7309,31 @@
           <w:sz w:val="24"/>
           <w:szCs w:val="24"/>
         </w:rPr>
-        <w:t>sebagai berikut :</w:t>
+        <w:t>sebagai</w:t>
+      </w:r>
+      <w:r>
+        <w:rPr>
+          <w:rFonts w:ascii="Arial Nova Cond" w:hAnsi="Arial Nova Cond"/>
+          <w:sz w:val="24"/>
+          <w:szCs w:val="24"/>
+        </w:rPr>
+        <w:t xml:space="preserve"> </w:t>
+      </w:r>
+      <w:r>
+        <w:rPr>
+          <w:rFonts w:ascii="Arial Nova Cond" w:hAnsi="Arial Nova Cond"/>
+          <w:sz w:val="24"/>
+          <w:szCs w:val="24"/>
+        </w:rPr>
+        <w:t>berikut</w:t>
+      </w:r>
+      <w:r>
+        <w:rPr>
+          <w:rFonts w:ascii="Arial Nova Cond" w:hAnsi="Arial Nova Cond"/>
+          <w:sz w:val="24"/>
+          <w:szCs w:val="24"/>
+        </w:rPr>
+        <w:t xml:space="preserve"> :</w:t>
       </w:r>
     </w:p>
     <w:p>
@@ -5716,7 +7574,15 @@
                 <w:sz w:val="24"/>
                 <w:szCs w:val="24"/>
               </w:rPr>
-              <w:t>Nomor HP</w:t>
+              <w:t>Nomor</w:t>
+            </w:r>
+            <w:r>
+              <w:rPr>
+                <w:rFonts w:ascii="Arial Nova Cond" w:hAnsi="Arial Nova Cond"/>
+                <w:sz w:val="24"/>
+                <w:szCs w:val="24"/>
+              </w:rPr>
+              <w:t xml:space="preserve"> HP</w:t>
             </w:r>
           </w:p>
         </w:tc>
@@ -5801,7 +7667,15 @@
                 <w:sz w:val="24"/>
                 <w:szCs w:val="24"/>
               </w:rPr>
-              <w:t>Tanda tangan</w:t>
+              <w:t xml:space="preserve">Tanda </w:t>
+            </w:r>
+            <w:r>
+              <w:rPr>
+                <w:rFonts w:ascii="Arial Nova Cond" w:hAnsi="Arial Nova Cond"/>
+                <w:sz w:val="24"/>
+                <w:szCs w:val="24"/>
+              </w:rPr>
+              <w:t>tangan</w:t>
             </w:r>
           </w:p>
         </w:tc>
@@ -6082,7 +7956,15 @@
                 <w:sz w:val="24"/>
                 <w:szCs w:val="24"/>
               </w:rPr>
-              <w:t>Nomor HP</w:t>
+              <w:t>Nomor</w:t>
+            </w:r>
+            <w:r>
+              <w:rPr>
+                <w:rFonts w:ascii="Arial Nova Cond" w:hAnsi="Arial Nova Cond"/>
+                <w:sz w:val="24"/>
+                <w:szCs w:val="24"/>
+              </w:rPr>
+              <w:t xml:space="preserve"> HP</w:t>
             </w:r>
           </w:p>
         </w:tc>
@@ -6167,7 +8049,15 @@
                 <w:sz w:val="24"/>
                 <w:szCs w:val="24"/>
               </w:rPr>
-              <w:t>Tanda tangan</w:t>
+              <w:t xml:space="preserve">Tanda </w:t>
+            </w:r>
+            <w:r>
+              <w:rPr>
+                <w:rFonts w:ascii="Arial Nova Cond" w:hAnsi="Arial Nova Cond"/>
+                <w:sz w:val="24"/>
+                <w:szCs w:val="24"/>
+              </w:rPr>
+              <w:t>tangan</w:t>
             </w:r>
           </w:p>
         </w:tc>
@@ -6266,7 +8156,124 @@
           <w:sz w:val="24"/>
           <w:szCs w:val="24"/>
         </w:rPr>
-        <w:t xml:space="preserve">Demikian Berita Acara Pengawasan Lingkungan Hidup pada lokasi kegiatan </w:t>
+        <w:t>Demikian</w:t>
+      </w:r>
+      <w:r>
+        <w:rPr>
+          <w:rFonts w:ascii="Arial Nova Cond" w:hAnsi="Arial Nova Cond"/>
+          <w:color w:val="0D0D0D"/>
+          <w:sz w:val="24"/>
+          <w:szCs w:val="24"/>
+        </w:rPr>
+        <w:t xml:space="preserve"> </w:t>
+      </w:r>
+      <w:r>
+        <w:rPr>
+          <w:rFonts w:ascii="Arial Nova Cond" w:hAnsi="Arial Nova Cond"/>
+          <w:color w:val="0D0D0D"/>
+          <w:sz w:val="24"/>
+          <w:szCs w:val="24"/>
+        </w:rPr>
+        <w:t>Berita</w:t>
+      </w:r>
+      <w:r>
+        <w:rPr>
+          <w:rFonts w:ascii="Arial Nova Cond" w:hAnsi="Arial Nova Cond"/>
+          <w:color w:val="0D0D0D"/>
+          <w:sz w:val="24"/>
+          <w:szCs w:val="24"/>
+        </w:rPr>
+        <w:t xml:space="preserve"> Acara </w:t>
+      </w:r>
+      <w:r>
+        <w:rPr>
+          <w:rFonts w:ascii="Arial Nova Cond" w:hAnsi="Arial Nova Cond"/>
+          <w:color w:val="0D0D0D"/>
+          <w:sz w:val="24"/>
+          <w:szCs w:val="24"/>
+        </w:rPr>
+        <w:t>Pengawasan</w:t>
+      </w:r>
+      <w:r>
+        <w:rPr>
+          <w:rFonts w:ascii="Arial Nova Cond" w:hAnsi="Arial Nova Cond"/>
+          <w:color w:val="0D0D0D"/>
+          <w:sz w:val="24"/>
+          <w:szCs w:val="24"/>
+        </w:rPr>
+        <w:t xml:space="preserve"> </w:t>
+      </w:r>
+      <w:r>
+        <w:rPr>
+          <w:rFonts w:ascii="Arial Nova Cond" w:hAnsi="Arial Nova Cond"/>
+          <w:color w:val="0D0D0D"/>
+          <w:sz w:val="24"/>
+          <w:szCs w:val="24"/>
+        </w:rPr>
+        <w:t>Lingkungan</w:t>
+      </w:r>
+      <w:r>
+        <w:rPr>
+          <w:rFonts w:ascii="Arial Nova Cond" w:hAnsi="Arial Nova Cond"/>
+          <w:color w:val="0D0D0D"/>
+          <w:sz w:val="24"/>
+          <w:szCs w:val="24"/>
+        </w:rPr>
+        <w:t xml:space="preserve"> </w:t>
+      </w:r>
+      <w:r>
+        <w:rPr>
+          <w:rFonts w:ascii="Arial Nova Cond" w:hAnsi="Arial Nova Cond"/>
+          <w:color w:val="0D0D0D"/>
+          <w:sz w:val="24"/>
+          <w:szCs w:val="24"/>
+        </w:rPr>
+        <w:t>Hidup</w:t>
+      </w:r>
+      <w:r>
+        <w:rPr>
+          <w:rFonts w:ascii="Arial Nova Cond" w:hAnsi="Arial Nova Cond"/>
+          <w:color w:val="0D0D0D"/>
+          <w:sz w:val="24"/>
+          <w:szCs w:val="24"/>
+        </w:rPr>
+        <w:t xml:space="preserve"> pada </w:t>
+      </w:r>
+      <w:r>
+        <w:rPr>
+          <w:rFonts w:ascii="Arial Nova Cond" w:hAnsi="Arial Nova Cond"/>
+          <w:color w:val="0D0D0D"/>
+          <w:sz w:val="24"/>
+          <w:szCs w:val="24"/>
+        </w:rPr>
+        <w:t>lokasi</w:t>
+      </w:r>
+      <w:r>
+        <w:rPr>
+          <w:rFonts w:ascii="Arial Nova Cond" w:hAnsi="Arial Nova Cond"/>
+          <w:color w:val="0D0D0D"/>
+          <w:sz w:val="24"/>
+          <w:szCs w:val="24"/>
+        </w:rPr>
+        <w:t xml:space="preserve"> </w:t>
+      </w:r>
+      <w:r>
+        <w:rPr>
+          <w:rFonts w:ascii="Arial Nova Cond" w:hAnsi="Arial Nova Cond"/>
+          <w:color w:val="0D0D0D"/>
+          <w:sz w:val="24"/>
+          <w:szCs w:val="24"/>
+        </w:rPr>
+        <w:t>kegiatan</w:t>
+      </w:r>
+      <w:r>
+        <w:rPr>
+          <w:rFonts w:ascii="Arial Nova Cond" w:hAnsi="Arial Nova Cond"/>
+          <w:color w:val="0D0D0D"/>
+          <w:sz w:val="24"/>
+          <w:szCs w:val="24"/>
+        </w:rPr>
+        <w:t xml:space="preserve"> </w:t>
       </w:r>
       <w:r>
         <w:rPr>
@@ -6292,7 +8299,106 @@
           <w:sz w:val="24"/>
           <w:szCs w:val="24"/>
         </w:rPr>
-        <w:t>dibuat dengan sebenar-benarnya dan mengingat sumpah jabatan.</w:t>
+        <w:t>dibuat</w:t>
+      </w:r>
+      <w:r>
+        <w:rPr>
+          <w:rFonts w:ascii="Arial Nova Cond" w:hAnsi="Arial Nova Cond"/>
+          <w:color w:val="0D0D0D"/>
+          <w:sz w:val="24"/>
+          <w:szCs w:val="24"/>
+        </w:rPr>
+        <w:t xml:space="preserve"> </w:t>
+      </w:r>
+      <w:r>
+        <w:rPr>
+          <w:rFonts w:ascii="Arial Nova Cond" w:hAnsi="Arial Nova Cond"/>
+          <w:color w:val="0D0D0D"/>
+          <w:sz w:val="24"/>
+          <w:szCs w:val="24"/>
+        </w:rPr>
+        <w:t>dengan</w:t>
+      </w:r>
+      <w:r>
+        <w:rPr>
+          <w:rFonts w:ascii="Arial Nova Cond" w:hAnsi="Arial Nova Cond"/>
+          <w:color w:val="0D0D0D"/>
+          <w:sz w:val="24"/>
+          <w:szCs w:val="24"/>
+        </w:rPr>
+        <w:t xml:space="preserve"> </w:t>
+      </w:r>
+      <w:r>
+        <w:rPr>
+          <w:rFonts w:ascii="Arial Nova Cond" w:hAnsi="Arial Nova Cond"/>
+          <w:color w:val="0D0D0D"/>
+          <w:sz w:val="24"/>
+          <w:szCs w:val="24"/>
+        </w:rPr>
+        <w:t>sebenar-benarnya</w:t>
+      </w:r>
+      <w:r>
+        <w:rPr>
+          <w:rFonts w:ascii="Arial Nova Cond" w:hAnsi="Arial Nova Cond"/>
+          <w:color w:val="0D0D0D"/>
+          <w:sz w:val="24"/>
+          <w:szCs w:val="24"/>
+        </w:rPr>
+        <w:t xml:space="preserve"> dan </w:t>
+      </w:r>
+      <w:r>
+        <w:rPr>
+          <w:rFonts w:ascii="Arial Nova Cond" w:hAnsi="Arial Nova Cond"/>
+          <w:color w:val="0D0D0D"/>
+          <w:sz w:val="24"/>
+          <w:szCs w:val="24"/>
+        </w:rPr>
+        <w:t>mengingat</w:t>
+      </w:r>
+      <w:r>
+        <w:rPr>
+          <w:rFonts w:ascii="Arial Nova Cond" w:hAnsi="Arial Nova Cond"/>
+          <w:color w:val="0D0D0D"/>
+          <w:sz w:val="24"/>
+          <w:szCs w:val="24"/>
+        </w:rPr>
+        <w:t xml:space="preserve"> </w:t>
+      </w:r>
+      <w:r>
+        <w:rPr>
+          <w:rFonts w:ascii="Arial Nova Cond" w:hAnsi="Arial Nova Cond"/>
+          <w:color w:val="0D0D0D"/>
+          <w:sz w:val="24"/>
+          <w:szCs w:val="24"/>
+        </w:rPr>
+        <w:t>sumpah</w:t>
+      </w:r>
+      <w:r>
+        <w:rPr>
+          <w:rFonts w:ascii="Arial Nova Cond" w:hAnsi="Arial Nova Cond"/>
+          <w:color w:val="0D0D0D"/>
+          <w:sz w:val="24"/>
+          <w:szCs w:val="24"/>
+        </w:rPr>
+        <w:t xml:space="preserve"> </w:t>
+      </w:r>
+      <w:r>
+        <w:rPr>
+          <w:rFonts w:ascii="Arial Nova Cond" w:hAnsi="Arial Nova Cond"/>
+          <w:color w:val="0D0D0D"/>
+          <w:sz w:val="24"/>
+          <w:szCs w:val="24"/>
+        </w:rPr>
+        <w:t>jabatan</w:t>
+      </w:r>
+      <w:r>
+        <w:rPr>
+          <w:rFonts w:ascii="Arial Nova Cond" w:hAnsi="Arial Nova Cond"/>
+          <w:color w:val="0D0D0D"/>
+          <w:sz w:val="24"/>
+          <w:szCs w:val="24"/>
+        </w:rPr>
+        <w:t>.</w:t>
       </w:r>
     </w:p>
     <w:p>
@@ -6329,7 +8435,77 @@
           <w:szCs w:val="24"/>
           <w:lang w:eastAsia="en-ID"/>
         </w:rPr>
-        <w:t>Tim Pejabat Pengawas Lingkungan Hidup</w:t>
+        <w:t xml:space="preserve">Tim </w:t>
+      </w:r>
+      <w:r>
+        <w:rPr>
+          <w:rFonts w:ascii="Arial Nova Cond" w:eastAsia="Times New Roman" w:hAnsi="Arial Nova Cond" w:cs="Times New Roman"/>
+          <w:color w:val="0D0D0D"/>
+          <w:sz w:val="24"/>
+          <w:szCs w:val="24"/>
+          <w:lang w:eastAsia="en-ID"/>
+        </w:rPr>
+        <w:t>Pejabat</w:t>
+      </w:r>
+      <w:r>
+        <w:rPr>
+          <w:rFonts w:ascii="Arial Nova Cond" w:eastAsia="Times New Roman" w:hAnsi="Arial Nova Cond" w:cs="Times New Roman"/>
+          <w:color w:val="0D0D0D"/>
+          <w:sz w:val="24"/>
+          <w:szCs w:val="24"/>
+          <w:lang w:eastAsia="en-ID"/>
+        </w:rPr>
+        <w:t xml:space="preserve"> </w:t>
+      </w:r>
+      <w:r>
+        <w:rPr>
+          <w:rFonts w:ascii="Arial Nova Cond" w:eastAsia="Times New Roman" w:hAnsi="Arial Nova Cond" w:cs="Times New Roman"/>
+          <w:color w:val="0D0D0D"/>
+          <w:sz w:val="24"/>
+          <w:szCs w:val="24"/>
+          <w:lang w:eastAsia="en-ID"/>
+        </w:rPr>
+        <w:t>Pengawas</w:t>
+      </w:r>
+      <w:r>
+        <w:rPr>
+          <w:rFonts w:ascii="Arial Nova Cond" w:eastAsia="Times New Roman" w:hAnsi="Arial Nova Cond" w:cs="Times New Roman"/>
+          <w:color w:val="0D0D0D"/>
+          <w:sz w:val="24"/>
+          <w:szCs w:val="24"/>
+          <w:lang w:eastAsia="en-ID"/>
+        </w:rPr>
+        <w:t xml:space="preserve"> </w:t>
+      </w:r>
+      <w:r>
+        <w:rPr>
+          <w:rFonts w:ascii="Arial Nova Cond" w:eastAsia="Times New Roman" w:hAnsi="Arial Nova Cond" w:cs="Times New Roman"/>
+          <w:color w:val="0D0D0D"/>
+          <w:sz w:val="24"/>
+          <w:szCs w:val="24"/>
+          <w:lang w:eastAsia="en-ID"/>
+        </w:rPr>
+        <w:t>Lingkungan</w:t>
+      </w:r>
+      <w:r>
+        <w:rPr>
+          <w:rFonts w:ascii="Arial Nova Cond" w:eastAsia="Times New Roman" w:hAnsi="Arial Nova Cond" w:cs="Times New Roman"/>
+          <w:color w:val="0D0D0D"/>
+          <w:sz w:val="24"/>
+          <w:szCs w:val="24"/>
+          <w:lang w:eastAsia="en-ID"/>
+        </w:rPr>
+        <w:t xml:space="preserve"> </w:t>
+      </w:r>
+      <w:r>
+        <w:rPr>
+          <w:rFonts w:ascii="Arial Nova Cond" w:eastAsia="Times New Roman" w:hAnsi="Arial Nova Cond" w:cs="Times New Roman"/>
+          <w:color w:val="0D0D0D"/>
+          <w:sz w:val="24"/>
+          <w:szCs w:val="24"/>
+          <w:lang w:eastAsia="en-ID"/>
+        </w:rPr>
+        <w:t>Hidup</w:t>
       </w:r>
     </w:p>
     <w:p>
@@ -6521,7 +8697,27 @@
                 <w:szCs w:val="24"/>
                 <w:lang w:eastAsia="en-ID"/>
               </w:rPr>
-              <w:t xml:space="preserve">Tanda tangan </w:t>
+              <w:t xml:space="preserve">Tanda </w:t>
+            </w:r>
+            <w:r>
+              <w:rPr>
+                <w:rFonts w:ascii="Arial Nova Cond" w:eastAsia="Times New Roman" w:hAnsi="Arial Nova Cond" w:cs="Times New Roman"/>
+                <w:color w:val="0D0D0D"/>
+                <w:sz w:val="24"/>
+                <w:szCs w:val="24"/>
+                <w:lang w:eastAsia="en-ID"/>
+              </w:rPr>
+              <w:t>tangan</w:t>
+            </w:r>
+            <w:r>
+              <w:rPr>
+                <w:rFonts w:ascii="Arial Nova Cond" w:eastAsia="Times New Roman" w:hAnsi="Arial Nova Cond" w:cs="Times New Roman"/>
+                <w:color w:val="0D0D0D"/>
+                <w:sz w:val="24"/>
+                <w:szCs w:val="24"/>
+                <w:lang w:eastAsia="en-ID"/>
+              </w:rPr>
+              <w:t xml:space="preserve"> </w:t>
             </w:r>
           </w:p>
         </w:tc>
@@ -6634,7 +8830,16 @@
           <w:sz w:val="24"/>
           <w:szCs w:val="24"/>
         </w:rPr>
-        <w:t xml:space="preserve">Saksi </w:t>
+        <w:t>Saksi</w:t>
+      </w:r>
+      <w:r>
+        <w:rPr>
+          <w:rFonts w:ascii="Arial Nova Cond" w:hAnsi="Arial Nova Cond"/>
+          <w:color w:val="0D0D0D"/>
+          <w:sz w:val="24"/>
+          <w:szCs w:val="24"/>
+        </w:rPr>
+        <w:t xml:space="preserve"> </w:t>
       </w:r>
     </w:p>
     <w:tbl>
@@ -6652,16 +8857,12 @@
         <w:tblLook w:val="04A0" w:firstRow="1" w:lastRow="0" w:firstColumn="1" w:lastColumn="0" w:noHBand="0" w:noVBand="1"/>
       </w:tblPr>
       <w:tblGrid>
-        <w:gridCol w:w="351"/>
-        <w:gridCol w:w="4509"/>
-        <w:gridCol w:w="265"/>
-        <w:gridCol w:w="4509"/>
+        <w:gridCol w:w="421"/>
+        <w:gridCol w:w="1808"/>
+        <w:gridCol w:w="283"/>
+        <w:gridCol w:w="7122"/>
       </w:tblGrid>
       <w:tr>
-        <w:trPr>
-          <w:gridAfter w:val="2"/>
-          <w:wAfter w:w="7405" w:type="dxa"/>
-        </w:trPr>
         <w:tc>
           <w:tcPr>
             <w:tcW w:w="421" w:type="dxa"/>
@@ -6686,9 +8887,18 @@
                 <w:szCs w:val="24"/>
                 <w:lang w:eastAsia="en-ID"/>
               </w:rPr>
-              <w:t xml:space="preserve">{#saksi} </w:t>
-            </w:r>
-            <w:r>
+              <w:t>{#saksi} {no}.</w:t>
+            </w:r>
+          </w:p>
+        </w:tc>
+        <w:tc>
+          <w:tcPr>
+            <w:tcW w:w="7122" w:type="dxa"/>
+            <w:vAlign w:val="center"/>
+          </w:tcPr>
+          <w:p>
+            <w:pPr>
+              <w:spacing w:after="0" w:line="240" w:lineRule="auto"/>
               <w:rPr>
                 <w:rFonts w:ascii="Arial Nova Cond" w:eastAsia="Times New Roman" w:hAnsi="Arial Nova Cond" w:cs="Times New Roman"/>
                 <w:color w:val="0D0D0D"/>
@@ -6696,19 +8906,8 @@
                 <w:szCs w:val="24"/>
                 <w:lang w:eastAsia="en-ID"/>
               </w:rPr>
-              <w:lastRenderedPageBreak/>
-              <w:t>{no}.</w:t>
-            </w:r>
-          </w:p>
-        </w:tc>
-        <w:tc>
-          <w:tcPr>
-            <w:tcW w:w="7122" w:type="dxa"/>
-            <w:vAlign w:val="center"/>
-          </w:tcPr>
-          <w:p>
-            <w:pPr>
-              <w:spacing w:after="0" w:line="240" w:lineRule="auto"/>
+            </w:pPr>
+            <w:r>
               <w:rPr>
                 <w:rFonts w:ascii="Arial Nova Cond" w:eastAsia="Times New Roman" w:hAnsi="Arial Nova Cond" w:cs="Times New Roman"/>
                 <w:color w:val="0D0D0D"/>
@@ -6716,16 +8915,6 @@
                 <w:szCs w:val="24"/>
                 <w:lang w:eastAsia="en-ID"/>
               </w:rPr>
-            </w:pPr>
-            <w:r>
-              <w:rPr>
-                <w:rFonts w:ascii="Arial Nova Cond" w:eastAsia="Times New Roman" w:hAnsi="Arial Nova Cond" w:cs="Times New Roman"/>
-                <w:color w:val="0D0D0D"/>
-                <w:sz w:val="24"/>
-                <w:szCs w:val="24"/>
-                <w:lang w:eastAsia="en-ID"/>
-              </w:rPr>
-              <w:lastRenderedPageBreak/>
               <w:t>{nama_saksi}</w:t>
             </w:r>
           </w:p>
@@ -6877,7 +9066,27 @@
                 <w:szCs w:val="24"/>
                 <w:lang w:eastAsia="en-ID"/>
               </w:rPr>
-              <w:t xml:space="preserve">Tanda tangan </w:t>
+              <w:t xml:space="preserve">Tanda </w:t>
+            </w:r>
+            <w:r>
+              <w:rPr>
+                <w:rFonts w:ascii="Arial Nova Cond" w:eastAsia="Times New Roman" w:hAnsi="Arial Nova Cond" w:cs="Times New Roman"/>
+                <w:color w:val="0D0D0D"/>
+                <w:sz w:val="24"/>
+                <w:szCs w:val="24"/>
+                <w:lang w:eastAsia="en-ID"/>
+              </w:rPr>
+              <w:t>tangan</w:t>
+            </w:r>
+            <w:r>
+              <w:rPr>
+                <w:rFonts w:ascii="Arial Nova Cond" w:eastAsia="Times New Roman" w:hAnsi="Arial Nova Cond" w:cs="Times New Roman"/>
+                <w:color w:val="0D0D0D"/>
+                <w:sz w:val="24"/>
+                <w:szCs w:val="24"/>
+                <w:lang w:eastAsia="en-ID"/>
+              </w:rPr>
+              <w:t xml:space="preserve"> </w:t>
             </w:r>
           </w:p>
         </w:tc>
@@ -7073,7 +9282,31 @@
                               <w:sz w:val="20"/>
                               <w:szCs w:val="20"/>
                             </w:rPr>
-                            <w:t xml:space="preserve">Paraf Tim Pengawas </w:t>
+                            <w:t>Paraf</w:t>
+                          </w:r>
+                          <w:r>
+                            <w:rPr>
+                              <w:rFonts w:ascii="Arial Nova Cond" w:hAnsi="Arial Nova Cond"/>
+                              <w:sz w:val="20"/>
+                              <w:szCs w:val="20"/>
+                            </w:rPr>
+                            <w:t xml:space="preserve"> Tim </w:t>
+                          </w:r>
+                          <w:r>
+                            <w:rPr>
+                              <w:rFonts w:ascii="Arial Nova Cond" w:hAnsi="Arial Nova Cond"/>
+                              <w:sz w:val="20"/>
+                              <w:szCs w:val="20"/>
+                            </w:rPr>
+                            <w:t>Pengawas</w:t>
+                          </w:r>
+                          <w:r>
+                            <w:rPr>
+                              <w:rFonts w:ascii="Arial Nova Cond" w:hAnsi="Arial Nova Cond"/>
+                              <w:sz w:val="20"/>
+                              <w:szCs w:val="20"/>
+                            </w:rPr>
+                            <w:t xml:space="preserve"> </w:t>
                           </w:r>
                           <w:r>
                             <w:rPr>
@@ -7239,7 +9472,47 @@
                               <w:sz w:val="20"/>
                               <w:szCs w:val="20"/>
                             </w:rPr>
-                            <w:t xml:space="preserve">Paraf Pihak Usaha/ Kegiatan </w:t>
+                            <w:t>Paraf</w:t>
+                          </w:r>
+                          <w:r>
+                            <w:rPr>
+                              <w:rFonts w:ascii="Arial Nova Cond" w:hAnsi="Arial Nova Cond" w:cs="Arial"/>
+                              <w:sz w:val="20"/>
+                              <w:szCs w:val="20"/>
+                            </w:rPr>
+                            <w:t xml:space="preserve"> </w:t>
+                          </w:r>
+                          <w:r>
+                            <w:rPr>
+                              <w:rFonts w:ascii="Arial Nova Cond" w:hAnsi="Arial Nova Cond" w:cs="Arial"/>
+                              <w:sz w:val="20"/>
+                              <w:szCs w:val="20"/>
+                            </w:rPr>
+                            <w:t>Pihak</w:t>
+                          </w:r>
+                          <w:r>
+                            <w:rPr>
+                              <w:rFonts w:ascii="Arial Nova Cond" w:hAnsi="Arial Nova Cond" w:cs="Arial"/>
+                              <w:sz w:val="20"/>
+                              <w:szCs w:val="20"/>
+                            </w:rPr>
+                            <w:t xml:space="preserve"> Usaha/ </w:t>
+                          </w:r>
+                          <w:r>
+                            <w:rPr>
+                              <w:rFonts w:ascii="Arial Nova Cond" w:hAnsi="Arial Nova Cond" w:cs="Arial"/>
+                              <w:sz w:val="20"/>
+                              <w:szCs w:val="20"/>
+                            </w:rPr>
+                            <w:t>Kegiatan</w:t>
+                          </w:r>
+                          <w:r>
+                            <w:rPr>
+                              <w:rFonts w:ascii="Arial Nova Cond" w:hAnsi="Arial Nova Cond" w:cs="Arial"/>
+                              <w:sz w:val="20"/>
+                              <w:szCs w:val="20"/>
+                            </w:rPr>
+                            <w:t xml:space="preserve"> </w:t>
                           </w:r>
                           <w:r>
                             <w:rPr>

</xml_diff>

<commit_message>
fix: map jumlah_karyawan to pekerja field in fasyankes
</commit_message>
<xml_diff>
--- a/public/templates-bap/bap-fasyankes.docx
+++ b/public/templates-bap/bap-fasyankes.docx
@@ -43,7 +43,7 @@
                 <w:lang w:val="en-US"/>
               </w:rPr>
               <w:drawing>
-                <wp:anchor distT="0" distB="0" distL="114300" distR="114300" simplePos="0" relativeHeight="251658752" behindDoc="0" locked="0" layoutInCell="1" allowOverlap="1" wp14:anchorId="069080DA" wp14:editId="3A31AD63">
+                <wp:anchor distT="0" distB="0" distL="114300" distR="114300" simplePos="0" relativeHeight="251658752" behindDoc="0" locked="0" layoutInCell="1" allowOverlap="1" wp14:anchorId="069080DA" wp14:editId="5A097F3A">
                   <wp:simplePos x="0" y="0"/>
                   <wp:positionH relativeFrom="column">
                     <wp:posOffset>68580</wp:posOffset>
@@ -164,107 +164,23 @@
                 <w:rFonts w:ascii="Arial" w:hAnsi="Arial" w:cs="Arial"/>
                 <w:lang w:val="en-US"/>
               </w:rPr>
-              <w:t xml:space="preserve">Jl. </w:t>
-            </w:r>
-            <w:r>
+              <w:t>Jl. Ronggowarsito No.18b, Sragen Wetan, Sragen, Jawa Tengah</w:t>
+            </w:r>
+          </w:p>
+          <w:p>
+            <w:pPr>
+              <w:jc w:val="center"/>
               <w:rPr>
                 <w:rFonts w:ascii="Arial" w:hAnsi="Arial" w:cs="Arial"/>
                 <w:lang w:val="en-US"/>
               </w:rPr>
-              <w:t>Ronggowarsito</w:t>
-            </w:r>
+            </w:pPr>
             <w:r>
               <w:rPr>
                 <w:rFonts w:ascii="Arial" w:hAnsi="Arial" w:cs="Arial"/>
                 <w:lang w:val="en-US"/>
               </w:rPr>
-              <w:t xml:space="preserve"> No.18b, </w:t>
-            </w:r>
-            <w:r>
-              <w:rPr>
-                <w:rFonts w:ascii="Arial" w:hAnsi="Arial" w:cs="Arial"/>
-                <w:lang w:val="en-US"/>
-              </w:rPr>
-              <w:t>Sragen</w:t>
-            </w:r>
-            <w:r>
-              <w:rPr>
-                <w:rFonts w:ascii="Arial" w:hAnsi="Arial" w:cs="Arial"/>
-                <w:lang w:val="en-US"/>
-              </w:rPr>
-              <w:t xml:space="preserve"> </w:t>
-            </w:r>
-            <w:r>
-              <w:rPr>
-                <w:rFonts w:ascii="Arial" w:hAnsi="Arial" w:cs="Arial"/>
-                <w:lang w:val="en-US"/>
-              </w:rPr>
-              <w:t>Wetan</w:t>
-            </w:r>
-            <w:r>
-              <w:rPr>
-                <w:rFonts w:ascii="Arial" w:hAnsi="Arial" w:cs="Arial"/>
-                <w:lang w:val="en-US"/>
-              </w:rPr>
-              <w:t xml:space="preserve">, </w:t>
-            </w:r>
-            <w:r>
-              <w:rPr>
-                <w:rFonts w:ascii="Arial" w:hAnsi="Arial" w:cs="Arial"/>
-                <w:lang w:val="en-US"/>
-              </w:rPr>
-              <w:t>Sragen</w:t>
-            </w:r>
-            <w:r>
-              <w:rPr>
-                <w:rFonts w:ascii="Arial" w:hAnsi="Arial" w:cs="Arial"/>
-                <w:lang w:val="en-US"/>
-              </w:rPr>
-              <w:t xml:space="preserve">, </w:t>
-            </w:r>
-            <w:r>
-              <w:rPr>
-                <w:rFonts w:ascii="Arial" w:hAnsi="Arial" w:cs="Arial"/>
-                <w:lang w:val="en-US"/>
-              </w:rPr>
-              <w:t>Jawa</w:t>
-            </w:r>
-            <w:r>
-              <w:rPr>
-                <w:rFonts w:ascii="Arial" w:hAnsi="Arial" w:cs="Arial"/>
-                <w:lang w:val="en-US"/>
-              </w:rPr>
-              <w:t xml:space="preserve"> Tengah</w:t>
-            </w:r>
-          </w:p>
-          <w:p>
-            <w:pPr>
-              <w:jc w:val="center"/>
-              <w:rPr>
-                <w:rFonts w:ascii="Arial" w:hAnsi="Arial" w:cs="Arial"/>
-                <w:lang w:val="en-US"/>
-              </w:rPr>
-            </w:pPr>
-            <w:r>
-              <w:rPr>
-                <w:rFonts w:ascii="Arial" w:hAnsi="Arial" w:cs="Arial"/>
-                <w:lang w:val="en-US"/>
-              </w:rPr>
-              <w:t xml:space="preserve">Telp. (0271) </w:t>
-            </w:r>
-            <w:r>
-              <w:rPr>
-                <w:rFonts w:ascii="Arial" w:hAnsi="Arial" w:cs="Arial"/>
-                <w:lang w:val="en-US"/>
-              </w:rPr>
-              <w:t>891136  Email</w:t>
-            </w:r>
-            <w:r>
-              <w:rPr>
-                <w:rFonts w:ascii="Arial" w:hAnsi="Arial" w:cs="Arial"/>
-                <w:lang w:val="en-US"/>
-              </w:rPr>
-              <w:t xml:space="preserve"> : dlhsragenkab@gmail.com</w:t>
+              <w:t>Telp. (0271) 891136  Email : dlhsragenkab@gmail.com</w:t>
             </w:r>
           </w:p>
           <w:p>
@@ -356,15 +272,7 @@
           <w:sz w:val="24"/>
           <w:szCs w:val="24"/>
         </w:rPr>
-        <w:t>Nomor</w:t>
-      </w:r>
-      <w:r>
-        <w:rPr>
-          <w:rFonts w:ascii="Arial Nova Cond" w:hAnsi="Arial Nova Cond"/>
-          <w:sz w:val="24"/>
-          <w:szCs w:val="24"/>
-        </w:rPr>
-        <w:t>: 600.4/         /BAP/17/</w:t>
+        <w:t>Nomor: 600.4/         /BAP/17/</w:t>
       </w:r>
       <w:r>
         <w:rPr>
@@ -401,71 +309,7 @@
           <w:sz w:val="24"/>
           <w:szCs w:val="24"/>
         </w:rPr>
-        <w:t xml:space="preserve">Pada </w:t>
-      </w:r>
-      <w:r>
-        <w:rPr>
-          <w:rFonts w:ascii="Arial Nova Cond" w:hAnsi="Arial Nova Cond"/>
-          <w:sz w:val="24"/>
-          <w:szCs w:val="24"/>
-        </w:rPr>
-        <w:t>hari</w:t>
-      </w:r>
-      <w:r>
-        <w:rPr>
-          <w:rFonts w:ascii="Arial Nova Cond" w:hAnsi="Arial Nova Cond"/>
-          <w:sz w:val="24"/>
-          <w:szCs w:val="24"/>
-        </w:rPr>
-        <w:t xml:space="preserve"> </w:t>
-      </w:r>
-      <w:r>
-        <w:rPr>
-          <w:rFonts w:ascii="Arial Nova Cond" w:hAnsi="Arial Nova Cond"/>
-          <w:sz w:val="24"/>
-          <w:szCs w:val="24"/>
-        </w:rPr>
-        <w:t>ini</w:t>
-      </w:r>
-      <w:r>
-        <w:rPr>
-          <w:rFonts w:ascii="Arial Nova Cond" w:hAnsi="Arial Nova Cond"/>
-          <w:sz w:val="24"/>
-          <w:szCs w:val="24"/>
-        </w:rPr>
-        <w:t xml:space="preserve"> {hari_ini_nama}, </w:t>
-      </w:r>
-      <w:r>
-        <w:rPr>
-          <w:rFonts w:ascii="Arial Nova Cond" w:hAnsi="Arial Nova Cond"/>
-          <w:sz w:val="24"/>
-          <w:szCs w:val="24"/>
-        </w:rPr>
-        <w:t>tanggal</w:t>
-      </w:r>
-      <w:r>
-        <w:rPr>
-          <w:rFonts w:ascii="Arial Nova Cond" w:hAnsi="Arial Nova Cond"/>
-          <w:sz w:val="24"/>
-          <w:szCs w:val="24"/>
-        </w:rPr>
-        <w:t xml:space="preserve"> {hari_ini_tanggal_terbilang} </w:t>
-      </w:r>
-      <w:r>
-        <w:rPr>
-          <w:rFonts w:ascii="Arial Nova Cond" w:hAnsi="Arial Nova Cond"/>
-          <w:sz w:val="24"/>
-          <w:szCs w:val="24"/>
-        </w:rPr>
-        <w:t>bulan</w:t>
-      </w:r>
-      <w:r>
-        <w:rPr>
-          <w:rFonts w:ascii="Arial Nova Cond" w:hAnsi="Arial Nova Cond"/>
-          <w:sz w:val="24"/>
-          <w:szCs w:val="24"/>
-        </w:rPr>
-        <w:t xml:space="preserve"> {hari_ini_bulan}</w:t>
+        <w:t>Pada hari ini {hari_ini_nama}, tanggal {hari_ini_tanggal_terbilang} bulan {hari_ini_bulan}</w:t>
       </w:r>
       <w:r>
         <w:rPr>
@@ -483,15 +327,7 @@
           <w:sz w:val="24"/>
           <w:szCs w:val="24"/>
         </w:rPr>
-        <w:t>tahun</w:t>
-      </w:r>
-      <w:r>
-        <w:rPr>
-          <w:rFonts w:ascii="Arial Nova Cond" w:hAnsi="Arial Nova Cond"/>
-          <w:sz w:val="24"/>
-          <w:szCs w:val="24"/>
-        </w:rPr>
-        <w:t xml:space="preserve"> {hari_ini_tahun_terbilang}</w:t>
+        <w:t>tahun {hari_ini_tahun_terbilang}</w:t>
       </w:r>
       <w:r>
         <w:rPr>
@@ -509,223 +345,7 @@
           <w:sz w:val="24"/>
           <w:szCs w:val="24"/>
         </w:rPr>
-        <w:t>pukul</w:t>
-      </w:r>
-      <w:r>
-        <w:rPr>
-          <w:rFonts w:ascii="Arial Nova Cond" w:hAnsi="Arial Nova Cond"/>
-          <w:sz w:val="24"/>
-          <w:szCs w:val="24"/>
-        </w:rPr>
-        <w:t xml:space="preserve"> {waktu_pengawasan} WIB, di </w:t>
-      </w:r>
-      <w:r>
-        <w:rPr>
-          <w:rFonts w:ascii="Arial Nova Cond" w:hAnsi="Arial Nova Cond"/>
-          <w:sz w:val="24"/>
-          <w:szCs w:val="24"/>
-        </w:rPr>
-        <w:t>lokasi</w:t>
-      </w:r>
-      <w:r>
-        <w:rPr>
-          <w:rFonts w:ascii="Arial Nova Cond" w:hAnsi="Arial Nova Cond"/>
-          <w:sz w:val="24"/>
-          <w:szCs w:val="24"/>
-        </w:rPr>
-        <w:t xml:space="preserve"> {nama_badan_usaha_kegiatan}, {alamat_lokasi}, </w:t>
-      </w:r>
-      <w:r>
-        <w:rPr>
-          <w:rFonts w:ascii="Arial Nova Cond" w:hAnsi="Arial Nova Cond"/>
-          <w:sz w:val="24"/>
-          <w:szCs w:val="24"/>
-        </w:rPr>
-        <w:t>telah</w:t>
-      </w:r>
-      <w:r>
-        <w:rPr>
-          <w:rFonts w:ascii="Arial Nova Cond" w:hAnsi="Arial Nova Cond"/>
-          <w:sz w:val="24"/>
-          <w:szCs w:val="24"/>
-        </w:rPr>
-        <w:t xml:space="preserve"> </w:t>
-      </w:r>
-      <w:r>
-        <w:rPr>
-          <w:rFonts w:ascii="Arial Nova Cond" w:hAnsi="Arial Nova Cond"/>
-          <w:sz w:val="24"/>
-          <w:szCs w:val="24"/>
-        </w:rPr>
-        <w:t>dilakukan</w:t>
-      </w:r>
-      <w:r>
-        <w:rPr>
-          <w:rFonts w:ascii="Arial Nova Cond" w:hAnsi="Arial Nova Cond"/>
-          <w:sz w:val="24"/>
-          <w:szCs w:val="24"/>
-        </w:rPr>
-        <w:t xml:space="preserve"> </w:t>
-      </w:r>
-      <w:r>
-        <w:rPr>
-          <w:rFonts w:ascii="Arial Nova Cond" w:hAnsi="Arial Nova Cond"/>
-          <w:sz w:val="24"/>
-          <w:szCs w:val="24"/>
-        </w:rPr>
-        <w:t>penandatanganan</w:t>
-      </w:r>
-      <w:r>
-        <w:rPr>
-          <w:rFonts w:ascii="Arial Nova Cond" w:hAnsi="Arial Nova Cond"/>
-          <w:sz w:val="24"/>
-          <w:szCs w:val="24"/>
-        </w:rPr>
-        <w:t xml:space="preserve"> </w:t>
-      </w:r>
-      <w:r>
-        <w:rPr>
-          <w:rFonts w:ascii="Arial Nova Cond" w:hAnsi="Arial Nova Cond"/>
-          <w:sz w:val="24"/>
-          <w:szCs w:val="24"/>
-        </w:rPr>
-        <w:t>berita</w:t>
-      </w:r>
-      <w:r>
-        <w:rPr>
-          <w:rFonts w:ascii="Arial Nova Cond" w:hAnsi="Arial Nova Cond"/>
-          <w:sz w:val="24"/>
-          <w:szCs w:val="24"/>
-        </w:rPr>
-        <w:t xml:space="preserve"> acara </w:t>
-      </w:r>
-      <w:r>
-        <w:rPr>
-          <w:rFonts w:ascii="Arial Nova Cond" w:hAnsi="Arial Nova Cond"/>
-          <w:sz w:val="24"/>
-          <w:szCs w:val="24"/>
-        </w:rPr>
-        <w:t>pengawasan</w:t>
-      </w:r>
-      <w:r>
-        <w:rPr>
-          <w:rFonts w:ascii="Arial Nova Cond" w:hAnsi="Arial Nova Cond"/>
-          <w:sz w:val="24"/>
-          <w:szCs w:val="24"/>
-        </w:rPr>
-        <w:t xml:space="preserve"> </w:t>
-      </w:r>
-      <w:r>
-        <w:rPr>
-          <w:rFonts w:ascii="Arial Nova Cond" w:hAnsi="Arial Nova Cond"/>
-          <w:sz w:val="24"/>
-          <w:szCs w:val="24"/>
-        </w:rPr>
-        <w:t>lingkungan</w:t>
-      </w:r>
-      <w:r>
-        <w:rPr>
-          <w:rFonts w:ascii="Arial Nova Cond" w:hAnsi="Arial Nova Cond"/>
-          <w:sz w:val="24"/>
-          <w:szCs w:val="24"/>
-        </w:rPr>
-        <w:t xml:space="preserve"> </w:t>
-      </w:r>
-      <w:r>
-        <w:rPr>
-          <w:rFonts w:ascii="Arial Nova Cond" w:hAnsi="Arial Nova Cond"/>
-          <w:sz w:val="24"/>
-          <w:szCs w:val="24"/>
-        </w:rPr>
-        <w:t>hidup</w:t>
-      </w:r>
-      <w:r>
-        <w:rPr>
-          <w:rFonts w:ascii="Arial Nova Cond" w:hAnsi="Arial Nova Cond"/>
-          <w:sz w:val="24"/>
-          <w:szCs w:val="24"/>
-        </w:rPr>
-        <w:t xml:space="preserve"> </w:t>
-      </w:r>
-      <w:r>
-        <w:rPr>
-          <w:rFonts w:ascii="Arial Nova Cond" w:hAnsi="Arial Nova Cond"/>
-          <w:sz w:val="24"/>
-          <w:szCs w:val="24"/>
-        </w:rPr>
-        <w:t>terhadap</w:t>
-      </w:r>
-      <w:r>
-        <w:rPr>
-          <w:rFonts w:ascii="Arial Nova Cond" w:hAnsi="Arial Nova Cond"/>
-          <w:sz w:val="24"/>
-          <w:szCs w:val="24"/>
-        </w:rPr>
-        <w:t xml:space="preserve"> {nama_badan_usaha_kegiatan} </w:t>
-      </w:r>
-      <w:r>
-        <w:rPr>
-          <w:rFonts w:ascii="Arial Nova Cond" w:hAnsi="Arial Nova Cond"/>
-          <w:sz w:val="24"/>
-          <w:szCs w:val="24"/>
-        </w:rPr>
-        <w:t>dengan</w:t>
-      </w:r>
-      <w:r>
-        <w:rPr>
-          <w:rFonts w:ascii="Arial Nova Cond" w:hAnsi="Arial Nova Cond"/>
-          <w:sz w:val="24"/>
-          <w:szCs w:val="24"/>
-        </w:rPr>
-        <w:t xml:space="preserve"> </w:t>
-      </w:r>
-      <w:r>
-        <w:rPr>
-          <w:rFonts w:ascii="Arial Nova Cond" w:hAnsi="Arial Nova Cond"/>
-          <w:sz w:val="24"/>
-          <w:szCs w:val="24"/>
-        </w:rPr>
-        <w:t>hasil</w:t>
-      </w:r>
-      <w:r>
-        <w:rPr>
-          <w:rFonts w:ascii="Arial Nova Cond" w:hAnsi="Arial Nova Cond"/>
-          <w:sz w:val="24"/>
-          <w:szCs w:val="24"/>
-        </w:rPr>
-        <w:t xml:space="preserve"> </w:t>
-      </w:r>
-      <w:r>
-        <w:rPr>
-          <w:rFonts w:ascii="Arial Nova Cond" w:hAnsi="Arial Nova Cond"/>
-          <w:sz w:val="24"/>
-          <w:szCs w:val="24"/>
-        </w:rPr>
-        <w:t>sebagai</w:t>
-      </w:r>
-      <w:r>
-        <w:rPr>
-          <w:rFonts w:ascii="Arial Nova Cond" w:hAnsi="Arial Nova Cond"/>
-          <w:sz w:val="24"/>
-          <w:szCs w:val="24"/>
-        </w:rPr>
-        <w:t xml:space="preserve"> </w:t>
-      </w:r>
-      <w:r>
-        <w:rPr>
-          <w:rFonts w:ascii="Arial Nova Cond" w:hAnsi="Arial Nova Cond"/>
-          <w:sz w:val="24"/>
-          <w:szCs w:val="24"/>
-        </w:rPr>
-        <w:t>berikut</w:t>
-      </w:r>
-      <w:r>
-        <w:rPr>
-          <w:rFonts w:ascii="Arial Nova Cond" w:hAnsi="Arial Nova Cond"/>
-          <w:sz w:val="24"/>
-          <w:szCs w:val="24"/>
-        </w:rPr>
-        <w:t>:</w:t>
+        <w:t>pukul {waktu_pengawasan} WIB, di lokasi {nama_badan_usaha_kegiatan}, {alamat_lokasi}, telah dilakukan penandatanganan berita acara pengawasan lingkungan hidup terhadap {nama_badan_usaha_kegiatan} dengan hasil sebagai berikut:</w:t>
       </w:r>
     </w:p>
     <w:p>
@@ -755,23 +375,7 @@
           <w:sz w:val="24"/>
           <w:szCs w:val="24"/>
         </w:rPr>
-        <w:t xml:space="preserve">A. </w:t>
-      </w:r>
-      <w:r>
-        <w:rPr>
-          <w:rFonts w:ascii="Arial Nova Cond" w:hAnsi="Arial Nova Cond"/>
-          <w:sz w:val="24"/>
-          <w:szCs w:val="24"/>
-        </w:rPr>
-        <w:t>Identitas</w:t>
-      </w:r>
-      <w:r>
-        <w:rPr>
-          <w:rFonts w:ascii="Arial Nova Cond" w:hAnsi="Arial Nova Cond"/>
-          <w:sz w:val="24"/>
-          <w:szCs w:val="24"/>
-        </w:rPr>
-        <w:t xml:space="preserve"> </w:t>
+        <w:t xml:space="preserve">A. Identitas </w:t>
       </w:r>
       <w:r>
         <w:rPr>
@@ -787,47 +391,7 @@
           <w:sz w:val="24"/>
           <w:szCs w:val="24"/>
         </w:rPr>
-        <w:t xml:space="preserve"> </w:t>
-      </w:r>
-      <w:r>
-        <w:rPr>
-          <w:rFonts w:ascii="Arial Nova Cond" w:hAnsi="Arial Nova Cond"/>
-          <w:sz w:val="24"/>
-          <w:szCs w:val="24"/>
-        </w:rPr>
-        <w:t>Pengawas</w:t>
-      </w:r>
-      <w:r>
-        <w:rPr>
-          <w:rFonts w:ascii="Arial Nova Cond" w:hAnsi="Arial Nova Cond"/>
-          <w:sz w:val="24"/>
-          <w:szCs w:val="24"/>
-        </w:rPr>
-        <w:t xml:space="preserve"> </w:t>
-      </w:r>
-      <w:r>
-        <w:rPr>
-          <w:rFonts w:ascii="Arial Nova Cond" w:hAnsi="Arial Nova Cond"/>
-          <w:sz w:val="24"/>
-          <w:szCs w:val="24"/>
-        </w:rPr>
-        <w:t>Lingkungan</w:t>
-      </w:r>
-      <w:r>
-        <w:rPr>
-          <w:rFonts w:ascii="Arial Nova Cond" w:hAnsi="Arial Nova Cond"/>
-          <w:sz w:val="24"/>
-          <w:szCs w:val="24"/>
-        </w:rPr>
-        <w:t xml:space="preserve"> </w:t>
-      </w:r>
-      <w:r>
-        <w:rPr>
-          <w:rFonts w:ascii="Arial Nova Cond" w:hAnsi="Arial Nova Cond"/>
-          <w:sz w:val="24"/>
-          <w:szCs w:val="24"/>
-        </w:rPr>
-        <w:t>Hidup</w:t>
+        <w:t xml:space="preserve"> Pengawas Lingkungan Hidup</w:t>
       </w:r>
       <w:r>
         <w:rPr>
@@ -951,15 +515,7 @@
                 <w:sz w:val="24"/>
                 <w:szCs w:val="24"/>
               </w:rPr>
-              <w:t>Instansi</w:t>
-            </w:r>
-            <w:r>
-              <w:rPr>
-                <w:rFonts w:ascii="Arial Nova Cond" w:hAnsi="Arial Nova Cond"/>
-                <w:sz w:val="24"/>
-                <w:szCs w:val="24"/>
-              </w:rPr>
-              <w:t xml:space="preserve"> </w:t>
+              <w:t xml:space="preserve">Instansi </w:t>
             </w:r>
           </w:p>
         </w:tc>
@@ -1149,63 +705,7 @@
                 <w:sz w:val="24"/>
                 <w:szCs w:val="24"/>
               </w:rPr>
-              <w:t xml:space="preserve">Dinas </w:t>
-            </w:r>
-            <w:r>
-              <w:rPr>
-                <w:rFonts w:ascii="Arial Nova Cond" w:hAnsi="Arial Nova Cond"/>
-                <w:sz w:val="24"/>
-                <w:szCs w:val="24"/>
-              </w:rPr>
-              <w:t>Lingkungan</w:t>
-            </w:r>
-            <w:r>
-              <w:rPr>
-                <w:rFonts w:ascii="Arial Nova Cond" w:hAnsi="Arial Nova Cond"/>
-                <w:sz w:val="24"/>
-                <w:szCs w:val="24"/>
-              </w:rPr>
-              <w:t xml:space="preserve"> </w:t>
-            </w:r>
-            <w:r>
-              <w:rPr>
-                <w:rFonts w:ascii="Arial Nova Cond" w:hAnsi="Arial Nova Cond"/>
-                <w:sz w:val="24"/>
-                <w:szCs w:val="24"/>
-              </w:rPr>
-              <w:t>Hidup</w:t>
-            </w:r>
-            <w:r>
-              <w:rPr>
-                <w:rFonts w:ascii="Arial Nova Cond" w:hAnsi="Arial Nova Cond"/>
-                <w:sz w:val="24"/>
-                <w:szCs w:val="24"/>
-              </w:rPr>
-              <w:t xml:space="preserve"> </w:t>
-            </w:r>
-            <w:r>
-              <w:rPr>
-                <w:rFonts w:ascii="Arial Nova Cond" w:hAnsi="Arial Nova Cond"/>
-                <w:sz w:val="24"/>
-                <w:szCs w:val="24"/>
-              </w:rPr>
-              <w:t>Kabupaten</w:t>
-            </w:r>
-            <w:r>
-              <w:rPr>
-                <w:rFonts w:ascii="Arial Nova Cond" w:hAnsi="Arial Nova Cond"/>
-                <w:sz w:val="24"/>
-                <w:szCs w:val="24"/>
-              </w:rPr>
-              <w:t xml:space="preserve"> </w:t>
-            </w:r>
-            <w:r>
-              <w:rPr>
-                <w:rFonts w:ascii="Arial Nova Cond" w:hAnsi="Arial Nova Cond"/>
-                <w:sz w:val="24"/>
-                <w:szCs w:val="24"/>
-              </w:rPr>
-              <w:t>Sragen</w:t>
+              <w:t>Dinas Lingkungan Hidup Kabupaten Sragen</w:t>
             </w:r>
           </w:p>
           <w:p>
@@ -1549,23 +1049,7 @@
                 <w:sz w:val="24"/>
                 <w:szCs w:val="24"/>
               </w:rPr>
-              <w:t>Tahun</w:t>
-            </w:r>
-            <w:r>
-              <w:rPr>
-                <w:rFonts w:ascii="Arial Nova Cond" w:hAnsi="Arial Nova Cond"/>
-                <w:sz w:val="24"/>
-                <w:szCs w:val="24"/>
-              </w:rPr>
-              <w:t xml:space="preserve"> </w:t>
-            </w:r>
-            <w:r>
-              <w:rPr>
-                <w:rFonts w:ascii="Arial Nova Cond" w:hAnsi="Arial Nova Cond"/>
-                <w:sz w:val="24"/>
-                <w:szCs w:val="24"/>
-              </w:rPr>
-              <w:t>beroperasi</w:t>
+              <w:t>Tahun beroperasi</w:t>
             </w:r>
           </w:p>
         </w:tc>
@@ -1659,15 +1143,7 @@
                 <w:sz w:val="24"/>
                 <w:szCs w:val="24"/>
               </w:rPr>
-              <w:t xml:space="preserve">Status </w:t>
-            </w:r>
-            <w:r>
-              <w:rPr>
-                <w:rFonts w:ascii="Arial Nova Cond" w:hAnsi="Arial Nova Cond"/>
-                <w:sz w:val="24"/>
-                <w:szCs w:val="24"/>
-              </w:rPr>
-              <w:t>permodalan</w:t>
+              <w:t>Status permodalan</w:t>
             </w:r>
           </w:p>
         </w:tc>
@@ -1761,63 +1237,7 @@
                 <w:sz w:val="24"/>
                 <w:szCs w:val="24"/>
               </w:rPr>
-              <w:t xml:space="preserve">Nama </w:t>
-            </w:r>
-            <w:r>
-              <w:rPr>
-                <w:rFonts w:ascii="Arial Nova Cond" w:hAnsi="Arial Nova Cond"/>
-                <w:sz w:val="24"/>
-                <w:szCs w:val="24"/>
-              </w:rPr>
-              <w:t>penanggung</w:t>
-            </w:r>
-            <w:r>
-              <w:rPr>
-                <w:rFonts w:ascii="Arial Nova Cond" w:hAnsi="Arial Nova Cond"/>
-                <w:sz w:val="24"/>
-                <w:szCs w:val="24"/>
-              </w:rPr>
-              <w:t xml:space="preserve"> </w:t>
-            </w:r>
-            <w:r>
-              <w:rPr>
-                <w:rFonts w:ascii="Arial Nova Cond" w:hAnsi="Arial Nova Cond"/>
-                <w:sz w:val="24"/>
-                <w:szCs w:val="24"/>
-              </w:rPr>
-              <w:t>jawab</w:t>
-            </w:r>
-            <w:r>
-              <w:rPr>
-                <w:rFonts w:ascii="Arial Nova Cond" w:hAnsi="Arial Nova Cond"/>
-                <w:sz w:val="24"/>
-                <w:szCs w:val="24"/>
-              </w:rPr>
-              <w:t xml:space="preserve"> Usaha dan/</w:t>
-            </w:r>
-            <w:r>
-              <w:rPr>
-                <w:rFonts w:ascii="Arial Nova Cond" w:hAnsi="Arial Nova Cond"/>
-                <w:sz w:val="24"/>
-                <w:szCs w:val="24"/>
-              </w:rPr>
-              <w:t>atau</w:t>
-            </w:r>
-            <w:r>
-              <w:rPr>
-                <w:rFonts w:ascii="Arial Nova Cond" w:hAnsi="Arial Nova Cond"/>
-                <w:sz w:val="24"/>
-                <w:szCs w:val="24"/>
-              </w:rPr>
-              <w:t xml:space="preserve"> </w:t>
-            </w:r>
-            <w:r>
-              <w:rPr>
-                <w:rFonts w:ascii="Arial Nova Cond" w:hAnsi="Arial Nova Cond"/>
-                <w:sz w:val="24"/>
-                <w:szCs w:val="24"/>
-              </w:rPr>
-              <w:t>Kegiatan</w:t>
+              <w:t>Nama penanggung jawab Usaha dan/atau Kegiatan</w:t>
             </w:r>
           </w:p>
         </w:tc>
@@ -1911,71 +1331,7 @@
                 <w:sz w:val="24"/>
                 <w:szCs w:val="24"/>
               </w:rPr>
-              <w:t>Jabatan</w:t>
-            </w:r>
-            <w:r>
-              <w:rPr>
-                <w:rFonts w:ascii="Arial Nova Cond" w:hAnsi="Arial Nova Cond"/>
-                <w:sz w:val="24"/>
-                <w:szCs w:val="24"/>
-              </w:rPr>
-              <w:t xml:space="preserve"> </w:t>
-            </w:r>
-            <w:r>
-              <w:rPr>
-                <w:rFonts w:ascii="Arial Nova Cond" w:hAnsi="Arial Nova Cond"/>
-                <w:sz w:val="24"/>
-                <w:szCs w:val="24"/>
-              </w:rPr>
-              <w:t>penanggung</w:t>
-            </w:r>
-            <w:r>
-              <w:rPr>
-                <w:rFonts w:ascii="Arial Nova Cond" w:hAnsi="Arial Nova Cond"/>
-                <w:sz w:val="24"/>
-                <w:szCs w:val="24"/>
-              </w:rPr>
-              <w:t xml:space="preserve"> </w:t>
-            </w:r>
-            <w:r>
-              <w:rPr>
-                <w:rFonts w:ascii="Arial Nova Cond" w:hAnsi="Arial Nova Cond"/>
-                <w:sz w:val="24"/>
-                <w:szCs w:val="24"/>
-              </w:rPr>
-              <w:t>jawab</w:t>
-            </w:r>
-            <w:r>
-              <w:rPr>
-                <w:rFonts w:ascii="Arial Nova Cond" w:hAnsi="Arial Nova Cond"/>
-                <w:sz w:val="24"/>
-                <w:szCs w:val="24"/>
-              </w:rPr>
-              <w:t xml:space="preserve"> Usaha dan/</w:t>
-            </w:r>
-            <w:r>
-              <w:rPr>
-                <w:rFonts w:ascii="Arial Nova Cond" w:hAnsi="Arial Nova Cond"/>
-                <w:sz w:val="24"/>
-                <w:szCs w:val="24"/>
-              </w:rPr>
-              <w:t>atau</w:t>
-            </w:r>
-            <w:r>
-              <w:rPr>
-                <w:rFonts w:ascii="Arial Nova Cond" w:hAnsi="Arial Nova Cond"/>
-                <w:sz w:val="24"/>
-                <w:szCs w:val="24"/>
-              </w:rPr>
-              <w:t xml:space="preserve"> </w:t>
-            </w:r>
-            <w:r>
-              <w:rPr>
-                <w:rFonts w:ascii="Arial Nova Cond" w:hAnsi="Arial Nova Cond"/>
-                <w:sz w:val="24"/>
-                <w:szCs w:val="24"/>
-              </w:rPr>
-              <w:t>Kegiatan</w:t>
+              <w:t>Jabatan penanggung jawab Usaha dan/atau Kegiatan</w:t>
             </w:r>
           </w:p>
         </w:tc>
@@ -2165,23 +1521,7 @@
                 <w:sz w:val="24"/>
                 <w:szCs w:val="24"/>
               </w:rPr>
-              <w:t>Nomor</w:t>
-            </w:r>
-            <w:r>
-              <w:rPr>
-                <w:rFonts w:ascii="Arial Nova Cond" w:hAnsi="Arial Nova Cond"/>
-                <w:sz w:val="24"/>
-                <w:szCs w:val="24"/>
-              </w:rPr>
-              <w:t xml:space="preserve"> </w:t>
-            </w:r>
-            <w:r>
-              <w:rPr>
-                <w:rFonts w:ascii="Arial Nova Cond" w:hAnsi="Arial Nova Cond"/>
-                <w:sz w:val="24"/>
-                <w:szCs w:val="24"/>
-              </w:rPr>
-              <w:t>telepon</w:t>
+              <w:t>Nomor telepon</w:t>
             </w:r>
           </w:p>
         </w:tc>
@@ -2279,55 +1619,7 @@
                 <w:sz w:val="24"/>
                 <w:szCs w:val="24"/>
               </w:rPr>
-              <w:t>Koordinat</w:t>
-            </w:r>
-            <w:r>
-              <w:rPr>
-                <w:rFonts w:ascii="Arial Nova Cond" w:hAnsi="Arial Nova Cond"/>
-                <w:sz w:val="24"/>
-                <w:szCs w:val="24"/>
-              </w:rPr>
-              <w:t xml:space="preserve"> </w:t>
-            </w:r>
-            <w:r>
-              <w:rPr>
-                <w:rFonts w:ascii="Arial Nova Cond" w:hAnsi="Arial Nova Cond"/>
-                <w:sz w:val="24"/>
-                <w:szCs w:val="24"/>
-              </w:rPr>
-              <w:t>lokasi</w:t>
-            </w:r>
-            <w:r>
-              <w:rPr>
-                <w:rFonts w:ascii="Arial Nova Cond" w:hAnsi="Arial Nova Cond"/>
-                <w:sz w:val="24"/>
-                <w:szCs w:val="24"/>
-              </w:rPr>
-              <w:t xml:space="preserve"> Usaha dan/</w:t>
-            </w:r>
-            <w:r>
-              <w:rPr>
-                <w:rFonts w:ascii="Arial Nova Cond" w:hAnsi="Arial Nova Cond"/>
-                <w:sz w:val="24"/>
-                <w:szCs w:val="24"/>
-              </w:rPr>
-              <w:t>atau</w:t>
-            </w:r>
-            <w:r>
-              <w:rPr>
-                <w:rFonts w:ascii="Arial Nova Cond" w:hAnsi="Arial Nova Cond"/>
-                <w:sz w:val="24"/>
-                <w:szCs w:val="24"/>
-              </w:rPr>
-              <w:t xml:space="preserve"> </w:t>
-            </w:r>
-            <w:r>
-              <w:rPr>
-                <w:rFonts w:ascii="Arial Nova Cond" w:hAnsi="Arial Nova Cond"/>
-                <w:sz w:val="24"/>
-                <w:szCs w:val="24"/>
-              </w:rPr>
-              <w:t>Kegiatan</w:t>
+              <w:t>Koordinat lokasi Usaha dan/atau Kegiatan</w:t>
             </w:r>
           </w:p>
           <w:p>
@@ -2484,45 +1776,55 @@
                 <w:szCs w:val="24"/>
                 <w:lang w:val="en-US"/>
               </w:rPr>
-              <w:t>Utara :</w:t>
-            </w:r>
-            <w:r>
+              <w:t xml:space="preserve">Utara : </w:t>
+            </w:r>
+            <w:r>
+              <w:rPr>
+                <w:rFonts w:ascii="Arial Nova Cond" w:hAnsi="Arial Nova Cond"/>
+                <w:sz w:val="24"/>
+                <w:szCs w:val="24"/>
+              </w:rPr>
+              <w:t>{batas_utara}</w:t>
+            </w:r>
+          </w:p>
+          <w:p>
+            <w:pPr>
+              <w:jc w:val="both"/>
               <w:rPr>
                 <w:rFonts w:ascii="Arial Nova Cond" w:hAnsi="Arial Nova Cond"/>
                 <w:sz w:val="24"/>
                 <w:szCs w:val="24"/>
                 <w:lang w:val="en-US"/>
               </w:rPr>
-              <w:t xml:space="preserve"> </w:t>
-            </w:r>
-            <w:r>
-              <w:rPr>
-                <w:rFonts w:ascii="Arial Nova Cond" w:hAnsi="Arial Nova Cond"/>
-                <w:sz w:val="24"/>
-                <w:szCs w:val="24"/>
-              </w:rPr>
-              <w:t>{batas_utara}</w:t>
-            </w:r>
-          </w:p>
-          <w:p>
-            <w:pPr>
-              <w:jc w:val="both"/>
+            </w:pPr>
+            <w:r>
               <w:rPr>
                 <w:rFonts w:ascii="Arial Nova Cond" w:hAnsi="Arial Nova Cond"/>
                 <w:sz w:val="24"/>
                 <w:szCs w:val="24"/>
                 <w:lang w:val="en-US"/>
               </w:rPr>
-            </w:pPr>
-            <w:r>
+              <w:t xml:space="preserve">Timur : </w:t>
+            </w:r>
+            <w:r>
+              <w:rPr>
+                <w:rFonts w:ascii="Arial Nova Cond" w:hAnsi="Arial Nova Cond"/>
+                <w:sz w:val="24"/>
+                <w:szCs w:val="24"/>
+              </w:rPr>
+              <w:t>{batas_timur}</w:t>
+            </w:r>
+          </w:p>
+          <w:p>
+            <w:pPr>
+              <w:jc w:val="both"/>
               <w:rPr>
                 <w:rFonts w:ascii="Arial Nova Cond" w:hAnsi="Arial Nova Cond"/>
                 <w:sz w:val="24"/>
                 <w:szCs w:val="24"/>
                 <w:lang w:val="en-US"/>
               </w:rPr>
-              <w:t>Timur :</w:t>
-            </w:r>
+            </w:pPr>
             <w:r>
               <w:rPr>
                 <w:rFonts w:ascii="Arial Nova Cond" w:hAnsi="Arial Nova Cond"/>
@@ -2530,15 +1832,15 @@
                 <w:szCs w:val="24"/>
                 <w:lang w:val="en-US"/>
               </w:rPr>
-              <w:t xml:space="preserve"> </w:t>
-            </w:r>
-            <w:r>
-              <w:rPr>
-                <w:rFonts w:ascii="Arial Nova Cond" w:hAnsi="Arial Nova Cond"/>
-                <w:sz w:val="24"/>
-                <w:szCs w:val="24"/>
-              </w:rPr>
-              <w:t>{batas_timur}</w:t>
+              <w:t xml:space="preserve">Selatan : </w:t>
+            </w:r>
+            <w:r>
+              <w:rPr>
+                <w:rFonts w:ascii="Arial Nova Cond" w:hAnsi="Arial Nova Cond"/>
+                <w:sz w:val="24"/>
+                <w:szCs w:val="24"/>
+              </w:rPr>
+              <w:t>{batas_selatan}</w:t>
             </w:r>
           </w:p>
           <w:p>
@@ -2558,53 +1860,7 @@
                 <w:szCs w:val="24"/>
                 <w:lang w:val="en-US"/>
               </w:rPr>
-              <w:t>Selatan :</w:t>
-            </w:r>
-            <w:r>
-              <w:rPr>
-                <w:rFonts w:ascii="Arial Nova Cond" w:hAnsi="Arial Nova Cond"/>
-                <w:sz w:val="24"/>
-                <w:szCs w:val="24"/>
-                <w:lang w:val="en-US"/>
-              </w:rPr>
-              <w:t xml:space="preserve"> </w:t>
-            </w:r>
-            <w:r>
-              <w:rPr>
-                <w:rFonts w:ascii="Arial Nova Cond" w:hAnsi="Arial Nova Cond"/>
-                <w:sz w:val="24"/>
-                <w:szCs w:val="24"/>
-              </w:rPr>
-              <w:t>{batas_selatan}</w:t>
-            </w:r>
-          </w:p>
-          <w:p>
-            <w:pPr>
-              <w:jc w:val="both"/>
-              <w:rPr>
-                <w:rFonts w:ascii="Arial Nova Cond" w:hAnsi="Arial Nova Cond"/>
-                <w:sz w:val="24"/>
-                <w:szCs w:val="24"/>
-                <w:lang w:val="en-US"/>
-              </w:rPr>
-            </w:pPr>
-            <w:r>
-              <w:rPr>
-                <w:rFonts w:ascii="Arial Nova Cond" w:hAnsi="Arial Nova Cond"/>
-                <w:sz w:val="24"/>
-                <w:szCs w:val="24"/>
-                <w:lang w:val="en-US"/>
-              </w:rPr>
-              <w:t>Barat :</w:t>
-            </w:r>
-            <w:r>
-              <w:rPr>
-                <w:rFonts w:ascii="Arial Nova Cond" w:hAnsi="Arial Nova Cond"/>
-                <w:sz w:val="24"/>
-                <w:szCs w:val="24"/>
-                <w:lang w:val="en-US"/>
-              </w:rPr>
-              <w:t xml:space="preserve"> </w:t>
+              <w:t xml:space="preserve">Barat : </w:t>
             </w:r>
             <w:r>
               <w:rPr>
@@ -2748,7 +2004,7 @@
                 <w:sz w:val="24"/>
                 <w:szCs w:val="24"/>
               </w:rPr>
-              <w:t>{luas_lahan} </w:t>
+              <w:t>{luas_lahan}</w:t>
             </w:r>
             <w:r>
               <w:rPr>
@@ -2977,23 +2233,7 @@
                 <w:sz w:val="24"/>
                 <w:szCs w:val="24"/>
               </w:rPr>
-              <w:t>Dokumen</w:t>
-            </w:r>
-            <w:r>
-              <w:rPr>
-                <w:rFonts w:ascii="Arial Nova Cond" w:hAnsi="Arial Nova Cond"/>
-                <w:sz w:val="24"/>
-                <w:szCs w:val="24"/>
-              </w:rPr>
-              <w:t xml:space="preserve"> yang </w:t>
-            </w:r>
-            <w:r>
-              <w:rPr>
-                <w:rFonts w:ascii="Arial Nova Cond" w:hAnsi="Arial Nova Cond"/>
-                <w:sz w:val="24"/>
-                <w:szCs w:val="24"/>
-              </w:rPr>
-              <w:t>dimiliki</w:t>
+              <w:t>Dokumen yang dimiliki</w:t>
             </w:r>
           </w:p>
         </w:tc>
@@ -3087,23 +2327,7 @@
                 <w:sz w:val="24"/>
                 <w:szCs w:val="24"/>
               </w:rPr>
-              <w:t>Persetujuan</w:t>
-            </w:r>
-            <w:r>
-              <w:rPr>
-                <w:rFonts w:ascii="Arial Nova Cond" w:hAnsi="Arial Nova Cond"/>
-                <w:sz w:val="24"/>
-                <w:szCs w:val="24"/>
-              </w:rPr>
-              <w:t xml:space="preserve"> </w:t>
-            </w:r>
-            <w:r>
-              <w:rPr>
-                <w:rFonts w:ascii="Arial Nova Cond" w:hAnsi="Arial Nova Cond"/>
-                <w:sz w:val="24"/>
-                <w:szCs w:val="24"/>
-              </w:rPr>
-              <w:t>Lingkungan</w:t>
+              <w:t>Persetujuan Lingkungan</w:t>
             </w:r>
           </w:p>
         </w:tc>
@@ -3198,55 +2422,7 @@
                 <w:sz w:val="24"/>
                 <w:szCs w:val="24"/>
               </w:rPr>
-              <w:t>Teknologi</w:t>
-            </w:r>
-            <w:r>
-              <w:rPr>
-                <w:rFonts w:ascii="Arial Nova Cond" w:hAnsi="Arial Nova Cond"/>
-                <w:sz w:val="24"/>
-                <w:szCs w:val="24"/>
-              </w:rPr>
-              <w:t xml:space="preserve"> </w:t>
-            </w:r>
-            <w:r>
-              <w:rPr>
-                <w:rFonts w:ascii="Arial Nova Cond" w:hAnsi="Arial Nova Cond"/>
-                <w:sz w:val="24"/>
-                <w:szCs w:val="24"/>
-              </w:rPr>
-              <w:t>pengelolaan</w:t>
-            </w:r>
-            <w:r>
-              <w:rPr>
-                <w:rFonts w:ascii="Arial Nova Cond" w:hAnsi="Arial Nova Cond"/>
-                <w:sz w:val="24"/>
-                <w:szCs w:val="24"/>
-              </w:rPr>
-              <w:t xml:space="preserve"> </w:t>
-            </w:r>
-            <w:r>
-              <w:rPr>
-                <w:rFonts w:ascii="Arial Nova Cond" w:hAnsi="Arial Nova Cond"/>
-                <w:sz w:val="24"/>
-                <w:szCs w:val="24"/>
-              </w:rPr>
-              <w:t>Pembuangan</w:t>
-            </w:r>
-            <w:r>
-              <w:rPr>
-                <w:rFonts w:ascii="Arial Nova Cond" w:hAnsi="Arial Nova Cond"/>
-                <w:sz w:val="24"/>
-                <w:szCs w:val="24"/>
-              </w:rPr>
-              <w:t xml:space="preserve"> Air </w:t>
-            </w:r>
-            <w:r>
-              <w:rPr>
-                <w:rFonts w:ascii="Arial Nova Cond" w:hAnsi="Arial Nova Cond"/>
-                <w:sz w:val="24"/>
-                <w:szCs w:val="24"/>
-              </w:rPr>
-              <w:t>Limbah</w:t>
+              <w:t>Teknologi pengelolaan Pembuangan Air Limbah</w:t>
             </w:r>
           </w:p>
         </w:tc>
@@ -3341,15 +2517,7 @@
                 <w:sz w:val="24"/>
                 <w:szCs w:val="24"/>
               </w:rPr>
-              <w:t xml:space="preserve">Volume air </w:t>
-            </w:r>
-            <w:r>
-              <w:rPr>
-                <w:rFonts w:ascii="Arial Nova Cond" w:hAnsi="Arial Nova Cond"/>
-                <w:sz w:val="24"/>
-                <w:szCs w:val="24"/>
-              </w:rPr>
-              <w:t>limbah</w:t>
+              <w:t>Volume air limbah</w:t>
             </w:r>
           </w:p>
         </w:tc>
@@ -3443,15 +2611,7 @@
                 <w:sz w:val="24"/>
                 <w:szCs w:val="24"/>
               </w:rPr>
-              <w:t>Pemanfaatan</w:t>
-            </w:r>
-            <w:r>
-              <w:rPr>
-                <w:rFonts w:ascii="Arial Nova Cond" w:hAnsi="Arial Nova Cond"/>
-                <w:sz w:val="24"/>
-                <w:szCs w:val="24"/>
-              </w:rPr>
-              <w:t xml:space="preserve"> Air Tanah</w:t>
+              <w:t>Pemanfaatan Air Tanah</w:t>
             </w:r>
           </w:p>
         </w:tc>
@@ -3545,63 +2705,7 @@
                 <w:sz w:val="24"/>
                 <w:szCs w:val="24"/>
               </w:rPr>
-              <w:t>Jumlah</w:t>
-            </w:r>
-            <w:r>
-              <w:rPr>
-                <w:rFonts w:ascii="Arial Nova Cond" w:hAnsi="Arial Nova Cond"/>
-                <w:sz w:val="24"/>
-                <w:szCs w:val="24"/>
-              </w:rPr>
-              <w:t xml:space="preserve"> </w:t>
-            </w:r>
-            <w:r>
-              <w:rPr>
-                <w:rFonts w:ascii="Arial Nova Cond" w:hAnsi="Arial Nova Cond"/>
-                <w:sz w:val="24"/>
-                <w:szCs w:val="24"/>
-              </w:rPr>
-              <w:t>Penggunaan</w:t>
-            </w:r>
-            <w:r>
-              <w:rPr>
-                <w:rFonts w:ascii="Arial Nova Cond" w:hAnsi="Arial Nova Cond"/>
-                <w:sz w:val="24"/>
-                <w:szCs w:val="24"/>
-              </w:rPr>
-              <w:t xml:space="preserve"> Air </w:t>
-            </w:r>
-            <w:r>
-              <w:rPr>
-                <w:rFonts w:ascii="Arial Nova Cond" w:hAnsi="Arial Nova Cond"/>
-                <w:sz w:val="24"/>
-                <w:szCs w:val="24"/>
-              </w:rPr>
-              <w:t>Dalam</w:t>
-            </w:r>
-            <w:r>
-              <w:rPr>
-                <w:rFonts w:ascii="Arial Nova Cond" w:hAnsi="Arial Nova Cond"/>
-                <w:sz w:val="24"/>
-                <w:szCs w:val="24"/>
-              </w:rPr>
-              <w:t xml:space="preserve"> Satu Hari (m3/</w:t>
-            </w:r>
-            <w:r>
-              <w:rPr>
-                <w:rFonts w:ascii="Arial Nova Cond" w:hAnsi="Arial Nova Cond"/>
-                <w:sz w:val="24"/>
-                <w:szCs w:val="24"/>
-              </w:rPr>
-              <w:t>hari</w:t>
-            </w:r>
-            <w:r>
-              <w:rPr>
-                <w:rFonts w:ascii="Arial Nova Cond" w:hAnsi="Arial Nova Cond"/>
-                <w:sz w:val="24"/>
-                <w:szCs w:val="24"/>
-              </w:rPr>
-              <w:t>)</w:t>
+              <w:t>Jumlah Penggunaan Air Dalam Satu Hari (m3/hari)</w:t>
             </w:r>
           </w:p>
         </w:tc>
@@ -3696,23 +2800,7 @@
                 <w:sz w:val="24"/>
                 <w:szCs w:val="24"/>
               </w:rPr>
-              <w:t>Penggunaan</w:t>
-            </w:r>
-            <w:r>
-              <w:rPr>
-                <w:rFonts w:ascii="Arial Nova Cond" w:hAnsi="Arial Nova Cond"/>
-                <w:sz w:val="24"/>
-                <w:szCs w:val="24"/>
-              </w:rPr>
-              <w:t xml:space="preserve"> </w:t>
-            </w:r>
-            <w:r>
-              <w:rPr>
-                <w:rFonts w:ascii="Arial Nova Cond" w:hAnsi="Arial Nova Cond"/>
-                <w:sz w:val="24"/>
-                <w:szCs w:val="24"/>
-              </w:rPr>
-              <w:t>Energi</w:t>
+              <w:t>Penggunaan Energi</w:t>
             </w:r>
           </w:p>
         </w:tc>
@@ -3799,71 +2887,7 @@
                 <w:sz w:val="24"/>
                 <w:szCs w:val="24"/>
               </w:rPr>
-              <w:t>Jumlah</w:t>
-            </w:r>
-            <w:r>
-              <w:rPr>
-                <w:rFonts w:ascii="Arial Nova Cond" w:hAnsi="Arial Nova Cond"/>
-                <w:sz w:val="24"/>
-                <w:szCs w:val="24"/>
-              </w:rPr>
-              <w:t xml:space="preserve"> </w:t>
-            </w:r>
-            <w:r>
-              <w:rPr>
-                <w:rFonts w:ascii="Arial Nova Cond" w:hAnsi="Arial Nova Cond"/>
-                <w:sz w:val="24"/>
-                <w:szCs w:val="24"/>
-              </w:rPr>
-              <w:t>Pekerja</w:t>
-            </w:r>
-            <w:r>
-              <w:rPr>
-                <w:rFonts w:ascii="Arial Nova Cond" w:hAnsi="Arial Nova Cond"/>
-                <w:sz w:val="24"/>
-                <w:szCs w:val="24"/>
-              </w:rPr>
-              <w:t xml:space="preserve"> </w:t>
-            </w:r>
-            <w:r>
-              <w:rPr>
-                <w:rFonts w:ascii="Arial Nova Cond" w:hAnsi="Arial Nova Cond"/>
-                <w:sz w:val="24"/>
-                <w:szCs w:val="24"/>
-              </w:rPr>
-              <w:t>karyawan</w:t>
-            </w:r>
-            <w:r>
-              <w:rPr>
-                <w:rFonts w:ascii="Arial Nova Cond" w:hAnsi="Arial Nova Cond"/>
-                <w:sz w:val="24"/>
-                <w:szCs w:val="24"/>
-              </w:rPr>
-              <w:t xml:space="preserve"> dan </w:t>
-            </w:r>
-            <w:r>
-              <w:rPr>
-                <w:rFonts w:ascii="Arial Nova Cond" w:hAnsi="Arial Nova Cond"/>
-                <w:sz w:val="24"/>
-                <w:szCs w:val="24"/>
-              </w:rPr>
-              <w:t>pengunjung</w:t>
-            </w:r>
-            <w:r>
-              <w:rPr>
-                <w:rFonts w:ascii="Arial Nova Cond" w:hAnsi="Arial Nova Cond"/>
-                <w:sz w:val="24"/>
-                <w:szCs w:val="24"/>
-              </w:rPr>
-              <w:t xml:space="preserve">/ </w:t>
-            </w:r>
-            <w:r>
-              <w:rPr>
-                <w:rFonts w:ascii="Arial Nova Cond" w:hAnsi="Arial Nova Cond"/>
-                <w:sz w:val="24"/>
-                <w:szCs w:val="24"/>
-              </w:rPr>
-              <w:t>hari</w:t>
+              <w:t>Jumlah Pekerja karyawan dan pengunjung/ hari</w:t>
             </w:r>
           </w:p>
         </w:tc>
@@ -3957,23 +2981,7 @@
                 <w:sz w:val="24"/>
                 <w:szCs w:val="24"/>
               </w:rPr>
-              <w:t xml:space="preserve">Jam Shift </w:t>
-            </w:r>
-            <w:r>
-              <w:rPr>
-                <w:rFonts w:ascii="Arial Nova Cond" w:hAnsi="Arial Nova Cond"/>
-                <w:sz w:val="24"/>
-                <w:szCs w:val="24"/>
-              </w:rPr>
-              <w:t>Kerja</w:t>
-            </w:r>
-            <w:r>
-              <w:rPr>
-                <w:rFonts w:ascii="Arial Nova Cond" w:hAnsi="Arial Nova Cond"/>
-                <w:sz w:val="24"/>
-                <w:szCs w:val="24"/>
-              </w:rPr>
-              <w:t xml:space="preserve">/Hari </w:t>
+              <w:t xml:space="preserve">Jam Shift Kerja/Hari </w:t>
             </w:r>
           </w:p>
         </w:tc>
@@ -4067,71 +3075,7 @@
                 <w:sz w:val="24"/>
                 <w:szCs w:val="24"/>
               </w:rPr>
-              <w:t>Jumlah</w:t>
-            </w:r>
-            <w:r>
-              <w:rPr>
-                <w:rFonts w:ascii="Arial Nova Cond" w:hAnsi="Arial Nova Cond"/>
-                <w:sz w:val="24"/>
-                <w:szCs w:val="24"/>
-              </w:rPr>
-              <w:t xml:space="preserve"> </w:t>
-            </w:r>
-            <w:r>
-              <w:rPr>
-                <w:rFonts w:ascii="Arial Nova Cond" w:hAnsi="Arial Nova Cond"/>
-                <w:sz w:val="24"/>
-                <w:szCs w:val="24"/>
-              </w:rPr>
-              <w:t>hari</w:t>
-            </w:r>
-            <w:r>
-              <w:rPr>
-                <w:rFonts w:ascii="Arial Nova Cond" w:hAnsi="Arial Nova Cond"/>
-                <w:sz w:val="24"/>
-                <w:szCs w:val="24"/>
-              </w:rPr>
-              <w:t xml:space="preserve"> </w:t>
-            </w:r>
-            <w:r>
-              <w:rPr>
-                <w:rFonts w:ascii="Arial Nova Cond" w:hAnsi="Arial Nova Cond"/>
-                <w:sz w:val="24"/>
-                <w:szCs w:val="24"/>
-              </w:rPr>
-              <w:t>kerja</w:t>
-            </w:r>
-            <w:r>
-              <w:rPr>
-                <w:rFonts w:ascii="Arial Nova Cond" w:hAnsi="Arial Nova Cond"/>
-                <w:sz w:val="24"/>
-                <w:szCs w:val="24"/>
-              </w:rPr>
-              <w:t xml:space="preserve"> </w:t>
-            </w:r>
-            <w:r>
-              <w:rPr>
-                <w:rFonts w:ascii="Arial Nova Cond" w:hAnsi="Arial Nova Cond"/>
-                <w:sz w:val="24"/>
-                <w:szCs w:val="24"/>
-              </w:rPr>
-              <w:t>dalam</w:t>
-            </w:r>
-            <w:r>
-              <w:rPr>
-                <w:rFonts w:ascii="Arial Nova Cond" w:hAnsi="Arial Nova Cond"/>
-                <w:sz w:val="24"/>
-                <w:szCs w:val="24"/>
-              </w:rPr>
-              <w:t xml:space="preserve"> 1 </w:t>
-            </w:r>
-            <w:r>
-              <w:rPr>
-                <w:rFonts w:ascii="Arial Nova Cond" w:hAnsi="Arial Nova Cond"/>
-                <w:sz w:val="24"/>
-                <w:szCs w:val="24"/>
-              </w:rPr>
-              <w:t>minggu</w:t>
+              <w:t>Jumlah hari kerja dalam 1 minggu</w:t>
             </w:r>
           </w:p>
         </w:tc>
@@ -4225,15 +3169,7 @@
                 <w:sz w:val="24"/>
                 <w:szCs w:val="24"/>
               </w:rPr>
-              <w:t xml:space="preserve">Riwayat </w:t>
-            </w:r>
-            <w:r>
-              <w:rPr>
-                <w:rFonts w:ascii="Arial Nova Cond" w:hAnsi="Arial Nova Cond"/>
-                <w:sz w:val="24"/>
-                <w:szCs w:val="24"/>
-              </w:rPr>
-              <w:t>ketaatan</w:t>
+              <w:t>Riwayat ketaatan</w:t>
             </w:r>
           </w:p>
         </w:tc>
@@ -4327,23 +3263,7 @@
                 <w:sz w:val="24"/>
                 <w:szCs w:val="24"/>
               </w:rPr>
-              <w:t>Inspeksi</w:t>
-            </w:r>
-            <w:r>
-              <w:rPr>
-                <w:rFonts w:ascii="Arial Nova Cond" w:hAnsi="Arial Nova Cond"/>
-                <w:sz w:val="24"/>
-                <w:szCs w:val="24"/>
-              </w:rPr>
-              <w:t xml:space="preserve"> </w:t>
-            </w:r>
-            <w:r>
-              <w:rPr>
-                <w:rFonts w:ascii="Arial Nova Cond" w:hAnsi="Arial Nova Cond"/>
-                <w:sz w:val="24"/>
-                <w:szCs w:val="24"/>
-              </w:rPr>
-              <w:t>Terakhir</w:t>
+              <w:t>Inspeksi Terakhir</w:t>
             </w:r>
           </w:p>
         </w:tc>
@@ -4421,15 +3341,7 @@
           <w:sz w:val="24"/>
           <w:szCs w:val="24"/>
         </w:rPr>
-        <w:t xml:space="preserve">C. Hasil </w:t>
-      </w:r>
-      <w:r>
-        <w:rPr>
-          <w:rFonts w:ascii="Arial Nova Cond" w:hAnsi="Arial Nova Cond"/>
-          <w:sz w:val="24"/>
-          <w:szCs w:val="24"/>
-        </w:rPr>
-        <w:t>Pengawasan</w:t>
+        <w:t>C. Hasil Pengawasan</w:t>
       </w:r>
     </w:p>
     <w:p>
@@ -4448,31 +3360,7 @@
           <w:sz w:val="24"/>
           <w:szCs w:val="24"/>
         </w:rPr>
-        <w:t xml:space="preserve">1.  </w:t>
-      </w:r>
-      <w:r>
-        <w:rPr>
-          <w:rFonts w:ascii="Arial Nova Cond" w:hAnsi="Arial Nova Cond"/>
-          <w:sz w:val="24"/>
-          <w:szCs w:val="24"/>
-        </w:rPr>
-        <w:t>Persetujuan</w:t>
-      </w:r>
-      <w:r>
-        <w:rPr>
-          <w:rFonts w:ascii="Arial Nova Cond" w:hAnsi="Arial Nova Cond"/>
-          <w:sz w:val="24"/>
-          <w:szCs w:val="24"/>
-        </w:rPr>
-        <w:t xml:space="preserve"> </w:t>
-      </w:r>
-      <w:r>
-        <w:rPr>
-          <w:rFonts w:ascii="Arial Nova Cond" w:hAnsi="Arial Nova Cond"/>
-          <w:sz w:val="24"/>
-          <w:szCs w:val="24"/>
-        </w:rPr>
-        <w:t>Lingkungan</w:t>
+        <w:t>1.  Persetujuan Lingkungan</w:t>
       </w:r>
     </w:p>
     <w:p>
@@ -4561,7 +3449,7 @@
           <w:sz w:val="24"/>
           <w:szCs w:val="24"/>
         </w:rPr>
-        <w:t>Pemeriksaan</w:t>
+        <w:t xml:space="preserve">Pemeriksaan </w:t>
       </w:r>
       <w:r>
         <w:rPr>
@@ -4569,7 +3457,7 @@
           <w:sz w:val="24"/>
           <w:szCs w:val="24"/>
         </w:rPr>
-        <w:t xml:space="preserve"> </w:t>
+        <w:t xml:space="preserve">Pengelolaan </w:t>
       </w:r>
       <w:r>
         <w:rPr>
@@ -4577,7 +3465,7 @@
           <w:sz w:val="24"/>
           <w:szCs w:val="24"/>
         </w:rPr>
-        <w:t>Pengelolaan</w:t>
+        <w:t>Air Limbah</w:t>
       </w:r>
       <w:r>
         <w:rPr>
@@ -4585,39 +3473,7 @@
           <w:sz w:val="24"/>
           <w:szCs w:val="24"/>
         </w:rPr>
-        <w:t xml:space="preserve"> </w:t>
-      </w:r>
-      <w:r>
-        <w:rPr>
-          <w:rFonts w:ascii="Arial Nova Cond" w:hAnsi="Arial Nova Cond"/>
-          <w:sz w:val="24"/>
-          <w:szCs w:val="24"/>
-        </w:rPr>
-        <w:t xml:space="preserve">Air </w:t>
-      </w:r>
-      <w:r>
-        <w:rPr>
-          <w:rFonts w:ascii="Arial Nova Cond" w:hAnsi="Arial Nova Cond"/>
-          <w:sz w:val="24"/>
-          <w:szCs w:val="24"/>
-        </w:rPr>
-        <w:t>Limbah</w:t>
-      </w:r>
-      <w:r>
-        <w:rPr>
-          <w:rFonts w:ascii="Arial Nova Cond" w:hAnsi="Arial Nova Cond"/>
-          <w:sz w:val="24"/>
-          <w:szCs w:val="24"/>
-        </w:rPr>
-        <w:t xml:space="preserve"> </w:t>
-      </w:r>
-      <w:r>
-        <w:rPr>
-          <w:rFonts w:ascii="Arial Nova Cond" w:hAnsi="Arial Nova Cond"/>
-          <w:sz w:val="24"/>
-          <w:szCs w:val="24"/>
-        </w:rPr>
-        <w:t>domestik</w:t>
+        <w:t xml:space="preserve"> domestik</w:t>
       </w:r>
     </w:p>
     <w:tbl>
@@ -4684,9 +3540,17 @@
                 <w:sz w:val="24"/>
                 <w:szCs w:val="24"/>
               </w:rPr>
-              <w:t xml:space="preserve">Point </w:t>
-            </w:r>
-            <w:r>
+              <w:t>Point Pemeriksaan</w:t>
+            </w:r>
+          </w:p>
+        </w:tc>
+        <w:tc>
+          <w:tcPr>
+            <w:tcW w:w="4002" w:type="dxa"/>
+          </w:tcPr>
+          <w:p>
+            <w:pPr>
+              <w:jc w:val="center"/>
               <w:rPr>
                 <w:rFonts w:ascii="Arial Nova Cond" w:hAnsi="Arial Nova Cond"/>
                 <w:b/>
@@ -4694,17 +3558,8 @@
                 <w:sz w:val="24"/>
                 <w:szCs w:val="24"/>
               </w:rPr>
-              <w:t>Pemeriksaan</w:t>
-            </w:r>
-          </w:p>
-        </w:tc>
-        <w:tc>
-          <w:tcPr>
-            <w:tcW w:w="4002" w:type="dxa"/>
-          </w:tcPr>
-          <w:p>
-            <w:pPr>
-              <w:jc w:val="center"/>
+            </w:pPr>
+            <w:r>
               <w:rPr>
                 <w:rFonts w:ascii="Arial Nova Cond" w:hAnsi="Arial Nova Cond"/>
                 <w:b/>
@@ -4712,8 +3567,17 @@
                 <w:sz w:val="24"/>
                 <w:szCs w:val="24"/>
               </w:rPr>
-            </w:pPr>
-            <w:r>
+              <w:t>Kondisi Eksisting</w:t>
+            </w:r>
+          </w:p>
+        </w:tc>
+        <w:tc>
+          <w:tcPr>
+            <w:tcW w:w="3154" w:type="dxa"/>
+          </w:tcPr>
+          <w:p>
+            <w:pPr>
+              <w:jc w:val="center"/>
               <w:rPr>
                 <w:rFonts w:ascii="Arial Nova Cond" w:hAnsi="Arial Nova Cond"/>
                 <w:b/>
@@ -4721,8 +3585,7 @@
                 <w:sz w:val="24"/>
                 <w:szCs w:val="24"/>
               </w:rPr>
-              <w:t>Kondisi</w:t>
-            </w:r>
+            </w:pPr>
             <w:r>
               <w:rPr>
                 <w:rFonts w:ascii="Arial Nova Cond" w:hAnsi="Arial Nova Cond"/>
@@ -4731,43 +3594,6 @@
                 <w:sz w:val="24"/>
                 <w:szCs w:val="24"/>
               </w:rPr>
-              <w:t xml:space="preserve"> </w:t>
-            </w:r>
-            <w:r>
-              <w:rPr>
-                <w:rFonts w:ascii="Arial Nova Cond" w:hAnsi="Arial Nova Cond"/>
-                <w:b/>
-                <w:bCs/>
-                <w:sz w:val="24"/>
-                <w:szCs w:val="24"/>
-              </w:rPr>
-              <w:t>Eksisting</w:t>
-            </w:r>
-          </w:p>
-        </w:tc>
-        <w:tc>
-          <w:tcPr>
-            <w:tcW w:w="3154" w:type="dxa"/>
-          </w:tcPr>
-          <w:p>
-            <w:pPr>
-              <w:jc w:val="center"/>
-              <w:rPr>
-                <w:rFonts w:ascii="Arial Nova Cond" w:hAnsi="Arial Nova Cond"/>
-                <w:b/>
-                <w:bCs/>
-                <w:sz w:val="24"/>
-                <w:szCs w:val="24"/>
-              </w:rPr>
-            </w:pPr>
-            <w:r>
-              <w:rPr>
-                <w:rFonts w:ascii="Arial Nova Cond" w:hAnsi="Arial Nova Cond"/>
-                <w:b/>
-                <w:bCs/>
-                <w:sz w:val="24"/>
-                <w:szCs w:val="24"/>
-              </w:rPr>
               <w:t>Keterangan</w:t>
             </w:r>
           </w:p>
@@ -4815,23 +3641,7 @@
                 <w:sz w:val="24"/>
                 <w:szCs w:val="24"/>
               </w:rPr>
-              <w:t>Sumber</w:t>
-            </w:r>
-            <w:r>
-              <w:rPr>
-                <w:rFonts w:ascii="Arial Nova Cond" w:hAnsi="Arial Nova Cond"/>
-                <w:sz w:val="24"/>
-                <w:szCs w:val="24"/>
-              </w:rPr>
-              <w:t xml:space="preserve"> </w:t>
-            </w:r>
-            <w:r>
-              <w:rPr>
-                <w:rFonts w:ascii="Arial Nova Cond" w:hAnsi="Arial Nova Cond"/>
-                <w:sz w:val="24"/>
-                <w:szCs w:val="24"/>
-              </w:rPr>
-              <w:t>limbah</w:t>
+              <w:t>Sumber limbah</w:t>
             </w:r>
           </w:p>
         </w:tc>
@@ -4923,63 +3733,7 @@
                 <w:sz w:val="24"/>
                 <w:szCs w:val="24"/>
               </w:rPr>
-              <w:t>Kondisi</w:t>
-            </w:r>
-            <w:r>
-              <w:rPr>
-                <w:rFonts w:ascii="Arial Nova Cond" w:hAnsi="Arial Nova Cond"/>
-                <w:sz w:val="24"/>
-                <w:szCs w:val="24"/>
-              </w:rPr>
-              <w:t xml:space="preserve"> </w:t>
-            </w:r>
-            <w:r>
-              <w:rPr>
-                <w:rFonts w:ascii="Arial Nova Cond" w:hAnsi="Arial Nova Cond"/>
-                <w:sz w:val="24"/>
-                <w:szCs w:val="24"/>
-              </w:rPr>
-              <w:t>fisik</w:t>
-            </w:r>
-            <w:r>
-              <w:rPr>
-                <w:rFonts w:ascii="Arial Nova Cond" w:hAnsi="Arial Nova Cond"/>
-                <w:sz w:val="24"/>
-                <w:szCs w:val="24"/>
-              </w:rPr>
-              <w:t xml:space="preserve"> </w:t>
-            </w:r>
-            <w:r>
-              <w:rPr>
-                <w:rFonts w:ascii="Arial Nova Cond" w:hAnsi="Arial Nova Cond"/>
-                <w:sz w:val="24"/>
-                <w:szCs w:val="24"/>
-              </w:rPr>
-              <w:t>septictank</w:t>
-            </w:r>
-            <w:r>
-              <w:rPr>
-                <w:rFonts w:ascii="Arial Nova Cond" w:hAnsi="Arial Nova Cond"/>
-                <w:sz w:val="24"/>
-                <w:szCs w:val="24"/>
-              </w:rPr>
-              <w:t xml:space="preserve"> dan </w:t>
-            </w:r>
-            <w:r>
-              <w:rPr>
-                <w:rFonts w:ascii="Arial Nova Cond" w:hAnsi="Arial Nova Cond"/>
-                <w:sz w:val="24"/>
-                <w:szCs w:val="24"/>
-              </w:rPr>
-              <w:t>resapan</w:t>
-            </w:r>
-            <w:r>
-              <w:rPr>
-                <w:rFonts w:ascii="Arial Nova Cond" w:hAnsi="Arial Nova Cond"/>
-                <w:sz w:val="24"/>
-                <w:szCs w:val="24"/>
-              </w:rPr>
-              <w:t xml:space="preserve"> </w:t>
+              <w:t xml:space="preserve">Kondisi fisik septictank dan resapan </w:t>
             </w:r>
           </w:p>
         </w:tc>
@@ -5071,55 +3825,7 @@
                 <w:sz w:val="24"/>
                 <w:szCs w:val="24"/>
               </w:rPr>
-              <w:t xml:space="preserve">Data </w:t>
-            </w:r>
-            <w:r>
-              <w:rPr>
-                <w:rFonts w:ascii="Arial Nova Cond" w:hAnsi="Arial Nova Cond"/>
-                <w:sz w:val="24"/>
-                <w:szCs w:val="24"/>
-              </w:rPr>
-              <w:t>pantau</w:t>
-            </w:r>
-            <w:r>
-              <w:rPr>
-                <w:rFonts w:ascii="Arial Nova Cond" w:hAnsi="Arial Nova Cond"/>
-                <w:sz w:val="24"/>
-                <w:szCs w:val="24"/>
-              </w:rPr>
-              <w:t xml:space="preserve"> </w:t>
-            </w:r>
-            <w:r>
-              <w:rPr>
-                <w:rFonts w:ascii="Arial Nova Cond" w:hAnsi="Arial Nova Cond"/>
-                <w:sz w:val="24"/>
-                <w:szCs w:val="24"/>
-              </w:rPr>
-              <w:t>analisa</w:t>
-            </w:r>
-            <w:r>
-              <w:rPr>
-                <w:rFonts w:ascii="Arial Nova Cond" w:hAnsi="Arial Nova Cond"/>
-                <w:sz w:val="24"/>
-                <w:szCs w:val="24"/>
-              </w:rPr>
-              <w:t xml:space="preserve"> air </w:t>
-            </w:r>
-            <w:r>
-              <w:rPr>
-                <w:rFonts w:ascii="Arial Nova Cond" w:hAnsi="Arial Nova Cond"/>
-                <w:sz w:val="24"/>
-                <w:szCs w:val="24"/>
-              </w:rPr>
-              <w:t>limbah</w:t>
-            </w:r>
-            <w:r>
-              <w:rPr>
-                <w:rFonts w:ascii="Arial Nova Cond" w:hAnsi="Arial Nova Cond"/>
-                <w:sz w:val="24"/>
-                <w:szCs w:val="24"/>
-              </w:rPr>
-              <w:t xml:space="preserve"> domestic</w:t>
+              <w:t>Data pantau analisa air limbah domestic</w:t>
             </w:r>
           </w:p>
         </w:tc>
@@ -5228,23 +3934,7 @@
                 <w:sz w:val="24"/>
                 <w:szCs w:val="24"/>
               </w:rPr>
-              <w:t>Pengelolaan</w:t>
-            </w:r>
-            <w:r>
-              <w:rPr>
-                <w:rFonts w:ascii="Arial Nova Cond" w:hAnsi="Arial Nova Cond"/>
-                <w:sz w:val="24"/>
-                <w:szCs w:val="24"/>
-              </w:rPr>
-              <w:t xml:space="preserve"> sludge </w:t>
-            </w:r>
-            <w:r>
-              <w:rPr>
-                <w:rFonts w:ascii="Arial Nova Cond" w:hAnsi="Arial Nova Cond"/>
-                <w:sz w:val="24"/>
-                <w:szCs w:val="24"/>
-              </w:rPr>
-              <w:t>septictank</w:t>
+              <w:t>Pengelolaan sludge septictank</w:t>
             </w:r>
           </w:p>
         </w:tc>
@@ -5335,15 +4025,7 @@
                 <w:sz w:val="24"/>
                 <w:szCs w:val="24"/>
               </w:rPr>
-              <w:t>Pengelolaan</w:t>
-            </w:r>
-            <w:r>
-              <w:rPr>
-                <w:rFonts w:ascii="Arial Nova Cond" w:hAnsi="Arial Nova Cond"/>
-                <w:sz w:val="24"/>
-                <w:szCs w:val="24"/>
-              </w:rPr>
-              <w:t xml:space="preserve"> IPAL</w:t>
+              <w:t>Pengelolaan IPAL</w:t>
             </w:r>
           </w:p>
         </w:tc>
@@ -5428,103 +4110,7 @@
           <w:sz w:val="24"/>
           <w:szCs w:val="24"/>
         </w:rPr>
-        <w:t xml:space="preserve">.  </w:t>
-      </w:r>
-      <w:r>
-        <w:rPr>
-          <w:rFonts w:ascii="Arial Nova Cond" w:hAnsi="Arial Nova Cond"/>
-          <w:sz w:val="24"/>
-          <w:szCs w:val="24"/>
-        </w:rPr>
-        <w:t>Pemeriksaan</w:t>
-      </w:r>
-      <w:r>
-        <w:rPr>
-          <w:rFonts w:ascii="Arial Nova Cond" w:hAnsi="Arial Nova Cond"/>
-          <w:sz w:val="24"/>
-          <w:szCs w:val="24"/>
-        </w:rPr>
-        <w:t xml:space="preserve"> </w:t>
-      </w:r>
-      <w:r>
-        <w:rPr>
-          <w:rFonts w:ascii="Arial Nova Cond" w:hAnsi="Arial Nova Cond"/>
-          <w:sz w:val="24"/>
-          <w:szCs w:val="24"/>
-        </w:rPr>
-        <w:t>Pengelolaan</w:t>
-      </w:r>
-      <w:r>
-        <w:rPr>
-          <w:rFonts w:ascii="Arial Nova Cond" w:hAnsi="Arial Nova Cond"/>
-          <w:sz w:val="24"/>
-          <w:szCs w:val="24"/>
-        </w:rPr>
-        <w:t xml:space="preserve"> </w:t>
-      </w:r>
-      <w:r>
-        <w:rPr>
-          <w:rFonts w:ascii="Arial Nova Cond" w:hAnsi="Arial Nova Cond"/>
-          <w:sz w:val="24"/>
-          <w:szCs w:val="24"/>
-        </w:rPr>
-        <w:t>Limbah</w:t>
-      </w:r>
-      <w:r>
-        <w:rPr>
-          <w:rFonts w:ascii="Arial Nova Cond" w:hAnsi="Arial Nova Cond"/>
-          <w:sz w:val="24"/>
-          <w:szCs w:val="24"/>
-        </w:rPr>
-        <w:t xml:space="preserve"> </w:t>
-      </w:r>
-      <w:r>
-        <w:rPr>
-          <w:rFonts w:ascii="Arial Nova Cond" w:hAnsi="Arial Nova Cond"/>
-          <w:sz w:val="24"/>
-          <w:szCs w:val="24"/>
-        </w:rPr>
-        <w:t>Bahan</w:t>
-      </w:r>
-      <w:r>
-        <w:rPr>
-          <w:rFonts w:ascii="Arial Nova Cond" w:hAnsi="Arial Nova Cond"/>
-          <w:sz w:val="24"/>
-          <w:szCs w:val="24"/>
-        </w:rPr>
-        <w:t xml:space="preserve"> </w:t>
-      </w:r>
-      <w:r>
-        <w:rPr>
-          <w:rFonts w:ascii="Arial Nova Cond" w:hAnsi="Arial Nova Cond"/>
-          <w:sz w:val="24"/>
-          <w:szCs w:val="24"/>
-        </w:rPr>
-        <w:t>Berbahaya</w:t>
-      </w:r>
-      <w:r>
-        <w:rPr>
-          <w:rFonts w:ascii="Arial Nova Cond" w:hAnsi="Arial Nova Cond"/>
-          <w:sz w:val="24"/>
-          <w:szCs w:val="24"/>
-        </w:rPr>
-        <w:t xml:space="preserve"> dan </w:t>
-      </w:r>
-      <w:r>
-        <w:rPr>
-          <w:rFonts w:ascii="Arial Nova Cond" w:hAnsi="Arial Nova Cond"/>
-          <w:sz w:val="24"/>
-          <w:szCs w:val="24"/>
-        </w:rPr>
-        <w:t>Beracun</w:t>
-      </w:r>
-      <w:r>
-        <w:rPr>
-          <w:rFonts w:ascii="Arial Nova Cond" w:hAnsi="Arial Nova Cond"/>
-          <w:sz w:val="24"/>
-          <w:szCs w:val="24"/>
-        </w:rPr>
-        <w:t xml:space="preserve"> </w:t>
+        <w:t xml:space="preserve">.  Pemeriksaan Pengelolaan Limbah Bahan Berbahaya dan Beracun </w:t>
       </w:r>
       <w:r>
         <w:rPr>
@@ -5599,9 +4185,17 @@
                 <w:sz w:val="24"/>
                 <w:szCs w:val="24"/>
               </w:rPr>
-              <w:t xml:space="preserve">Point </w:t>
-            </w:r>
-            <w:r>
+              <w:t>Point Pemeriksaan</w:t>
+            </w:r>
+          </w:p>
+        </w:tc>
+        <w:tc>
+          <w:tcPr>
+            <w:tcW w:w="3460" w:type="dxa"/>
+          </w:tcPr>
+          <w:p>
+            <w:pPr>
+              <w:jc w:val="center"/>
               <w:rPr>
                 <w:rFonts w:ascii="Arial Nova Cond" w:hAnsi="Arial Nova Cond"/>
                 <w:b/>
@@ -5609,17 +4203,8 @@
                 <w:sz w:val="24"/>
                 <w:szCs w:val="24"/>
               </w:rPr>
-              <w:t>Pemeriksaan</w:t>
-            </w:r>
-          </w:p>
-        </w:tc>
-        <w:tc>
-          <w:tcPr>
-            <w:tcW w:w="3460" w:type="dxa"/>
-          </w:tcPr>
-          <w:p>
-            <w:pPr>
-              <w:jc w:val="center"/>
+            </w:pPr>
+            <w:r>
               <w:rPr>
                 <w:rFonts w:ascii="Arial Nova Cond" w:hAnsi="Arial Nova Cond"/>
                 <w:b/>
@@ -5627,8 +4212,17 @@
                 <w:sz w:val="24"/>
                 <w:szCs w:val="24"/>
               </w:rPr>
-            </w:pPr>
-            <w:r>
+              <w:t>Kondisi Eksisting</w:t>
+            </w:r>
+          </w:p>
+        </w:tc>
+        <w:tc>
+          <w:tcPr>
+            <w:tcW w:w="3694" w:type="dxa"/>
+          </w:tcPr>
+          <w:p>
+            <w:pPr>
+              <w:jc w:val="center"/>
               <w:rPr>
                 <w:rFonts w:ascii="Arial Nova Cond" w:hAnsi="Arial Nova Cond"/>
                 <w:b/>
@@ -5636,8 +4230,7 @@
                 <w:sz w:val="24"/>
                 <w:szCs w:val="24"/>
               </w:rPr>
-              <w:t>Kondisi</w:t>
-            </w:r>
+            </w:pPr>
             <w:r>
               <w:rPr>
                 <w:rFonts w:ascii="Arial Nova Cond" w:hAnsi="Arial Nova Cond"/>
@@ -5646,43 +4239,6 @@
                 <w:sz w:val="24"/>
                 <w:szCs w:val="24"/>
               </w:rPr>
-              <w:t xml:space="preserve"> </w:t>
-            </w:r>
-            <w:r>
-              <w:rPr>
-                <w:rFonts w:ascii="Arial Nova Cond" w:hAnsi="Arial Nova Cond"/>
-                <w:b/>
-                <w:bCs/>
-                <w:sz w:val="24"/>
-                <w:szCs w:val="24"/>
-              </w:rPr>
-              <w:t>Eksisting</w:t>
-            </w:r>
-          </w:p>
-        </w:tc>
-        <w:tc>
-          <w:tcPr>
-            <w:tcW w:w="3694" w:type="dxa"/>
-          </w:tcPr>
-          <w:p>
-            <w:pPr>
-              <w:jc w:val="center"/>
-              <w:rPr>
-                <w:rFonts w:ascii="Arial Nova Cond" w:hAnsi="Arial Nova Cond"/>
-                <w:b/>
-                <w:bCs/>
-                <w:sz w:val="24"/>
-                <w:szCs w:val="24"/>
-              </w:rPr>
-            </w:pPr>
-            <w:r>
-              <w:rPr>
-                <w:rFonts w:ascii="Arial Nova Cond" w:hAnsi="Arial Nova Cond"/>
-                <w:b/>
-                <w:bCs/>
-                <w:sz w:val="24"/>
-                <w:szCs w:val="24"/>
-              </w:rPr>
               <w:t>Keterangan</w:t>
             </w:r>
           </w:p>
@@ -5730,15 +4286,7 @@
                 <w:sz w:val="24"/>
                 <w:szCs w:val="24"/>
               </w:rPr>
-              <w:t>Sumber</w:t>
-            </w:r>
-            <w:r>
-              <w:rPr>
-                <w:rFonts w:ascii="Arial Nova Cond" w:hAnsi="Arial Nova Cond"/>
-                <w:sz w:val="24"/>
-                <w:szCs w:val="24"/>
-              </w:rPr>
-              <w:t xml:space="preserve"> LB3</w:t>
+              <w:t>Sumber LB3</w:t>
             </w:r>
           </w:p>
         </w:tc>
@@ -5830,15 +4378,7 @@
                 <w:sz w:val="24"/>
                 <w:szCs w:val="24"/>
               </w:rPr>
-              <w:t>Jenis</w:t>
-            </w:r>
-            <w:r>
-              <w:rPr>
-                <w:rFonts w:ascii="Arial Nova Cond" w:hAnsi="Arial Nova Cond"/>
-                <w:sz w:val="24"/>
-                <w:szCs w:val="24"/>
-              </w:rPr>
-              <w:t xml:space="preserve"> LB3</w:t>
+              <w:t>Jenis LB3</w:t>
             </w:r>
           </w:p>
         </w:tc>
@@ -5931,15 +4471,7 @@
                 <w:sz w:val="24"/>
                 <w:szCs w:val="24"/>
               </w:rPr>
-              <w:t>Kondisi</w:t>
-            </w:r>
-            <w:r>
-              <w:rPr>
-                <w:rFonts w:ascii="Arial Nova Cond" w:hAnsi="Arial Nova Cond"/>
-                <w:sz w:val="24"/>
-                <w:szCs w:val="24"/>
-              </w:rPr>
-              <w:t xml:space="preserve"> TPS LB3</w:t>
+              <w:t>Kondisi TPS LB3</w:t>
             </w:r>
           </w:p>
         </w:tc>
@@ -6034,15 +4566,7 @@
                 <w:sz w:val="24"/>
                 <w:szCs w:val="24"/>
               </w:rPr>
-              <w:t>Pengelolaan</w:t>
-            </w:r>
-            <w:r>
-              <w:rPr>
-                <w:rFonts w:ascii="Arial Nova Cond" w:hAnsi="Arial Nova Cond"/>
-                <w:sz w:val="24"/>
-                <w:szCs w:val="24"/>
-              </w:rPr>
-              <w:t xml:space="preserve"> LB3 </w:t>
+              <w:t xml:space="preserve">Pengelolaan LB3 </w:t>
             </w:r>
           </w:p>
         </w:tc>
@@ -6127,63 +4651,7 @@
           <w:sz w:val="24"/>
           <w:szCs w:val="24"/>
         </w:rPr>
-        <w:t xml:space="preserve">.  </w:t>
-      </w:r>
-      <w:r>
-        <w:rPr>
-          <w:rFonts w:ascii="Arial Nova Cond" w:hAnsi="Arial Nova Cond"/>
-          <w:sz w:val="24"/>
-          <w:szCs w:val="24"/>
-        </w:rPr>
-        <w:t>Pemeriksaan</w:t>
-      </w:r>
-      <w:r>
-        <w:rPr>
-          <w:rFonts w:ascii="Arial Nova Cond" w:hAnsi="Arial Nova Cond"/>
-          <w:sz w:val="24"/>
-          <w:szCs w:val="24"/>
-        </w:rPr>
-        <w:t xml:space="preserve"> </w:t>
-      </w:r>
-      <w:r>
-        <w:rPr>
-          <w:rFonts w:ascii="Arial Nova Cond" w:hAnsi="Arial Nova Cond"/>
-          <w:sz w:val="24"/>
-          <w:szCs w:val="24"/>
-        </w:rPr>
-        <w:t>Pengelolaan</w:t>
-      </w:r>
-      <w:r>
-        <w:rPr>
-          <w:rFonts w:ascii="Arial Nova Cond" w:hAnsi="Arial Nova Cond"/>
-          <w:sz w:val="24"/>
-          <w:szCs w:val="24"/>
-        </w:rPr>
-        <w:t xml:space="preserve"> </w:t>
-      </w:r>
-      <w:r>
-        <w:rPr>
-          <w:rFonts w:ascii="Arial Nova Cond" w:hAnsi="Arial Nova Cond"/>
-          <w:sz w:val="24"/>
-          <w:szCs w:val="24"/>
-        </w:rPr>
-        <w:t>Sampah</w:t>
-      </w:r>
-      <w:r>
-        <w:rPr>
-          <w:rFonts w:ascii="Arial Nova Cond" w:hAnsi="Arial Nova Cond"/>
-          <w:sz w:val="24"/>
-          <w:szCs w:val="24"/>
-        </w:rPr>
-        <w:t xml:space="preserve"> </w:t>
-      </w:r>
-      <w:r>
-        <w:rPr>
-          <w:rFonts w:ascii="Arial Nova Cond" w:hAnsi="Arial Nova Cond"/>
-          <w:sz w:val="24"/>
-          <w:szCs w:val="24"/>
-        </w:rPr>
-        <w:t>Domestik</w:t>
+        <w:t>.  Pemeriksaan Pengelolaan Sampah Domestik</w:t>
       </w:r>
     </w:p>
     <w:tbl>
@@ -6250,9 +4718,17 @@
                 <w:sz w:val="24"/>
                 <w:szCs w:val="24"/>
               </w:rPr>
-              <w:t xml:space="preserve">Point </w:t>
-            </w:r>
-            <w:r>
+              <w:t>Point Pemeriksaan</w:t>
+            </w:r>
+          </w:p>
+        </w:tc>
+        <w:tc>
+          <w:tcPr>
+            <w:tcW w:w="3757" w:type="dxa"/>
+          </w:tcPr>
+          <w:p>
+            <w:pPr>
+              <w:jc w:val="center"/>
               <w:rPr>
                 <w:rFonts w:ascii="Arial Nova Cond" w:hAnsi="Arial Nova Cond"/>
                 <w:b/>
@@ -6260,17 +4736,8 @@
                 <w:sz w:val="24"/>
                 <w:szCs w:val="24"/>
               </w:rPr>
-              <w:t>Pemeriksaan</w:t>
-            </w:r>
-          </w:p>
-        </w:tc>
-        <w:tc>
-          <w:tcPr>
-            <w:tcW w:w="3757" w:type="dxa"/>
-          </w:tcPr>
-          <w:p>
-            <w:pPr>
-              <w:jc w:val="center"/>
+            </w:pPr>
+            <w:r>
               <w:rPr>
                 <w:rFonts w:ascii="Arial Nova Cond" w:hAnsi="Arial Nova Cond"/>
                 <w:b/>
@@ -6278,8 +4745,17 @@
                 <w:sz w:val="24"/>
                 <w:szCs w:val="24"/>
               </w:rPr>
-            </w:pPr>
-            <w:r>
+              <w:t>Kondisi Eksisting</w:t>
+            </w:r>
+          </w:p>
+        </w:tc>
+        <w:tc>
+          <w:tcPr>
+            <w:tcW w:w="3331" w:type="dxa"/>
+          </w:tcPr>
+          <w:p>
+            <w:pPr>
+              <w:jc w:val="center"/>
               <w:rPr>
                 <w:rFonts w:ascii="Arial Nova Cond" w:hAnsi="Arial Nova Cond"/>
                 <w:b/>
@@ -6287,8 +4763,7 @@
                 <w:sz w:val="24"/>
                 <w:szCs w:val="24"/>
               </w:rPr>
-              <w:t>Kondisi</w:t>
-            </w:r>
+            </w:pPr>
             <w:r>
               <w:rPr>
                 <w:rFonts w:ascii="Arial Nova Cond" w:hAnsi="Arial Nova Cond"/>
@@ -6297,43 +4772,6 @@
                 <w:sz w:val="24"/>
                 <w:szCs w:val="24"/>
               </w:rPr>
-              <w:t xml:space="preserve"> </w:t>
-            </w:r>
-            <w:r>
-              <w:rPr>
-                <w:rFonts w:ascii="Arial Nova Cond" w:hAnsi="Arial Nova Cond"/>
-                <w:b/>
-                <w:bCs/>
-                <w:sz w:val="24"/>
-                <w:szCs w:val="24"/>
-              </w:rPr>
-              <w:t>Eksisting</w:t>
-            </w:r>
-          </w:p>
-        </w:tc>
-        <w:tc>
-          <w:tcPr>
-            <w:tcW w:w="3331" w:type="dxa"/>
-          </w:tcPr>
-          <w:p>
-            <w:pPr>
-              <w:jc w:val="center"/>
-              <w:rPr>
-                <w:rFonts w:ascii="Arial Nova Cond" w:hAnsi="Arial Nova Cond"/>
-                <w:b/>
-                <w:bCs/>
-                <w:sz w:val="24"/>
-                <w:szCs w:val="24"/>
-              </w:rPr>
-            </w:pPr>
-            <w:r>
-              <w:rPr>
-                <w:rFonts w:ascii="Arial Nova Cond" w:hAnsi="Arial Nova Cond"/>
-                <w:b/>
-                <w:bCs/>
-                <w:sz w:val="24"/>
-                <w:szCs w:val="24"/>
-              </w:rPr>
               <w:t>Keterangan</w:t>
             </w:r>
           </w:p>
@@ -6382,39 +4820,7 @@
                 <w:sz w:val="24"/>
                 <w:szCs w:val="24"/>
               </w:rPr>
-              <w:t>Sumber</w:t>
-            </w:r>
-            <w:r>
-              <w:rPr>
-                <w:rFonts w:ascii="Arial Nova Cond" w:hAnsi="Arial Nova Cond"/>
-                <w:sz w:val="24"/>
-                <w:szCs w:val="24"/>
-              </w:rPr>
-              <w:t xml:space="preserve"> </w:t>
-            </w:r>
-            <w:r>
-              <w:rPr>
-                <w:rFonts w:ascii="Arial Nova Cond" w:hAnsi="Arial Nova Cond"/>
-                <w:sz w:val="24"/>
-                <w:szCs w:val="24"/>
-              </w:rPr>
-              <w:t>Sampah</w:t>
-            </w:r>
-            <w:r>
-              <w:rPr>
-                <w:rFonts w:ascii="Arial Nova Cond" w:hAnsi="Arial Nova Cond"/>
-                <w:sz w:val="24"/>
-                <w:szCs w:val="24"/>
-              </w:rPr>
-              <w:t xml:space="preserve"> </w:t>
-            </w:r>
-            <w:r>
-              <w:rPr>
-                <w:rFonts w:ascii="Arial Nova Cond" w:hAnsi="Arial Nova Cond"/>
-                <w:sz w:val="24"/>
-                <w:szCs w:val="24"/>
-              </w:rPr>
-              <w:t>Domestik</w:t>
+              <w:t>Sumber Sampah Domestik</w:t>
             </w:r>
           </w:p>
         </w:tc>
@@ -6506,39 +4912,7 @@
                 <w:sz w:val="24"/>
                 <w:szCs w:val="24"/>
               </w:rPr>
-              <w:t>Jenis</w:t>
-            </w:r>
-            <w:r>
-              <w:rPr>
-                <w:rFonts w:ascii="Arial Nova Cond" w:hAnsi="Arial Nova Cond"/>
-                <w:sz w:val="24"/>
-                <w:szCs w:val="24"/>
-              </w:rPr>
-              <w:t xml:space="preserve"> </w:t>
-            </w:r>
-            <w:r>
-              <w:rPr>
-                <w:rFonts w:ascii="Arial Nova Cond" w:hAnsi="Arial Nova Cond"/>
-                <w:sz w:val="24"/>
-                <w:szCs w:val="24"/>
-              </w:rPr>
-              <w:t>Sampah</w:t>
-            </w:r>
-            <w:r>
-              <w:rPr>
-                <w:rFonts w:ascii="Arial Nova Cond" w:hAnsi="Arial Nova Cond"/>
-                <w:sz w:val="24"/>
-                <w:szCs w:val="24"/>
-              </w:rPr>
-              <w:t xml:space="preserve"> </w:t>
-            </w:r>
-            <w:r>
-              <w:rPr>
-                <w:rFonts w:ascii="Arial Nova Cond" w:hAnsi="Arial Nova Cond"/>
-                <w:sz w:val="24"/>
-                <w:szCs w:val="24"/>
-              </w:rPr>
-              <w:t>Domestik</w:t>
+              <w:t>Jenis Sampah Domestik</w:t>
             </w:r>
           </w:p>
         </w:tc>
@@ -6630,39 +5004,7 @@
                 <w:sz w:val="24"/>
                 <w:szCs w:val="24"/>
               </w:rPr>
-              <w:t>Kondisi</w:t>
-            </w:r>
-            <w:r>
-              <w:rPr>
-                <w:rFonts w:ascii="Arial Nova Cond" w:hAnsi="Arial Nova Cond"/>
-                <w:sz w:val="24"/>
-                <w:szCs w:val="24"/>
-              </w:rPr>
-              <w:t xml:space="preserve"> TPS </w:t>
-            </w:r>
-            <w:r>
-              <w:rPr>
-                <w:rFonts w:ascii="Arial Nova Cond" w:hAnsi="Arial Nova Cond"/>
-                <w:sz w:val="24"/>
-                <w:szCs w:val="24"/>
-              </w:rPr>
-              <w:t>Sampah</w:t>
-            </w:r>
-            <w:r>
-              <w:rPr>
-                <w:rFonts w:ascii="Arial Nova Cond" w:hAnsi="Arial Nova Cond"/>
-                <w:sz w:val="24"/>
-                <w:szCs w:val="24"/>
-              </w:rPr>
-              <w:t xml:space="preserve"> </w:t>
-            </w:r>
-            <w:r>
-              <w:rPr>
-                <w:rFonts w:ascii="Arial Nova Cond" w:hAnsi="Arial Nova Cond"/>
-                <w:sz w:val="24"/>
-                <w:szCs w:val="24"/>
-              </w:rPr>
-              <w:t>Domestik</w:t>
+              <w:t>Kondisi TPS Sampah Domestik</w:t>
             </w:r>
           </w:p>
         </w:tc>
@@ -6754,39 +5096,7 @@
                 <w:sz w:val="24"/>
                 <w:szCs w:val="24"/>
               </w:rPr>
-              <w:t>Pengelolaan</w:t>
-            </w:r>
-            <w:r>
-              <w:rPr>
-                <w:rFonts w:ascii="Arial Nova Cond" w:hAnsi="Arial Nova Cond"/>
-                <w:sz w:val="24"/>
-                <w:szCs w:val="24"/>
-              </w:rPr>
-              <w:t xml:space="preserve"> </w:t>
-            </w:r>
-            <w:r>
-              <w:rPr>
-                <w:rFonts w:ascii="Arial Nova Cond" w:hAnsi="Arial Nova Cond"/>
-                <w:sz w:val="24"/>
-                <w:szCs w:val="24"/>
-              </w:rPr>
-              <w:t>sampah</w:t>
-            </w:r>
-            <w:r>
-              <w:rPr>
-                <w:rFonts w:ascii="Arial Nova Cond" w:hAnsi="Arial Nova Cond"/>
-                <w:sz w:val="24"/>
-                <w:szCs w:val="24"/>
-              </w:rPr>
-              <w:t xml:space="preserve"> </w:t>
-            </w:r>
-            <w:r>
-              <w:rPr>
-                <w:rFonts w:ascii="Arial Nova Cond" w:hAnsi="Arial Nova Cond"/>
-                <w:sz w:val="24"/>
-                <w:szCs w:val="24"/>
-              </w:rPr>
-              <w:t>domestik</w:t>
+              <w:t>Pengelolaan sampah domestik</w:t>
             </w:r>
           </w:p>
         </w:tc>
@@ -7058,9 +5368,15 @@
     </w:p>
     <w:p>
       <w:pPr>
-        <w:spacing w:after="0" w:line="240" w:lineRule="auto"/>
-        <w:ind w:left="426"/>
-        <w:jc w:val="both"/>
+        <w:pStyle w:val="ListParagraph"/>
+        <w:numPr>
+          <w:ilvl w:val="0"/>
+          <w:numId w:val="32"/>
+        </w:numPr>
+        <w:tabs>
+          <w:tab w:val="left" w:pos="709"/>
+        </w:tabs>
+        <w:ind w:left="851" w:hanging="425"/>
         <w:rPr>
           <w:rFonts w:ascii="Arial Nova Cond" w:hAnsi="Arial Nova Cond"/>
           <w:sz w:val="24"/>
@@ -7073,41 +5389,65 @@
           <w:sz w:val="24"/>
           <w:szCs w:val="24"/>
         </w:rPr>
-        <w:t xml:space="preserve">6. Saran dan </w:t>
+        <w:t>Saran dan Masukan</w:t>
       </w:r>
+    </w:p>
+    <w:p>
+      <w:pPr>
+        <w:pStyle w:val="ListParagraph"/>
+        <w:ind w:left="709"/>
+        <w:rPr>
+          <w:rFonts w:ascii="Arial Nova Cond" w:hAnsi="Arial Nova Cond"/>
+          <w:sz w:val="24"/>
+          <w:szCs w:val="24"/>
+        </w:rPr>
+      </w:pPr>
       <w:r>
         <w:rPr>
           <w:rFonts w:ascii="Arial Nova Cond" w:hAnsi="Arial Nova Cond"/>
           <w:sz w:val="24"/>
           <w:szCs w:val="24"/>
         </w:rPr>
-        <w:t>Masukan</w:t>
+        <w:t>{#saran}</w:t>
       </w:r>
+    </w:p>
+    <w:p>
+      <w:pPr>
+        <w:pStyle w:val="ListParagraph"/>
+        <w:ind w:left="709"/>
+        <w:rPr>
+          <w:rFonts w:ascii="Arial Nova Cond" w:hAnsi="Arial Nova Cond"/>
+          <w:sz w:val="24"/>
+          <w:szCs w:val="24"/>
+        </w:rPr>
+      </w:pPr>
       <w:r>
         <w:rPr>
           <w:rFonts w:ascii="Arial Nova Cond" w:hAnsi="Arial Nova Cond"/>
           <w:sz w:val="24"/>
           <w:szCs w:val="24"/>
         </w:rPr>
-        <w:t xml:space="preserve"> </w:t>
+        <w:t>{abjad}. {saran_text}</w:t>
       </w:r>
+    </w:p>
+    <w:p>
+      <w:pPr>
+        <w:pStyle w:val="ListParagraph"/>
+        <w:ind w:left="709"/>
+        <w:rPr>
+          <w:rFonts w:ascii="Arial Nova Cond" w:hAnsi="Arial Nova Cond"/>
+          <w:sz w:val="24"/>
+          <w:szCs w:val="24"/>
+        </w:rPr>
+      </w:pPr>
       <w:r>
         <w:rPr>
           <w:rFonts w:ascii="Arial Nova Cond" w:hAnsi="Arial Nova Cond"/>
           <w:sz w:val="24"/>
           <w:szCs w:val="24"/>
         </w:rPr>
-        <w:t>{#saran} {abjad}. {saran_text} {/saran}</w:t>
+        <w:t>{/saran}</w:t>
       </w:r>
-    </w:p>
-    <w:p>
-      <w:pPr>
-        <w:rPr>
-          <w:rFonts w:ascii="Arial Nova Cond" w:hAnsi="Arial Nova Cond"/>
-          <w:sz w:val="24"/>
-          <w:szCs w:val="24"/>
-        </w:rPr>
-      </w:pPr>
       <w:r>
         <w:rPr>
           <w:rFonts w:ascii="Arial Nova Cond" w:hAnsi="Arial Nova Cond"/>
@@ -7133,151 +5473,7 @@
           <w:szCs w:val="24"/>
         </w:rPr>
         <w:lastRenderedPageBreak/>
-        <w:t>Pelaksanaan</w:t>
-      </w:r>
-      <w:r>
-        <w:rPr>
-          <w:rFonts w:ascii="Arial Nova Cond" w:hAnsi="Arial Nova Cond"/>
-          <w:sz w:val="24"/>
-          <w:szCs w:val="24"/>
-        </w:rPr>
-        <w:t xml:space="preserve"> dan </w:t>
-      </w:r>
-      <w:r>
-        <w:rPr>
-          <w:rFonts w:ascii="Arial Nova Cond" w:hAnsi="Arial Nova Cond"/>
-          <w:sz w:val="24"/>
-          <w:szCs w:val="24"/>
-        </w:rPr>
-        <w:t>temuan</w:t>
-      </w:r>
-      <w:r>
-        <w:rPr>
-          <w:rFonts w:ascii="Arial Nova Cond" w:hAnsi="Arial Nova Cond"/>
-          <w:sz w:val="24"/>
-          <w:szCs w:val="24"/>
-        </w:rPr>
-        <w:t xml:space="preserve"> </w:t>
-      </w:r>
-      <w:r>
-        <w:rPr>
-          <w:rFonts w:ascii="Arial Nova Cond" w:hAnsi="Arial Nova Cond"/>
-          <w:sz w:val="24"/>
-          <w:szCs w:val="24"/>
-        </w:rPr>
-        <w:t>fakta-fakta</w:t>
-      </w:r>
-      <w:r>
-        <w:rPr>
-          <w:rFonts w:ascii="Arial Nova Cond" w:hAnsi="Arial Nova Cond"/>
-          <w:sz w:val="24"/>
-          <w:szCs w:val="24"/>
-        </w:rPr>
-        <w:t xml:space="preserve"> </w:t>
-      </w:r>
-      <w:r>
-        <w:rPr>
-          <w:rFonts w:ascii="Arial Nova Cond" w:hAnsi="Arial Nova Cond"/>
-          <w:sz w:val="24"/>
-          <w:szCs w:val="24"/>
-        </w:rPr>
-        <w:t>pengawasan</w:t>
-      </w:r>
-      <w:r>
-        <w:rPr>
-          <w:rFonts w:ascii="Arial Nova Cond" w:hAnsi="Arial Nova Cond"/>
-          <w:sz w:val="24"/>
-          <w:szCs w:val="24"/>
-        </w:rPr>
-        <w:t xml:space="preserve"> </w:t>
-      </w:r>
-      <w:r>
-        <w:rPr>
-          <w:rFonts w:ascii="Arial Nova Cond" w:hAnsi="Arial Nova Cond"/>
-          <w:sz w:val="24"/>
-          <w:szCs w:val="24"/>
-        </w:rPr>
-        <w:t>lingkungan</w:t>
-      </w:r>
-      <w:r>
-        <w:rPr>
-          <w:rFonts w:ascii="Arial Nova Cond" w:hAnsi="Arial Nova Cond"/>
-          <w:sz w:val="24"/>
-          <w:szCs w:val="24"/>
-        </w:rPr>
-        <w:t xml:space="preserve"> </w:t>
-      </w:r>
-      <w:r>
-        <w:rPr>
-          <w:rFonts w:ascii="Arial Nova Cond" w:hAnsi="Arial Nova Cond"/>
-          <w:sz w:val="24"/>
-          <w:szCs w:val="24"/>
-        </w:rPr>
-        <w:t>hidup</w:t>
-      </w:r>
-      <w:r>
-        <w:rPr>
-          <w:rFonts w:ascii="Arial Nova Cond" w:hAnsi="Arial Nova Cond"/>
-          <w:sz w:val="24"/>
-          <w:szCs w:val="24"/>
-        </w:rPr>
-        <w:t xml:space="preserve"> </w:t>
-      </w:r>
-      <w:r>
-        <w:rPr>
-          <w:rFonts w:ascii="Arial Nova Cond" w:hAnsi="Arial Nova Cond"/>
-          <w:sz w:val="24"/>
-          <w:szCs w:val="24"/>
-        </w:rPr>
-        <w:t>ini</w:t>
-      </w:r>
-      <w:r>
-        <w:rPr>
-          <w:rFonts w:ascii="Arial Nova Cond" w:hAnsi="Arial Nova Cond"/>
-          <w:sz w:val="24"/>
-          <w:szCs w:val="24"/>
-        </w:rPr>
-        <w:t xml:space="preserve"> </w:t>
-      </w:r>
-      <w:r>
-        <w:rPr>
-          <w:rFonts w:ascii="Arial Nova Cond" w:hAnsi="Arial Nova Cond"/>
-          <w:sz w:val="24"/>
-          <w:szCs w:val="24"/>
-        </w:rPr>
-        <w:t>diketahui</w:t>
-      </w:r>
-      <w:r>
-        <w:rPr>
-          <w:rFonts w:ascii="Arial Nova Cond" w:hAnsi="Arial Nova Cond"/>
-          <w:sz w:val="24"/>
-          <w:szCs w:val="24"/>
-        </w:rPr>
-        <w:t xml:space="preserve"> dan </w:t>
-      </w:r>
-      <w:r>
-        <w:rPr>
-          <w:rFonts w:ascii="Arial Nova Cond" w:hAnsi="Arial Nova Cond"/>
-          <w:sz w:val="24"/>
-          <w:szCs w:val="24"/>
-        </w:rPr>
-        <w:t>dibenarkan</w:t>
-      </w:r>
-      <w:r>
-        <w:rPr>
-          <w:rFonts w:ascii="Arial Nova Cond" w:hAnsi="Arial Nova Cond"/>
-          <w:sz w:val="24"/>
-          <w:szCs w:val="24"/>
-        </w:rPr>
-        <w:t xml:space="preserve"> oleh </w:t>
-      </w:r>
-      <w:r>
-        <w:rPr>
-          <w:rFonts w:ascii="Arial Nova Cond" w:hAnsi="Arial Nova Cond"/>
-          <w:sz w:val="24"/>
-          <w:szCs w:val="24"/>
-        </w:rPr>
-        <w:t>pihak</w:t>
+        <w:t>Pelaksanaan dan temuan fakta-fakta pengawasan lingkungan hidup ini diketahui dan dibenarkan oleh pihak</w:t>
       </w:r>
       <w:r>
         <w:rPr>
@@ -7309,31 +5505,7 @@
           <w:sz w:val="24"/>
           <w:szCs w:val="24"/>
         </w:rPr>
-        <w:t>sebagai</w:t>
-      </w:r>
-      <w:r>
-        <w:rPr>
-          <w:rFonts w:ascii="Arial Nova Cond" w:hAnsi="Arial Nova Cond"/>
-          <w:sz w:val="24"/>
-          <w:szCs w:val="24"/>
-        </w:rPr>
-        <w:t xml:space="preserve"> </w:t>
-      </w:r>
-      <w:r>
-        <w:rPr>
-          <w:rFonts w:ascii="Arial Nova Cond" w:hAnsi="Arial Nova Cond"/>
-          <w:sz w:val="24"/>
-          <w:szCs w:val="24"/>
-        </w:rPr>
-        <w:t>berikut</w:t>
-      </w:r>
-      <w:r>
-        <w:rPr>
-          <w:rFonts w:ascii="Arial Nova Cond" w:hAnsi="Arial Nova Cond"/>
-          <w:sz w:val="24"/>
-          <w:szCs w:val="24"/>
-        </w:rPr>
-        <w:t xml:space="preserve"> :</w:t>
+        <w:t>sebagai berikut :</w:t>
       </w:r>
     </w:p>
     <w:p>
@@ -7574,15 +5746,7 @@
                 <w:sz w:val="24"/>
                 <w:szCs w:val="24"/>
               </w:rPr>
-              <w:t>Nomor</w:t>
-            </w:r>
-            <w:r>
-              <w:rPr>
-                <w:rFonts w:ascii="Arial Nova Cond" w:hAnsi="Arial Nova Cond"/>
-                <w:sz w:val="24"/>
-                <w:szCs w:val="24"/>
-              </w:rPr>
-              <w:t xml:space="preserve"> HP</w:t>
+              <w:t>Nomor HP</w:t>
             </w:r>
           </w:p>
         </w:tc>
@@ -7667,15 +5831,7 @@
                 <w:sz w:val="24"/>
                 <w:szCs w:val="24"/>
               </w:rPr>
-              <w:t xml:space="preserve">Tanda </w:t>
-            </w:r>
-            <w:r>
-              <w:rPr>
-                <w:rFonts w:ascii="Arial Nova Cond" w:hAnsi="Arial Nova Cond"/>
-                <w:sz w:val="24"/>
-                <w:szCs w:val="24"/>
-              </w:rPr>
-              <w:t>tangan</w:t>
+              <w:t>Tanda tangan</w:t>
             </w:r>
           </w:p>
         </w:tc>
@@ -7956,15 +6112,7 @@
                 <w:sz w:val="24"/>
                 <w:szCs w:val="24"/>
               </w:rPr>
-              <w:t>Nomor</w:t>
-            </w:r>
-            <w:r>
-              <w:rPr>
-                <w:rFonts w:ascii="Arial Nova Cond" w:hAnsi="Arial Nova Cond"/>
-                <w:sz w:val="24"/>
-                <w:szCs w:val="24"/>
-              </w:rPr>
-              <w:t xml:space="preserve"> HP</w:t>
+              <w:t>Nomor HP</w:t>
             </w:r>
           </w:p>
         </w:tc>
@@ -8049,15 +6197,7 @@
                 <w:sz w:val="24"/>
                 <w:szCs w:val="24"/>
               </w:rPr>
-              <w:t xml:space="preserve">Tanda </w:t>
-            </w:r>
-            <w:r>
-              <w:rPr>
-                <w:rFonts w:ascii="Arial Nova Cond" w:hAnsi="Arial Nova Cond"/>
-                <w:sz w:val="24"/>
-                <w:szCs w:val="24"/>
-              </w:rPr>
-              <w:t>tangan</w:t>
+              <w:t>Tanda tangan</w:t>
             </w:r>
           </w:p>
         </w:tc>
@@ -8156,124 +6296,7 @@
           <w:sz w:val="24"/>
           <w:szCs w:val="24"/>
         </w:rPr>
-        <w:t>Demikian</w:t>
-      </w:r>
-      <w:r>
-        <w:rPr>
-          <w:rFonts w:ascii="Arial Nova Cond" w:hAnsi="Arial Nova Cond"/>
-          <w:color w:val="0D0D0D"/>
-          <w:sz w:val="24"/>
-          <w:szCs w:val="24"/>
-        </w:rPr>
-        <w:t xml:space="preserve"> </w:t>
-      </w:r>
-      <w:r>
-        <w:rPr>
-          <w:rFonts w:ascii="Arial Nova Cond" w:hAnsi="Arial Nova Cond"/>
-          <w:color w:val="0D0D0D"/>
-          <w:sz w:val="24"/>
-          <w:szCs w:val="24"/>
-        </w:rPr>
-        <w:t>Berita</w:t>
-      </w:r>
-      <w:r>
-        <w:rPr>
-          <w:rFonts w:ascii="Arial Nova Cond" w:hAnsi="Arial Nova Cond"/>
-          <w:color w:val="0D0D0D"/>
-          <w:sz w:val="24"/>
-          <w:szCs w:val="24"/>
-        </w:rPr>
-        <w:t xml:space="preserve"> Acara </w:t>
-      </w:r>
-      <w:r>
-        <w:rPr>
-          <w:rFonts w:ascii="Arial Nova Cond" w:hAnsi="Arial Nova Cond"/>
-          <w:color w:val="0D0D0D"/>
-          <w:sz w:val="24"/>
-          <w:szCs w:val="24"/>
-        </w:rPr>
-        <w:t>Pengawasan</w:t>
-      </w:r>
-      <w:r>
-        <w:rPr>
-          <w:rFonts w:ascii="Arial Nova Cond" w:hAnsi="Arial Nova Cond"/>
-          <w:color w:val="0D0D0D"/>
-          <w:sz w:val="24"/>
-          <w:szCs w:val="24"/>
-        </w:rPr>
-        <w:t xml:space="preserve"> </w:t>
-      </w:r>
-      <w:r>
-        <w:rPr>
-          <w:rFonts w:ascii="Arial Nova Cond" w:hAnsi="Arial Nova Cond"/>
-          <w:color w:val="0D0D0D"/>
-          <w:sz w:val="24"/>
-          <w:szCs w:val="24"/>
-        </w:rPr>
-        <w:t>Lingkungan</w:t>
-      </w:r>
-      <w:r>
-        <w:rPr>
-          <w:rFonts w:ascii="Arial Nova Cond" w:hAnsi="Arial Nova Cond"/>
-          <w:color w:val="0D0D0D"/>
-          <w:sz w:val="24"/>
-          <w:szCs w:val="24"/>
-        </w:rPr>
-        <w:t xml:space="preserve"> </w:t>
-      </w:r>
-      <w:r>
-        <w:rPr>
-          <w:rFonts w:ascii="Arial Nova Cond" w:hAnsi="Arial Nova Cond"/>
-          <w:color w:val="0D0D0D"/>
-          <w:sz w:val="24"/>
-          <w:szCs w:val="24"/>
-        </w:rPr>
-        <w:t>Hidup</w:t>
-      </w:r>
-      <w:r>
-        <w:rPr>
-          <w:rFonts w:ascii="Arial Nova Cond" w:hAnsi="Arial Nova Cond"/>
-          <w:color w:val="0D0D0D"/>
-          <w:sz w:val="24"/>
-          <w:szCs w:val="24"/>
-        </w:rPr>
-        <w:t xml:space="preserve"> pada </w:t>
-      </w:r>
-      <w:r>
-        <w:rPr>
-          <w:rFonts w:ascii="Arial Nova Cond" w:hAnsi="Arial Nova Cond"/>
-          <w:color w:val="0D0D0D"/>
-          <w:sz w:val="24"/>
-          <w:szCs w:val="24"/>
-        </w:rPr>
-        <w:t>lokasi</w:t>
-      </w:r>
-      <w:r>
-        <w:rPr>
-          <w:rFonts w:ascii="Arial Nova Cond" w:hAnsi="Arial Nova Cond"/>
-          <w:color w:val="0D0D0D"/>
-          <w:sz w:val="24"/>
-          <w:szCs w:val="24"/>
-        </w:rPr>
-        <w:t xml:space="preserve"> </w:t>
-      </w:r>
-      <w:r>
-        <w:rPr>
-          <w:rFonts w:ascii="Arial Nova Cond" w:hAnsi="Arial Nova Cond"/>
-          <w:color w:val="0D0D0D"/>
-          <w:sz w:val="24"/>
-          <w:szCs w:val="24"/>
-        </w:rPr>
-        <w:t>kegiatan</w:t>
-      </w:r>
-      <w:r>
-        <w:rPr>
-          <w:rFonts w:ascii="Arial Nova Cond" w:hAnsi="Arial Nova Cond"/>
-          <w:color w:val="0D0D0D"/>
-          <w:sz w:val="24"/>
-          <w:szCs w:val="24"/>
-        </w:rPr>
-        <w:t xml:space="preserve"> </w:t>
+        <w:t xml:space="preserve">Demikian Berita Acara Pengawasan Lingkungan Hidup pada lokasi kegiatan </w:t>
       </w:r>
       <w:r>
         <w:rPr>
@@ -8299,106 +6322,7 @@
           <w:sz w:val="24"/>
           <w:szCs w:val="24"/>
         </w:rPr>
-        <w:t>dibuat</w:t>
-      </w:r>
-      <w:r>
-        <w:rPr>
-          <w:rFonts w:ascii="Arial Nova Cond" w:hAnsi="Arial Nova Cond"/>
-          <w:color w:val="0D0D0D"/>
-          <w:sz w:val="24"/>
-          <w:szCs w:val="24"/>
-        </w:rPr>
-        <w:t xml:space="preserve"> </w:t>
-      </w:r>
-      <w:r>
-        <w:rPr>
-          <w:rFonts w:ascii="Arial Nova Cond" w:hAnsi="Arial Nova Cond"/>
-          <w:color w:val="0D0D0D"/>
-          <w:sz w:val="24"/>
-          <w:szCs w:val="24"/>
-        </w:rPr>
-        <w:t>dengan</w:t>
-      </w:r>
-      <w:r>
-        <w:rPr>
-          <w:rFonts w:ascii="Arial Nova Cond" w:hAnsi="Arial Nova Cond"/>
-          <w:color w:val="0D0D0D"/>
-          <w:sz w:val="24"/>
-          <w:szCs w:val="24"/>
-        </w:rPr>
-        <w:t xml:space="preserve"> </w:t>
-      </w:r>
-      <w:r>
-        <w:rPr>
-          <w:rFonts w:ascii="Arial Nova Cond" w:hAnsi="Arial Nova Cond"/>
-          <w:color w:val="0D0D0D"/>
-          <w:sz w:val="24"/>
-          <w:szCs w:val="24"/>
-        </w:rPr>
-        <w:t>sebenar-benarnya</w:t>
-      </w:r>
-      <w:r>
-        <w:rPr>
-          <w:rFonts w:ascii="Arial Nova Cond" w:hAnsi="Arial Nova Cond"/>
-          <w:color w:val="0D0D0D"/>
-          <w:sz w:val="24"/>
-          <w:szCs w:val="24"/>
-        </w:rPr>
-        <w:t xml:space="preserve"> dan </w:t>
-      </w:r>
-      <w:r>
-        <w:rPr>
-          <w:rFonts w:ascii="Arial Nova Cond" w:hAnsi="Arial Nova Cond"/>
-          <w:color w:val="0D0D0D"/>
-          <w:sz w:val="24"/>
-          <w:szCs w:val="24"/>
-        </w:rPr>
-        <w:t>mengingat</w:t>
-      </w:r>
-      <w:r>
-        <w:rPr>
-          <w:rFonts w:ascii="Arial Nova Cond" w:hAnsi="Arial Nova Cond"/>
-          <w:color w:val="0D0D0D"/>
-          <w:sz w:val="24"/>
-          <w:szCs w:val="24"/>
-        </w:rPr>
-        <w:t xml:space="preserve"> </w:t>
-      </w:r>
-      <w:r>
-        <w:rPr>
-          <w:rFonts w:ascii="Arial Nova Cond" w:hAnsi="Arial Nova Cond"/>
-          <w:color w:val="0D0D0D"/>
-          <w:sz w:val="24"/>
-          <w:szCs w:val="24"/>
-        </w:rPr>
-        <w:t>sumpah</w:t>
-      </w:r>
-      <w:r>
-        <w:rPr>
-          <w:rFonts w:ascii="Arial Nova Cond" w:hAnsi="Arial Nova Cond"/>
-          <w:color w:val="0D0D0D"/>
-          <w:sz w:val="24"/>
-          <w:szCs w:val="24"/>
-        </w:rPr>
-        <w:t xml:space="preserve"> </w:t>
-      </w:r>
-      <w:r>
-        <w:rPr>
-          <w:rFonts w:ascii="Arial Nova Cond" w:hAnsi="Arial Nova Cond"/>
-          <w:color w:val="0D0D0D"/>
-          <w:sz w:val="24"/>
-          <w:szCs w:val="24"/>
-        </w:rPr>
-        <w:t>jabatan</w:t>
-      </w:r>
-      <w:r>
-        <w:rPr>
-          <w:rFonts w:ascii="Arial Nova Cond" w:hAnsi="Arial Nova Cond"/>
-          <w:color w:val="0D0D0D"/>
-          <w:sz w:val="24"/>
-          <w:szCs w:val="24"/>
-        </w:rPr>
-        <w:t>.</w:t>
+        <w:t>dibuat dengan sebenar-benarnya dan mengingat sumpah jabatan.</w:t>
       </w:r>
     </w:p>
     <w:p>
@@ -8435,77 +6359,7 @@
           <w:szCs w:val="24"/>
           <w:lang w:eastAsia="en-ID"/>
         </w:rPr>
-        <w:t xml:space="preserve">Tim </w:t>
-      </w:r>
-      <w:r>
-        <w:rPr>
-          <w:rFonts w:ascii="Arial Nova Cond" w:eastAsia="Times New Roman" w:hAnsi="Arial Nova Cond" w:cs="Times New Roman"/>
-          <w:color w:val="0D0D0D"/>
-          <w:sz w:val="24"/>
-          <w:szCs w:val="24"/>
-          <w:lang w:eastAsia="en-ID"/>
-        </w:rPr>
-        <w:t>Pejabat</w:t>
-      </w:r>
-      <w:r>
-        <w:rPr>
-          <w:rFonts w:ascii="Arial Nova Cond" w:eastAsia="Times New Roman" w:hAnsi="Arial Nova Cond" w:cs="Times New Roman"/>
-          <w:color w:val="0D0D0D"/>
-          <w:sz w:val="24"/>
-          <w:szCs w:val="24"/>
-          <w:lang w:eastAsia="en-ID"/>
-        </w:rPr>
-        <w:t xml:space="preserve"> </w:t>
-      </w:r>
-      <w:r>
-        <w:rPr>
-          <w:rFonts w:ascii="Arial Nova Cond" w:eastAsia="Times New Roman" w:hAnsi="Arial Nova Cond" w:cs="Times New Roman"/>
-          <w:color w:val="0D0D0D"/>
-          <w:sz w:val="24"/>
-          <w:szCs w:val="24"/>
-          <w:lang w:eastAsia="en-ID"/>
-        </w:rPr>
-        <w:t>Pengawas</w:t>
-      </w:r>
-      <w:r>
-        <w:rPr>
-          <w:rFonts w:ascii="Arial Nova Cond" w:eastAsia="Times New Roman" w:hAnsi="Arial Nova Cond" w:cs="Times New Roman"/>
-          <w:color w:val="0D0D0D"/>
-          <w:sz w:val="24"/>
-          <w:szCs w:val="24"/>
-          <w:lang w:eastAsia="en-ID"/>
-        </w:rPr>
-        <w:t xml:space="preserve"> </w:t>
-      </w:r>
-      <w:r>
-        <w:rPr>
-          <w:rFonts w:ascii="Arial Nova Cond" w:eastAsia="Times New Roman" w:hAnsi="Arial Nova Cond" w:cs="Times New Roman"/>
-          <w:color w:val="0D0D0D"/>
-          <w:sz w:val="24"/>
-          <w:szCs w:val="24"/>
-          <w:lang w:eastAsia="en-ID"/>
-        </w:rPr>
-        <w:t>Lingkungan</w:t>
-      </w:r>
-      <w:r>
-        <w:rPr>
-          <w:rFonts w:ascii="Arial Nova Cond" w:eastAsia="Times New Roman" w:hAnsi="Arial Nova Cond" w:cs="Times New Roman"/>
-          <w:color w:val="0D0D0D"/>
-          <w:sz w:val="24"/>
-          <w:szCs w:val="24"/>
-          <w:lang w:eastAsia="en-ID"/>
-        </w:rPr>
-        <w:t xml:space="preserve"> </w:t>
-      </w:r>
-      <w:r>
-        <w:rPr>
-          <w:rFonts w:ascii="Arial Nova Cond" w:eastAsia="Times New Roman" w:hAnsi="Arial Nova Cond" w:cs="Times New Roman"/>
-          <w:color w:val="0D0D0D"/>
-          <w:sz w:val="24"/>
-          <w:szCs w:val="24"/>
-          <w:lang w:eastAsia="en-ID"/>
-        </w:rPr>
-        <w:t>Hidup</w:t>
+        <w:t>Tim Pejabat Pengawas Lingkungan Hidup</w:t>
       </w:r>
     </w:p>
     <w:p>
@@ -8697,27 +6551,7 @@
                 <w:szCs w:val="24"/>
                 <w:lang w:eastAsia="en-ID"/>
               </w:rPr>
-              <w:t xml:space="preserve">Tanda </w:t>
-            </w:r>
-            <w:r>
-              <w:rPr>
-                <w:rFonts w:ascii="Arial Nova Cond" w:eastAsia="Times New Roman" w:hAnsi="Arial Nova Cond" w:cs="Times New Roman"/>
-                <w:color w:val="0D0D0D"/>
-                <w:sz w:val="24"/>
-                <w:szCs w:val="24"/>
-                <w:lang w:eastAsia="en-ID"/>
-              </w:rPr>
-              <w:t>tangan</w:t>
-            </w:r>
-            <w:r>
-              <w:rPr>
-                <w:rFonts w:ascii="Arial Nova Cond" w:eastAsia="Times New Roman" w:hAnsi="Arial Nova Cond" w:cs="Times New Roman"/>
-                <w:color w:val="0D0D0D"/>
-                <w:sz w:val="24"/>
-                <w:szCs w:val="24"/>
-                <w:lang w:eastAsia="en-ID"/>
-              </w:rPr>
-              <w:t xml:space="preserve"> </w:t>
+              <w:t xml:space="preserve">Tanda tangan </w:t>
             </w:r>
           </w:p>
         </w:tc>
@@ -8830,16 +6664,7 @@
           <w:sz w:val="24"/>
           <w:szCs w:val="24"/>
         </w:rPr>
-        <w:t>Saksi</w:t>
-      </w:r>
-      <w:r>
-        <w:rPr>
-          <w:rFonts w:ascii="Arial Nova Cond" w:hAnsi="Arial Nova Cond"/>
-          <w:color w:val="0D0D0D"/>
-          <w:sz w:val="24"/>
-          <w:szCs w:val="24"/>
-        </w:rPr>
-        <w:t xml:space="preserve"> </w:t>
+        <w:t xml:space="preserve">Saksi </w:t>
       </w:r>
     </w:p>
     <w:tbl>
@@ -8857,12 +6682,16 @@
         <w:tblLook w:val="04A0" w:firstRow="1" w:lastRow="0" w:firstColumn="1" w:lastColumn="0" w:noHBand="0" w:noVBand="1"/>
       </w:tblPr>
       <w:tblGrid>
-        <w:gridCol w:w="421"/>
-        <w:gridCol w:w="1808"/>
-        <w:gridCol w:w="283"/>
-        <w:gridCol w:w="7122"/>
+        <w:gridCol w:w="351"/>
+        <w:gridCol w:w="4509"/>
+        <w:gridCol w:w="265"/>
+        <w:gridCol w:w="4509"/>
       </w:tblGrid>
       <w:tr>
+        <w:trPr>
+          <w:gridAfter w:val="2"/>
+          <w:wAfter w:w="7405" w:type="dxa"/>
+        </w:trPr>
         <w:tc>
           <w:tcPr>
             <w:tcW w:w="421" w:type="dxa"/>
@@ -8887,7 +6716,18 @@
                 <w:szCs w:val="24"/>
                 <w:lang w:eastAsia="en-ID"/>
               </w:rPr>
-              <w:t>{#saksi} {no}.</w:t>
+              <w:t xml:space="preserve">{#saksi} </w:t>
+            </w:r>
+            <w:r>
+              <w:rPr>
+                <w:rFonts w:ascii="Arial Nova Cond" w:eastAsia="Times New Roman" w:hAnsi="Arial Nova Cond" w:cs="Times New Roman"/>
+                <w:color w:val="0D0D0D"/>
+                <w:sz w:val="24"/>
+                <w:szCs w:val="24"/>
+                <w:lang w:eastAsia="en-ID"/>
+              </w:rPr>
+              <w:lastRenderedPageBreak/>
+              <w:t>{no}.</w:t>
             </w:r>
           </w:p>
         </w:tc>
@@ -8915,6 +6755,7 @@
                 <w:szCs w:val="24"/>
                 <w:lang w:eastAsia="en-ID"/>
               </w:rPr>
+              <w:lastRenderedPageBreak/>
               <w:t>{nama_saksi}</w:t>
             </w:r>
           </w:p>
@@ -9066,27 +6907,7 @@
                 <w:szCs w:val="24"/>
                 <w:lang w:eastAsia="en-ID"/>
               </w:rPr>
-              <w:t xml:space="preserve">Tanda </w:t>
-            </w:r>
-            <w:r>
-              <w:rPr>
-                <w:rFonts w:ascii="Arial Nova Cond" w:eastAsia="Times New Roman" w:hAnsi="Arial Nova Cond" w:cs="Times New Roman"/>
-                <w:color w:val="0D0D0D"/>
-                <w:sz w:val="24"/>
-                <w:szCs w:val="24"/>
-                <w:lang w:eastAsia="en-ID"/>
-              </w:rPr>
-              <w:t>tangan</w:t>
-            </w:r>
-            <w:r>
-              <w:rPr>
-                <w:rFonts w:ascii="Arial Nova Cond" w:eastAsia="Times New Roman" w:hAnsi="Arial Nova Cond" w:cs="Times New Roman"/>
-                <w:color w:val="0D0D0D"/>
-                <w:sz w:val="24"/>
-                <w:szCs w:val="24"/>
-                <w:lang w:eastAsia="en-ID"/>
-              </w:rPr>
-              <w:t xml:space="preserve"> </w:t>
+              <w:t xml:space="preserve">Tanda tangan </w:t>
             </w:r>
           </w:p>
         </w:tc>
@@ -9282,31 +7103,7 @@
                               <w:sz w:val="20"/>
                               <w:szCs w:val="20"/>
                             </w:rPr>
-                            <w:t>Paraf</w:t>
-                          </w:r>
-                          <w:r>
-                            <w:rPr>
-                              <w:rFonts w:ascii="Arial Nova Cond" w:hAnsi="Arial Nova Cond"/>
-                              <w:sz w:val="20"/>
-                              <w:szCs w:val="20"/>
-                            </w:rPr>
-                            <w:t xml:space="preserve"> Tim </w:t>
-                          </w:r>
-                          <w:r>
-                            <w:rPr>
-                              <w:rFonts w:ascii="Arial Nova Cond" w:hAnsi="Arial Nova Cond"/>
-                              <w:sz w:val="20"/>
-                              <w:szCs w:val="20"/>
-                            </w:rPr>
-                            <w:t>Pengawas</w:t>
-                          </w:r>
-                          <w:r>
-                            <w:rPr>
-                              <w:rFonts w:ascii="Arial Nova Cond" w:hAnsi="Arial Nova Cond"/>
-                              <w:sz w:val="20"/>
-                              <w:szCs w:val="20"/>
-                            </w:rPr>
-                            <w:t xml:space="preserve"> </w:t>
+                            <w:t xml:space="preserve">Paraf Tim Pengawas </w:t>
                           </w:r>
                           <w:r>
                             <w:rPr>
@@ -9472,47 +7269,7 @@
                               <w:sz w:val="20"/>
                               <w:szCs w:val="20"/>
                             </w:rPr>
-                            <w:t>Paraf</w:t>
-                          </w:r>
-                          <w:r>
-                            <w:rPr>
-                              <w:rFonts w:ascii="Arial Nova Cond" w:hAnsi="Arial Nova Cond" w:cs="Arial"/>
-                              <w:sz w:val="20"/>
-                              <w:szCs w:val="20"/>
-                            </w:rPr>
-                            <w:t xml:space="preserve"> </w:t>
-                          </w:r>
-                          <w:r>
-                            <w:rPr>
-                              <w:rFonts w:ascii="Arial Nova Cond" w:hAnsi="Arial Nova Cond" w:cs="Arial"/>
-                              <w:sz w:val="20"/>
-                              <w:szCs w:val="20"/>
-                            </w:rPr>
-                            <w:t>Pihak</w:t>
-                          </w:r>
-                          <w:r>
-                            <w:rPr>
-                              <w:rFonts w:ascii="Arial Nova Cond" w:hAnsi="Arial Nova Cond" w:cs="Arial"/>
-                              <w:sz w:val="20"/>
-                              <w:szCs w:val="20"/>
-                            </w:rPr>
-                            <w:t xml:space="preserve"> Usaha/ </w:t>
-                          </w:r>
-                          <w:r>
-                            <w:rPr>
-                              <w:rFonts w:ascii="Arial Nova Cond" w:hAnsi="Arial Nova Cond" w:cs="Arial"/>
-                              <w:sz w:val="20"/>
-                              <w:szCs w:val="20"/>
-                            </w:rPr>
-                            <w:t>Kegiatan</w:t>
-                          </w:r>
-                          <w:r>
-                            <w:rPr>
-                              <w:rFonts w:ascii="Arial Nova Cond" w:hAnsi="Arial Nova Cond" w:cs="Arial"/>
-                              <w:sz w:val="20"/>
-                              <w:szCs w:val="20"/>
-                            </w:rPr>
-                            <w:t xml:space="preserve"> </w:t>
+                            <w:t xml:space="preserve">Paraf Pihak Usaha/ Kegiatan </w:t>
                           </w:r>
                           <w:r>
                             <w:rPr>
@@ -12532,6 +10289,95 @@
     </w:lvl>
   </w:abstractNum>
   <w:abstractNum w:abstractNumId="30" w15:restartNumberingAfterBreak="0">
+    <w:nsid w:val="7A8C1FB9"/>
+    <w:multiLevelType w:val="hybridMultilevel"/>
+    <w:tmpl w:val="1CCE958A"/>
+    <w:lvl w:ilvl="0" w:tplc="BB1EE892">
+      <w:start w:val="6"/>
+      <w:numFmt w:val="decimal"/>
+      <w:lvlText w:val="%1."/>
+      <w:lvlJc w:val="left"/>
+      <w:pPr>
+        <w:ind w:left="1146" w:hanging="360"/>
+      </w:pPr>
+      <w:rPr>
+        <w:rFonts w:hint="default"/>
+      </w:rPr>
+    </w:lvl>
+    <w:lvl w:ilvl="1" w:tplc="04210019" w:tentative="1">
+      <w:start w:val="1"/>
+      <w:numFmt w:val="lowerLetter"/>
+      <w:lvlText w:val="%2."/>
+      <w:lvlJc w:val="left"/>
+      <w:pPr>
+        <w:ind w:left="1866" w:hanging="360"/>
+      </w:pPr>
+    </w:lvl>
+    <w:lvl w:ilvl="2" w:tplc="0421001B" w:tentative="1">
+      <w:start w:val="1"/>
+      <w:numFmt w:val="lowerRoman"/>
+      <w:lvlText w:val="%3."/>
+      <w:lvlJc w:val="right"/>
+      <w:pPr>
+        <w:ind w:left="2586" w:hanging="180"/>
+      </w:pPr>
+    </w:lvl>
+    <w:lvl w:ilvl="3" w:tplc="0421000F" w:tentative="1">
+      <w:start w:val="1"/>
+      <w:numFmt w:val="decimal"/>
+      <w:lvlText w:val="%4."/>
+      <w:lvlJc w:val="left"/>
+      <w:pPr>
+        <w:ind w:left="3306" w:hanging="360"/>
+      </w:pPr>
+    </w:lvl>
+    <w:lvl w:ilvl="4" w:tplc="04210019" w:tentative="1">
+      <w:start w:val="1"/>
+      <w:numFmt w:val="lowerLetter"/>
+      <w:lvlText w:val="%5."/>
+      <w:lvlJc w:val="left"/>
+      <w:pPr>
+        <w:ind w:left="4026" w:hanging="360"/>
+      </w:pPr>
+    </w:lvl>
+    <w:lvl w:ilvl="5" w:tplc="0421001B" w:tentative="1">
+      <w:start w:val="1"/>
+      <w:numFmt w:val="lowerRoman"/>
+      <w:lvlText w:val="%6."/>
+      <w:lvlJc w:val="right"/>
+      <w:pPr>
+        <w:ind w:left="4746" w:hanging="180"/>
+      </w:pPr>
+    </w:lvl>
+    <w:lvl w:ilvl="6" w:tplc="0421000F" w:tentative="1">
+      <w:start w:val="1"/>
+      <w:numFmt w:val="decimal"/>
+      <w:lvlText w:val="%7."/>
+      <w:lvlJc w:val="left"/>
+      <w:pPr>
+        <w:ind w:left="5466" w:hanging="360"/>
+      </w:pPr>
+    </w:lvl>
+    <w:lvl w:ilvl="7" w:tplc="04210019" w:tentative="1">
+      <w:start w:val="1"/>
+      <w:numFmt w:val="lowerLetter"/>
+      <w:lvlText w:val="%8."/>
+      <w:lvlJc w:val="left"/>
+      <w:pPr>
+        <w:ind w:left="6186" w:hanging="360"/>
+      </w:pPr>
+    </w:lvl>
+    <w:lvl w:ilvl="8" w:tplc="0421001B" w:tentative="1">
+      <w:start w:val="1"/>
+      <w:numFmt w:val="lowerRoman"/>
+      <w:lvlText w:val="%9."/>
+      <w:lvlJc w:val="right"/>
+      <w:pPr>
+        <w:ind w:left="6906" w:hanging="180"/>
+      </w:pPr>
+    </w:lvl>
+  </w:abstractNum>
+  <w:abstractNum w:abstractNumId="31" w15:restartNumberingAfterBreak="0">
     <w:nsid w:val="7D696E39"/>
     <w:multiLevelType w:val="hybridMultilevel"/>
     <w:tmpl w:val="956A7464"/>
@@ -12705,13 +10551,16 @@
     <w:abstractNumId w:val="8"/>
   </w:num>
   <w:num w:numId="29" w16cid:durableId="218245100">
-    <w:abstractNumId w:val="30"/>
+    <w:abstractNumId w:val="31"/>
   </w:num>
   <w:num w:numId="30" w16cid:durableId="306133003">
     <w:abstractNumId w:val="2"/>
   </w:num>
   <w:num w:numId="31" w16cid:durableId="1535383748">
     <w:abstractNumId w:val="17"/>
+  </w:num>
+  <w:num w:numId="32" w16cid:durableId="1095134054">
+    <w:abstractNumId w:val="30"/>
   </w:num>
 </w:numbering>
 </file>
@@ -13160,7 +11009,6 @@
   <w:style w:type="character" w:default="1" w:styleId="DefaultParagraphFont">
     <w:name w:val="Default Paragraph Font"/>
     <w:uiPriority w:val="1"/>
-    <w:semiHidden/>
     <w:unhideWhenUsed/>
   </w:style>
   <w:style w:type="table" w:default="1" w:styleId="TableNormal">

</xml_diff>

<commit_message>
fix: docx variable names in fasyankes and perumahan
</commit_message>
<xml_diff>
--- a/public/templates-bap/bap-fasyankes.docx
+++ b/public/templates-bap/bap-fasyankes.docx
@@ -2839,7 +2839,7 @@
                 <w:sz w:val="24"/>
                 <w:szCs w:val="24"/>
               </w:rPr>
-              <w:t>{jumlah_karyawan_pengunjung}</w:t>
+              <w:t>{penggunaan_energi}</w:t>
             </w:r>
           </w:p>
         </w:tc>
@@ -2933,7 +2933,7 @@
                 <w:sz w:val="24"/>
                 <w:szCs w:val="24"/>
               </w:rPr>
-              <w:t>{shift_kerja}</w:t>
+              <w:t>{jumlah_karyawan_pengunjung}</w:t>
             </w:r>
           </w:p>
         </w:tc>
@@ -3027,7 +3027,7 @@
                 <w:sz w:val="24"/>
                 <w:szCs w:val="24"/>
               </w:rPr>
-              <w:t>{jam_operasional}</w:t>
+              <w:t>{shift_kerja}</w:t>
             </w:r>
           </w:p>
         </w:tc>

</xml_diff>